<commit_message>
cambios en el word
</commit_message>
<xml_diff>
--- a/MemoriaTFG-IvanMartinNieto.docx
+++ b/MemoriaTFG-IvanMartinNieto.docx
@@ -223,6 +223,58 @@
     </w:p>
     <w:p>
       <w:pPr>
+        <w:pStyle w:val="Caption"/>
+        <w:jc w:val="center"/>
+        <w:rPr>
+          <w:color w:val="A6A6A6" w:themeColor="background1" w:themeShade="A6"/>
+        </w:rPr>
+      </w:pPr>
+      <w:r>
+        <w:rPr>
+          <w:color w:val="A6A6A6" w:themeColor="background1" w:themeShade="A6"/>
+        </w:rPr>
+        <w:t xml:space="preserve">Figura </w:t>
+      </w:r>
+      <w:r>
+        <w:rPr>
+          <w:color w:val="A6A6A6" w:themeColor="background1" w:themeShade="A6"/>
+        </w:rPr>
+        <w:fldChar w:fldCharType="begin"/>
+      </w:r>
+      <w:r>
+        <w:rPr>
+          <w:color w:val="A6A6A6" w:themeColor="background1" w:themeShade="A6"/>
+        </w:rPr>
+        <w:instrText xml:space="preserve"> SEQ Figura \* ARABIC </w:instrText>
+      </w:r>
+      <w:r>
+        <w:rPr>
+          <w:color w:val="A6A6A6" w:themeColor="background1" w:themeShade="A6"/>
+        </w:rPr>
+        <w:fldChar w:fldCharType="separate"/>
+      </w:r>
+      <w:r>
+        <w:rPr>
+          <w:noProof/>
+          <w:color w:val="A6A6A6" w:themeColor="background1" w:themeShade="A6"/>
+        </w:rPr>
+        <w:t>1</w:t>
+      </w:r>
+      <w:r>
+        <w:rPr>
+          <w:color w:val="A6A6A6" w:themeColor="background1" w:themeShade="A6"/>
+        </w:rPr>
+        <w:fldChar w:fldCharType="end"/>
+      </w:r>
+      <w:r>
+        <w:rPr>
+          <w:color w:val="A6A6A6" w:themeColor="background1" w:themeShade="A6"/>
+        </w:rPr>
+        <w:t>. Logo Ianuarius</w:t>
+      </w:r>
+    </w:p>
+    <w:p>
+      <w:pPr>
         <w:tabs>
           <w:tab w:val="center" w:pos="4678"/>
         </w:tabs>
@@ -283,7 +335,7 @@
           <w:noProof/>
         </w:rPr>
         <w:drawing>
-          <wp:anchor distT="0" distB="0" distL="114300" distR="114300" simplePos="0" relativeHeight="251658240" behindDoc="0" locked="0" layoutInCell="1" allowOverlap="1" wp14:anchorId="50D1A5F3" wp14:editId="15D82E27">
+          <wp:anchor distT="0" distB="0" distL="114300" distR="114300" simplePos="0" relativeHeight="251658240" behindDoc="0" locked="0" layoutInCell="1" allowOverlap="1" wp14:anchorId="50D1A5F3" wp14:editId="7110D19D">
             <wp:simplePos x="0" y="0"/>
             <wp:positionH relativeFrom="column">
               <wp:posOffset>3509645</wp:posOffset>
@@ -366,6 +418,201 @@
       </w:pPr>
       <w:r>
         <w:rPr>
+          <w:noProof/>
+        </w:rPr>
+        <mc:AlternateContent>
+          <mc:Choice Requires="wps">
+            <w:drawing>
+              <wp:anchor distT="0" distB="0" distL="114300" distR="114300" simplePos="0" relativeHeight="251663360" behindDoc="0" locked="0" layoutInCell="1" allowOverlap="1" wp14:anchorId="561999BE" wp14:editId="00A566D2">
+                <wp:simplePos x="0" y="0"/>
+                <wp:positionH relativeFrom="column">
+                  <wp:posOffset>3566795</wp:posOffset>
+                </wp:positionH>
+                <wp:positionV relativeFrom="paragraph">
+                  <wp:posOffset>12700</wp:posOffset>
+                </wp:positionV>
+                <wp:extent cx="485775" cy="247650"/>
+                <wp:effectExtent l="0" t="0" r="9525" b="0"/>
+                <wp:wrapNone/>
+                <wp:docPr id="440395839" name="Text Box 1"/>
+                <wp:cNvGraphicFramePr/>
+                <a:graphic xmlns:a="http://schemas.openxmlformats.org/drawingml/2006/main">
+                  <a:graphicData uri="http://schemas.microsoft.com/office/word/2010/wordprocessingShape">
+                    <wps:wsp>
+                      <wps:cNvSpPr txBox="1"/>
+                      <wps:spPr>
+                        <a:xfrm>
+                          <a:off x="0" y="0"/>
+                          <a:ext cx="485775" cy="247650"/>
+                        </a:xfrm>
+                        <a:prstGeom prst="rect">
+                          <a:avLst/>
+                        </a:prstGeom>
+                        <a:solidFill>
+                          <a:prstClr val="white"/>
+                        </a:solidFill>
+                        <a:ln>
+                          <a:noFill/>
+                        </a:ln>
+                      </wps:spPr>
+                      <wps:txbx>
+                        <w:txbxContent>
+                          <w:p>
+                            <w:pPr>
+                              <w:pStyle w:val="Caption"/>
+                              <w:rPr>
+                                <w:noProof/>
+                                <w:color w:val="A6A6A6" w:themeColor="background1" w:themeShade="A6"/>
+                                <w:sz w:val="22"/>
+                              </w:rPr>
+                            </w:pPr>
+                            <w:r>
+                              <w:rPr>
+                                <w:color w:val="A6A6A6" w:themeColor="background1" w:themeShade="A6"/>
+                              </w:rPr>
+                              <w:t>Fig</w:t>
+                            </w:r>
+                            <w:r>
+                              <w:rPr>
+                                <w:color w:val="A6A6A6" w:themeColor="background1" w:themeShade="A6"/>
+                              </w:rPr>
+                              <w:t>u</w:t>
+                            </w:r>
+                            <w:r>
+                              <w:rPr>
+                                <w:color w:val="A6A6A6" w:themeColor="background1" w:themeShade="A6"/>
+                              </w:rPr>
+                              <w:t xml:space="preserve">ra </w:t>
+                            </w:r>
+                            <w:r>
+                              <w:rPr>
+                                <w:color w:val="A6A6A6" w:themeColor="background1" w:themeShade="A6"/>
+                              </w:rPr>
+                              <w:fldChar w:fldCharType="begin"/>
+                            </w:r>
+                            <w:r>
+                              <w:rPr>
+                                <w:color w:val="A6A6A6" w:themeColor="background1" w:themeShade="A6"/>
+                              </w:rPr>
+                              <w:instrText xml:space="preserve"> SEQ Figura \* ARABIC </w:instrText>
+                            </w:r>
+                            <w:r>
+                              <w:rPr>
+                                <w:color w:val="A6A6A6" w:themeColor="background1" w:themeShade="A6"/>
+                              </w:rPr>
+                              <w:fldChar w:fldCharType="separate"/>
+                            </w:r>
+                            <w:r>
+                              <w:rPr>
+                                <w:noProof/>
+                                <w:color w:val="A6A6A6" w:themeColor="background1" w:themeShade="A6"/>
+                              </w:rPr>
+                              <w:t>2</w:t>
+                            </w:r>
+                            <w:r>
+                              <w:rPr>
+                                <w:color w:val="A6A6A6" w:themeColor="background1" w:themeShade="A6"/>
+                              </w:rPr>
+                              <w:fldChar w:fldCharType="end"/>
+                            </w:r>
+                          </w:p>
+                        </w:txbxContent>
+                      </wps:txbx>
+                      <wps:bodyPr rot="0" spcFirstLastPara="0" vertOverflow="overflow" horzOverflow="overflow" vert="horz" wrap="square" lIns="0" tIns="0" rIns="0" bIns="0" numCol="1" spcCol="0" rtlCol="0" fromWordArt="0" anchor="t" anchorCtr="0" forceAA="0" compatLnSpc="1">
+                        <a:prstTxWarp prst="textNoShape">
+                          <a:avLst/>
+                        </a:prstTxWarp>
+                        <a:noAutofit/>
+                      </wps:bodyPr>
+                    </wps:wsp>
+                  </a:graphicData>
+                </a:graphic>
+                <wp14:sizeRelH relativeFrom="margin">
+                  <wp14:pctWidth>0</wp14:pctWidth>
+                </wp14:sizeRelH>
+                <wp14:sizeRelV relativeFrom="margin">
+                  <wp14:pctHeight>0</wp14:pctHeight>
+                </wp14:sizeRelV>
+              </wp:anchor>
+            </w:drawing>
+          </mc:Choice>
+          <mc:Fallback>
+            <w:pict>
+              <v:shapetype w14:anchorId="561999BE" id="_x0000_t202" coordsize="21600,21600" o:spt="202" path="m,l,21600r21600,l21600,xe">
+                <v:stroke joinstyle="miter"/>
+                <v:path gradientshapeok="t" o:connecttype="rect"/>
+              </v:shapetype>
+              <v:shape id="Text Box 1" o:spid="_x0000_s1026" type="#_x0000_t202" style="position:absolute;left:0;text-align:left;margin-left:280.85pt;margin-top:1pt;width:38.25pt;height:19.5pt;z-index:251663360;visibility:visible;mso-wrap-style:square;mso-width-percent:0;mso-height-percent:0;mso-wrap-distance-left:9pt;mso-wrap-distance-top:0;mso-wrap-distance-right:9pt;mso-wrap-distance-bottom:0;mso-position-horizontal:absolute;mso-position-horizontal-relative:text;mso-position-vertical:absolute;mso-position-vertical-relative:text;mso-width-percent:0;mso-height-percent:0;mso-width-relative:margin;mso-height-relative:margin;v-text-anchor:top" o:gfxdata="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" stroked="f">
+                <v:textbox inset="0,0,0,0">
+                  <w:txbxContent>
+                    <w:p>
+                      <w:pPr>
+                        <w:pStyle w:val="Caption"/>
+                        <w:rPr>
+                          <w:noProof/>
+                          <w:color w:val="A6A6A6" w:themeColor="background1" w:themeShade="A6"/>
+                          <w:sz w:val="22"/>
+                        </w:rPr>
+                      </w:pPr>
+                      <w:r>
+                        <w:rPr>
+                          <w:color w:val="A6A6A6" w:themeColor="background1" w:themeShade="A6"/>
+                        </w:rPr>
+                        <w:t>Fig</w:t>
+                      </w:r>
+                      <w:r>
+                        <w:rPr>
+                          <w:color w:val="A6A6A6" w:themeColor="background1" w:themeShade="A6"/>
+                        </w:rPr>
+                        <w:t>u</w:t>
+                      </w:r>
+                      <w:r>
+                        <w:rPr>
+                          <w:color w:val="A6A6A6" w:themeColor="background1" w:themeShade="A6"/>
+                        </w:rPr>
+                        <w:t xml:space="preserve">ra </w:t>
+                      </w:r>
+                      <w:r>
+                        <w:rPr>
+                          <w:color w:val="A6A6A6" w:themeColor="background1" w:themeShade="A6"/>
+                        </w:rPr>
+                        <w:fldChar w:fldCharType="begin"/>
+                      </w:r>
+                      <w:r>
+                        <w:rPr>
+                          <w:color w:val="A6A6A6" w:themeColor="background1" w:themeShade="A6"/>
+                        </w:rPr>
+                        <w:instrText xml:space="preserve"> SEQ Figura \* ARABIC </w:instrText>
+                      </w:r>
+                      <w:r>
+                        <w:rPr>
+                          <w:color w:val="A6A6A6" w:themeColor="background1" w:themeShade="A6"/>
+                        </w:rPr>
+                        <w:fldChar w:fldCharType="separate"/>
+                      </w:r>
+                      <w:r>
+                        <w:rPr>
+                          <w:noProof/>
+                          <w:color w:val="A6A6A6" w:themeColor="background1" w:themeShade="A6"/>
+                        </w:rPr>
+                        <w:t>2</w:t>
+                      </w:r>
+                      <w:r>
+                        <w:rPr>
+                          <w:color w:val="A6A6A6" w:themeColor="background1" w:themeShade="A6"/>
+                        </w:rPr>
+                        <w:fldChar w:fldCharType="end"/>
+                      </w:r>
+                    </w:p>
+                  </w:txbxContent>
+                </v:textbox>
+              </v:shape>
+            </w:pict>
+          </mc:Fallback>
+        </mc:AlternateContent>
+      </w:r>
+      <w:r>
+        <w:rPr>
           <w:rFonts w:asciiTheme="minorHAnsi" w:hAnsiTheme="minorHAnsi" w:cs="Arial"/>
           <w:b/>
           <w:bCs/>
@@ -512,42 +759,7 @@
       <w:pPr>
         <w:pStyle w:val="Heading1"/>
       </w:pPr>
-    </w:p>
-    <w:p>
-      <w:pPr>
-        <w:pStyle w:val="Heading1"/>
-      </w:pPr>
-    </w:p>
-    <w:p>
-      <w:pPr>
-        <w:pStyle w:val="Heading1"/>
-      </w:pPr>
-    </w:p>
-    <w:p>
-      <w:pPr>
-        <w:pStyle w:val="Heading1"/>
-      </w:pPr>
-    </w:p>
-    <w:p>
-      <w:pPr>
-        <w:pStyle w:val="Heading1"/>
-      </w:pPr>
-    </w:p>
-    <w:p>
-      <w:pPr>
-        <w:pStyle w:val="Heading1"/>
-      </w:pPr>
-    </w:p>
-    <w:p>
-      <w:pPr>
-        <w:pStyle w:val="Heading1"/>
-      </w:pPr>
       <w:bookmarkStart w:id="9" w:name="_Toc116375689"/>
-    </w:p>
-    <w:p>
-      <w:pPr>
-        <w:pStyle w:val="Heading1"/>
-      </w:pPr>
       <w:r>
         <w:t>L</w:t>
       </w:r>
@@ -558,6 +770,8 @@
     </w:p>
     <w:p>
       <w:pPr>
+        <w:keepNext w:val="0"/>
+        <w:widowControl w:val="0"/>
         <w:spacing w:after="0"/>
         <w:jc w:val="both"/>
         <w:rPr>
@@ -577,19 +791,6 @@
         <w:t>http://creativecommons.org/licenses/by-sa/3.0/es/ o envíe una carta a Creative Commons, 171 Second Street, Suite 300, San Francisco, California 94105, USA.</w:t>
       </w:r>
       <w:bookmarkStart w:id="10" w:name="_Toc116375691"/>
-    </w:p>
-    <w:p>
-      <w:pPr>
-        <w:keepNext w:val="0"/>
-        <w:suppressAutoHyphens w:val="0"/>
-        <w:spacing w:line="276" w:lineRule="auto"/>
-        <w:rPr>
-          <w:szCs w:val="22"/>
-        </w:rPr>
-      </w:pPr>
-      <w:r>
-        <w:br w:type="page"/>
-      </w:r>
     </w:p>
     <w:p>
       <w:pPr>
@@ -607,7 +808,6 @@
           <w:i w:val="0"/>
           <w:iCs w:val="0"/>
           <w:color w:val="1F2937"/>
-          <w:sz w:val="48"/>
           <w:szCs w:val="48"/>
         </w:rPr>
         <w:lastRenderedPageBreak/>
@@ -1461,23 +1661,9 @@
     </w:p>
     <w:p>
       <w:pPr>
-        <w:pStyle w:val="Heading2"/>
-        <w:pBdr>
-          <w:bottom w:val="single" w:sz="7" w:space="0" w:color="374151"/>
-        </w:pBdr>
-        <w:shd w:val="clear" w:color="auto" w:fill="FFFFFF" w:themeFill="background1"/>
-        <w:spacing w:before="720" w:after="360"/>
-      </w:pPr>
-      <w:r>
-        <w:rPr>
-          <w:rFonts w:ascii="Segoe UI" w:eastAsia="Segoe UI" w:hAnsi="Segoe UI" w:cs="Segoe UI"/>
-          <w:b/>
-          <w:i w:val="0"/>
-          <w:iCs w:val="0"/>
-          <w:color w:val="1F2937"/>
-          <w:sz w:val="48"/>
-          <w:szCs w:val="48"/>
-        </w:rPr>
+        <w:pStyle w:val="Heading1"/>
+      </w:pPr>
+      <w:r>
         <w:lastRenderedPageBreak/>
         <w:t>Índice de Figuras</w:t>
       </w:r>
@@ -1485,9 +1671,19 @@
     <w:p>
       <w:pPr>
         <w:shd w:val="clear" w:color="auto" w:fill="FFFFFF" w:themeFill="background1"/>
+        <w:tabs>
+          <w:tab w:val="num" w:pos="720"/>
+        </w:tabs>
         <w:spacing w:after="0"/>
-      </w:pPr>
-      <w:hyperlink r:id="rId55" w:anchor="figura1-logo">
+        <w:rPr>
+          <w:rStyle w:val="Hyperlink"/>
+          <w:rFonts w:ascii="Segoe UI" w:eastAsia="Segoe UI" w:hAnsi="Segoe UI" w:cs="Segoe UI"/>
+          <w:color w:val="2563EB"/>
+          <w:sz w:val="24"/>
+          <w:u w:val="none"/>
+        </w:rPr>
+      </w:pPr>
+      <w:hyperlink r:id="rId55" w:anchor="figura1-logo" w:history="1">
         <w:r>
           <w:rPr>
             <w:rStyle w:val="Hyperlink"/>
@@ -1503,9 +1699,19 @@
     <w:p>
       <w:pPr>
         <w:shd w:val="clear" w:color="auto" w:fill="FFFFFF" w:themeFill="background1"/>
+        <w:tabs>
+          <w:tab w:val="num" w:pos="720"/>
+        </w:tabs>
         <w:spacing w:after="0"/>
-      </w:pPr>
-      <w:hyperlink r:id="rId56" w:anchor="figura2-venancio">
+        <w:rPr>
+          <w:rStyle w:val="Hyperlink"/>
+          <w:rFonts w:ascii="Segoe UI" w:eastAsia="Segoe UI" w:hAnsi="Segoe UI" w:cs="Segoe UI"/>
+          <w:color w:val="2563EB"/>
+          <w:sz w:val="24"/>
+          <w:u w:val="none"/>
+        </w:rPr>
+      </w:pPr>
+      <w:hyperlink r:id="rId56" w:anchor="figura2-venancio" w:history="1">
         <w:r>
           <w:rPr>
             <w:rStyle w:val="Hyperlink"/>
@@ -1521,9 +1727,19 @@
     <w:p>
       <w:pPr>
         <w:shd w:val="clear" w:color="auto" w:fill="FFFFFF" w:themeFill="background1"/>
+        <w:tabs>
+          <w:tab w:val="num" w:pos="720"/>
+        </w:tabs>
         <w:spacing w:after="0"/>
-      </w:pPr>
-      <w:hyperlink r:id="rId57" w:anchor="figura3-uml">
+        <w:rPr>
+          <w:rStyle w:val="Hyperlink"/>
+          <w:rFonts w:ascii="Segoe UI" w:eastAsia="Segoe UI" w:hAnsi="Segoe UI" w:cs="Segoe UI"/>
+          <w:color w:val="2563EB"/>
+          <w:sz w:val="24"/>
+          <w:u w:val="none"/>
+        </w:rPr>
+      </w:pPr>
+      <w:hyperlink r:id="rId57" w:anchor="figura3-uml" w:history="1">
         <w:r>
           <w:rPr>
             <w:rStyle w:val="Hyperlink"/>
@@ -1539,9 +1755,19 @@
     <w:p>
       <w:pPr>
         <w:shd w:val="clear" w:color="auto" w:fill="FFFFFF" w:themeFill="background1"/>
+        <w:tabs>
+          <w:tab w:val="num" w:pos="720"/>
+        </w:tabs>
         <w:spacing w:after="0"/>
-      </w:pPr>
-      <w:hyperlink r:id="rId58" w:anchor="figura4-gantt">
+        <w:rPr>
+          <w:rStyle w:val="Hyperlink"/>
+          <w:rFonts w:ascii="Segoe UI" w:eastAsia="Segoe UI" w:hAnsi="Segoe UI" w:cs="Segoe UI"/>
+          <w:color w:val="2563EB"/>
+          <w:sz w:val="24"/>
+          <w:u w:val="none"/>
+        </w:rPr>
+      </w:pPr>
+      <w:hyperlink r:id="rId58" w:anchor="figura4-gantt" w:history="1">
         <w:r>
           <w:rPr>
             <w:rStyle w:val="Hyperlink"/>
@@ -1556,6 +1782,140 @@
     </w:p>
     <w:p>
       <w:pPr>
+        <w:shd w:val="clear" w:color="auto" w:fill="FFFFFF" w:themeFill="background1"/>
+        <w:tabs>
+          <w:tab w:val="num" w:pos="720"/>
+        </w:tabs>
+        <w:spacing w:after="0"/>
+        <w:rPr>
+          <w:rStyle w:val="Hyperlink"/>
+          <w:rFonts w:ascii="Segoe UI" w:eastAsia="Segoe UI" w:hAnsi="Segoe UI" w:cs="Segoe UI"/>
+          <w:color w:val="2563EB"/>
+          <w:sz w:val="24"/>
+          <w:u w:val="none"/>
+        </w:rPr>
+      </w:pPr>
+      <w:hyperlink r:id="rId59" w:anchor="figura5-clupik" w:history="1">
+        <w:r>
+          <w:rPr>
+            <w:rStyle w:val="Hyperlink"/>
+            <w:rFonts w:ascii="Segoe UI" w:eastAsia="Segoe UI" w:hAnsi="Segoe UI" w:cs="Segoe UI"/>
+            <w:color w:val="2563EB"/>
+            <w:sz w:val="24"/>
+            <w:u w:val="none"/>
+          </w:rPr>
+          <w:t>Figura 5. Interfaz de competiciones de Clupik</w:t>
+        </w:r>
+      </w:hyperlink>
+    </w:p>
+    <w:p>
+      <w:pPr>
+        <w:shd w:val="clear" w:color="auto" w:fill="FFFFFF" w:themeFill="background1"/>
+        <w:tabs>
+          <w:tab w:val="num" w:pos="720"/>
+        </w:tabs>
+        <w:spacing w:after="0"/>
+        <w:rPr>
+          <w:rStyle w:val="Hyperlink"/>
+          <w:rFonts w:ascii="Segoe UI" w:eastAsia="Segoe UI" w:hAnsi="Segoe UI" w:cs="Segoe UI"/>
+          <w:color w:val="2563EB"/>
+          <w:sz w:val="24"/>
+          <w:u w:val="none"/>
+        </w:rPr>
+      </w:pPr>
+      <w:hyperlink r:id="rId60" w:anchor="figura6-playoff1" w:history="1">
+        <w:r>
+          <w:rPr>
+            <w:rStyle w:val="Hyperlink"/>
+            <w:rFonts w:ascii="Segoe UI" w:eastAsia="Segoe UI" w:hAnsi="Segoe UI" w:cs="Segoe UI"/>
+            <w:color w:val="2563EB"/>
+            <w:sz w:val="24"/>
+            <w:u w:val="none"/>
+          </w:rPr>
+          <w:t xml:space="preserve">Figura 6. Interfaz de gestión de </w:t>
+        </w:r>
+        <w:proofErr w:type="gramStart"/>
+        <w:r>
+          <w:rPr>
+            <w:rStyle w:val="Hyperlink"/>
+            <w:rFonts w:ascii="Segoe UI" w:eastAsia="Segoe UI" w:hAnsi="Segoe UI" w:cs="Segoe UI"/>
+            <w:color w:val="2563EB"/>
+            <w:sz w:val="24"/>
+            <w:u w:val="none"/>
+          </w:rPr>
+          <w:t>Playoff</w:t>
+        </w:r>
+        <w:proofErr w:type="gramEnd"/>
+        <w:r>
+          <w:rPr>
+            <w:rStyle w:val="Hyperlink"/>
+            <w:rFonts w:ascii="Segoe UI" w:eastAsia="Segoe UI" w:hAnsi="Segoe UI" w:cs="Segoe UI"/>
+            <w:color w:val="2563EB"/>
+            <w:sz w:val="24"/>
+            <w:u w:val="none"/>
+          </w:rPr>
+          <w:t xml:space="preserve"> Informática</w:t>
+        </w:r>
+      </w:hyperlink>
+    </w:p>
+    <w:p>
+      <w:pPr>
+        <w:shd w:val="clear" w:color="auto" w:fill="FFFFFF" w:themeFill="background1"/>
+        <w:tabs>
+          <w:tab w:val="num" w:pos="720"/>
+        </w:tabs>
+        <w:spacing w:after="0"/>
+        <w:rPr>
+          <w:rStyle w:val="Hyperlink"/>
+          <w:rFonts w:ascii="Segoe UI" w:eastAsia="Segoe UI" w:hAnsi="Segoe UI" w:cs="Segoe UI"/>
+          <w:color w:val="2563EB"/>
+          <w:sz w:val="24"/>
+          <w:u w:val="none"/>
+        </w:rPr>
+      </w:pPr>
+      <w:hyperlink r:id="rId61" w:anchor="figura7-playoff2" w:history="1">
+        <w:r>
+          <w:rPr>
+            <w:rStyle w:val="Hyperlink"/>
+            <w:rFonts w:ascii="Segoe UI" w:eastAsia="Segoe UI" w:hAnsi="Segoe UI" w:cs="Segoe UI"/>
+            <w:color w:val="2563EB"/>
+            <w:sz w:val="24"/>
+            <w:u w:val="none"/>
+          </w:rPr>
+          <w:t xml:space="preserve">Figura 7. Funcionalidades de </w:t>
+        </w:r>
+        <w:proofErr w:type="gramStart"/>
+        <w:r>
+          <w:rPr>
+            <w:rStyle w:val="Hyperlink"/>
+            <w:rFonts w:ascii="Segoe UI" w:eastAsia="Segoe UI" w:hAnsi="Segoe UI" w:cs="Segoe UI"/>
+            <w:color w:val="2563EB"/>
+            <w:sz w:val="24"/>
+            <w:u w:val="none"/>
+          </w:rPr>
+          <w:t>Playoff</w:t>
+        </w:r>
+        <w:proofErr w:type="gramEnd"/>
+        <w:r>
+          <w:rPr>
+            <w:rStyle w:val="Hyperlink"/>
+            <w:rFonts w:ascii="Segoe UI" w:eastAsia="Segoe UI" w:hAnsi="Segoe UI" w:cs="Segoe UI"/>
+            <w:color w:val="2563EB"/>
+            <w:sz w:val="24"/>
+            <w:u w:val="none"/>
+          </w:rPr>
+          <w:t xml:space="preserve"> Informática</w:t>
+        </w:r>
+      </w:hyperlink>
+    </w:p>
+    <w:p>
+      <w:pPr>
+        <w:shd w:val="clear" w:color="auto" w:fill="FFFFFF" w:themeFill="background1"/>
+        <w:spacing w:after="0"/>
+      </w:pPr>
+    </w:p>
+    <w:p>
+      <w:pPr>
         <w:pStyle w:val="Heading2"/>
         <w:pBdr>
           <w:bottom w:val="single" w:sz="7" w:space="0" w:color="374151"/>
@@ -1568,7 +1928,6 @@
           <w:i w:val="0"/>
           <w:iCs w:val="0"/>
           <w:color w:val="1F2937"/>
-          <w:sz w:val="48"/>
           <w:szCs w:val="48"/>
         </w:rPr>
       </w:pPr>
@@ -1587,7 +1946,6 @@
           <w:i w:val="0"/>
           <w:iCs w:val="0"/>
           <w:color w:val="1F2937"/>
-          <w:sz w:val="48"/>
           <w:szCs w:val="48"/>
         </w:rPr>
       </w:pPr>
@@ -1606,7 +1964,6 @@
           <w:i w:val="0"/>
           <w:iCs w:val="0"/>
           <w:color w:val="1F2937"/>
-          <w:sz w:val="48"/>
           <w:szCs w:val="48"/>
         </w:rPr>
       </w:pPr>
@@ -1625,7 +1982,6 @@
           <w:i w:val="0"/>
           <w:iCs w:val="0"/>
           <w:color w:val="1F2937"/>
-          <w:sz w:val="48"/>
           <w:szCs w:val="48"/>
         </w:rPr>
       </w:pPr>
@@ -1644,7 +2000,6 @@
           <w:i w:val="0"/>
           <w:iCs w:val="0"/>
           <w:color w:val="1F2937"/>
-          <w:sz w:val="48"/>
           <w:szCs w:val="48"/>
         </w:rPr>
       </w:pPr>
@@ -1663,10 +2018,374 @@
           <w:i w:val="0"/>
           <w:iCs w:val="0"/>
           <w:color w:val="1F2937"/>
-          <w:sz w:val="48"/>
           <w:szCs w:val="48"/>
         </w:rPr>
       </w:pPr>
+    </w:p>
+    <w:p>
+      <w:pPr>
+        <w:pStyle w:val="Heading2"/>
+        <w:keepNext w:val="0"/>
+        <w:widowControl w:val="0"/>
+        <w:pBdr>
+          <w:bottom w:val="single" w:sz="7" w:space="0" w:color="374151"/>
+        </w:pBdr>
+        <w:shd w:val="clear" w:color="auto" w:fill="FFFFFF" w:themeFill="background1"/>
+        <w:spacing w:before="720" w:after="360"/>
+        <w:rPr>
+          <w:rFonts w:ascii="Segoe UI" w:eastAsia="Segoe UI" w:hAnsi="Segoe UI" w:cs="Segoe UI"/>
+          <w:b/>
+          <w:i w:val="0"/>
+          <w:iCs w:val="0"/>
+          <w:color w:val="1F2937"/>
+          <w:szCs w:val="48"/>
+        </w:rPr>
+      </w:pPr>
+    </w:p>
+    <w:p>
+      <w:pPr>
+        <w:pStyle w:val="Heading1"/>
+      </w:pPr>
+      <w:r>
+        <w:lastRenderedPageBreak/>
+        <w:t>Índice de Tablas</w:t>
+      </w:r>
+    </w:p>
+    <w:p>
+      <w:pPr>
+        <w:keepNext w:val="0"/>
+        <w:widowControl w:val="0"/>
+        <w:shd w:val="clear" w:color="auto" w:fill="FFFFFF" w:themeFill="background1"/>
+        <w:tabs>
+          <w:tab w:val="num" w:pos="720"/>
+        </w:tabs>
+        <w:spacing w:after="0"/>
+        <w:rPr>
+          <w:rStyle w:val="Hyperlink"/>
+          <w:color w:val="2563EB"/>
+          <w:u w:val="none"/>
+        </w:rPr>
+      </w:pPr>
+      <w:hyperlink r:id="rId62" w:anchor="analisis-viabilidad" w:history="1">
+        <w:r>
+          <w:rPr>
+            <w:rStyle w:val="Hyperlink"/>
+            <w:rFonts w:ascii="Segoe UI" w:eastAsia="Segoe UI" w:hAnsi="Segoe UI" w:cs="Segoe UI"/>
+            <w:color w:val="2563EB"/>
+            <w:sz w:val="24"/>
+            <w:u w:val="none"/>
+          </w:rPr>
+          <w:t>Tabla 1. Costes de Hardware y Software</w:t>
+        </w:r>
+      </w:hyperlink>
+    </w:p>
+    <w:p>
+      <w:pPr>
+        <w:keepNext w:val="0"/>
+        <w:widowControl w:val="0"/>
+        <w:shd w:val="clear" w:color="auto" w:fill="FFFFFF" w:themeFill="background1"/>
+        <w:tabs>
+          <w:tab w:val="num" w:pos="720"/>
+        </w:tabs>
+        <w:spacing w:after="0"/>
+        <w:rPr>
+          <w:rStyle w:val="Hyperlink"/>
+          <w:color w:val="2563EB"/>
+          <w:u w:val="none"/>
+        </w:rPr>
+      </w:pPr>
+      <w:hyperlink r:id="rId63" w:anchor="analisis-viabilidad" w:history="1">
+        <w:r>
+          <w:rPr>
+            <w:rStyle w:val="Hyperlink"/>
+            <w:rFonts w:ascii="Segoe UI" w:eastAsia="Segoe UI" w:hAnsi="Segoe UI" w:cs="Segoe UI"/>
+            <w:color w:val="2563EB"/>
+            <w:sz w:val="24"/>
+            <w:u w:val="none"/>
+          </w:rPr>
+          <w:t>Tabla 2. Costes de Personal (Desarrollo)</w:t>
+        </w:r>
+      </w:hyperlink>
+    </w:p>
+    <w:p>
+      <w:pPr>
+        <w:keepNext w:val="0"/>
+        <w:widowControl w:val="0"/>
+        <w:shd w:val="clear" w:color="auto" w:fill="FFFFFF" w:themeFill="background1"/>
+        <w:tabs>
+          <w:tab w:val="num" w:pos="720"/>
+        </w:tabs>
+        <w:spacing w:after="0"/>
+        <w:rPr>
+          <w:rStyle w:val="Hyperlink"/>
+          <w:color w:val="2563EB"/>
+          <w:u w:val="none"/>
+        </w:rPr>
+      </w:pPr>
+      <w:hyperlink r:id="rId64" w:anchor="analisis-viabilidad" w:history="1">
+        <w:r>
+          <w:rPr>
+            <w:rStyle w:val="Hyperlink"/>
+            <w:rFonts w:ascii="Segoe UI" w:eastAsia="Segoe UI" w:hAnsi="Segoe UI" w:cs="Segoe UI"/>
+            <w:color w:val="2563EB"/>
+            <w:sz w:val="24"/>
+            <w:u w:val="none"/>
+          </w:rPr>
+          <w:t>Tabla 3. Costes de Mantenimiento Anual</w:t>
+        </w:r>
+      </w:hyperlink>
+    </w:p>
+    <w:p>
+      <w:pPr>
+        <w:keepNext w:val="0"/>
+        <w:widowControl w:val="0"/>
+        <w:shd w:val="clear" w:color="auto" w:fill="FFFFFF" w:themeFill="background1"/>
+        <w:tabs>
+          <w:tab w:val="num" w:pos="720"/>
+        </w:tabs>
+        <w:spacing w:after="0"/>
+        <w:rPr>
+          <w:rStyle w:val="Hyperlink"/>
+          <w:color w:val="2563EB"/>
+          <w:u w:val="none"/>
+        </w:rPr>
+      </w:pPr>
+      <w:hyperlink r:id="rId65" w:anchor="objetivos-proyecto" w:history="1">
+        <w:r>
+          <w:rPr>
+            <w:rStyle w:val="Hyperlink"/>
+            <w:rFonts w:ascii="Segoe UI" w:eastAsia="Segoe UI" w:hAnsi="Segoe UI" w:cs="Segoe UI"/>
+            <w:color w:val="2563EB"/>
+            <w:sz w:val="24"/>
+            <w:u w:val="none"/>
+          </w:rPr>
+          <w:t>Tabla 4. Análisis SMART: Objetivo General</w:t>
+        </w:r>
+      </w:hyperlink>
+    </w:p>
+    <w:p>
+      <w:pPr>
+        <w:keepNext w:val="0"/>
+        <w:widowControl w:val="0"/>
+        <w:shd w:val="clear" w:color="auto" w:fill="FFFFFF" w:themeFill="background1"/>
+        <w:tabs>
+          <w:tab w:val="num" w:pos="720"/>
+        </w:tabs>
+        <w:spacing w:after="0"/>
+        <w:rPr>
+          <w:rStyle w:val="Hyperlink"/>
+          <w:color w:val="2563EB"/>
+          <w:u w:val="none"/>
+        </w:rPr>
+      </w:pPr>
+      <w:hyperlink r:id="rId66" w:anchor="objetivos-proyecto" w:history="1">
+        <w:r>
+          <w:rPr>
+            <w:rStyle w:val="Hyperlink"/>
+            <w:rFonts w:ascii="Segoe UI" w:eastAsia="Segoe UI" w:hAnsi="Segoe UI" w:cs="Segoe UI"/>
+            <w:color w:val="2563EB"/>
+            <w:sz w:val="24"/>
+            <w:u w:val="none"/>
+          </w:rPr>
+          <w:t>Tabla 5. Análisis SMART: Objetivos Funcionales</w:t>
+        </w:r>
+      </w:hyperlink>
+    </w:p>
+    <w:p>
+      <w:pPr>
+        <w:keepNext w:val="0"/>
+        <w:widowControl w:val="0"/>
+        <w:shd w:val="clear" w:color="auto" w:fill="FFFFFF" w:themeFill="background1"/>
+        <w:tabs>
+          <w:tab w:val="num" w:pos="720"/>
+        </w:tabs>
+        <w:spacing w:after="0"/>
+        <w:rPr>
+          <w:rStyle w:val="Hyperlink"/>
+          <w:color w:val="2563EB"/>
+          <w:u w:val="none"/>
+        </w:rPr>
+      </w:pPr>
+      <w:hyperlink r:id="rId67" w:anchor="definicion-actores" w:history="1">
+        <w:r>
+          <w:rPr>
+            <w:rStyle w:val="Hyperlink"/>
+            <w:rFonts w:ascii="Segoe UI" w:eastAsia="Segoe UI" w:hAnsi="Segoe UI" w:cs="Segoe UI"/>
+            <w:color w:val="2563EB"/>
+            <w:sz w:val="24"/>
+            <w:u w:val="none"/>
+          </w:rPr>
+          <w:t>Tabla 6. Definición de Actores</w:t>
+        </w:r>
+      </w:hyperlink>
+    </w:p>
+    <w:p>
+      <w:pPr>
+        <w:keepNext w:val="0"/>
+        <w:widowControl w:val="0"/>
+        <w:shd w:val="clear" w:color="auto" w:fill="FFFFFF" w:themeFill="background1"/>
+        <w:tabs>
+          <w:tab w:val="num" w:pos="720"/>
+        </w:tabs>
+        <w:spacing w:after="0"/>
+        <w:rPr>
+          <w:rStyle w:val="Hyperlink"/>
+          <w:color w:val="2563EB"/>
+          <w:u w:val="none"/>
+        </w:rPr>
+      </w:pPr>
+      <w:hyperlink r:id="rId68" w:anchor="especificacion-funcional" w:history="1">
+        <w:r>
+          <w:rPr>
+            <w:rStyle w:val="Hyperlink"/>
+            <w:rFonts w:ascii="Segoe UI" w:eastAsia="Segoe UI" w:hAnsi="Segoe UI" w:cs="Segoe UI"/>
+            <w:color w:val="2563EB"/>
+            <w:sz w:val="24"/>
+            <w:u w:val="none"/>
+          </w:rPr>
+          <w:t>Tabla 7. Especificación de Casos de Uso</w:t>
+        </w:r>
+      </w:hyperlink>
+    </w:p>
+    <w:p>
+      <w:pPr>
+        <w:keepNext w:val="0"/>
+        <w:widowControl w:val="0"/>
+        <w:shd w:val="clear" w:color="auto" w:fill="FFFFFF" w:themeFill="background1"/>
+        <w:tabs>
+          <w:tab w:val="num" w:pos="720"/>
+        </w:tabs>
+        <w:spacing w:after="0"/>
+        <w:rPr>
+          <w:rStyle w:val="Hyperlink"/>
+          <w:color w:val="2563EB"/>
+          <w:u w:val="none"/>
+        </w:rPr>
+      </w:pPr>
+      <w:hyperlink r:id="rId69" w:anchor="requisitos-srs" w:history="1">
+        <w:r>
+          <w:rPr>
+            <w:rStyle w:val="Hyperlink"/>
+            <w:rFonts w:ascii="Segoe UI" w:eastAsia="Segoe UI" w:hAnsi="Segoe UI" w:cs="Segoe UI"/>
+            <w:color w:val="2563EB"/>
+            <w:sz w:val="24"/>
+            <w:u w:val="none"/>
+          </w:rPr>
+          <w:t>Tabla 8. Requisitos Funcionales y No Funcionales</w:t>
+        </w:r>
+      </w:hyperlink>
+    </w:p>
+    <w:p>
+      <w:pPr>
+        <w:keepNext w:val="0"/>
+        <w:widowControl w:val="0"/>
+        <w:shd w:val="clear" w:color="auto" w:fill="FFFFFF" w:themeFill="background1"/>
+        <w:tabs>
+          <w:tab w:val="num" w:pos="720"/>
+        </w:tabs>
+        <w:spacing w:after="0"/>
+        <w:rPr>
+          <w:rStyle w:val="Hyperlink"/>
+          <w:color w:val="2563EB"/>
+          <w:u w:val="none"/>
+        </w:rPr>
+      </w:pPr>
+      <w:hyperlink r:id="rId70" w:anchor="requisitos-srs" w:history="1">
+        <w:r>
+          <w:rPr>
+            <w:rStyle w:val="Hyperlink"/>
+            <w:rFonts w:ascii="Segoe UI" w:eastAsia="Segoe UI" w:hAnsi="Segoe UI" w:cs="Segoe UI"/>
+            <w:color w:val="2563EB"/>
+            <w:sz w:val="24"/>
+            <w:u w:val="none"/>
+          </w:rPr>
+          <w:t>Tabla 9. Requisitos de Información (IRQ)</w:t>
+        </w:r>
+      </w:hyperlink>
+    </w:p>
+    <w:p>
+      <w:pPr>
+        <w:keepNext w:val="0"/>
+        <w:widowControl w:val="0"/>
+        <w:shd w:val="clear" w:color="auto" w:fill="FFFFFF" w:themeFill="background1"/>
+        <w:tabs>
+          <w:tab w:val="num" w:pos="720"/>
+        </w:tabs>
+        <w:spacing w:after="0"/>
+        <w:rPr>
+          <w:rStyle w:val="Hyperlink"/>
+          <w:color w:val="2563EB"/>
+          <w:u w:val="none"/>
+        </w:rPr>
+      </w:pPr>
+      <w:hyperlink r:id="rId71" w:anchor="stack-tecnologico" w:history="1">
+        <w:r>
+          <w:rPr>
+            <w:rStyle w:val="Hyperlink"/>
+            <w:rFonts w:ascii="Segoe UI" w:eastAsia="Segoe UI" w:hAnsi="Segoe UI" w:cs="Segoe UI"/>
+            <w:color w:val="2563EB"/>
+            <w:sz w:val="24"/>
+            <w:u w:val="none"/>
+          </w:rPr>
+          <w:t>Tabla 10. Stack Tecnológico</w:t>
+        </w:r>
+      </w:hyperlink>
+    </w:p>
+    <w:p>
+      <w:pPr>
+        <w:keepNext w:val="0"/>
+        <w:widowControl w:val="0"/>
+        <w:shd w:val="clear" w:color="auto" w:fill="FFFFFF" w:themeFill="background1"/>
+        <w:tabs>
+          <w:tab w:val="num" w:pos="720"/>
+        </w:tabs>
+        <w:spacing w:after="0"/>
+        <w:rPr>
+          <w:rStyle w:val="Hyperlink"/>
+          <w:color w:val="2563EB"/>
+          <w:u w:val="none"/>
+        </w:rPr>
+      </w:pPr>
+      <w:hyperlink r:id="rId72" w:anchor="planificacion-temporal" w:history="1">
+        <w:r>
+          <w:rPr>
+            <w:rStyle w:val="Hyperlink"/>
+            <w:rFonts w:ascii="Segoe UI" w:eastAsia="Segoe UI" w:hAnsi="Segoe UI" w:cs="Segoe UI"/>
+            <w:color w:val="2563EB"/>
+            <w:sz w:val="24"/>
+            <w:u w:val="none"/>
+          </w:rPr>
+          <w:t>Tabla 11. Fases de Planificación (Gantt)</w:t>
+        </w:r>
+      </w:hyperlink>
+    </w:p>
+    <w:p>
+      <w:pPr>
+        <w:keepNext w:val="0"/>
+        <w:widowControl w:val="0"/>
+        <w:shd w:val="clear" w:color="auto" w:fill="FFFFFF" w:themeFill="background1"/>
+        <w:tabs>
+          <w:tab w:val="num" w:pos="720"/>
+        </w:tabs>
+        <w:spacing w:after="0"/>
+        <w:rPr>
+          <w:rStyle w:val="Hyperlink"/>
+          <w:color w:val="2563EB"/>
+          <w:u w:val="none"/>
+        </w:rPr>
+      </w:pPr>
+      <w:hyperlink r:id="rId73" w:anchor="glosario" w:history="1">
+        <w:r>
+          <w:rPr>
+            <w:rStyle w:val="Hyperlink"/>
+            <w:rFonts w:ascii="Segoe UI" w:eastAsia="Segoe UI" w:hAnsi="Segoe UI" w:cs="Segoe UI"/>
+            <w:color w:val="2563EB"/>
+            <w:sz w:val="24"/>
+            <w:u w:val="none"/>
+          </w:rPr>
+          <w:t>Tabla 12. Glosario de Términos</w:t>
+        </w:r>
+      </w:hyperlink>
     </w:p>
     <w:p>
       <w:pPr>
@@ -1682,7 +2401,6 @@
           <w:i w:val="0"/>
           <w:iCs w:val="0"/>
           <w:color w:val="1F2937"/>
-          <w:sz w:val="48"/>
           <w:szCs w:val="48"/>
         </w:rPr>
       </w:pPr>
@@ -1701,7 +2419,6 @@
           <w:i w:val="0"/>
           <w:iCs w:val="0"/>
           <w:color w:val="1F2937"/>
-          <w:sz w:val="48"/>
           <w:szCs w:val="48"/>
         </w:rPr>
       </w:pPr>
@@ -1714,35 +2431,15 @@
         </w:pBdr>
         <w:shd w:val="clear" w:color="auto" w:fill="FFFFFF" w:themeFill="background1"/>
         <w:spacing w:before="720" w:after="360"/>
-      </w:pPr>
-      <w:r>
         <w:rPr>
           <w:rFonts w:ascii="Segoe UI" w:eastAsia="Segoe UI" w:hAnsi="Segoe UI" w:cs="Segoe UI"/>
           <w:b/>
           <w:i w:val="0"/>
           <w:iCs w:val="0"/>
           <w:color w:val="1F2937"/>
-          <w:sz w:val="48"/>
           <w:szCs w:val="48"/>
         </w:rPr>
-        <w:lastRenderedPageBreak/>
-        <w:t>Índice de Tablas</w:t>
-      </w:r>
-    </w:p>
-    <w:p>
-      <w:pPr>
-        <w:shd w:val="clear" w:color="auto" w:fill="FFFFFF" w:themeFill="background1"/>
-        <w:spacing w:after="48"/>
-        <w:jc w:val="both"/>
-      </w:pPr>
-      <w:r>
-        <w:rPr>
-          <w:rFonts w:ascii="Segoe UI" w:eastAsia="Segoe UI" w:hAnsi="Segoe UI" w:cs="Segoe UI"/>
-          <w:color w:val="212121"/>
-          <w:sz w:val="24"/>
-        </w:rPr>
-        <w:t>- (Las tablas se generarán en el documento final Word)</w:t>
-      </w:r>
+      </w:pPr>
     </w:p>
     <w:p>
       <w:pPr>
@@ -1758,7 +2455,6 @@
           <w:i w:val="0"/>
           <w:iCs w:val="0"/>
           <w:color w:val="1F2937"/>
-          <w:sz w:val="48"/>
           <w:szCs w:val="48"/>
         </w:rPr>
       </w:pPr>
@@ -1777,7 +2473,6 @@
           <w:i w:val="0"/>
           <w:iCs w:val="0"/>
           <w:color w:val="1F2937"/>
-          <w:sz w:val="48"/>
           <w:szCs w:val="48"/>
         </w:rPr>
       </w:pPr>
@@ -1785,6 +2480,8 @@
     <w:p>
       <w:pPr>
         <w:pStyle w:val="Heading2"/>
+        <w:keepNext w:val="0"/>
+        <w:widowControl w:val="0"/>
         <w:pBdr>
           <w:bottom w:val="single" w:sz="7" w:space="0" w:color="374151"/>
         </w:pBdr>
@@ -1796,153 +2493,19 @@
           <w:i w:val="0"/>
           <w:iCs w:val="0"/>
           <w:color w:val="1F2937"/>
-          <w:sz w:val="48"/>
           <w:szCs w:val="48"/>
         </w:rPr>
       </w:pPr>
     </w:p>
     <w:p>
       <w:pPr>
-        <w:pStyle w:val="Heading2"/>
-        <w:pBdr>
-          <w:bottom w:val="single" w:sz="7" w:space="0" w:color="374151"/>
-        </w:pBdr>
-        <w:shd w:val="clear" w:color="auto" w:fill="FFFFFF" w:themeFill="background1"/>
-        <w:spacing w:before="720" w:after="360"/>
-        <w:rPr>
-          <w:rFonts w:ascii="Segoe UI" w:eastAsia="Segoe UI" w:hAnsi="Segoe UI" w:cs="Segoe UI"/>
-          <w:b/>
-          <w:i w:val="0"/>
-          <w:iCs w:val="0"/>
-          <w:color w:val="1F2937"/>
-          <w:sz w:val="48"/>
-          <w:szCs w:val="48"/>
-        </w:rPr>
-      </w:pPr>
-    </w:p>
-    <w:p>
-      <w:pPr>
-        <w:pStyle w:val="Heading2"/>
-        <w:pBdr>
-          <w:bottom w:val="single" w:sz="7" w:space="0" w:color="374151"/>
-        </w:pBdr>
-        <w:shd w:val="clear" w:color="auto" w:fill="FFFFFF" w:themeFill="background1"/>
-        <w:spacing w:before="720" w:after="360"/>
-        <w:rPr>
-          <w:rFonts w:ascii="Segoe UI" w:eastAsia="Segoe UI" w:hAnsi="Segoe UI" w:cs="Segoe UI"/>
-          <w:b/>
-          <w:i w:val="0"/>
-          <w:iCs w:val="0"/>
-          <w:color w:val="1F2937"/>
-          <w:sz w:val="48"/>
-          <w:szCs w:val="48"/>
-        </w:rPr>
-      </w:pPr>
-    </w:p>
-    <w:p>
-      <w:pPr>
-        <w:pStyle w:val="Heading2"/>
-        <w:pBdr>
-          <w:bottom w:val="single" w:sz="7" w:space="0" w:color="374151"/>
-        </w:pBdr>
-        <w:shd w:val="clear" w:color="auto" w:fill="FFFFFF" w:themeFill="background1"/>
-        <w:spacing w:before="720" w:after="360"/>
-        <w:rPr>
-          <w:rFonts w:ascii="Segoe UI" w:eastAsia="Segoe UI" w:hAnsi="Segoe UI" w:cs="Segoe UI"/>
-          <w:b/>
-          <w:i w:val="0"/>
-          <w:iCs w:val="0"/>
-          <w:color w:val="1F2937"/>
-          <w:sz w:val="48"/>
-          <w:szCs w:val="48"/>
-        </w:rPr>
-      </w:pPr>
-    </w:p>
-    <w:p>
-      <w:pPr>
-        <w:pStyle w:val="Heading2"/>
-        <w:pBdr>
-          <w:bottom w:val="single" w:sz="7" w:space="0" w:color="374151"/>
-        </w:pBdr>
-        <w:shd w:val="clear" w:color="auto" w:fill="FFFFFF" w:themeFill="background1"/>
-        <w:spacing w:before="720" w:after="360"/>
-        <w:rPr>
-          <w:rFonts w:ascii="Segoe UI" w:eastAsia="Segoe UI" w:hAnsi="Segoe UI" w:cs="Segoe UI"/>
-          <w:b/>
-          <w:i w:val="0"/>
-          <w:iCs w:val="0"/>
-          <w:color w:val="1F2937"/>
-          <w:sz w:val="48"/>
-          <w:szCs w:val="48"/>
-        </w:rPr>
-      </w:pPr>
-    </w:p>
-    <w:p>
-      <w:pPr>
-        <w:pStyle w:val="Heading2"/>
-        <w:pBdr>
-          <w:bottom w:val="single" w:sz="7" w:space="0" w:color="374151"/>
-        </w:pBdr>
-        <w:shd w:val="clear" w:color="auto" w:fill="FFFFFF" w:themeFill="background1"/>
-        <w:spacing w:before="720" w:after="360"/>
-        <w:rPr>
-          <w:rFonts w:ascii="Segoe UI" w:eastAsia="Segoe UI" w:hAnsi="Segoe UI" w:cs="Segoe UI"/>
-          <w:b/>
-          <w:i w:val="0"/>
-          <w:iCs w:val="0"/>
-          <w:color w:val="1F2937"/>
-          <w:sz w:val="48"/>
-          <w:szCs w:val="48"/>
-        </w:rPr>
-      </w:pPr>
-    </w:p>
-    <w:p>
-      <w:pPr>
-        <w:pStyle w:val="Heading2"/>
-        <w:pBdr>
-          <w:bottom w:val="single" w:sz="7" w:space="0" w:color="374151"/>
-        </w:pBdr>
-        <w:shd w:val="clear" w:color="auto" w:fill="FFFFFF" w:themeFill="background1"/>
-        <w:spacing w:before="720" w:after="360"/>
-        <w:rPr>
-          <w:rFonts w:ascii="Segoe UI" w:eastAsia="Segoe UI" w:hAnsi="Segoe UI" w:cs="Segoe UI"/>
-          <w:b/>
-          <w:i w:val="0"/>
-          <w:iCs w:val="0"/>
-          <w:color w:val="1F2937"/>
-          <w:sz w:val="48"/>
-          <w:szCs w:val="48"/>
-        </w:rPr>
-      </w:pPr>
-    </w:p>
-    <w:p>
-      <w:pPr>
-        <w:pStyle w:val="Heading2"/>
-        <w:pBdr>
-          <w:bottom w:val="single" w:sz="7" w:space="0" w:color="374151"/>
-        </w:pBdr>
-        <w:shd w:val="clear" w:color="auto" w:fill="FFFFFF" w:themeFill="background1"/>
-        <w:spacing w:before="720" w:after="360"/>
-        <w:rPr>
-          <w:rFonts w:ascii="Segoe UI" w:eastAsia="Segoe UI" w:hAnsi="Segoe UI" w:cs="Segoe UI"/>
-          <w:b/>
-          <w:i w:val="0"/>
-          <w:iCs w:val="0"/>
-          <w:color w:val="1F2937"/>
-          <w:sz w:val="48"/>
-          <w:szCs w:val="48"/>
-        </w:rPr>
-      </w:pPr>
-      <w:r>
-        <w:rPr>
-          <w:rFonts w:ascii="Segoe UI" w:eastAsia="Segoe UI" w:hAnsi="Segoe UI" w:cs="Segoe UI"/>
-          <w:b/>
-          <w:i w:val="0"/>
-          <w:iCs w:val="0"/>
-          <w:color w:val="1F2937"/>
-          <w:sz w:val="48"/>
-          <w:szCs w:val="48"/>
-        </w:rPr>
+        <w:pStyle w:val="Heading1"/>
+        <w:rPr>
+          <w:i/>
+          <w:iCs/>
+        </w:rPr>
+      </w:pPr>
+      <w:r>
         <w:lastRenderedPageBreak/>
         <w:t>1. Introducción y Justificación</w:t>
       </w:r>
@@ -1953,16 +2516,11 @@
         <w:pBdr>
           <w:bottom w:val="single" w:sz="7" w:space="0" w:color="D1D5DB"/>
         </w:pBdr>
-        <w:shd w:val="clear" w:color="auto" w:fill="FFFFFF" w:themeFill="background1"/>
         <w:spacing w:before="360" w:after="120"/>
         <w:ind w:left="360"/>
       </w:pPr>
       <w:r>
         <w:rPr>
-          <w:rFonts w:ascii="Segoe UI" w:eastAsia="Segoe UI" w:hAnsi="Segoe UI" w:cs="Segoe UI"/>
-          <w:b/>
-          <w:bCs/>
-          <w:color w:val="1F2937"/>
           <w:szCs w:val="24"/>
         </w:rPr>
         <w:t>1.1. Memoria Inicial</w:t>
@@ -2004,18 +2562,10 @@
         <w:pBdr>
           <w:bottom w:val="single" w:sz="7" w:space="0" w:color="D1D5DB"/>
         </w:pBdr>
-        <w:shd w:val="clear" w:color="auto" w:fill="FFFFFF" w:themeFill="background1"/>
         <w:spacing w:before="360" w:after="120"/>
         <w:ind w:left="360"/>
       </w:pPr>
       <w:r>
-        <w:rPr>
-          <w:rFonts w:ascii="Segoe UI" w:eastAsia="Segoe UI" w:hAnsi="Segoe UI" w:cs="Segoe UI"/>
-          <w:b/>
-          <w:bCs/>
-          <w:color w:val="1F2937"/>
-          <w:szCs w:val="24"/>
-        </w:rPr>
         <w:t>1.2. Justificación</w:t>
       </w:r>
     </w:p>
@@ -2040,16 +2590,11 @@
         <w:pBdr>
           <w:bottom w:val="single" w:sz="7" w:space="0" w:color="D1D5DB"/>
         </w:pBdr>
-        <w:shd w:val="clear" w:color="auto" w:fill="FFFFFF" w:themeFill="background1"/>
         <w:spacing w:before="360" w:after="120"/>
         <w:ind w:left="360"/>
       </w:pPr>
       <w:r>
         <w:rPr>
-          <w:rFonts w:ascii="Segoe UI" w:eastAsia="Segoe UI" w:hAnsi="Segoe UI" w:cs="Segoe UI"/>
-          <w:b/>
-          <w:bCs/>
-          <w:color w:val="1F2937"/>
           <w:szCs w:val="24"/>
         </w:rPr>
         <w:t>1.3. Oportunidad de Negocio</w:t>
@@ -2111,16 +2656,11 @@
         <w:pBdr>
           <w:bottom w:val="single" w:sz="7" w:space="0" w:color="D1D5DB"/>
         </w:pBdr>
-        <w:shd w:val="clear" w:color="auto" w:fill="FFFFFF" w:themeFill="background1"/>
         <w:spacing w:before="360" w:after="120"/>
         <w:ind w:left="360"/>
       </w:pPr>
       <w:r>
         <w:rPr>
-          <w:rFonts w:ascii="Segoe UI" w:eastAsia="Segoe UI" w:hAnsi="Segoe UI" w:cs="Segoe UI"/>
-          <w:b/>
-          <w:bCs/>
-          <w:color w:val="1F2937"/>
           <w:szCs w:val="24"/>
         </w:rPr>
         <w:lastRenderedPageBreak/>
@@ -2243,7 +2783,7 @@
                     <pic:cNvPicPr/>
                   </pic:nvPicPr>
                   <pic:blipFill>
-                    <a:blip r:embed="rId59">
+                    <a:blip r:embed="rId74">
                       <a:extLst>
                         <a:ext uri="{28A0092B-C50C-407E-A947-70E740481C1C}">
                           <a14:useLocalDpi xmlns:a14="http://schemas.microsoft.com/office/drawing/2010/main"/>
@@ -2272,6 +2812,58 @@
     </w:p>
     <w:p>
       <w:pPr>
+        <w:pStyle w:val="Caption"/>
+        <w:jc w:val="center"/>
+        <w:rPr>
+          <w:color w:val="A6A6A6" w:themeColor="background1" w:themeShade="A6"/>
+        </w:rPr>
+      </w:pPr>
+      <w:r>
+        <w:rPr>
+          <w:color w:val="A6A6A6" w:themeColor="background1" w:themeShade="A6"/>
+        </w:rPr>
+        <w:t xml:space="preserve">Figura </w:t>
+      </w:r>
+      <w:r>
+        <w:rPr>
+          <w:color w:val="A6A6A6" w:themeColor="background1" w:themeShade="A6"/>
+        </w:rPr>
+        <w:fldChar w:fldCharType="begin"/>
+      </w:r>
+      <w:r>
+        <w:rPr>
+          <w:color w:val="A6A6A6" w:themeColor="background1" w:themeShade="A6"/>
+        </w:rPr>
+        <w:instrText xml:space="preserve"> SEQ Figura \* ARABIC </w:instrText>
+      </w:r>
+      <w:r>
+        <w:rPr>
+          <w:color w:val="A6A6A6" w:themeColor="background1" w:themeShade="A6"/>
+        </w:rPr>
+        <w:fldChar w:fldCharType="separate"/>
+      </w:r>
+      <w:r>
+        <w:rPr>
+          <w:noProof/>
+          <w:color w:val="A6A6A6" w:themeColor="background1" w:themeShade="A6"/>
+        </w:rPr>
+        <w:t>3</w:t>
+      </w:r>
+      <w:r>
+        <w:rPr>
+          <w:color w:val="A6A6A6" w:themeColor="background1" w:themeShade="A6"/>
+        </w:rPr>
+        <w:fldChar w:fldCharType="end"/>
+      </w:r>
+      <w:r>
+        <w:rPr>
+          <w:color w:val="A6A6A6" w:themeColor="background1" w:themeShade="A6"/>
+        </w:rPr>
+        <w:t>. Interfaz de competiciones de Clupik</w:t>
+      </w:r>
+    </w:p>
+    <w:p>
+      <w:pPr>
         <w:pStyle w:val="Heading4"/>
         <w:shd w:val="clear" w:color="auto" w:fill="FFFFFF" w:themeFill="background1"/>
         <w:spacing w:before="360" w:after="120"/>
@@ -2375,9 +2967,9 @@
     <w:p>
       <w:pPr>
         <w:pStyle w:val="Heading4"/>
+        <w:widowControl w:val="0"/>
         <w:shd w:val="clear" w:color="auto" w:fill="FFFFFF" w:themeFill="background1"/>
         <w:spacing w:before="360" w:after="120"/>
-        <w:ind w:left="720"/>
         <w:jc w:val="both"/>
         <w:rPr>
           <w:rFonts w:ascii="Segoe UI" w:eastAsia="Segoe UI" w:hAnsi="Segoe UI" w:cs="Segoe UI"/>
@@ -2393,27 +2985,6 @@
     <w:p>
       <w:pPr>
         <w:pStyle w:val="Heading4"/>
-        <w:keepNext w:val="0"/>
-        <w:widowControl w:val="0"/>
-        <w:shd w:val="clear" w:color="auto" w:fill="FFFFFF" w:themeFill="background1"/>
-        <w:spacing w:before="360" w:after="120"/>
-        <w:ind w:left="720"/>
-        <w:jc w:val="both"/>
-        <w:rPr>
-          <w:rFonts w:ascii="Segoe UI" w:eastAsia="Segoe UI" w:hAnsi="Segoe UI" w:cs="Segoe UI"/>
-          <w:b/>
-          <w:bCs/>
-          <w:i w:val="0"/>
-          <w:iCs w:val="0"/>
-          <w:color w:val="000000" w:themeColor="text1"/>
-          <w:sz w:val="24"/>
-        </w:rPr>
-      </w:pPr>
-    </w:p>
-    <w:p>
-      <w:pPr>
-        <w:pStyle w:val="Heading4"/>
-        <w:keepNext w:val="0"/>
         <w:widowControl w:val="0"/>
         <w:shd w:val="clear" w:color="auto" w:fill="FFFFFF" w:themeFill="background1"/>
         <w:spacing w:before="360" w:after="120"/>
@@ -2517,7 +3088,7 @@
                     <pic:cNvPicPr/>
                   </pic:nvPicPr>
                   <pic:blipFill>
-                    <a:blip r:embed="rId60">
+                    <a:blip r:embed="rId75">
                       <a:extLst>
                         <a:ext uri="{28A0092B-C50C-407E-A947-70E740481C1C}">
                           <a14:useLocalDpi xmlns:a14="http://schemas.microsoft.com/office/drawing/2010/main"/>
@@ -2546,6 +3117,72 @@
     </w:p>
     <w:p>
       <w:pPr>
+        <w:pStyle w:val="Caption"/>
+        <w:jc w:val="center"/>
+        <w:rPr>
+          <w:color w:val="A6A6A6" w:themeColor="background1" w:themeShade="A6"/>
+        </w:rPr>
+      </w:pPr>
+      <w:r>
+        <w:rPr>
+          <w:color w:val="A6A6A6" w:themeColor="background1" w:themeShade="A6"/>
+        </w:rPr>
+        <w:t xml:space="preserve">Figura </w:t>
+      </w:r>
+      <w:r>
+        <w:rPr>
+          <w:color w:val="A6A6A6" w:themeColor="background1" w:themeShade="A6"/>
+        </w:rPr>
+        <w:fldChar w:fldCharType="begin"/>
+      </w:r>
+      <w:r>
+        <w:rPr>
+          <w:color w:val="A6A6A6" w:themeColor="background1" w:themeShade="A6"/>
+        </w:rPr>
+        <w:instrText xml:space="preserve"> SEQ Figura \* ARABIC </w:instrText>
+      </w:r>
+      <w:r>
+        <w:rPr>
+          <w:color w:val="A6A6A6" w:themeColor="background1" w:themeShade="A6"/>
+        </w:rPr>
+        <w:fldChar w:fldCharType="separate"/>
+      </w:r>
+      <w:r>
+        <w:rPr>
+          <w:noProof/>
+          <w:color w:val="A6A6A6" w:themeColor="background1" w:themeShade="A6"/>
+        </w:rPr>
+        <w:t>4</w:t>
+      </w:r>
+      <w:r>
+        <w:rPr>
+          <w:color w:val="A6A6A6" w:themeColor="background1" w:themeShade="A6"/>
+        </w:rPr>
+        <w:fldChar w:fldCharType="end"/>
+      </w:r>
+      <w:r>
+        <w:rPr>
+          <w:color w:val="A6A6A6" w:themeColor="background1" w:themeShade="A6"/>
+        </w:rPr>
+        <w:t xml:space="preserve">. Interfaz de gestión de </w:t>
+      </w:r>
+      <w:proofErr w:type="gramStart"/>
+      <w:r>
+        <w:rPr>
+          <w:color w:val="A6A6A6" w:themeColor="background1" w:themeShade="A6"/>
+        </w:rPr>
+        <w:t>Playoff</w:t>
+      </w:r>
+      <w:proofErr w:type="gramEnd"/>
+      <w:r>
+        <w:rPr>
+          <w:color w:val="A6A6A6" w:themeColor="background1" w:themeShade="A6"/>
+        </w:rPr>
+        <w:t xml:space="preserve"> Informática</w:t>
+      </w:r>
+    </w:p>
+    <w:p>
+      <w:pPr>
         <w:jc w:val="center"/>
       </w:pPr>
       <w:r>
@@ -2568,7 +3205,7 @@
                     <pic:cNvPicPr/>
                   </pic:nvPicPr>
                   <pic:blipFill>
-                    <a:blip r:embed="rId61">
+                    <a:blip r:embed="rId76">
                       <a:extLst>
                         <a:ext uri="{28A0092B-C50C-407E-A947-70E740481C1C}">
                           <a14:useLocalDpi xmlns:a14="http://schemas.microsoft.com/office/drawing/2010/main"/>
@@ -2597,6 +3234,72 @@
     </w:p>
     <w:p>
       <w:pPr>
+        <w:pStyle w:val="Caption"/>
+        <w:jc w:val="center"/>
+        <w:rPr>
+          <w:color w:val="A6A6A6" w:themeColor="background1" w:themeShade="A6"/>
+        </w:rPr>
+      </w:pPr>
+      <w:r>
+        <w:rPr>
+          <w:color w:val="A6A6A6" w:themeColor="background1" w:themeShade="A6"/>
+        </w:rPr>
+        <w:t xml:space="preserve">Figura </w:t>
+      </w:r>
+      <w:r>
+        <w:rPr>
+          <w:color w:val="A6A6A6" w:themeColor="background1" w:themeShade="A6"/>
+        </w:rPr>
+        <w:fldChar w:fldCharType="begin"/>
+      </w:r>
+      <w:r>
+        <w:rPr>
+          <w:color w:val="A6A6A6" w:themeColor="background1" w:themeShade="A6"/>
+        </w:rPr>
+        <w:instrText xml:space="preserve"> SEQ Figura \* ARABIC </w:instrText>
+      </w:r>
+      <w:r>
+        <w:rPr>
+          <w:color w:val="A6A6A6" w:themeColor="background1" w:themeShade="A6"/>
+        </w:rPr>
+        <w:fldChar w:fldCharType="separate"/>
+      </w:r>
+      <w:r>
+        <w:rPr>
+          <w:noProof/>
+          <w:color w:val="A6A6A6" w:themeColor="background1" w:themeShade="A6"/>
+        </w:rPr>
+        <w:t>5</w:t>
+      </w:r>
+      <w:r>
+        <w:rPr>
+          <w:color w:val="A6A6A6" w:themeColor="background1" w:themeShade="A6"/>
+        </w:rPr>
+        <w:fldChar w:fldCharType="end"/>
+      </w:r>
+      <w:r>
+        <w:rPr>
+          <w:color w:val="A6A6A6" w:themeColor="background1" w:themeShade="A6"/>
+        </w:rPr>
+        <w:t xml:space="preserve">. Funcionalidades de </w:t>
+      </w:r>
+      <w:proofErr w:type="gramStart"/>
+      <w:r>
+        <w:rPr>
+          <w:color w:val="A6A6A6" w:themeColor="background1" w:themeShade="A6"/>
+        </w:rPr>
+        <w:t>Playoff</w:t>
+      </w:r>
+      <w:proofErr w:type="gramEnd"/>
+      <w:r>
+        <w:rPr>
+          <w:color w:val="A6A6A6" w:themeColor="background1" w:themeShade="A6"/>
+        </w:rPr>
+        <w:t xml:space="preserve"> Informática</w:t>
+      </w:r>
+    </w:p>
+    <w:p>
+      <w:pPr>
         <w:pStyle w:val="Heading4"/>
         <w:shd w:val="clear" w:color="auto" w:fill="FFFFFF" w:themeFill="background1"/>
         <w:spacing w:before="360" w:after="120"/>
@@ -2648,26 +3351,10 @@
     </w:p>
     <w:p>
       <w:pPr>
-        <w:shd w:val="clear" w:color="auto" w:fill="FFFFFF" w:themeFill="background1"/>
-        <w:spacing w:before="360" w:after="120"/>
-        <w:ind w:left="720"/>
-        <w:rPr>
-          <w:rFonts w:ascii="Segoe UI" w:eastAsia="Segoe UI" w:hAnsi="Segoe UI" w:cs="Segoe UI"/>
-          <w:b/>
-          <w:bCs/>
-          <w:color w:val="000000" w:themeColor="text1"/>
-          <w:sz w:val="24"/>
-        </w:rPr>
-      </w:pPr>
-    </w:p>
-    <w:p>
-      <w:pPr>
         <w:pStyle w:val="Heading4"/>
-        <w:keepNext w:val="0"/>
         <w:widowControl w:val="0"/>
         <w:shd w:val="clear" w:color="auto" w:fill="FFFFFF" w:themeFill="background1"/>
         <w:spacing w:before="360" w:after="120"/>
-        <w:ind w:left="720"/>
         <w:rPr>
           <w:rFonts w:ascii="Segoe UI" w:eastAsia="Segoe UI" w:hAnsi="Segoe UI" w:cs="Segoe UI"/>
           <w:b/>
@@ -2682,7 +3369,6 @@
     <w:p>
       <w:pPr>
         <w:pStyle w:val="Heading4"/>
-        <w:keepNext w:val="0"/>
         <w:widowControl w:val="0"/>
         <w:shd w:val="clear" w:color="auto" w:fill="FFFFFF" w:themeFill="background1"/>
         <w:spacing w:before="360" w:after="120"/>
@@ -2701,7 +3387,6 @@
     <w:p>
       <w:pPr>
         <w:pStyle w:val="Heading4"/>
-        <w:keepNext w:val="0"/>
         <w:widowControl w:val="0"/>
         <w:shd w:val="clear" w:color="auto" w:fill="FFFFFF" w:themeFill="background1"/>
         <w:spacing w:before="360" w:after="120"/>
@@ -2911,16 +3596,11 @@
         <w:pBdr>
           <w:bottom w:val="single" w:sz="7" w:space="0" w:color="D1D5DB"/>
         </w:pBdr>
-        <w:shd w:val="clear" w:color="auto" w:fill="FFFFFF" w:themeFill="background1"/>
         <w:spacing w:before="360" w:after="120"/>
         <w:ind w:left="360"/>
       </w:pPr>
       <w:r>
         <w:rPr>
-          <w:rFonts w:ascii="Segoe UI" w:eastAsia="Segoe UI" w:hAnsi="Segoe UI" w:cs="Segoe UI"/>
-          <w:b/>
-          <w:bCs/>
-          <w:color w:val="1F2937"/>
           <w:szCs w:val="24"/>
         </w:rPr>
         <w:t>1.5. Análisis de Viabilidad</w:t>
@@ -3049,7 +3729,6 @@
     <w:p>
       <w:pPr>
         <w:pStyle w:val="Heading4"/>
-        <w:keepNext w:val="0"/>
         <w:widowControl w:val="0"/>
         <w:shd w:val="clear" w:color="auto" w:fill="FFFFFF" w:themeFill="background1"/>
         <w:spacing w:before="360" w:after="120"/>
@@ -3068,7 +3747,6 @@
     <w:p>
       <w:pPr>
         <w:pStyle w:val="Heading4"/>
-        <w:keepNext w:val="0"/>
         <w:widowControl w:val="0"/>
         <w:shd w:val="clear" w:color="auto" w:fill="FFFFFF" w:themeFill="background1"/>
         <w:spacing w:before="360" w:after="120"/>
@@ -3087,7 +3765,6 @@
     <w:p>
       <w:pPr>
         <w:pStyle w:val="Heading4"/>
-        <w:keepNext w:val="0"/>
         <w:widowControl w:val="0"/>
         <w:shd w:val="clear" w:color="auto" w:fill="FFFFFF" w:themeFill="background1"/>
         <w:spacing w:before="360" w:after="120"/>
@@ -3112,7 +3789,6 @@
           <w:color w:val="000000" w:themeColor="text1"/>
           <w:sz w:val="24"/>
         </w:rPr>
-        <w:lastRenderedPageBreak/>
         <w:t>1.5.2. Viabilidad Económica</w:t>
       </w:r>
       <w:r>
@@ -3159,7 +3835,7 @@
           <w:color w:val="212121"/>
           <w:sz w:val="24"/>
         </w:rPr>
-        <w:t xml:space="preserve"> se presenta una estimación del presupuesto como si se tratase de un encargo profesional para el Club Atletismo Ianuarius. Adicionalmente, se han calculado los costes </w:t>
+        <w:t xml:space="preserve"> se presenta una estimación del presupuesto como si se tratase de un encargo profesional para el Club Atletismo Ianuarius. Adicionalmente, se han calculado </w:t>
       </w:r>
       <w:r>
         <w:rPr>
@@ -3167,7 +3843,8 @@
           <w:color w:val="212121"/>
           <w:sz w:val="24"/>
         </w:rPr>
-        <w:t>periódicos</w:t>
+        <w:lastRenderedPageBreak/>
+        <w:t xml:space="preserve">los costes </w:t>
       </w:r>
       <w:r>
         <w:rPr>
@@ -3175,24 +3852,29 @@
           <w:color w:val="212121"/>
           <w:sz w:val="24"/>
         </w:rPr>
+        <w:t>periódicos</w:t>
+      </w:r>
+      <w:r>
+        <w:rPr>
+          <w:rFonts w:ascii="Segoe UI" w:eastAsia="Segoe UI" w:hAnsi="Segoe UI" w:cs="Segoe UI"/>
+          <w:color w:val="212121"/>
+          <w:sz w:val="24"/>
+        </w:rPr>
         <w:t xml:space="preserve"> necesarios para mantener el sistema en producción una vez finalizado el proyecto.</w:t>
       </w:r>
     </w:p>
     <w:p>
       <w:pPr>
         <w:pStyle w:val="Heading5"/>
-        <w:shd w:val="clear" w:color="auto" w:fill="FFFFFF" w:themeFill="background1"/>
         <w:spacing w:before="324" w:after="0"/>
         <w:ind w:left="1412"/>
         <w:rPr>
-          <w:rFonts w:ascii="Segoe UI" w:eastAsia="Segoe UI" w:hAnsi="Segoe UI" w:cs="Segoe UI"/>
           <w:color w:val="303741"/>
           <w:sz w:val="24"/>
         </w:rPr>
       </w:pPr>
       <w:r>
         <w:rPr>
-          <w:rFonts w:ascii="Segoe UI" w:eastAsia="Segoe UI" w:hAnsi="Segoe UI" w:cs="Segoe UI"/>
           <w:color w:val="303741"/>
           <w:sz w:val="24"/>
         </w:rPr>
@@ -3775,32 +4457,19 @@
     <w:p>
       <w:pPr>
         <w:pStyle w:val="Heading5"/>
-        <w:shd w:val="clear" w:color="auto" w:fill="FFFFFF" w:themeFill="background1"/>
         <w:spacing w:before="324" w:after="0"/>
         <w:ind w:left="1412"/>
         <w:rPr>
-          <w:rFonts w:ascii="Segoe UI" w:eastAsia="Segoe UI" w:hAnsi="Segoe UI" w:cs="Segoe UI"/>
           <w:color w:val="303741"/>
           <w:sz w:val="24"/>
         </w:rPr>
       </w:pPr>
       <w:r>
         <w:rPr>
-          <w:rFonts w:ascii="Segoe UI" w:eastAsia="Segoe UI" w:hAnsi="Segoe UI" w:cs="Segoe UI"/>
           <w:color w:val="303741"/>
           <w:sz w:val="24"/>
         </w:rPr>
-        <w:t>1.5.2.2. Costes de Personal</w:t>
-      </w:r>
-      <w:r>
-        <w:rPr>
-          <w:rFonts w:ascii="Segoe UI" w:eastAsia="Segoe UI" w:hAnsi="Segoe UI" w:cs="Segoe UI"/>
-          <w:b w:val="0"/>
-          <w:bCs w:val="0"/>
-          <w:color w:val="303741"/>
-          <w:sz w:val="24"/>
-        </w:rPr>
-        <w:t xml:space="preserve"> (Desarrollo)</w:t>
+        <w:t>1.5.2.2. Costes de Personal (Desarrollo)</w:t>
       </w:r>
     </w:p>
     <w:tbl>
@@ -4353,18 +5022,15 @@
     <w:p>
       <w:pPr>
         <w:pStyle w:val="Heading5"/>
-        <w:shd w:val="clear" w:color="auto" w:fill="FFFFFF" w:themeFill="background1"/>
         <w:spacing w:before="324" w:after="0"/>
         <w:ind w:left="1412"/>
         <w:rPr>
-          <w:rFonts w:ascii="Segoe UI" w:eastAsia="Segoe UI" w:hAnsi="Segoe UI" w:cs="Segoe UI"/>
           <w:color w:val="303741"/>
           <w:sz w:val="24"/>
         </w:rPr>
       </w:pPr>
       <w:r>
         <w:rPr>
-          <w:rFonts w:ascii="Segoe UI" w:eastAsia="Segoe UI" w:hAnsi="Segoe UI" w:cs="Segoe UI"/>
           <w:color w:val="303741"/>
           <w:sz w:val="24"/>
         </w:rPr>
@@ -4372,39 +5038,22 @@
       </w:r>
       <w:r>
         <w:rPr>
-          <w:rFonts w:ascii="Segoe UI" w:eastAsia="Segoe UI" w:hAnsi="Segoe UI" w:cs="Segoe UI"/>
           <w:color w:val="303741"/>
           <w:sz w:val="24"/>
         </w:rPr>
-        <w:t xml:space="preserve">.5.2.3. Costes de Mantenimiento Anual </w:t>
-      </w:r>
-      <w:r>
-        <w:rPr>
-          <w:rFonts w:ascii="Segoe UI" w:eastAsia="Segoe UI" w:hAnsi="Segoe UI" w:cs="Segoe UI"/>
-          <w:b w:val="0"/>
-          <w:bCs w:val="0"/>
+        <w:t>.5.2.3. Costes de Mantenimiento Anual (</w:t>
+      </w:r>
+      <w:proofErr w:type="gramStart"/>
+      <w:r>
+        <w:rPr>
           <w:color w:val="303741"/>
           <w:sz w:val="24"/>
         </w:rPr>
-        <w:t>(</w:t>
-      </w:r>
-      <w:proofErr w:type="gramStart"/>
-      <w:r>
-        <w:rPr>
-          <w:rFonts w:ascii="Segoe UI" w:eastAsia="Segoe UI" w:hAnsi="Segoe UI" w:cs="Segoe UI"/>
-          <w:b w:val="0"/>
-          <w:bCs w:val="0"/>
-          <w:color w:val="303741"/>
-          <w:sz w:val="24"/>
-        </w:rPr>
         <w:t>Post-Desarrollo</w:t>
       </w:r>
       <w:proofErr w:type="gramEnd"/>
       <w:r>
         <w:rPr>
-          <w:rFonts w:ascii="Segoe UI" w:eastAsia="Segoe UI" w:hAnsi="Segoe UI" w:cs="Segoe UI"/>
-          <w:b w:val="0"/>
-          <w:bCs w:val="0"/>
           <w:color w:val="303741"/>
           <w:sz w:val="24"/>
         </w:rPr>
@@ -4939,7 +5588,6 @@
           <w:i w:val="0"/>
           <w:iCs w:val="0"/>
           <w:color w:val="1F2937"/>
-          <w:sz w:val="48"/>
           <w:szCs w:val="48"/>
         </w:rPr>
         <w:lastRenderedPageBreak/>
@@ -4952,16 +5600,11 @@
         <w:pBdr>
           <w:bottom w:val="single" w:sz="7" w:space="0" w:color="D1D5DB"/>
         </w:pBdr>
-        <w:shd w:val="clear" w:color="auto" w:fill="FFFFFF" w:themeFill="background1"/>
         <w:spacing w:before="360" w:after="120"/>
         <w:ind w:left="360"/>
       </w:pPr>
       <w:r>
         <w:rPr>
-          <w:rFonts w:ascii="Segoe UI" w:eastAsia="Segoe UI" w:hAnsi="Segoe UI" w:cs="Segoe UI"/>
-          <w:b/>
-          <w:bCs/>
-          <w:color w:val="1F2937"/>
           <w:szCs w:val="24"/>
         </w:rPr>
         <w:t>2.1. Objetivos del Proyecto</w:t>
@@ -5288,7 +5931,6 @@
     <w:p>
       <w:pPr>
         <w:pStyle w:val="Heading4"/>
-        <w:keepNext w:val="0"/>
         <w:widowControl w:val="0"/>
         <w:shd w:val="clear" w:color="auto" w:fill="FFFFFF" w:themeFill="background1"/>
         <w:spacing w:before="360" w:after="120"/>
@@ -5307,7 +5949,6 @@
     <w:p>
       <w:pPr>
         <w:pStyle w:val="Heading4"/>
-        <w:keepNext w:val="0"/>
         <w:widowControl w:val="0"/>
         <w:shd w:val="clear" w:color="auto" w:fill="FFFFFF" w:themeFill="background1"/>
         <w:spacing w:before="360" w:after="120"/>
@@ -5326,7 +5967,6 @@
     <w:p>
       <w:pPr>
         <w:pStyle w:val="Heading4"/>
-        <w:keepNext w:val="0"/>
         <w:widowControl w:val="0"/>
         <w:shd w:val="clear" w:color="auto" w:fill="FFFFFF" w:themeFill="background1"/>
         <w:spacing w:before="360" w:after="120"/>
@@ -5345,7 +5985,6 @@
     <w:p>
       <w:pPr>
         <w:pStyle w:val="Heading4"/>
-        <w:keepNext w:val="0"/>
         <w:widowControl w:val="0"/>
         <w:shd w:val="clear" w:color="auto" w:fill="FFFFFF" w:themeFill="background1"/>
         <w:spacing w:before="360" w:after="120"/>
@@ -6438,19 +7077,49 @@
     </w:tbl>
     <w:p>
       <w:pPr>
-        <w:pStyle w:val="Heading3"/>
-        <w:pBdr>
-          <w:bottom w:val="single" w:sz="7" w:space="0" w:color="D1D5DB"/>
-        </w:pBdr>
-        <w:shd w:val="clear" w:color="auto" w:fill="FFFFFF" w:themeFill="background1"/>
-        <w:spacing w:before="360" w:after="120"/>
-        <w:ind w:left="360"/>
-        <w:rPr>
-          <w:rFonts w:ascii="Segoe UI" w:eastAsia="Segoe UI" w:hAnsi="Segoe UI" w:cs="Segoe UI"/>
-          <w:b/>
-          <w:bCs/>
-          <w:color w:val="1F2937"/>
-          <w:szCs w:val="24"/>
+        <w:pStyle w:val="SubHeading3"/>
+        <w:rPr>
+          <w:rFonts w:eastAsia="Segoe UI"/>
+        </w:rPr>
+      </w:pPr>
+    </w:p>
+    <w:p>
+      <w:pPr>
+        <w:pStyle w:val="SubHeading3"/>
+        <w:rPr>
+          <w:rFonts w:eastAsia="Segoe UI"/>
+        </w:rPr>
+      </w:pPr>
+    </w:p>
+    <w:p>
+      <w:pPr>
+        <w:pStyle w:val="SubHeading3"/>
+        <w:rPr>
+          <w:rFonts w:eastAsia="Segoe UI"/>
+        </w:rPr>
+      </w:pPr>
+    </w:p>
+    <w:p>
+      <w:pPr>
+        <w:pStyle w:val="SubHeading3"/>
+        <w:rPr>
+          <w:rFonts w:eastAsia="Segoe UI"/>
+        </w:rPr>
+      </w:pPr>
+    </w:p>
+    <w:p>
+      <w:pPr>
+        <w:pStyle w:val="SubHeading3"/>
+        <w:rPr>
+          <w:rFonts w:eastAsia="Segoe UI"/>
+        </w:rPr>
+      </w:pPr>
+    </w:p>
+    <w:p>
+      <w:pPr>
+        <w:pStyle w:val="SubHeading3"/>
+        <w:rPr>
+          <w:rFonts w:eastAsia="Segoe UI"/>
         </w:rPr>
       </w:pPr>
     </w:p>
@@ -6462,116 +7131,11 @@
         <w:pBdr>
           <w:bottom w:val="single" w:sz="7" w:space="0" w:color="D1D5DB"/>
         </w:pBdr>
-        <w:shd w:val="clear" w:color="auto" w:fill="FFFFFF" w:themeFill="background1"/>
         <w:spacing w:before="360" w:after="120"/>
         <w:ind w:left="360"/>
-        <w:rPr>
-          <w:rFonts w:ascii="Segoe UI" w:eastAsia="Segoe UI" w:hAnsi="Segoe UI" w:cs="Segoe UI"/>
-          <w:b/>
-          <w:bCs/>
-          <w:color w:val="1F2937"/>
-          <w:szCs w:val="24"/>
-        </w:rPr>
-      </w:pPr>
-    </w:p>
-    <w:p>
-      <w:pPr>
-        <w:pStyle w:val="Heading3"/>
-        <w:keepNext w:val="0"/>
-        <w:widowControl w:val="0"/>
-        <w:pBdr>
-          <w:bottom w:val="single" w:sz="7" w:space="0" w:color="D1D5DB"/>
-        </w:pBdr>
-        <w:shd w:val="clear" w:color="auto" w:fill="FFFFFF" w:themeFill="background1"/>
-        <w:spacing w:before="360" w:after="120"/>
-        <w:ind w:left="360"/>
-        <w:rPr>
-          <w:rFonts w:ascii="Segoe UI" w:eastAsia="Segoe UI" w:hAnsi="Segoe UI" w:cs="Segoe UI"/>
-          <w:b/>
-          <w:bCs/>
-          <w:color w:val="1F2937"/>
-          <w:szCs w:val="24"/>
-        </w:rPr>
-      </w:pPr>
-    </w:p>
-    <w:p>
-      <w:pPr>
-        <w:pStyle w:val="Heading3"/>
-        <w:keepNext w:val="0"/>
-        <w:widowControl w:val="0"/>
-        <w:pBdr>
-          <w:bottom w:val="single" w:sz="7" w:space="0" w:color="D1D5DB"/>
-        </w:pBdr>
-        <w:shd w:val="clear" w:color="auto" w:fill="FFFFFF" w:themeFill="background1"/>
-        <w:spacing w:before="360" w:after="120"/>
-        <w:ind w:left="360"/>
-        <w:rPr>
-          <w:rFonts w:ascii="Segoe UI" w:eastAsia="Segoe UI" w:hAnsi="Segoe UI" w:cs="Segoe UI"/>
-          <w:b/>
-          <w:bCs/>
-          <w:color w:val="1F2937"/>
-          <w:szCs w:val="24"/>
-        </w:rPr>
-      </w:pPr>
-    </w:p>
-    <w:p>
-      <w:pPr>
-        <w:pStyle w:val="Heading3"/>
-        <w:keepNext w:val="0"/>
-        <w:widowControl w:val="0"/>
-        <w:pBdr>
-          <w:bottom w:val="single" w:sz="7" w:space="0" w:color="D1D5DB"/>
-        </w:pBdr>
-        <w:shd w:val="clear" w:color="auto" w:fill="FFFFFF" w:themeFill="background1"/>
-        <w:spacing w:before="360" w:after="120"/>
-        <w:ind w:left="360"/>
-        <w:rPr>
-          <w:rFonts w:ascii="Segoe UI" w:eastAsia="Segoe UI" w:hAnsi="Segoe UI" w:cs="Segoe UI"/>
-          <w:b/>
-          <w:bCs/>
-          <w:color w:val="1F2937"/>
-          <w:szCs w:val="24"/>
-        </w:rPr>
-      </w:pPr>
-    </w:p>
-    <w:p>
-      <w:pPr>
-        <w:pStyle w:val="Heading3"/>
-        <w:keepNext w:val="0"/>
-        <w:widowControl w:val="0"/>
-        <w:pBdr>
-          <w:bottom w:val="single" w:sz="7" w:space="0" w:color="D1D5DB"/>
-        </w:pBdr>
-        <w:shd w:val="clear" w:color="auto" w:fill="FFFFFF" w:themeFill="background1"/>
-        <w:spacing w:before="360" w:after="120"/>
-        <w:ind w:left="360"/>
-        <w:rPr>
-          <w:rFonts w:ascii="Segoe UI" w:eastAsia="Segoe UI" w:hAnsi="Segoe UI" w:cs="Segoe UI"/>
-          <w:b/>
-          <w:bCs/>
-          <w:color w:val="1F2937"/>
-          <w:szCs w:val="24"/>
-        </w:rPr>
-      </w:pPr>
-    </w:p>
-    <w:p>
-      <w:pPr>
-        <w:pStyle w:val="Heading3"/>
-        <w:keepNext w:val="0"/>
-        <w:widowControl w:val="0"/>
-        <w:pBdr>
-          <w:bottom w:val="single" w:sz="7" w:space="0" w:color="D1D5DB"/>
-        </w:pBdr>
-        <w:shd w:val="clear" w:color="auto" w:fill="FFFFFF" w:themeFill="background1"/>
-        <w:spacing w:before="360" w:after="120"/>
-        <w:ind w:left="360"/>
-      </w:pPr>
-      <w:r>
-        <w:rPr>
-          <w:rFonts w:ascii="Segoe UI" w:eastAsia="Segoe UI" w:hAnsi="Segoe UI" w:cs="Segoe UI"/>
-          <w:b/>
-          <w:bCs/>
-          <w:color w:val="1F2937"/>
+      </w:pPr>
+      <w:r>
+        <w:rPr>
           <w:szCs w:val="24"/>
         </w:rPr>
         <w:lastRenderedPageBreak/>
@@ -7145,16 +7709,11 @@
         <w:pBdr>
           <w:bottom w:val="single" w:sz="7" w:space="0" w:color="D1D5DB"/>
         </w:pBdr>
-        <w:shd w:val="clear" w:color="auto" w:fill="FFFFFF" w:themeFill="background1"/>
         <w:spacing w:before="360" w:after="120"/>
         <w:ind w:left="360"/>
       </w:pPr>
       <w:r>
         <w:rPr>
-          <w:rFonts w:ascii="Segoe UI" w:eastAsia="Segoe UI" w:hAnsi="Segoe UI" w:cs="Segoe UI"/>
-          <w:b/>
-          <w:bCs/>
-          <w:color w:val="1F2937"/>
           <w:szCs w:val="24"/>
         </w:rPr>
         <w:t>2.3. Especificación Funcional</w:t>
@@ -7207,7 +7766,7 @@
                     <pic:cNvPicPr/>
                   </pic:nvPicPr>
                   <pic:blipFill>
-                    <a:blip r:embed="rId62">
+                    <a:blip r:embed="rId77">
                       <a:extLst>
                         <a:ext uri="{28A0092B-C50C-407E-A947-70E740481C1C}">
                           <a14:useLocalDpi xmlns:a14="http://schemas.microsoft.com/office/drawing/2010/main" val="0"/>
@@ -7247,7 +7806,6 @@
     <w:p>
       <w:pPr>
         <w:pStyle w:val="Heading4"/>
-        <w:keepNext w:val="0"/>
         <w:widowControl w:val="0"/>
         <w:shd w:val="clear" w:color="auto" w:fill="FFFFFF" w:themeFill="background1"/>
         <w:spacing w:before="360" w:after="120"/>
@@ -7266,7 +7824,6 @@
     <w:p>
       <w:pPr>
         <w:pStyle w:val="Heading4"/>
-        <w:keepNext w:val="0"/>
         <w:widowControl w:val="0"/>
         <w:shd w:val="clear" w:color="auto" w:fill="FFFFFF" w:themeFill="background1"/>
         <w:spacing w:before="360" w:after="120"/>
@@ -7285,7 +7842,6 @@
     <w:p>
       <w:pPr>
         <w:pStyle w:val="Heading4"/>
-        <w:keepNext w:val="0"/>
         <w:widowControl w:val="0"/>
         <w:shd w:val="clear" w:color="auto" w:fill="FFFFFF" w:themeFill="background1"/>
         <w:spacing w:before="360" w:after="120"/>
@@ -7304,7 +7860,6 @@
     <w:p>
       <w:pPr>
         <w:pStyle w:val="Heading4"/>
-        <w:keepNext w:val="0"/>
         <w:widowControl w:val="0"/>
         <w:shd w:val="clear" w:color="auto" w:fill="FFFFFF" w:themeFill="background1"/>
         <w:spacing w:before="360" w:after="120"/>
@@ -7323,7 +7878,6 @@
     <w:p>
       <w:pPr>
         <w:pStyle w:val="Heading4"/>
-        <w:keepNext w:val="0"/>
         <w:widowControl w:val="0"/>
         <w:shd w:val="clear" w:color="auto" w:fill="FFFFFF" w:themeFill="background1"/>
         <w:spacing w:before="360" w:after="120"/>
@@ -7342,7 +7896,6 @@
     <w:p>
       <w:pPr>
         <w:pStyle w:val="Heading4"/>
-        <w:keepNext w:val="0"/>
         <w:widowControl w:val="0"/>
         <w:shd w:val="clear" w:color="auto" w:fill="FFFFFF" w:themeFill="background1"/>
         <w:spacing w:before="360" w:after="120"/>
@@ -7361,7 +7914,6 @@
     <w:p>
       <w:pPr>
         <w:pStyle w:val="Heading4"/>
-        <w:keepNext w:val="0"/>
         <w:widowControl w:val="0"/>
         <w:shd w:val="clear" w:color="auto" w:fill="FFFFFF" w:themeFill="background1"/>
         <w:spacing w:before="360" w:after="120"/>
@@ -7380,7 +7932,6 @@
     <w:p>
       <w:pPr>
         <w:pStyle w:val="Heading4"/>
-        <w:keepNext w:val="0"/>
         <w:widowControl w:val="0"/>
         <w:shd w:val="clear" w:color="auto" w:fill="FFFFFF" w:themeFill="background1"/>
         <w:spacing w:before="360" w:after="120"/>
@@ -7399,7 +7950,6 @@
     <w:p>
       <w:pPr>
         <w:pStyle w:val="Heading4"/>
-        <w:keepNext w:val="0"/>
         <w:widowControl w:val="0"/>
         <w:shd w:val="clear" w:color="auto" w:fill="FFFFFF" w:themeFill="background1"/>
         <w:spacing w:before="360" w:after="120"/>
@@ -7418,7 +7968,6 @@
     <w:p>
       <w:pPr>
         <w:pStyle w:val="Heading4"/>
-        <w:keepNext w:val="0"/>
         <w:widowControl w:val="0"/>
         <w:shd w:val="clear" w:color="auto" w:fill="FFFFFF" w:themeFill="background1"/>
         <w:spacing w:before="360" w:after="120"/>
@@ -7434,7 +7983,6 @@
           <w:color w:val="000000" w:themeColor="text1"/>
           <w:sz w:val="24"/>
         </w:rPr>
-        <w:lastRenderedPageBreak/>
         <w:t>2.3.2. Especificación de Casos de Uso</w:t>
       </w:r>
     </w:p>
@@ -8283,73 +8831,57 @@
     </w:tbl>
     <w:p>
       <w:pPr>
-        <w:pStyle w:val="Heading3"/>
-        <w:pBdr>
-          <w:bottom w:val="single" w:sz="7" w:space="0" w:color="D1D5DB"/>
-        </w:pBdr>
-        <w:shd w:val="clear" w:color="auto" w:fill="FFFFFF" w:themeFill="background1"/>
-        <w:spacing w:before="360" w:after="120"/>
-        <w:ind w:left="360"/>
-        <w:rPr>
-          <w:rFonts w:ascii="Segoe UI" w:eastAsia="Segoe UI" w:hAnsi="Segoe UI" w:cs="Segoe UI"/>
-          <w:b/>
-          <w:bCs/>
-          <w:color w:val="1F2937"/>
-          <w:szCs w:val="24"/>
-        </w:rPr>
-      </w:pPr>
-    </w:p>
-    <w:p>
-      <w:pPr>
-        <w:pStyle w:val="Heading3"/>
-        <w:pBdr>
-          <w:bottom w:val="single" w:sz="7" w:space="0" w:color="D1D5DB"/>
-        </w:pBdr>
-        <w:shd w:val="clear" w:color="auto" w:fill="FFFFFF" w:themeFill="background1"/>
-        <w:spacing w:before="360" w:after="120"/>
-        <w:ind w:left="360"/>
-        <w:rPr>
-          <w:rFonts w:ascii="Segoe UI" w:eastAsia="Segoe UI" w:hAnsi="Segoe UI" w:cs="Segoe UI"/>
-          <w:b/>
-          <w:bCs/>
-          <w:color w:val="1F2937"/>
-          <w:szCs w:val="24"/>
-        </w:rPr>
-      </w:pPr>
-    </w:p>
-    <w:p>
-      <w:pPr>
-        <w:pStyle w:val="Heading3"/>
-        <w:pBdr>
-          <w:bottom w:val="single" w:sz="7" w:space="0" w:color="D1D5DB"/>
-        </w:pBdr>
-        <w:shd w:val="clear" w:color="auto" w:fill="FFFFFF" w:themeFill="background1"/>
-        <w:spacing w:before="360" w:after="120"/>
-        <w:ind w:left="360"/>
-        <w:rPr>
-          <w:rFonts w:ascii="Segoe UI" w:eastAsia="Segoe UI" w:hAnsi="Segoe UI" w:cs="Segoe UI"/>
-          <w:b/>
-          <w:bCs/>
-          <w:color w:val="1F2937"/>
-          <w:szCs w:val="24"/>
-        </w:rPr>
-      </w:pPr>
-    </w:p>
-    <w:p>
-      <w:pPr>
-        <w:pStyle w:val="Heading3"/>
-        <w:pBdr>
-          <w:bottom w:val="single" w:sz="7" w:space="0" w:color="D1D5DB"/>
-        </w:pBdr>
-        <w:shd w:val="clear" w:color="auto" w:fill="FFFFFF" w:themeFill="background1"/>
-        <w:spacing w:before="360" w:after="120"/>
-        <w:ind w:left="360"/>
-        <w:rPr>
-          <w:rFonts w:ascii="Segoe UI" w:eastAsia="Segoe UI" w:hAnsi="Segoe UI" w:cs="Segoe UI"/>
-          <w:b/>
-          <w:bCs/>
-          <w:color w:val="1F2937"/>
-          <w:szCs w:val="24"/>
+        <w:pStyle w:val="SubHeading3"/>
+        <w:rPr>
+          <w:rFonts w:eastAsia="Segoe UI"/>
+        </w:rPr>
+      </w:pPr>
+    </w:p>
+    <w:p>
+      <w:pPr>
+        <w:pStyle w:val="SubHeading3"/>
+        <w:rPr>
+          <w:rFonts w:eastAsia="Segoe UI"/>
+        </w:rPr>
+      </w:pPr>
+    </w:p>
+    <w:p>
+      <w:pPr>
+        <w:pStyle w:val="SubHeading3"/>
+        <w:rPr>
+          <w:rFonts w:eastAsia="Segoe UI"/>
+        </w:rPr>
+      </w:pPr>
+    </w:p>
+    <w:p>
+      <w:pPr>
+        <w:pStyle w:val="SubHeading3"/>
+        <w:rPr>
+          <w:rFonts w:eastAsia="Segoe UI"/>
+        </w:rPr>
+      </w:pPr>
+    </w:p>
+    <w:p>
+      <w:pPr>
+        <w:pStyle w:val="SubHeading3"/>
+        <w:rPr>
+          <w:rFonts w:eastAsia="Segoe UI"/>
+        </w:rPr>
+      </w:pPr>
+    </w:p>
+    <w:p>
+      <w:pPr>
+        <w:pStyle w:val="SubHeading3"/>
+        <w:rPr>
+          <w:rFonts w:eastAsia="Segoe UI"/>
+        </w:rPr>
+      </w:pPr>
+    </w:p>
+    <w:p>
+      <w:pPr>
+        <w:pStyle w:val="SubHeading3"/>
+        <w:rPr>
+          <w:rFonts w:eastAsia="Segoe UI"/>
         </w:rPr>
       </w:pPr>
     </w:p>
@@ -8361,79 +8893,13 @@
         <w:pBdr>
           <w:bottom w:val="single" w:sz="7" w:space="0" w:color="D1D5DB"/>
         </w:pBdr>
-        <w:shd w:val="clear" w:color="auto" w:fill="FFFFFF" w:themeFill="background1"/>
         <w:spacing w:before="360" w:after="120"/>
         <w:ind w:left="360"/>
-        <w:rPr>
-          <w:rFonts w:ascii="Segoe UI" w:eastAsia="Segoe UI" w:hAnsi="Segoe UI" w:cs="Segoe UI"/>
-          <w:b/>
-          <w:bCs/>
-          <w:color w:val="1F2937"/>
+      </w:pPr>
+      <w:r>
+        <w:rPr>
           <w:szCs w:val="24"/>
         </w:rPr>
-      </w:pPr>
-    </w:p>
-    <w:p>
-      <w:pPr>
-        <w:pStyle w:val="Heading3"/>
-        <w:keepNext w:val="0"/>
-        <w:widowControl w:val="0"/>
-        <w:pBdr>
-          <w:bottom w:val="single" w:sz="7" w:space="0" w:color="D1D5DB"/>
-        </w:pBdr>
-        <w:shd w:val="clear" w:color="auto" w:fill="FFFFFF" w:themeFill="background1"/>
-        <w:spacing w:before="360" w:after="120"/>
-        <w:ind w:left="360"/>
-        <w:rPr>
-          <w:rFonts w:ascii="Segoe UI" w:eastAsia="Segoe UI" w:hAnsi="Segoe UI" w:cs="Segoe UI"/>
-          <w:b/>
-          <w:bCs/>
-          <w:color w:val="1F2937"/>
-          <w:szCs w:val="24"/>
-        </w:rPr>
-      </w:pPr>
-    </w:p>
-    <w:p>
-      <w:pPr>
-        <w:pStyle w:val="Heading3"/>
-        <w:keepNext w:val="0"/>
-        <w:widowControl w:val="0"/>
-        <w:pBdr>
-          <w:bottom w:val="single" w:sz="7" w:space="0" w:color="D1D5DB"/>
-        </w:pBdr>
-        <w:shd w:val="clear" w:color="auto" w:fill="FFFFFF" w:themeFill="background1"/>
-        <w:spacing w:before="360" w:after="120"/>
-        <w:ind w:left="360"/>
-        <w:rPr>
-          <w:rFonts w:ascii="Segoe UI" w:eastAsia="Segoe UI" w:hAnsi="Segoe UI" w:cs="Segoe UI"/>
-          <w:b/>
-          <w:bCs/>
-          <w:color w:val="1F2937"/>
-          <w:szCs w:val="24"/>
-        </w:rPr>
-      </w:pPr>
-    </w:p>
-    <w:p>
-      <w:pPr>
-        <w:pStyle w:val="Heading3"/>
-        <w:keepNext w:val="0"/>
-        <w:widowControl w:val="0"/>
-        <w:pBdr>
-          <w:bottom w:val="single" w:sz="7" w:space="0" w:color="D1D5DB"/>
-        </w:pBdr>
-        <w:shd w:val="clear" w:color="auto" w:fill="FFFFFF" w:themeFill="background1"/>
-        <w:spacing w:before="360" w:after="120"/>
-        <w:ind w:left="360"/>
-      </w:pPr>
-      <w:r>
-        <w:rPr>
-          <w:rFonts w:ascii="Segoe UI" w:eastAsia="Segoe UI" w:hAnsi="Segoe UI" w:cs="Segoe UI"/>
-          <w:b/>
-          <w:bCs/>
-          <w:color w:val="1F2937"/>
-          <w:szCs w:val="24"/>
-        </w:rPr>
-        <w:lastRenderedPageBreak/>
         <w:t>2.4. Requisitos del Sistema (SRS)</w:t>
       </w:r>
     </w:p>
@@ -9984,7 +10450,6 @@
     <w:p>
       <w:pPr>
         <w:pStyle w:val="Heading4"/>
-        <w:keepNext w:val="0"/>
         <w:widowControl w:val="0"/>
         <w:shd w:val="clear" w:color="auto" w:fill="FFFFFF" w:themeFill="background1"/>
         <w:spacing w:before="360" w:after="120"/>
@@ -10003,7 +10468,6 @@
     <w:p>
       <w:pPr>
         <w:pStyle w:val="Heading4"/>
-        <w:keepNext w:val="0"/>
         <w:widowControl w:val="0"/>
         <w:shd w:val="clear" w:color="auto" w:fill="FFFFFF" w:themeFill="background1"/>
         <w:spacing w:before="360" w:after="120"/>
@@ -10022,7 +10486,6 @@
     <w:p>
       <w:pPr>
         <w:pStyle w:val="Heading4"/>
-        <w:keepNext w:val="0"/>
         <w:widowControl w:val="0"/>
         <w:shd w:val="clear" w:color="auto" w:fill="FFFFFF" w:themeFill="background1"/>
         <w:spacing w:before="360" w:after="120"/>
@@ -10041,7 +10504,6 @@
     <w:p>
       <w:pPr>
         <w:pStyle w:val="Heading4"/>
-        <w:keepNext w:val="0"/>
         <w:widowControl w:val="0"/>
         <w:shd w:val="clear" w:color="auto" w:fill="FFFFFF" w:themeFill="background1"/>
         <w:spacing w:before="360" w:after="120"/>
@@ -10057,7 +10519,6 @@
           <w:color w:val="000000" w:themeColor="text1"/>
           <w:sz w:val="24"/>
         </w:rPr>
-        <w:lastRenderedPageBreak/>
         <w:t>2.4.3. Requisitos de Información (IRQ)</w:t>
       </w:r>
     </w:p>
@@ -10281,16 +10742,11 @@
         <w:pBdr>
           <w:bottom w:val="single" w:sz="7" w:space="0" w:color="D1D5DB"/>
         </w:pBdr>
-        <w:shd w:val="clear" w:color="auto" w:fill="FFFFFF" w:themeFill="background1"/>
         <w:spacing w:before="360" w:after="120"/>
         <w:ind w:left="360"/>
       </w:pPr>
       <w:r>
         <w:rPr>
-          <w:rFonts w:ascii="Segoe UI" w:eastAsia="Segoe UI" w:hAnsi="Segoe UI" w:cs="Segoe UI"/>
-          <w:b/>
-          <w:bCs/>
-          <w:color w:val="1F2937"/>
           <w:szCs w:val="24"/>
         </w:rPr>
         <w:t>2.5. Normativa y Legislación</w:t>
@@ -10470,7 +10926,6 @@
           <w:i w:val="0"/>
           <w:iCs w:val="0"/>
           <w:color w:val="1F2937"/>
-          <w:sz w:val="48"/>
           <w:szCs w:val="48"/>
         </w:rPr>
       </w:pPr>
@@ -10491,7 +10946,6 @@
           <w:i w:val="0"/>
           <w:iCs w:val="0"/>
           <w:color w:val="1F2937"/>
-          <w:sz w:val="48"/>
           <w:szCs w:val="48"/>
         </w:rPr>
       </w:pPr>
@@ -10512,7 +10966,6 @@
           <w:i w:val="0"/>
           <w:iCs w:val="0"/>
           <w:color w:val="1F2937"/>
-          <w:sz w:val="48"/>
           <w:szCs w:val="48"/>
         </w:rPr>
       </w:pPr>
@@ -10533,7 +10986,6 @@
           <w:i w:val="0"/>
           <w:iCs w:val="0"/>
           <w:color w:val="1F2937"/>
-          <w:sz w:val="48"/>
           <w:szCs w:val="48"/>
         </w:rPr>
       </w:pPr>
@@ -10556,10 +11008,8 @@
           <w:i w:val="0"/>
           <w:iCs w:val="0"/>
           <w:color w:val="1F2937"/>
-          <w:sz w:val="48"/>
           <w:szCs w:val="48"/>
         </w:rPr>
-        <w:lastRenderedPageBreak/>
         <w:t>3. Diseño Tecnológico y Arquitectura</w:t>
       </w:r>
     </w:p>
@@ -10569,16 +11019,11 @@
         <w:pBdr>
           <w:bottom w:val="single" w:sz="7" w:space="0" w:color="D1D5DB"/>
         </w:pBdr>
-        <w:shd w:val="clear" w:color="auto" w:fill="FFFFFF" w:themeFill="background1"/>
         <w:spacing w:before="360" w:after="120"/>
         <w:ind w:left="360"/>
       </w:pPr>
       <w:r>
         <w:rPr>
-          <w:rFonts w:ascii="Segoe UI" w:eastAsia="Segoe UI" w:hAnsi="Segoe UI" w:cs="Segoe UI"/>
-          <w:b/>
-          <w:bCs/>
-          <w:color w:val="1F2937"/>
           <w:szCs w:val="24"/>
         </w:rPr>
         <w:t>3.1. Stack Tecnológico</w:t>
@@ -10676,7 +11121,7 @@
                           <pic:cNvPicPr/>
                         </pic:nvPicPr>
                         <pic:blipFill>
-                          <a:blip r:embed="rId63">
+                          <a:blip r:embed="rId78">
                             <a:extLst>
                               <a:ext uri="{28A0092B-C50C-407E-A947-70E740481C1C}">
                                 <a14:useLocalDpi xmlns:a14="http://schemas.microsoft.com/office/drawing/2010/main"/>
@@ -10841,7 +11286,7 @@
                           <pic:cNvPicPr/>
                         </pic:nvPicPr>
                         <pic:blipFill>
-                          <a:blip r:embed="rId64">
+                          <a:blip r:embed="rId79">
                             <a:extLst>
                               <a:ext uri="{28A0092B-C50C-407E-A947-70E740481C1C}">
                                 <a14:useLocalDpi xmlns:a14="http://schemas.microsoft.com/office/drawing/2010/main"/>
@@ -11006,7 +11451,7 @@
                           <pic:cNvPicPr/>
                         </pic:nvPicPr>
                         <pic:blipFill>
-                          <a:blip r:embed="rId65">
+                          <a:blip r:embed="rId80">
                             <a:extLst>
                               <a:ext uri="{28A0092B-C50C-407E-A947-70E740481C1C}">
                                 <a14:useLocalDpi xmlns:a14="http://schemas.microsoft.com/office/drawing/2010/main"/>
@@ -11167,16 +11612,11 @@
         <w:pBdr>
           <w:bottom w:val="single" w:sz="7" w:space="0" w:color="D1D5DB"/>
         </w:pBdr>
-        <w:shd w:val="clear" w:color="auto" w:fill="FFFFFF" w:themeFill="background1"/>
         <w:spacing w:before="360" w:after="120"/>
         <w:ind w:left="360"/>
       </w:pPr>
       <w:r>
         <w:rPr>
-          <w:rFonts w:ascii="Segoe UI" w:eastAsia="Segoe UI" w:hAnsi="Segoe UI" w:cs="Segoe UI"/>
-          <w:b/>
-          <w:bCs/>
-          <w:color w:val="1F2937"/>
           <w:szCs w:val="24"/>
         </w:rPr>
         <w:lastRenderedPageBreak/>
@@ -11207,16 +11647,11 @@
         <w:pBdr>
           <w:bottom w:val="single" w:sz="7" w:space="0" w:color="D1D5DB"/>
         </w:pBdr>
-        <w:shd w:val="clear" w:color="auto" w:fill="FFFFFF" w:themeFill="background1"/>
         <w:spacing w:before="360" w:after="120"/>
         <w:ind w:left="360"/>
       </w:pPr>
       <w:r>
         <w:rPr>
-          <w:rFonts w:ascii="Segoe UI" w:eastAsia="Segoe UI" w:hAnsi="Segoe UI" w:cs="Segoe UI"/>
-          <w:b/>
-          <w:bCs/>
-          <w:color w:val="1F2937"/>
           <w:szCs w:val="24"/>
         </w:rPr>
         <w:t>3.3. Diseño de Datos</w:t>
@@ -11246,16 +11681,11 @@
         <w:pBdr>
           <w:bottom w:val="single" w:sz="7" w:space="0" w:color="D1D5DB"/>
         </w:pBdr>
-        <w:shd w:val="clear" w:color="auto" w:fill="FFFFFF" w:themeFill="background1"/>
         <w:spacing w:before="360" w:after="120"/>
         <w:ind w:left="360"/>
       </w:pPr>
       <w:r>
         <w:rPr>
-          <w:rFonts w:ascii="Segoe UI" w:eastAsia="Segoe UI" w:hAnsi="Segoe UI" w:cs="Segoe UI"/>
-          <w:b/>
-          <w:bCs/>
-          <w:color w:val="1F2937"/>
           <w:szCs w:val="24"/>
         </w:rPr>
         <w:t>3.4. Diseño de Interfaz (UI/UX)</w:t>
@@ -11295,7 +11725,6 @@
           <w:i w:val="0"/>
           <w:iCs w:val="0"/>
           <w:color w:val="1F2937"/>
-          <w:sz w:val="48"/>
           <w:szCs w:val="48"/>
         </w:rPr>
         <w:t>4. Planificación y Metodología</w:t>
@@ -11307,16 +11736,11 @@
         <w:pBdr>
           <w:bottom w:val="single" w:sz="7" w:space="0" w:color="D1D5DB"/>
         </w:pBdr>
-        <w:shd w:val="clear" w:color="auto" w:fill="FFFFFF" w:themeFill="background1"/>
         <w:spacing w:before="360" w:after="120"/>
         <w:ind w:left="360"/>
       </w:pPr>
       <w:r>
         <w:rPr>
-          <w:rFonts w:ascii="Segoe UI" w:eastAsia="Segoe UI" w:hAnsi="Segoe UI" w:cs="Segoe UI"/>
-          <w:b/>
-          <w:bCs/>
-          <w:color w:val="1F2937"/>
           <w:szCs w:val="24"/>
         </w:rPr>
         <w:t>4.1. Metodología de Trabajo</w:t>
@@ -11430,142 +11854,65 @@
     </w:p>
     <w:p>
       <w:pPr>
+        <w:pStyle w:val="SubHeading3"/>
+        <w:rPr>
+          <w:rFonts w:eastAsia="Segoe UI"/>
+        </w:rPr>
+      </w:pPr>
+    </w:p>
+    <w:p>
+      <w:pPr>
+        <w:pStyle w:val="SubHeading3"/>
+        <w:rPr>
+          <w:rFonts w:eastAsia="Segoe UI"/>
+        </w:rPr>
+      </w:pPr>
+    </w:p>
+    <w:p>
+      <w:pPr>
+        <w:pStyle w:val="SubHeading3"/>
+        <w:rPr>
+          <w:rFonts w:eastAsia="Segoe UI"/>
+        </w:rPr>
+      </w:pPr>
+    </w:p>
+    <w:p>
+      <w:pPr>
+        <w:pStyle w:val="SubHeading3"/>
+        <w:rPr>
+          <w:rFonts w:eastAsia="Segoe UI"/>
+        </w:rPr>
+      </w:pPr>
+    </w:p>
+    <w:p>
+      <w:pPr>
+        <w:pStyle w:val="SubHeading3"/>
+        <w:rPr>
+          <w:rFonts w:eastAsia="Segoe UI"/>
+        </w:rPr>
+      </w:pPr>
+    </w:p>
+    <w:p>
+      <w:pPr>
+        <w:pStyle w:val="SubHeading3"/>
+        <w:rPr>
+          <w:rFonts w:eastAsia="Segoe UI"/>
+        </w:rPr>
+      </w:pPr>
+    </w:p>
+    <w:p>
+      <w:pPr>
         <w:pStyle w:val="Heading3"/>
         <w:keepNext w:val="0"/>
         <w:widowControl w:val="0"/>
         <w:pBdr>
           <w:bottom w:val="single" w:sz="7" w:space="0" w:color="D1D5DB"/>
         </w:pBdr>
-        <w:shd w:val="clear" w:color="auto" w:fill="FFFFFF" w:themeFill="background1"/>
         <w:spacing w:before="360" w:after="120"/>
         <w:ind w:left="360"/>
-        <w:rPr>
-          <w:rFonts w:ascii="Segoe UI" w:eastAsia="Segoe UI" w:hAnsi="Segoe UI" w:cs="Segoe UI"/>
-          <w:b/>
-          <w:bCs/>
-          <w:color w:val="1F2937"/>
-          <w:szCs w:val="24"/>
-        </w:rPr>
-      </w:pPr>
-    </w:p>
-    <w:p>
-      <w:pPr>
-        <w:pStyle w:val="Heading3"/>
-        <w:keepNext w:val="0"/>
-        <w:widowControl w:val="0"/>
-        <w:pBdr>
-          <w:bottom w:val="single" w:sz="7" w:space="0" w:color="D1D5DB"/>
-        </w:pBdr>
-        <w:shd w:val="clear" w:color="auto" w:fill="FFFFFF" w:themeFill="background1"/>
-        <w:spacing w:before="360" w:after="120"/>
-        <w:ind w:left="360"/>
-        <w:rPr>
-          <w:rFonts w:ascii="Segoe UI" w:eastAsia="Segoe UI" w:hAnsi="Segoe UI" w:cs="Segoe UI"/>
-          <w:b/>
-          <w:bCs/>
-          <w:color w:val="1F2937"/>
-          <w:szCs w:val="24"/>
-        </w:rPr>
-      </w:pPr>
-    </w:p>
-    <w:p>
-      <w:pPr>
-        <w:pStyle w:val="Heading3"/>
-        <w:keepNext w:val="0"/>
-        <w:widowControl w:val="0"/>
-        <w:pBdr>
-          <w:bottom w:val="single" w:sz="7" w:space="0" w:color="D1D5DB"/>
-        </w:pBdr>
-        <w:shd w:val="clear" w:color="auto" w:fill="FFFFFF" w:themeFill="background1"/>
-        <w:spacing w:before="360" w:after="120"/>
-        <w:ind w:left="360"/>
-        <w:rPr>
-          <w:rFonts w:ascii="Segoe UI" w:eastAsia="Segoe UI" w:hAnsi="Segoe UI" w:cs="Segoe UI"/>
-          <w:b/>
-          <w:bCs/>
-          <w:color w:val="1F2937"/>
-          <w:szCs w:val="24"/>
-        </w:rPr>
-      </w:pPr>
-    </w:p>
-    <w:p>
-      <w:pPr>
-        <w:pStyle w:val="Heading3"/>
-        <w:keepNext w:val="0"/>
-        <w:widowControl w:val="0"/>
-        <w:pBdr>
-          <w:bottom w:val="single" w:sz="7" w:space="0" w:color="D1D5DB"/>
-        </w:pBdr>
-        <w:shd w:val="clear" w:color="auto" w:fill="FFFFFF" w:themeFill="background1"/>
-        <w:spacing w:before="360" w:after="120"/>
-        <w:ind w:left="360"/>
-        <w:rPr>
-          <w:rFonts w:ascii="Segoe UI" w:eastAsia="Segoe UI" w:hAnsi="Segoe UI" w:cs="Segoe UI"/>
-          <w:b/>
-          <w:bCs/>
-          <w:color w:val="1F2937"/>
-          <w:szCs w:val="24"/>
-        </w:rPr>
-      </w:pPr>
-    </w:p>
-    <w:p>
-      <w:pPr>
-        <w:pStyle w:val="Heading3"/>
-        <w:keepNext w:val="0"/>
-        <w:widowControl w:val="0"/>
-        <w:pBdr>
-          <w:bottom w:val="single" w:sz="7" w:space="0" w:color="D1D5DB"/>
-        </w:pBdr>
-        <w:shd w:val="clear" w:color="auto" w:fill="FFFFFF" w:themeFill="background1"/>
-        <w:spacing w:before="360" w:after="120"/>
-        <w:ind w:left="360"/>
-        <w:rPr>
-          <w:rFonts w:ascii="Segoe UI" w:eastAsia="Segoe UI" w:hAnsi="Segoe UI" w:cs="Segoe UI"/>
-          <w:b/>
-          <w:bCs/>
-          <w:color w:val="1F2937"/>
-          <w:szCs w:val="24"/>
-        </w:rPr>
-      </w:pPr>
-    </w:p>
-    <w:p>
-      <w:pPr>
-        <w:pStyle w:val="Heading3"/>
-        <w:keepNext w:val="0"/>
-        <w:widowControl w:val="0"/>
-        <w:pBdr>
-          <w:bottom w:val="single" w:sz="7" w:space="0" w:color="D1D5DB"/>
-        </w:pBdr>
-        <w:shd w:val="clear" w:color="auto" w:fill="FFFFFF" w:themeFill="background1"/>
-        <w:spacing w:before="360" w:after="120"/>
-        <w:ind w:left="360"/>
-        <w:rPr>
-          <w:rFonts w:ascii="Segoe UI" w:eastAsia="Segoe UI" w:hAnsi="Segoe UI" w:cs="Segoe UI"/>
-          <w:b/>
-          <w:bCs/>
-          <w:color w:val="1F2937"/>
-          <w:szCs w:val="24"/>
-        </w:rPr>
-      </w:pPr>
-    </w:p>
-    <w:p>
-      <w:pPr>
-        <w:pStyle w:val="Heading3"/>
-        <w:keepNext w:val="0"/>
-        <w:widowControl w:val="0"/>
-        <w:pBdr>
-          <w:bottom w:val="single" w:sz="7" w:space="0" w:color="D1D5DB"/>
-        </w:pBdr>
-        <w:shd w:val="clear" w:color="auto" w:fill="FFFFFF" w:themeFill="background1"/>
-        <w:spacing w:before="360" w:after="120"/>
-        <w:ind w:left="360"/>
-      </w:pPr>
-      <w:r>
-        <w:rPr>
-          <w:rFonts w:ascii="Segoe UI" w:eastAsia="Segoe UI" w:hAnsi="Segoe UI" w:cs="Segoe UI"/>
-          <w:b/>
-          <w:bCs/>
-          <w:color w:val="1F2937"/>
+      </w:pPr>
+      <w:r>
+        <w:rPr>
           <w:szCs w:val="24"/>
         </w:rPr>
         <w:lastRenderedPageBreak/>
@@ -11619,7 +11966,7 @@
                     <pic:cNvPicPr/>
                   </pic:nvPicPr>
                   <pic:blipFill>
-                    <a:blip r:embed="rId62">
+                    <a:blip r:embed="rId77">
                       <a:extLst>
                         <a:ext uri="{28A0092B-C50C-407E-A947-70E740481C1C}">
                           <a14:useLocalDpi xmlns:a14="http://schemas.microsoft.com/office/drawing/2010/main" val="0"/>
@@ -12667,42 +13014,25 @@
     </w:tbl>
     <w:p>
       <w:pPr>
+        <w:pStyle w:val="SubHeading3"/>
+        <w:rPr>
+          <w:rFonts w:eastAsia="Segoe UI"/>
+        </w:rPr>
+      </w:pPr>
+    </w:p>
+    <w:p>
+      <w:pPr>
         <w:pStyle w:val="Heading3"/>
         <w:keepNext w:val="0"/>
         <w:widowControl w:val="0"/>
         <w:pBdr>
           <w:bottom w:val="single" w:sz="7" w:space="0" w:color="D1D5DB"/>
         </w:pBdr>
-        <w:shd w:val="clear" w:color="auto" w:fill="FFFFFF" w:themeFill="background1"/>
         <w:spacing w:before="360" w:after="120"/>
         <w:ind w:left="360"/>
-        <w:rPr>
-          <w:rFonts w:ascii="Segoe UI" w:eastAsia="Segoe UI" w:hAnsi="Segoe UI" w:cs="Segoe UI"/>
-          <w:b/>
-          <w:bCs/>
-          <w:color w:val="1F2937"/>
-          <w:szCs w:val="24"/>
-        </w:rPr>
-      </w:pPr>
-    </w:p>
-    <w:p>
-      <w:pPr>
-        <w:pStyle w:val="Heading3"/>
-        <w:keepNext w:val="0"/>
-        <w:widowControl w:val="0"/>
-        <w:pBdr>
-          <w:bottom w:val="single" w:sz="7" w:space="0" w:color="D1D5DB"/>
-        </w:pBdr>
-        <w:shd w:val="clear" w:color="auto" w:fill="FFFFFF" w:themeFill="background1"/>
-        <w:spacing w:before="360" w:after="120"/>
-        <w:ind w:left="360"/>
-      </w:pPr>
-      <w:r>
-        <w:rPr>
-          <w:rFonts w:ascii="Segoe UI" w:eastAsia="Segoe UI" w:hAnsi="Segoe UI" w:cs="Segoe UI"/>
-          <w:b/>
-          <w:bCs/>
-          <w:color w:val="1F2937"/>
+      </w:pPr>
+      <w:r>
+        <w:rPr>
           <w:szCs w:val="24"/>
         </w:rPr>
         <w:t>4.3. Guion de Trabajo</w:t>
@@ -12744,7 +13074,6 @@
           <w:i w:val="0"/>
           <w:iCs w:val="0"/>
           <w:color w:val="1F2937"/>
-          <w:sz w:val="48"/>
           <w:szCs w:val="48"/>
         </w:rPr>
       </w:pPr>
@@ -12765,7 +13094,6 @@
           <w:i w:val="0"/>
           <w:iCs w:val="0"/>
           <w:color w:val="1F2937"/>
-          <w:sz w:val="48"/>
           <w:szCs w:val="48"/>
         </w:rPr>
       </w:pPr>
@@ -12786,7 +13114,6 @@
           <w:i w:val="0"/>
           <w:iCs w:val="0"/>
           <w:color w:val="1F2937"/>
-          <w:sz w:val="48"/>
           <w:szCs w:val="48"/>
         </w:rPr>
       </w:pPr>
@@ -12809,7 +13136,6 @@
           <w:i w:val="0"/>
           <w:iCs w:val="0"/>
           <w:color w:val="1F2937"/>
-          <w:sz w:val="48"/>
           <w:szCs w:val="48"/>
         </w:rPr>
         <w:lastRenderedPageBreak/>
@@ -12824,16 +13150,11 @@
         <w:pBdr>
           <w:bottom w:val="single" w:sz="7" w:space="0" w:color="D1D5DB"/>
         </w:pBdr>
-        <w:shd w:val="clear" w:color="auto" w:fill="FFFFFF" w:themeFill="background1"/>
         <w:spacing w:before="360" w:after="120"/>
         <w:ind w:left="360"/>
       </w:pPr>
       <w:r>
         <w:rPr>
-          <w:rFonts w:ascii="Segoe UI" w:eastAsia="Segoe UI" w:hAnsi="Segoe UI" w:cs="Segoe UI"/>
-          <w:b/>
-          <w:bCs/>
-          <w:color w:val="1F2937"/>
           <w:szCs w:val="24"/>
         </w:rPr>
         <w:t>5.1. Organización real del trabajo</w:t>
@@ -12865,16 +13186,11 @@
         <w:pBdr>
           <w:bottom w:val="single" w:sz="7" w:space="0" w:color="D1D5DB"/>
         </w:pBdr>
-        <w:shd w:val="clear" w:color="auto" w:fill="FFFFFF" w:themeFill="background1"/>
         <w:spacing w:before="360" w:after="120"/>
         <w:ind w:left="360"/>
       </w:pPr>
       <w:r>
         <w:rPr>
-          <w:rFonts w:ascii="Segoe UI" w:eastAsia="Segoe UI" w:hAnsi="Segoe UI" w:cs="Segoe UI"/>
-          <w:b/>
-          <w:bCs/>
-          <w:color w:val="1F2937"/>
           <w:szCs w:val="24"/>
         </w:rPr>
         <w:t>5.2. Estructura del Proyecto</w:t>
@@ -12906,16 +13222,11 @@
         <w:pBdr>
           <w:bottom w:val="single" w:sz="7" w:space="0" w:color="D1D5DB"/>
         </w:pBdr>
-        <w:shd w:val="clear" w:color="auto" w:fill="FFFFFF" w:themeFill="background1"/>
         <w:spacing w:before="360" w:after="120"/>
         <w:ind w:left="360"/>
       </w:pPr>
       <w:r>
         <w:rPr>
-          <w:rFonts w:ascii="Segoe UI" w:eastAsia="Segoe UI" w:hAnsi="Segoe UI" w:cs="Segoe UI"/>
-          <w:b/>
-          <w:bCs/>
-          <w:color w:val="1F2937"/>
           <w:szCs w:val="24"/>
         </w:rPr>
         <w:t>5.3. Aspectos relevantes de la codificación</w:t>
@@ -12947,16 +13258,11 @@
         <w:pBdr>
           <w:bottom w:val="single" w:sz="7" w:space="0" w:color="D1D5DB"/>
         </w:pBdr>
-        <w:shd w:val="clear" w:color="auto" w:fill="FFFFFF" w:themeFill="background1"/>
         <w:spacing w:before="360" w:after="120"/>
         <w:ind w:left="360"/>
       </w:pPr>
       <w:r>
         <w:rPr>
-          <w:rFonts w:ascii="Segoe UI" w:eastAsia="Segoe UI" w:hAnsi="Segoe UI" w:cs="Segoe UI"/>
-          <w:b/>
-          <w:bCs/>
-          <w:color w:val="1F2937"/>
           <w:szCs w:val="24"/>
         </w:rPr>
         <w:t>5.4. Despliegue</w:t>
@@ -12998,7 +13304,6 @@
           <w:i w:val="0"/>
           <w:iCs w:val="0"/>
           <w:color w:val="1F2937"/>
-          <w:sz w:val="48"/>
           <w:szCs w:val="48"/>
         </w:rPr>
         <w:t>6. Pruebas y Control de Calidad</w:t>
@@ -13012,16 +13317,11 @@
         <w:pBdr>
           <w:bottom w:val="single" w:sz="7" w:space="0" w:color="D1D5DB"/>
         </w:pBdr>
-        <w:shd w:val="clear" w:color="auto" w:fill="FFFFFF" w:themeFill="background1"/>
         <w:spacing w:before="360" w:after="120"/>
         <w:ind w:left="360"/>
       </w:pPr>
       <w:r>
         <w:rPr>
-          <w:rFonts w:ascii="Segoe UI" w:eastAsia="Segoe UI" w:hAnsi="Segoe UI" w:cs="Segoe UI"/>
-          <w:b/>
-          <w:bCs/>
-          <w:color w:val="1F2937"/>
           <w:szCs w:val="24"/>
         </w:rPr>
         <w:t>6.1. Plan de Pruebas</w:t>
@@ -13053,16 +13353,11 @@
         <w:pBdr>
           <w:bottom w:val="single" w:sz="7" w:space="0" w:color="D1D5DB"/>
         </w:pBdr>
-        <w:shd w:val="clear" w:color="auto" w:fill="FFFFFF" w:themeFill="background1"/>
         <w:spacing w:before="360" w:after="120"/>
         <w:ind w:left="360"/>
       </w:pPr>
       <w:r>
         <w:rPr>
-          <w:rFonts w:ascii="Segoe UI" w:eastAsia="Segoe UI" w:hAnsi="Segoe UI" w:cs="Segoe UI"/>
-          <w:b/>
-          <w:bCs/>
-          <w:color w:val="1F2937"/>
           <w:szCs w:val="24"/>
         </w:rPr>
         <w:t>6.2. Registro de Incidencias</w:t>
@@ -13094,16 +13389,11 @@
         <w:pBdr>
           <w:bottom w:val="single" w:sz="7" w:space="0" w:color="D1D5DB"/>
         </w:pBdr>
-        <w:shd w:val="clear" w:color="auto" w:fill="FFFFFF" w:themeFill="background1"/>
         <w:spacing w:before="360" w:after="120"/>
         <w:ind w:left="360"/>
       </w:pPr>
       <w:r>
         <w:rPr>
-          <w:rFonts w:ascii="Segoe UI" w:eastAsia="Segoe UI" w:hAnsi="Segoe UI" w:cs="Segoe UI"/>
-          <w:b/>
-          <w:bCs/>
-          <w:color w:val="1F2937"/>
           <w:szCs w:val="24"/>
         </w:rPr>
         <w:t>6.3. Validación de Requisitos</w:t>
@@ -13143,7 +13433,6 @@
           <w:i w:val="0"/>
           <w:iCs w:val="0"/>
           <w:color w:val="1F2937"/>
-          <w:sz w:val="48"/>
           <w:szCs w:val="48"/>
         </w:rPr>
       </w:pPr>
@@ -13164,7 +13453,6 @@
           <w:i w:val="0"/>
           <w:iCs w:val="0"/>
           <w:color w:val="1F2937"/>
-          <w:sz w:val="48"/>
           <w:szCs w:val="48"/>
         </w:rPr>
       </w:pPr>
@@ -13187,7 +13475,6 @@
           <w:i w:val="0"/>
           <w:iCs w:val="0"/>
           <w:color w:val="1F2937"/>
-          <w:sz w:val="48"/>
           <w:szCs w:val="48"/>
         </w:rPr>
         <w:lastRenderedPageBreak/>
@@ -13202,16 +13489,11 @@
         <w:pBdr>
           <w:bottom w:val="single" w:sz="7" w:space="0" w:color="D1D5DB"/>
         </w:pBdr>
-        <w:shd w:val="clear" w:color="auto" w:fill="FFFFFF" w:themeFill="background1"/>
         <w:spacing w:before="360" w:after="120"/>
         <w:ind w:left="360"/>
       </w:pPr>
       <w:r>
         <w:rPr>
-          <w:rFonts w:ascii="Segoe UI" w:eastAsia="Segoe UI" w:hAnsi="Segoe UI" w:cs="Segoe UI"/>
-          <w:b/>
-          <w:bCs/>
-          <w:color w:val="1F2937"/>
           <w:szCs w:val="24"/>
         </w:rPr>
         <w:t>7.1. Grado de cumplimiento de objetivos</w:t>
@@ -13243,16 +13525,11 @@
         <w:pBdr>
           <w:bottom w:val="single" w:sz="7" w:space="0" w:color="D1D5DB"/>
         </w:pBdr>
-        <w:shd w:val="clear" w:color="auto" w:fill="FFFFFF" w:themeFill="background1"/>
         <w:spacing w:before="360" w:after="120"/>
         <w:ind w:left="360"/>
       </w:pPr>
       <w:r>
         <w:rPr>
-          <w:rFonts w:ascii="Segoe UI" w:eastAsia="Segoe UI" w:hAnsi="Segoe UI" w:cs="Segoe UI"/>
-          <w:b/>
-          <w:bCs/>
-          <w:color w:val="1F2937"/>
           <w:szCs w:val="24"/>
         </w:rPr>
         <w:t>7.2. Dificultades y aprendizaje personal</w:t>
@@ -13284,16 +13561,11 @@
         <w:pBdr>
           <w:bottom w:val="single" w:sz="7" w:space="0" w:color="D1D5DB"/>
         </w:pBdr>
-        <w:shd w:val="clear" w:color="auto" w:fill="FFFFFF" w:themeFill="background1"/>
         <w:spacing w:before="360" w:after="120"/>
         <w:ind w:left="360"/>
       </w:pPr>
       <w:r>
         <w:rPr>
-          <w:rFonts w:ascii="Segoe UI" w:eastAsia="Segoe UI" w:hAnsi="Segoe UI" w:cs="Segoe UI"/>
-          <w:b/>
-          <w:bCs/>
-          <w:color w:val="1F2937"/>
           <w:szCs w:val="24"/>
         </w:rPr>
         <w:t>7.3. Posibles mejoras y líneas futuras del proyecto</w:t>
@@ -13333,7 +13605,6 @@
           <w:i w:val="0"/>
           <w:iCs w:val="0"/>
           <w:color w:val="1F2937"/>
-          <w:sz w:val="48"/>
           <w:szCs w:val="48"/>
         </w:rPr>
       </w:pPr>
@@ -13344,7 +13615,6 @@
           <w:i w:val="0"/>
           <w:iCs w:val="0"/>
           <w:color w:val="1F2937"/>
-          <w:sz w:val="48"/>
           <w:szCs w:val="48"/>
         </w:rPr>
         <w:t>8. Referencias y bibliografía</w:t>
@@ -13374,7 +13644,6 @@
           <w:i w:val="0"/>
           <w:iCs w:val="0"/>
           <w:color w:val="1F2937"/>
-          <w:sz w:val="48"/>
           <w:szCs w:val="48"/>
         </w:rPr>
         <w:t>9. Glosario de Términos y Acrónimos</w:t>
@@ -13717,7 +13986,6 @@
           <w:i w:val="0"/>
           <w:iCs w:val="0"/>
           <w:color w:val="1F2937"/>
-          <w:sz w:val="48"/>
           <w:szCs w:val="48"/>
         </w:rPr>
       </w:pPr>
@@ -13738,7 +14006,6 @@
           <w:i w:val="0"/>
           <w:iCs w:val="0"/>
           <w:color w:val="1F2937"/>
-          <w:sz w:val="48"/>
           <w:szCs w:val="48"/>
         </w:rPr>
       </w:pPr>
@@ -13761,7 +14028,6 @@
           <w:i w:val="0"/>
           <w:iCs w:val="0"/>
           <w:color w:val="1F2937"/>
-          <w:sz w:val="48"/>
           <w:szCs w:val="48"/>
         </w:rPr>
         <w:lastRenderedPageBreak/>
@@ -13776,16 +14042,11 @@
         <w:pBdr>
           <w:bottom w:val="single" w:sz="7" w:space="0" w:color="D1D5DB"/>
         </w:pBdr>
-        <w:shd w:val="clear" w:color="auto" w:fill="FFFFFF" w:themeFill="background1"/>
         <w:spacing w:before="360" w:after="120"/>
         <w:ind w:left="360"/>
       </w:pPr>
       <w:r>
         <w:rPr>
-          <w:rFonts w:ascii="Segoe UI" w:eastAsia="Segoe UI" w:hAnsi="Segoe UI" w:cs="Segoe UI"/>
-          <w:b/>
-          <w:bCs/>
-          <w:color w:val="1F2937"/>
           <w:szCs w:val="24"/>
         </w:rPr>
         <w:t>10.1. Manual de instalación</w:t>
@@ -13805,16 +14066,11 @@
         <w:pBdr>
           <w:bottom w:val="single" w:sz="7" w:space="0" w:color="D1D5DB"/>
         </w:pBdr>
-        <w:shd w:val="clear" w:color="auto" w:fill="FFFFFF" w:themeFill="background1"/>
         <w:spacing w:before="360" w:after="120"/>
         <w:ind w:left="360"/>
       </w:pPr>
       <w:r>
         <w:rPr>
-          <w:rFonts w:ascii="Segoe UI" w:eastAsia="Segoe UI" w:hAnsi="Segoe UI" w:cs="Segoe UI"/>
-          <w:b/>
-          <w:bCs/>
-          <w:color w:val="1F2937"/>
           <w:szCs w:val="24"/>
         </w:rPr>
         <w:t>10.2. Manual de usuario</w:t>
@@ -13834,16 +14090,11 @@
         <w:pBdr>
           <w:bottom w:val="single" w:sz="7" w:space="0" w:color="D1D5DB"/>
         </w:pBdr>
-        <w:shd w:val="clear" w:color="auto" w:fill="FFFFFF" w:themeFill="background1"/>
         <w:spacing w:before="360" w:after="120"/>
         <w:ind w:left="360"/>
       </w:pPr>
       <w:r>
         <w:rPr>
-          <w:rFonts w:ascii="Segoe UI" w:eastAsia="Segoe UI" w:hAnsi="Segoe UI" w:cs="Segoe UI"/>
-          <w:b/>
-          <w:bCs/>
-          <w:color w:val="1F2937"/>
           <w:szCs w:val="24"/>
         </w:rPr>
         <w:t>10.3. Documentación complementaria</w:t>
@@ -13863,16 +14114,11 @@
         <w:pBdr>
           <w:bottom w:val="single" w:sz="7" w:space="0" w:color="D1D5DB"/>
         </w:pBdr>
-        <w:shd w:val="clear" w:color="auto" w:fill="FFFFFF" w:themeFill="background1"/>
         <w:spacing w:before="360" w:after="120"/>
         <w:ind w:left="360"/>
       </w:pPr>
       <w:r>
         <w:rPr>
-          <w:rFonts w:ascii="Segoe UI" w:eastAsia="Segoe UI" w:hAnsi="Segoe UI" w:cs="Segoe UI"/>
-          <w:b/>
-          <w:bCs/>
-          <w:color w:val="1F2937"/>
           <w:szCs w:val="24"/>
         </w:rPr>
         <w:t>10.4. Anexos Técnicos</w:t>
@@ -13914,12 +14160,12 @@
       </w:r>
     </w:p>
     <w:sectPr>
-      <w:headerReference w:type="even" r:id="rId66"/>
-      <w:headerReference w:type="default" r:id="rId67"/>
-      <w:footerReference w:type="even" r:id="rId68"/>
-      <w:footerReference w:type="default" r:id="rId69"/>
-      <w:headerReference w:type="first" r:id="rId70"/>
-      <w:footerReference w:type="first" r:id="rId71"/>
+      <w:headerReference w:type="even" r:id="rId81"/>
+      <w:headerReference w:type="default" r:id="rId82"/>
+      <w:footerReference w:type="even" r:id="rId83"/>
+      <w:footerReference w:type="default" r:id="rId84"/>
+      <w:headerReference w:type="first" r:id="rId85"/>
+      <w:footerReference w:type="first" r:id="rId86"/>
       <w:type w:val="continuous"/>
       <w:pgSz w:w="11906" w:h="16838"/>
       <w:pgMar w:top="1418" w:right="1418" w:bottom="1418" w:left="1418" w:header="709" w:footer="709" w:gutter="0"/>
@@ -13988,7 +14234,7 @@
           <wp:extent cx="266700" cy="250190"/>
           <wp:effectExtent l="0" t="0" r="0" b="0"/>
           <wp:wrapSquare wrapText="bothSides"/>
-          <wp:docPr id="46905625" name="0 Imagen"/>
+          <wp:docPr id="721924865" name="0 Imagen"/>
           <wp:cNvGraphicFramePr>
             <a:graphicFrameLocks xmlns:a="http://schemas.openxmlformats.org/drawingml/2006/main" noChangeAspect="1"/>
           </wp:cNvGraphicFramePr>
@@ -15068,6 +15314,155 @@
     </w:lvl>
   </w:abstractNum>
   <w:abstractNum w:abstractNumId="10" w15:restartNumberingAfterBreak="0">
+    <w:nsid w:val="03AF066C"/>
+    <w:multiLevelType w:val="multilevel"/>
+    <w:tmpl w:val="3420FA12"/>
+    <w:lvl w:ilvl="0">
+      <w:start w:val="1"/>
+      <w:numFmt w:val="bullet"/>
+      <w:lvlText w:val=""/>
+      <w:lvlJc w:val="left"/>
+      <w:pPr>
+        <w:tabs>
+          <w:tab w:val="num" w:pos="720"/>
+        </w:tabs>
+        <w:ind w:left="720" w:hanging="360"/>
+      </w:pPr>
+      <w:rPr>
+        <w:rFonts w:ascii="Symbol" w:hAnsi="Symbol" w:hint="default"/>
+        <w:sz w:val="20"/>
+      </w:rPr>
+    </w:lvl>
+    <w:lvl w:ilvl="1" w:tentative="1">
+      <w:start w:val="1"/>
+      <w:numFmt w:val="bullet"/>
+      <w:lvlText w:val="o"/>
+      <w:lvlJc w:val="left"/>
+      <w:pPr>
+        <w:tabs>
+          <w:tab w:val="num" w:pos="1440"/>
+        </w:tabs>
+        <w:ind w:left="1440" w:hanging="360"/>
+      </w:pPr>
+      <w:rPr>
+        <w:rFonts w:ascii="Courier New" w:hAnsi="Courier New" w:hint="default"/>
+        <w:sz w:val="20"/>
+      </w:rPr>
+    </w:lvl>
+    <w:lvl w:ilvl="2" w:tentative="1">
+      <w:start w:val="1"/>
+      <w:numFmt w:val="bullet"/>
+      <w:lvlText w:val=""/>
+      <w:lvlJc w:val="left"/>
+      <w:pPr>
+        <w:tabs>
+          <w:tab w:val="num" w:pos="2160"/>
+        </w:tabs>
+        <w:ind w:left="2160" w:hanging="360"/>
+      </w:pPr>
+      <w:rPr>
+        <w:rFonts w:ascii="Wingdings" w:hAnsi="Wingdings" w:hint="default"/>
+        <w:sz w:val="20"/>
+      </w:rPr>
+    </w:lvl>
+    <w:lvl w:ilvl="3" w:tentative="1">
+      <w:start w:val="1"/>
+      <w:numFmt w:val="bullet"/>
+      <w:lvlText w:val=""/>
+      <w:lvlJc w:val="left"/>
+      <w:pPr>
+        <w:tabs>
+          <w:tab w:val="num" w:pos="2880"/>
+        </w:tabs>
+        <w:ind w:left="2880" w:hanging="360"/>
+      </w:pPr>
+      <w:rPr>
+        <w:rFonts w:ascii="Wingdings" w:hAnsi="Wingdings" w:hint="default"/>
+        <w:sz w:val="20"/>
+      </w:rPr>
+    </w:lvl>
+    <w:lvl w:ilvl="4" w:tentative="1">
+      <w:start w:val="1"/>
+      <w:numFmt w:val="bullet"/>
+      <w:lvlText w:val=""/>
+      <w:lvlJc w:val="left"/>
+      <w:pPr>
+        <w:tabs>
+          <w:tab w:val="num" w:pos="3600"/>
+        </w:tabs>
+        <w:ind w:left="3600" w:hanging="360"/>
+      </w:pPr>
+      <w:rPr>
+        <w:rFonts w:ascii="Wingdings" w:hAnsi="Wingdings" w:hint="default"/>
+        <w:sz w:val="20"/>
+      </w:rPr>
+    </w:lvl>
+    <w:lvl w:ilvl="5" w:tentative="1">
+      <w:start w:val="1"/>
+      <w:numFmt w:val="bullet"/>
+      <w:lvlText w:val=""/>
+      <w:lvlJc w:val="left"/>
+      <w:pPr>
+        <w:tabs>
+          <w:tab w:val="num" w:pos="4320"/>
+        </w:tabs>
+        <w:ind w:left="4320" w:hanging="360"/>
+      </w:pPr>
+      <w:rPr>
+        <w:rFonts w:ascii="Wingdings" w:hAnsi="Wingdings" w:hint="default"/>
+        <w:sz w:val="20"/>
+      </w:rPr>
+    </w:lvl>
+    <w:lvl w:ilvl="6" w:tentative="1">
+      <w:start w:val="1"/>
+      <w:numFmt w:val="bullet"/>
+      <w:lvlText w:val=""/>
+      <w:lvlJc w:val="left"/>
+      <w:pPr>
+        <w:tabs>
+          <w:tab w:val="num" w:pos="5040"/>
+        </w:tabs>
+        <w:ind w:left="5040" w:hanging="360"/>
+      </w:pPr>
+      <w:rPr>
+        <w:rFonts w:ascii="Wingdings" w:hAnsi="Wingdings" w:hint="default"/>
+        <w:sz w:val="20"/>
+      </w:rPr>
+    </w:lvl>
+    <w:lvl w:ilvl="7" w:tentative="1">
+      <w:start w:val="1"/>
+      <w:numFmt w:val="bullet"/>
+      <w:lvlText w:val=""/>
+      <w:lvlJc w:val="left"/>
+      <w:pPr>
+        <w:tabs>
+          <w:tab w:val="num" w:pos="5760"/>
+        </w:tabs>
+        <w:ind w:left="5760" w:hanging="360"/>
+      </w:pPr>
+      <w:rPr>
+        <w:rFonts w:ascii="Wingdings" w:hAnsi="Wingdings" w:hint="default"/>
+        <w:sz w:val="20"/>
+      </w:rPr>
+    </w:lvl>
+    <w:lvl w:ilvl="8" w:tentative="1">
+      <w:start w:val="1"/>
+      <w:numFmt w:val="bullet"/>
+      <w:lvlText w:val=""/>
+      <w:lvlJc w:val="left"/>
+      <w:pPr>
+        <w:tabs>
+          <w:tab w:val="num" w:pos="6480"/>
+        </w:tabs>
+        <w:ind w:left="6480" w:hanging="360"/>
+      </w:pPr>
+      <w:rPr>
+        <w:rFonts w:ascii="Wingdings" w:hAnsi="Wingdings" w:hint="default"/>
+        <w:sz w:val="20"/>
+      </w:rPr>
+    </w:lvl>
+  </w:abstractNum>
+  <w:abstractNum w:abstractNumId="11" w15:restartNumberingAfterBreak="0">
     <w:nsid w:val="0552590E"/>
     <w:multiLevelType w:val="multilevel"/>
     <w:tmpl w:val="6AB66012"/>
@@ -15216,7 +15611,156 @@
       </w:rPr>
     </w:lvl>
   </w:abstractNum>
-  <w:abstractNum w:abstractNumId="11" w15:restartNumberingAfterBreak="0">
+  <w:abstractNum w:abstractNumId="12" w15:restartNumberingAfterBreak="0">
+    <w:nsid w:val="07126C6A"/>
+    <w:multiLevelType w:val="multilevel"/>
+    <w:tmpl w:val="CFB85098"/>
+    <w:lvl w:ilvl="0">
+      <w:start w:val="1"/>
+      <w:numFmt w:val="bullet"/>
+      <w:lvlText w:val=""/>
+      <w:lvlJc w:val="left"/>
+      <w:pPr>
+        <w:tabs>
+          <w:tab w:val="num" w:pos="720"/>
+        </w:tabs>
+        <w:ind w:left="720" w:hanging="360"/>
+      </w:pPr>
+      <w:rPr>
+        <w:rFonts w:ascii="Symbol" w:hAnsi="Symbol" w:hint="default"/>
+        <w:sz w:val="20"/>
+      </w:rPr>
+    </w:lvl>
+    <w:lvl w:ilvl="1" w:tentative="1">
+      <w:start w:val="1"/>
+      <w:numFmt w:val="bullet"/>
+      <w:lvlText w:val="o"/>
+      <w:lvlJc w:val="left"/>
+      <w:pPr>
+        <w:tabs>
+          <w:tab w:val="num" w:pos="1440"/>
+        </w:tabs>
+        <w:ind w:left="1440" w:hanging="360"/>
+      </w:pPr>
+      <w:rPr>
+        <w:rFonts w:ascii="Courier New" w:hAnsi="Courier New" w:hint="default"/>
+        <w:sz w:val="20"/>
+      </w:rPr>
+    </w:lvl>
+    <w:lvl w:ilvl="2" w:tentative="1">
+      <w:start w:val="1"/>
+      <w:numFmt w:val="bullet"/>
+      <w:lvlText w:val=""/>
+      <w:lvlJc w:val="left"/>
+      <w:pPr>
+        <w:tabs>
+          <w:tab w:val="num" w:pos="2160"/>
+        </w:tabs>
+        <w:ind w:left="2160" w:hanging="360"/>
+      </w:pPr>
+      <w:rPr>
+        <w:rFonts w:ascii="Wingdings" w:hAnsi="Wingdings" w:hint="default"/>
+        <w:sz w:val="20"/>
+      </w:rPr>
+    </w:lvl>
+    <w:lvl w:ilvl="3" w:tentative="1">
+      <w:start w:val="1"/>
+      <w:numFmt w:val="bullet"/>
+      <w:lvlText w:val=""/>
+      <w:lvlJc w:val="left"/>
+      <w:pPr>
+        <w:tabs>
+          <w:tab w:val="num" w:pos="2880"/>
+        </w:tabs>
+        <w:ind w:left="2880" w:hanging="360"/>
+      </w:pPr>
+      <w:rPr>
+        <w:rFonts w:ascii="Wingdings" w:hAnsi="Wingdings" w:hint="default"/>
+        <w:sz w:val="20"/>
+      </w:rPr>
+    </w:lvl>
+    <w:lvl w:ilvl="4" w:tentative="1">
+      <w:start w:val="1"/>
+      <w:numFmt w:val="bullet"/>
+      <w:lvlText w:val=""/>
+      <w:lvlJc w:val="left"/>
+      <w:pPr>
+        <w:tabs>
+          <w:tab w:val="num" w:pos="3600"/>
+        </w:tabs>
+        <w:ind w:left="3600" w:hanging="360"/>
+      </w:pPr>
+      <w:rPr>
+        <w:rFonts w:ascii="Wingdings" w:hAnsi="Wingdings" w:hint="default"/>
+        <w:sz w:val="20"/>
+      </w:rPr>
+    </w:lvl>
+    <w:lvl w:ilvl="5" w:tentative="1">
+      <w:start w:val="1"/>
+      <w:numFmt w:val="bullet"/>
+      <w:lvlText w:val=""/>
+      <w:lvlJc w:val="left"/>
+      <w:pPr>
+        <w:tabs>
+          <w:tab w:val="num" w:pos="4320"/>
+        </w:tabs>
+        <w:ind w:left="4320" w:hanging="360"/>
+      </w:pPr>
+      <w:rPr>
+        <w:rFonts w:ascii="Wingdings" w:hAnsi="Wingdings" w:hint="default"/>
+        <w:sz w:val="20"/>
+      </w:rPr>
+    </w:lvl>
+    <w:lvl w:ilvl="6" w:tentative="1">
+      <w:start w:val="1"/>
+      <w:numFmt w:val="bullet"/>
+      <w:lvlText w:val=""/>
+      <w:lvlJc w:val="left"/>
+      <w:pPr>
+        <w:tabs>
+          <w:tab w:val="num" w:pos="5040"/>
+        </w:tabs>
+        <w:ind w:left="5040" w:hanging="360"/>
+      </w:pPr>
+      <w:rPr>
+        <w:rFonts w:ascii="Wingdings" w:hAnsi="Wingdings" w:hint="default"/>
+        <w:sz w:val="20"/>
+      </w:rPr>
+    </w:lvl>
+    <w:lvl w:ilvl="7" w:tentative="1">
+      <w:start w:val="1"/>
+      <w:numFmt w:val="bullet"/>
+      <w:lvlText w:val=""/>
+      <w:lvlJc w:val="left"/>
+      <w:pPr>
+        <w:tabs>
+          <w:tab w:val="num" w:pos="5760"/>
+        </w:tabs>
+        <w:ind w:left="5760" w:hanging="360"/>
+      </w:pPr>
+      <w:rPr>
+        <w:rFonts w:ascii="Wingdings" w:hAnsi="Wingdings" w:hint="default"/>
+        <w:sz w:val="20"/>
+      </w:rPr>
+    </w:lvl>
+    <w:lvl w:ilvl="8" w:tentative="1">
+      <w:start w:val="1"/>
+      <w:numFmt w:val="bullet"/>
+      <w:lvlText w:val=""/>
+      <w:lvlJc w:val="left"/>
+      <w:pPr>
+        <w:tabs>
+          <w:tab w:val="num" w:pos="6480"/>
+        </w:tabs>
+        <w:ind w:left="6480" w:hanging="360"/>
+      </w:pPr>
+      <w:rPr>
+        <w:rFonts w:ascii="Wingdings" w:hAnsi="Wingdings" w:hint="default"/>
+        <w:sz w:val="20"/>
+      </w:rPr>
+    </w:lvl>
+  </w:abstractNum>
+  <w:abstractNum w:abstractNumId="13" w15:restartNumberingAfterBreak="0">
     <w:nsid w:val="0ABC069A"/>
     <w:multiLevelType w:val="multilevel"/>
     <w:tmpl w:val="FAE6D9B2"/>
@@ -15329,7 +15873,7 @@
       </w:pPr>
     </w:lvl>
   </w:abstractNum>
-  <w:abstractNum w:abstractNumId="12" w15:restartNumberingAfterBreak="0">
+  <w:abstractNum w:abstractNumId="14" w15:restartNumberingAfterBreak="0">
     <w:nsid w:val="0FC77EE1"/>
     <w:multiLevelType w:val="multilevel"/>
     <w:tmpl w:val="A90469EA"/>
@@ -15446,7 +15990,7 @@
       </w:pPr>
     </w:lvl>
   </w:abstractNum>
-  <w:abstractNum w:abstractNumId="13" w15:restartNumberingAfterBreak="0">
+  <w:abstractNum w:abstractNumId="15" w15:restartNumberingAfterBreak="0">
     <w:nsid w:val="15B5726D"/>
     <w:multiLevelType w:val="multilevel"/>
     <w:tmpl w:val="14B601A0"/>
@@ -15559,7 +16103,7 @@
       </w:pPr>
     </w:lvl>
   </w:abstractNum>
-  <w:abstractNum w:abstractNumId="14" w15:restartNumberingAfterBreak="0">
+  <w:abstractNum w:abstractNumId="16" w15:restartNumberingAfterBreak="0">
     <w:nsid w:val="17D16090"/>
     <w:multiLevelType w:val="hybridMultilevel"/>
     <w:tmpl w:val="A33CE50E"/>
@@ -15672,7 +16216,7 @@
       </w:rPr>
     </w:lvl>
   </w:abstractNum>
-  <w:abstractNum w:abstractNumId="15" w15:restartNumberingAfterBreak="0">
+  <w:abstractNum w:abstractNumId="17" w15:restartNumberingAfterBreak="0">
     <w:nsid w:val="1AD87688"/>
     <w:multiLevelType w:val="multilevel"/>
     <w:tmpl w:val="076647A4"/>
@@ -15821,7 +16365,7 @@
       </w:rPr>
     </w:lvl>
   </w:abstractNum>
-  <w:abstractNum w:abstractNumId="16" w15:restartNumberingAfterBreak="0">
+  <w:abstractNum w:abstractNumId="18" w15:restartNumberingAfterBreak="0">
     <w:nsid w:val="1B7E5BCD"/>
     <w:multiLevelType w:val="multilevel"/>
     <w:tmpl w:val="FD460818"/>
@@ -15934,7 +16478,7 @@
       </w:pPr>
     </w:lvl>
   </w:abstractNum>
-  <w:abstractNum w:abstractNumId="17" w15:restartNumberingAfterBreak="0">
+  <w:abstractNum w:abstractNumId="19" w15:restartNumberingAfterBreak="0">
     <w:nsid w:val="210C706E"/>
     <w:multiLevelType w:val="multilevel"/>
     <w:tmpl w:val="EDFA514A"/>
@@ -16051,7 +16595,7 @@
       </w:pPr>
     </w:lvl>
   </w:abstractNum>
-  <w:abstractNum w:abstractNumId="18" w15:restartNumberingAfterBreak="0">
+  <w:abstractNum w:abstractNumId="20" w15:restartNumberingAfterBreak="0">
     <w:nsid w:val="216B39DA"/>
     <w:multiLevelType w:val="multilevel"/>
     <w:tmpl w:val="45D66E00"/>
@@ -16191,7 +16735,7 @@
       </w:rPr>
     </w:lvl>
   </w:abstractNum>
-  <w:abstractNum w:abstractNumId="19" w15:restartNumberingAfterBreak="0">
+  <w:abstractNum w:abstractNumId="21" w15:restartNumberingAfterBreak="0">
     <w:nsid w:val="2BEE0818"/>
     <w:multiLevelType w:val="multilevel"/>
     <w:tmpl w:val="6DBEAC04"/>
@@ -16340,7 +16884,7 @@
       </w:rPr>
     </w:lvl>
   </w:abstractNum>
-  <w:abstractNum w:abstractNumId="20" w15:restartNumberingAfterBreak="0">
+  <w:abstractNum w:abstractNumId="22" w15:restartNumberingAfterBreak="0">
     <w:nsid w:val="2CED3286"/>
     <w:multiLevelType w:val="multilevel"/>
     <w:tmpl w:val="0DCEFBEC"/>
@@ -16435,7 +16979,7 @@
       </w:pPr>
     </w:lvl>
   </w:abstractNum>
-  <w:abstractNum w:abstractNumId="21" w15:restartNumberingAfterBreak="0">
+  <w:abstractNum w:abstractNumId="23" w15:restartNumberingAfterBreak="0">
     <w:nsid w:val="34B844AD"/>
     <w:multiLevelType w:val="multilevel"/>
     <w:tmpl w:val="AE628106"/>
@@ -16548,7 +17092,7 @@
       </w:pPr>
     </w:lvl>
   </w:abstractNum>
-  <w:abstractNum w:abstractNumId="22" w15:restartNumberingAfterBreak="0">
+  <w:abstractNum w:abstractNumId="24" w15:restartNumberingAfterBreak="0">
     <w:nsid w:val="35ED0668"/>
     <w:multiLevelType w:val="multilevel"/>
     <w:tmpl w:val="F9CA6292"/>
@@ -16697,7 +17241,7 @@
       </w:rPr>
     </w:lvl>
   </w:abstractNum>
-  <w:abstractNum w:abstractNumId="23" w15:restartNumberingAfterBreak="0">
+  <w:abstractNum w:abstractNumId="25" w15:restartNumberingAfterBreak="0">
     <w:nsid w:val="3D10441D"/>
     <w:multiLevelType w:val="multilevel"/>
     <w:tmpl w:val="A2EA6756"/>
@@ -16837,7 +17381,7 @@
       </w:rPr>
     </w:lvl>
   </w:abstractNum>
-  <w:abstractNum w:abstractNumId="24" w15:restartNumberingAfterBreak="0">
+  <w:abstractNum w:abstractNumId="26" w15:restartNumberingAfterBreak="0">
     <w:nsid w:val="480C30B5"/>
     <w:multiLevelType w:val="multilevel"/>
     <w:tmpl w:val="B3A2EC8E"/>
@@ -16977,7 +17521,7 @@
       </w:rPr>
     </w:lvl>
   </w:abstractNum>
-  <w:abstractNum w:abstractNumId="25" w15:restartNumberingAfterBreak="0">
+  <w:abstractNum w:abstractNumId="27" w15:restartNumberingAfterBreak="0">
     <w:nsid w:val="49B745FC"/>
     <w:multiLevelType w:val="hybridMultilevel"/>
     <w:tmpl w:val="0A6413E0"/>
@@ -17090,7 +17634,7 @@
       </w:rPr>
     </w:lvl>
   </w:abstractNum>
-  <w:abstractNum w:abstractNumId="26" w15:restartNumberingAfterBreak="0">
+  <w:abstractNum w:abstractNumId="28" w15:restartNumberingAfterBreak="0">
     <w:nsid w:val="528A44CC"/>
     <w:multiLevelType w:val="multilevel"/>
     <w:tmpl w:val="FF12F8EA"/>
@@ -17230,7 +17774,7 @@
       </w:rPr>
     </w:lvl>
   </w:abstractNum>
-  <w:abstractNum w:abstractNumId="27" w15:restartNumberingAfterBreak="0">
+  <w:abstractNum w:abstractNumId="29" w15:restartNumberingAfterBreak="0">
     <w:nsid w:val="56EA1EAF"/>
     <w:multiLevelType w:val="multilevel"/>
     <w:tmpl w:val="C79C3080"/>
@@ -17343,7 +17887,7 @@
       </w:pPr>
     </w:lvl>
   </w:abstractNum>
-  <w:abstractNum w:abstractNumId="28" w15:restartNumberingAfterBreak="0">
+  <w:abstractNum w:abstractNumId="30" w15:restartNumberingAfterBreak="0">
     <w:nsid w:val="61292A82"/>
     <w:multiLevelType w:val="multilevel"/>
     <w:tmpl w:val="10F0450A"/>
@@ -17483,7 +18027,7 @@
       </w:rPr>
     </w:lvl>
   </w:abstractNum>
-  <w:abstractNum w:abstractNumId="29" w15:restartNumberingAfterBreak="0">
+  <w:abstractNum w:abstractNumId="31" w15:restartNumberingAfterBreak="0">
     <w:nsid w:val="614B5575"/>
     <w:multiLevelType w:val="hybridMultilevel"/>
     <w:tmpl w:val="0406A6C8"/>
@@ -17597,7 +18141,7 @@
       </w:rPr>
     </w:lvl>
   </w:abstractNum>
-  <w:abstractNum w:abstractNumId="30" w15:restartNumberingAfterBreak="0">
+  <w:abstractNum w:abstractNumId="32" w15:restartNumberingAfterBreak="0">
     <w:nsid w:val="61FF33FD"/>
     <w:multiLevelType w:val="multilevel"/>
     <w:tmpl w:val="70B65930"/>
@@ -17737,7 +18281,7 @@
       </w:rPr>
     </w:lvl>
   </w:abstractNum>
-  <w:abstractNum w:abstractNumId="31" w15:restartNumberingAfterBreak="0">
+  <w:abstractNum w:abstractNumId="33" w15:restartNumberingAfterBreak="0">
     <w:nsid w:val="65913E8C"/>
     <w:multiLevelType w:val="multilevel"/>
     <w:tmpl w:val="970643DA"/>
@@ -17886,7 +18430,7 @@
       </w:rPr>
     </w:lvl>
   </w:abstractNum>
-  <w:abstractNum w:abstractNumId="32" w15:restartNumberingAfterBreak="0">
+  <w:abstractNum w:abstractNumId="34" w15:restartNumberingAfterBreak="0">
     <w:nsid w:val="6BF31981"/>
     <w:multiLevelType w:val="multilevel"/>
     <w:tmpl w:val="2C64408A"/>
@@ -18026,7 +18570,7 @@
       </w:rPr>
     </w:lvl>
   </w:abstractNum>
-  <w:abstractNum w:abstractNumId="33" w15:restartNumberingAfterBreak="0">
+  <w:abstractNum w:abstractNumId="35" w15:restartNumberingAfterBreak="0">
     <w:nsid w:val="73B4C88C"/>
     <w:multiLevelType w:val="hybridMultilevel"/>
     <w:tmpl w:val="6D8C17A2"/>
@@ -18112,7 +18656,7 @@
       </w:pPr>
     </w:lvl>
   </w:abstractNum>
-  <w:abstractNum w:abstractNumId="34" w15:restartNumberingAfterBreak="0">
+  <w:abstractNum w:abstractNumId="36" w15:restartNumberingAfterBreak="0">
     <w:nsid w:val="76723588"/>
     <w:multiLevelType w:val="multilevel"/>
     <w:tmpl w:val="DA28D350"/>
@@ -18225,7 +18769,7 @@
       </w:pPr>
     </w:lvl>
   </w:abstractNum>
-  <w:abstractNum w:abstractNumId="35" w15:restartNumberingAfterBreak="0">
+  <w:abstractNum w:abstractNumId="37" w15:restartNumberingAfterBreak="0">
     <w:nsid w:val="774B49F8"/>
     <w:multiLevelType w:val="multilevel"/>
     <w:tmpl w:val="CBFAD1F2"/>
@@ -18365,7 +18909,7 @@
       </w:rPr>
     </w:lvl>
   </w:abstractNum>
-  <w:abstractNum w:abstractNumId="36" w15:restartNumberingAfterBreak="0">
+  <w:abstractNum w:abstractNumId="38" w15:restartNumberingAfterBreak="0">
     <w:nsid w:val="799C31B5"/>
     <w:multiLevelType w:val="multilevel"/>
     <w:tmpl w:val="70889FAE"/>
@@ -18506,52 +19050,52 @@
     </w:lvl>
   </w:abstractNum>
   <w:num w:numId="1" w16cid:durableId="2113014704">
-    <w:abstractNumId w:val="33"/>
+    <w:abstractNumId w:val="35"/>
   </w:num>
   <w:num w:numId="2" w16cid:durableId="846021626">
+    <w:abstractNumId w:val="22"/>
+  </w:num>
+  <w:num w:numId="3" w16cid:durableId="856044585">
     <w:abstractNumId w:val="20"/>
   </w:num>
-  <w:num w:numId="3" w16cid:durableId="856044585">
+  <w:num w:numId="4" w16cid:durableId="101271883">
+    <w:abstractNumId w:val="26"/>
+  </w:num>
+  <w:num w:numId="5" w16cid:durableId="1243026041">
+    <w:abstractNumId w:val="30"/>
+  </w:num>
+  <w:num w:numId="6" w16cid:durableId="824787241">
+    <w:abstractNumId w:val="37"/>
+  </w:num>
+  <w:num w:numId="7" w16cid:durableId="1391535419">
+    <w:abstractNumId w:val="29"/>
+  </w:num>
+  <w:num w:numId="8" w16cid:durableId="1032150560">
+    <w:abstractNumId w:val="38"/>
+  </w:num>
+  <w:num w:numId="9" w16cid:durableId="499126505">
+    <w:abstractNumId w:val="25"/>
+  </w:num>
+  <w:num w:numId="10" w16cid:durableId="266085855">
+    <w:abstractNumId w:val="34"/>
+  </w:num>
+  <w:num w:numId="11" w16cid:durableId="779959250">
+    <w:abstractNumId w:val="23"/>
+  </w:num>
+  <w:num w:numId="12" w16cid:durableId="1604873041">
     <w:abstractNumId w:val="18"/>
   </w:num>
-  <w:num w:numId="4" w16cid:durableId="101271883">
-    <w:abstractNumId w:val="24"/>
+  <w:num w:numId="13" w16cid:durableId="511842705">
+    <w:abstractNumId w:val="36"/>
   </w:num>
-  <w:num w:numId="5" w16cid:durableId="1243026041">
+  <w:num w:numId="14" w16cid:durableId="840504318">
+    <w:abstractNumId w:val="15"/>
+  </w:num>
+  <w:num w:numId="15" w16cid:durableId="768357962">
     <w:abstractNumId w:val="28"/>
   </w:num>
-  <w:num w:numId="6" w16cid:durableId="824787241">
-    <w:abstractNumId w:val="35"/>
-  </w:num>
-  <w:num w:numId="7" w16cid:durableId="1391535419">
-    <w:abstractNumId w:val="27"/>
-  </w:num>
-  <w:num w:numId="8" w16cid:durableId="1032150560">
-    <w:abstractNumId w:val="36"/>
-  </w:num>
-  <w:num w:numId="9" w16cid:durableId="499126505">
-    <w:abstractNumId w:val="23"/>
-  </w:num>
-  <w:num w:numId="10" w16cid:durableId="266085855">
+  <w:num w:numId="16" w16cid:durableId="440878550">
     <w:abstractNumId w:val="32"/>
-  </w:num>
-  <w:num w:numId="11" w16cid:durableId="779959250">
-    <w:abstractNumId w:val="21"/>
-  </w:num>
-  <w:num w:numId="12" w16cid:durableId="1604873041">
-    <w:abstractNumId w:val="16"/>
-  </w:num>
-  <w:num w:numId="13" w16cid:durableId="511842705">
-    <w:abstractNumId w:val="34"/>
-  </w:num>
-  <w:num w:numId="14" w16cid:durableId="840504318">
-    <w:abstractNumId w:val="13"/>
-  </w:num>
-  <w:num w:numId="15" w16cid:durableId="768357962">
-    <w:abstractNumId w:val="26"/>
-  </w:num>
-  <w:num w:numId="16" w16cid:durableId="440878550">
-    <w:abstractNumId w:val="30"/>
   </w:num>
   <w:num w:numId="17" w16cid:durableId="1772043573">
     <w:abstractNumId w:val="8"/>
@@ -18584,37 +19128,43 @@
     <w:abstractNumId w:val="4"/>
   </w:num>
   <w:num w:numId="27" w16cid:durableId="1585871920">
+    <w:abstractNumId w:val="16"/>
+  </w:num>
+  <w:num w:numId="28" w16cid:durableId="368651360">
+    <w:abstractNumId w:val="31"/>
+  </w:num>
+  <w:num w:numId="29" w16cid:durableId="879130581">
+    <w:abstractNumId w:val="27"/>
+  </w:num>
+  <w:num w:numId="30" w16cid:durableId="1805462885">
     <w:abstractNumId w:val="14"/>
   </w:num>
-  <w:num w:numId="28" w16cid:durableId="368651360">
-    <w:abstractNumId w:val="29"/>
+  <w:num w:numId="31" w16cid:durableId="451554970">
+    <w:abstractNumId w:val="13"/>
   </w:num>
-  <w:num w:numId="29" w16cid:durableId="879130581">
-    <w:abstractNumId w:val="25"/>
+  <w:num w:numId="32" w16cid:durableId="817457399">
+    <w:abstractNumId w:val="33"/>
   </w:num>
-  <w:num w:numId="30" w16cid:durableId="1805462885">
+  <w:num w:numId="33" w16cid:durableId="1996567190">
+    <w:abstractNumId w:val="19"/>
+  </w:num>
+  <w:num w:numId="34" w16cid:durableId="1299992438">
+    <w:abstractNumId w:val="21"/>
+  </w:num>
+  <w:num w:numId="35" w16cid:durableId="352653858">
+    <w:abstractNumId w:val="11"/>
+  </w:num>
+  <w:num w:numId="36" w16cid:durableId="1840121875">
+    <w:abstractNumId w:val="17"/>
+  </w:num>
+  <w:num w:numId="37" w16cid:durableId="1831170911">
+    <w:abstractNumId w:val="24"/>
+  </w:num>
+  <w:num w:numId="38" w16cid:durableId="827136442">
     <w:abstractNumId w:val="12"/>
   </w:num>
-  <w:num w:numId="31" w16cid:durableId="451554970">
-    <w:abstractNumId w:val="11"/>
-  </w:num>
-  <w:num w:numId="32" w16cid:durableId="817457399">
-    <w:abstractNumId w:val="31"/>
-  </w:num>
-  <w:num w:numId="33" w16cid:durableId="1996567190">
-    <w:abstractNumId w:val="17"/>
-  </w:num>
-  <w:num w:numId="34" w16cid:durableId="1299992438">
-    <w:abstractNumId w:val="19"/>
-  </w:num>
-  <w:num w:numId="35" w16cid:durableId="352653858">
+  <w:num w:numId="39" w16cid:durableId="446969884">
     <w:abstractNumId w:val="10"/>
-  </w:num>
-  <w:num w:numId="36" w16cid:durableId="1840121875">
-    <w:abstractNumId w:val="15"/>
-  </w:num>
-  <w:num w:numId="37" w16cid:durableId="1831170911">
-    <w:abstractNumId w:val="22"/>
   </w:num>
 </w:numbering>
 </file>
@@ -19029,23 +19579,20 @@
   </w:style>
   <w:style w:type="paragraph" w:styleId="Heading1">
     <w:name w:val="heading 1"/>
-    <w:basedOn w:val="Normal"/>
+    <w:basedOn w:val="Title"/>
     <w:next w:val="Normal"/>
     <w:link w:val="Heading1Char"/>
-    <w:rsid w:val="000107CD"/>
+    <w:rsid w:val="008B726E"/>
     <w:pPr>
       <w:outlineLvl w:val="0"/>
     </w:pPr>
-    <w:rPr>
-      <w:sz w:val="48"/>
-      <w:szCs w:val="28"/>
-    </w:rPr>
   </w:style>
   <w:style w:type="paragraph" w:styleId="Heading2">
     <w:name w:val="heading 2"/>
     <w:basedOn w:val="Normal"/>
-    <w:next w:val="Normal"/>
-    <w:rsid w:val="000107CD"/>
+    <w:next w:val="Heading1"/>
+    <w:link w:val="Heading2Char"/>
+    <w:rsid w:val="00613423"/>
     <w:pPr>
       <w:spacing w:before="240" w:after="60"/>
       <w:outlineLvl w:val="1"/>
@@ -19055,13 +19602,13 @@
       <w:bCs/>
       <w:i/>
       <w:iCs/>
-      <w:sz w:val="28"/>
+      <w:sz w:val="48"/>
       <w:szCs w:val="28"/>
     </w:rPr>
   </w:style>
   <w:style w:type="paragraph" w:styleId="Heading3">
     <w:name w:val="heading 3"/>
-    <w:basedOn w:val="Normal"/>
+    <w:basedOn w:val="Heading1"/>
     <w:next w:val="Normal"/>
     <w:rsid w:val="000107CD"/>
     <w:pPr>
@@ -19074,20 +19621,21 @@
   </w:style>
   <w:style w:type="paragraph" w:styleId="Heading4">
     <w:name w:val="heading 4"/>
-    <w:basedOn w:val="Normal"/>
     <w:next w:val="Normal"/>
-    <w:rsid w:val="00493830"/>
+    <w:rsid w:val="00613423"/>
     <w:pPr>
       <w:outlineLvl w:val="3"/>
     </w:pPr>
     <w:rPr>
+      <w:rFonts w:ascii="Calibri" w:eastAsia="Times New Roman" w:hAnsi="Calibri" w:cs="Times New Roman"/>
       <w:i/>
       <w:iCs/>
+      <w:szCs w:val="24"/>
     </w:rPr>
   </w:style>
   <w:style w:type="paragraph" w:styleId="Heading5">
     <w:name w:val="heading 5"/>
-    <w:basedOn w:val="Normal"/>
+    <w:basedOn w:val="Heading1"/>
     <w:next w:val="Normal"/>
     <w:rsid w:val="00493830"/>
     <w:pPr>
@@ -19095,48 +19643,47 @@
       <w:outlineLvl w:val="4"/>
     </w:pPr>
     <w:rPr>
-      <w:b/>
-      <w:bCs/>
+      <w:b w:val="0"/>
+      <w:bCs w:val="0"/>
     </w:rPr>
   </w:style>
   <w:style w:type="paragraph" w:styleId="Heading6">
     <w:name w:val="heading 6"/>
-    <w:basedOn w:val="Normal"/>
+    <w:basedOn w:val="Heading1"/>
     <w:next w:val="Normal"/>
     <w:rsid w:val="000107CD"/>
     <w:pPr>
       <w:outlineLvl w:val="5"/>
     </w:pPr>
     <w:rPr>
-      <w:b/>
-      <w:bCs/>
+      <w:b w:val="0"/>
+      <w:bCs w:val="0"/>
     </w:rPr>
   </w:style>
   <w:style w:type="paragraph" w:styleId="Heading7">
     <w:name w:val="heading 7"/>
-    <w:basedOn w:val="Normal"/>
+    <w:basedOn w:val="Heading1"/>
     <w:next w:val="Normal"/>
     <w:rsid w:val="00493830"/>
     <w:pPr>
       <w:outlineLvl w:val="6"/>
     </w:pPr>
     <w:rPr>
-      <w:b/>
-      <w:bCs/>
+      <w:b w:val="0"/>
+      <w:bCs w:val="0"/>
     </w:rPr>
   </w:style>
   <w:style w:type="paragraph" w:styleId="Heading8">
     <w:name w:val="heading 8"/>
-    <w:basedOn w:val="Normal"/>
+    <w:basedOn w:val="Heading1"/>
     <w:next w:val="Normal"/>
-    <w:rsid w:val="000107CD"/>
+    <w:rsid w:val="00613423"/>
     <w:pPr>
       <w:outlineLvl w:val="7"/>
     </w:pPr>
     <w:rPr>
       <w:rFonts w:cs="Arial"/>
-      <w:bCs/>
-      <w:sz w:val="20"/>
+      <w:bCs w:val="0"/>
     </w:rPr>
   </w:style>
   <w:style w:type="paragraph" w:styleId="Heading9">
@@ -19314,26 +19861,26 @@
   </w:style>
   <w:style w:type="paragraph" w:styleId="Title">
     <w:name w:val="Title"/>
-    <w:basedOn w:val="Normal"/>
+    <w:basedOn w:val="Heading2"/>
     <w:next w:val="Normal"/>
     <w:link w:val="TitleChar"/>
     <w:uiPriority w:val="10"/>
     <w:qFormat/>
-    <w:rsid w:val="000810BF"/>
+    <w:rsid w:val="008B726E"/>
     <w:pPr>
       <w:pBdr>
-        <w:bottom w:val="single" w:sz="8" w:space="4" w:color="4F81BD" w:themeColor="accent1"/>
+        <w:bottom w:val="single" w:sz="7" w:space="0" w:color="374151"/>
       </w:pBdr>
-      <w:spacing w:after="300" w:line="240" w:lineRule="auto"/>
-      <w:contextualSpacing/>
+      <w:shd w:val="clear" w:color="auto" w:fill="FFFFFF" w:themeFill="background1"/>
+      <w:spacing w:before="720" w:after="360"/>
     </w:pPr>
     <w:rPr>
-      <w:rFonts w:eastAsiaTheme="majorEastAsia" w:cstheme="majorBidi"/>
-      <w:color w:val="17365D" w:themeColor="text2" w:themeShade="BF"/>
-      <w:spacing w:val="5"/>
-      <w:kern w:val="28"/>
-      <w:sz w:val="52"/>
-      <w:szCs w:val="52"/>
+      <w:rFonts w:ascii="Segoe UI" w:eastAsia="Segoe UI" w:hAnsi="Segoe UI" w:cs="Segoe UI"/>
+      <w:b/>
+      <w:i w:val="0"/>
+      <w:iCs w:val="0"/>
+      <w:color w:val="1F2937"/>
+      <w:szCs w:val="48"/>
     </w:rPr>
   </w:style>
   <w:style w:type="character" w:customStyle="1" w:styleId="TitleChar">
@@ -19341,14 +19888,15 @@
     <w:basedOn w:val="DefaultParagraphFont"/>
     <w:link w:val="Title"/>
     <w:uiPriority w:val="10"/>
-    <w:rsid w:val="000810BF"/>
+    <w:rsid w:val="008B726E"/>
     <w:rPr>
-      <w:rFonts w:ascii="Calibri" w:eastAsiaTheme="majorEastAsia" w:hAnsi="Calibri" w:cstheme="majorBidi"/>
-      <w:color w:val="17365D" w:themeColor="text2" w:themeShade="BF"/>
-      <w:spacing w:val="5"/>
-      <w:kern w:val="28"/>
-      <w:sz w:val="52"/>
-      <w:szCs w:val="52"/>
+      <w:rFonts w:ascii="Segoe UI" w:eastAsia="Segoe UI" w:hAnsi="Segoe UI" w:cs="Segoe UI"/>
+      <w:b/>
+      <w:bCs/>
+      <w:color w:val="1F2937"/>
+      <w:sz w:val="48"/>
+      <w:szCs w:val="48"/>
+      <w:shd w:val="clear" w:color="auto" w:fill="FFFFFF" w:themeFill="background1"/>
     </w:rPr>
   </w:style>
   <w:style w:type="character" w:customStyle="1" w:styleId="SangradetextonormalCar">
@@ -19972,11 +20520,15 @@
     <w:name w:val="Heading 1 Char"/>
     <w:basedOn w:val="DefaultParagraphFont"/>
     <w:link w:val="Heading1"/>
-    <w:rsid w:val="00A46E79"/>
+    <w:rsid w:val="008B726E"/>
     <w:rPr>
-      <w:rFonts w:ascii="Calibri" w:eastAsia="Times New Roman" w:hAnsi="Calibri" w:cs="Times New Roman"/>
+      <w:rFonts w:ascii="Segoe UI" w:eastAsia="Segoe UI" w:hAnsi="Segoe UI" w:cs="Segoe UI"/>
+      <w:b/>
+      <w:bCs/>
+      <w:color w:val="1F2937"/>
       <w:sz w:val="48"/>
-      <w:szCs w:val="28"/>
+      <w:szCs w:val="48"/>
+      <w:shd w:val="clear" w:color="auto" w:fill="FFFFFF" w:themeFill="background1"/>
     </w:rPr>
   </w:style>
   <w:style w:type="character" w:customStyle="1" w:styleId="citation-289">
@@ -20055,6 +20607,56 @@
         <w:insideV w:val="single" w:sz="4" w:space="0" w:color="000000" w:themeColor="text1"/>
       </w:tblBorders>
     </w:tblPr>
+  </w:style>
+  <w:style w:type="paragraph" w:styleId="Caption">
+    <w:name w:val="caption"/>
+    <w:basedOn w:val="Normal"/>
+    <w:next w:val="Normal"/>
+    <w:uiPriority w:val="35"/>
+    <w:unhideWhenUsed/>
+    <w:qFormat/>
+    <w:rsid w:val="00F55B8E"/>
+    <w:pPr>
+      <w:spacing w:line="240" w:lineRule="auto"/>
+    </w:pPr>
+    <w:rPr>
+      <w:i/>
+      <w:iCs/>
+      <w:color w:val="1F497D" w:themeColor="text2"/>
+      <w:sz w:val="18"/>
+      <w:szCs w:val="18"/>
+    </w:rPr>
+  </w:style>
+  <w:style w:type="character" w:customStyle="1" w:styleId="Heading2Char">
+    <w:name w:val="Heading 2 Char"/>
+    <w:basedOn w:val="DefaultParagraphFont"/>
+    <w:link w:val="Heading2"/>
+    <w:rsid w:val="00613423"/>
+    <w:rPr>
+      <w:rFonts w:ascii="Calibri" w:eastAsia="Times New Roman" w:hAnsi="Calibri" w:cs="Arial"/>
+      <w:bCs/>
+      <w:i/>
+      <w:iCs/>
+      <w:sz w:val="48"/>
+      <w:szCs w:val="28"/>
+    </w:rPr>
+  </w:style>
+  <w:style w:type="paragraph" w:customStyle="1" w:styleId="SubHeading3">
+    <w:name w:val="SubHeading 3"/>
+    <w:rsid w:val="00613423"/>
+    <w:pPr>
+      <w:pBdr>
+        <w:bottom w:val="single" w:sz="7" w:space="0" w:color="D1D5DB"/>
+      </w:pBdr>
+      <w:spacing w:before="360" w:after="120"/>
+      <w:ind w:left="360"/>
+    </w:pPr>
+    <w:rPr>
+      <w:rFonts w:ascii="Segoe UI" w:eastAsia="Times New Roman" w:hAnsi="Segoe UI" w:cs="Times New Roman"/>
+      <w:color w:val="1F2937"/>
+      <w:sz w:val="24"/>
+      <w:szCs w:val="20"/>
+    </w:rPr>
   </w:style>
 </w:styles>
 </file>
@@ -20537,20 +21139,20 @@
 </file>
 
 <file path=customXml/item3.xml><?xml version="1.0" encoding="utf-8"?>
+<p:properties xmlns:p="http://schemas.microsoft.com/office/2006/metadata/properties" xmlns:xsi="http://www.w3.org/2001/XMLSchema-instance" xmlns:pc="http://schemas.microsoft.com/office/infopath/2007/PartnerControls">
+  <documentManagement>
+    <_activity xmlns="0dd81e3e-32c4-45c3-852a-33c36a8ca9a2" xsi:nil="true"/>
+  </documentManagement>
+</p:properties>
+</file>
+
+<file path=customXml/item4.xml><?xml version="1.0" encoding="utf-8"?>
 <?mso-contentType ?>
 <FormTemplates xmlns="http://schemas.microsoft.com/sharepoint/v3/contenttype/forms">
   <Display>DocumentLibraryForm</Display>
   <Edit>DocumentLibraryForm</Edit>
   <New>DocumentLibraryForm</New>
 </FormTemplates>
-</file>
-
-<file path=customXml/item4.xml><?xml version="1.0" encoding="utf-8"?>
-<p:properties xmlns:p="http://schemas.microsoft.com/office/2006/metadata/properties" xmlns:xsi="http://www.w3.org/2001/XMLSchema-instance" xmlns:pc="http://schemas.microsoft.com/office/infopath/2007/PartnerControls">
-  <documentManagement>
-    <_activity xmlns="0dd81e3e-32c4-45c3-852a-33c36a8ca9a2" xsi:nil="true"/>
-  </documentManagement>
-</p:properties>
 </file>
 
 <file path=customXml/itemProps1.xml><?xml version="1.0" encoding="utf-8"?>
@@ -20580,14 +21182,6 @@
 </file>
 
 <file path=customXml/itemProps3.xml><?xml version="1.0" encoding="utf-8"?>
-<ds:datastoreItem xmlns:ds="http://schemas.openxmlformats.org/officeDocument/2006/customXml" ds:itemID="{D6C383AF-1EC1-4F0E-B800-E4A39F6E2FAF}">
-  <ds:schemaRefs>
-    <ds:schemaRef ds:uri="http://schemas.microsoft.com/sharepoint/v3/contenttype/forms"/>
-  </ds:schemaRefs>
-</ds:datastoreItem>
-</file>
-
-<file path=customXml/itemProps4.xml><?xml version="1.0" encoding="utf-8"?>
 <ds:datastoreItem xmlns:ds="http://schemas.openxmlformats.org/officeDocument/2006/customXml" ds:itemID="{56B03E1A-13FD-4632-B7FD-6FEC8181D718}">
   <ds:schemaRefs>
     <ds:schemaRef ds:uri="http://schemas.microsoft.com/office/2006/metadata/properties"/>
@@ -20595,4 +21189,12 @@
     <ds:schemaRef ds:uri="0dd81e3e-32c4-45c3-852a-33c36a8ca9a2"/>
   </ds:schemaRefs>
 </ds:datastoreItem>
+</file>
+
+<file path=customXml/itemProps4.xml><?xml version="1.0" encoding="utf-8"?>
+<ds:datastoreItem xmlns:ds="http://schemas.openxmlformats.org/officeDocument/2006/customXml" ds:itemID="{D6C383AF-1EC1-4F0E-B800-E4A39F6E2FAF}">
+  <ds:schemaRefs>
+    <ds:schemaRef ds:uri="http://schemas.microsoft.com/sharepoint/v3/contenttype/forms"/>
+  </ds:schemaRefs>
+</ds:datastoreItem>
 </file>
</xml_diff>

<commit_message>
uml añadido y modificacion del word
</commit_message>
<xml_diff>
--- a/MemoriaTFG-IvanMartinNieto.docx
+++ b/MemoriaTFG-IvanMartinNieto.docx
@@ -83,7 +83,7 @@
               </wp:anchor>
             </w:drawing>
           </mc:Choice>
-          <mc:Fallback xmlns:a="http://schemas.openxmlformats.org/drawingml/2006/main" xmlns:a14="http://schemas.microsoft.com/office/drawing/2010/main" xmlns:pic="http://schemas.openxmlformats.org/drawingml/2006/picture">
+          <mc:Fallback xmlns:pic="http://schemas.openxmlformats.org/drawingml/2006/picture" xmlns:a14="http://schemas.microsoft.com/office/drawing/2010/main" xmlns:a="http://schemas.openxmlformats.org/drawingml/2006/main">
             <w:pict w14:anchorId="0829D9D1">
               <v:shapetype id="_x0000_t32" coordsize="21600,21600" o:oned="t" filled="f" o:spt="32" path="m,l21600,21600e" w14:anchorId="38844837">
                 <v:path fillok="f" arrowok="t" o:connecttype="none"/>
@@ -1832,29 +1832,7 @@
             <w:sz w:val="24"/>
             <w:u w:val="none"/>
           </w:rPr>
-          <w:t xml:space="preserve">Figura 6. Interfaz de gestión de </w:t>
-        </w:r>
-        <w:proofErr w:type="gramStart"/>
-        <w:r>
-          <w:rPr>
-            <w:rStyle w:val="Hyperlink"/>
-            <w:rFonts w:ascii="Segoe UI" w:eastAsia="Segoe UI" w:hAnsi="Segoe UI" w:cs="Segoe UI"/>
-            <w:color w:val="2563EB"/>
-            <w:sz w:val="24"/>
-            <w:u w:val="none"/>
-          </w:rPr>
-          <w:t>Playoff</w:t>
-        </w:r>
-        <w:proofErr w:type="gramEnd"/>
-        <w:r>
-          <w:rPr>
-            <w:rStyle w:val="Hyperlink"/>
-            <w:rFonts w:ascii="Segoe UI" w:eastAsia="Segoe UI" w:hAnsi="Segoe UI" w:cs="Segoe UI"/>
-            <w:color w:val="2563EB"/>
-            <w:sz w:val="24"/>
-            <w:u w:val="none"/>
-          </w:rPr>
-          <w:t xml:space="preserve"> Informática</w:t>
+          <w:t>Figura 6. Interfaz de gestión de Playoff Informática</w:t>
         </w:r>
       </w:hyperlink>
     </w:p>
@@ -1882,29 +1860,7 @@
             <w:sz w:val="24"/>
             <w:u w:val="none"/>
           </w:rPr>
-          <w:t xml:space="preserve">Figura 7. Funcionalidades de </w:t>
-        </w:r>
-        <w:proofErr w:type="gramStart"/>
-        <w:r>
-          <w:rPr>
-            <w:rStyle w:val="Hyperlink"/>
-            <w:rFonts w:ascii="Segoe UI" w:eastAsia="Segoe UI" w:hAnsi="Segoe UI" w:cs="Segoe UI"/>
-            <w:color w:val="2563EB"/>
-            <w:sz w:val="24"/>
-            <w:u w:val="none"/>
-          </w:rPr>
-          <w:t>Playoff</w:t>
-        </w:r>
-        <w:proofErr w:type="gramEnd"/>
-        <w:r>
-          <w:rPr>
-            <w:rStyle w:val="Hyperlink"/>
-            <w:rFonts w:ascii="Segoe UI" w:eastAsia="Segoe UI" w:hAnsi="Segoe UI" w:cs="Segoe UI"/>
-            <w:color w:val="2563EB"/>
-            <w:sz w:val="24"/>
-            <w:u w:val="none"/>
-          </w:rPr>
-          <w:t xml:space="preserve"> Informática</w:t>
+          <w:t>Figura 7. Funcionalidades de Playoff Informática</w:t>
         </w:r>
       </w:hyperlink>
     </w:p>
@@ -2605,7 +2561,6 @@
         <w:shd w:val="clear" w:color="auto" w:fill="FFFFFF" w:themeFill="background1"/>
         <w:spacing w:after="48"/>
         <w:ind w:left="360"/>
-        <w:jc w:val="both"/>
       </w:pPr>
       <w:r>
         <w:rPr>
@@ -2623,7 +2578,6 @@
         <w:shd w:val="clear" w:color="auto" w:fill="FFFFFF" w:themeFill="background1"/>
         <w:spacing w:before="300" w:after="48"/>
         <w:ind w:left="357"/>
-        <w:jc w:val="both"/>
       </w:pPr>
       <w:r>
         <w:rPr>
@@ -2672,7 +2626,6 @@
         <w:shd w:val="clear" w:color="auto" w:fill="FFFFFF" w:themeFill="background1"/>
         <w:spacing w:after="48"/>
         <w:ind w:left="360"/>
-        <w:jc w:val="both"/>
       </w:pPr>
       <w:r>
         <w:rPr>
@@ -2753,19 +2706,29 @@
           <w:color w:val="212121"/>
           <w:sz w:val="24"/>
         </w:rPr>
-        <w:t>Es una plataforma muy popular y visualmente atractiva. Sin embargo, su enfoque principal es la comunicación bidireccional y la venta de merchandising. Carece de herramientas ágiles para la autogeneración de documentos burocráticos (como los PDF federativos) y su modelo de suscripción mensual resulta inasumible para un club de atletismo sin ánimo de lucro.</w:t>
-      </w:r>
-    </w:p>
-    <w:p>
-      <w:pPr>
-        <w:shd w:val="clear" w:color="auto" w:fill="FFFFFF" w:themeFill="background1"/>
-        <w:spacing w:after="48"/>
-        <w:ind w:left="720"/>
-        <w:jc w:val="center"/>
-      </w:pPr>
-      <w:r>
-        <w:rPr>
-          <w:noProof/>
+        <w:t xml:space="preserve">Es una plataforma centrada fundamentalmente en la gestión de competiciones. Permite a los usuarios inscribirse en eventos deportivos, hacer un seguimiento de </w:t>
+      </w:r>
+      <w:r>
+        <w:rPr>
+          <w:rFonts w:ascii="Segoe UI" w:eastAsia="Segoe UI" w:hAnsi="Segoe UI" w:cs="Segoe UI"/>
+          <w:color w:val="212121"/>
+          <w:sz w:val="24"/>
+        </w:rPr>
+        <w:t>estos</w:t>
+      </w:r>
+      <w:r>
+        <w:rPr>
+          <w:rFonts w:ascii="Segoe UI" w:eastAsia="Segoe UI" w:hAnsi="Segoe UI" w:cs="Segoe UI"/>
+          <w:color w:val="212121"/>
+          <w:sz w:val="24"/>
+        </w:rPr>
+        <w:t xml:space="preserve"> y, a nivel de administración, crear y organizar dichos torneos. Sin embargo, no está diseñada para cubrir la gestión burocrática interna del día a día de un club modesto. Carece de herramientas para la gestión de un club de atletismo (independientemente de sus dimensiones)</w:t>
+      </w:r>
+      <w:r>
+        <w:rPr>
+          <w:rFonts w:ascii="Segoe UI" w:eastAsia="Segoe UI" w:hAnsi="Segoe UI" w:cs="Segoe UI"/>
+          <w:color w:val="212121"/>
+          <w:sz w:val="24"/>
         </w:rPr>
         <w:drawing>
           <wp:inline distT="0" distB="0" distL="0" distR="0" wp14:anchorId="473491B3" wp14:editId="4FC31C96">
@@ -3164,21 +3127,7 @@
         <w:rPr>
           <w:color w:val="A6A6A6" w:themeColor="background1" w:themeShade="A6"/>
         </w:rPr>
-        <w:t xml:space="preserve">. Interfaz de gestión de </w:t>
-      </w:r>
-      <w:proofErr w:type="gramStart"/>
-      <w:r>
-        <w:rPr>
-          <w:color w:val="A6A6A6" w:themeColor="background1" w:themeShade="A6"/>
-        </w:rPr>
-        <w:t>Playoff</w:t>
-      </w:r>
-      <w:proofErr w:type="gramEnd"/>
-      <w:r>
-        <w:rPr>
-          <w:color w:val="A6A6A6" w:themeColor="background1" w:themeShade="A6"/>
-        </w:rPr>
-        <w:t xml:space="preserve"> Informática</w:t>
+        <w:t>. Interfaz de gestión de Playoff Informática</w:t>
       </w:r>
     </w:p>
     <w:p>
@@ -3281,21 +3230,7 @@
         <w:rPr>
           <w:color w:val="A6A6A6" w:themeColor="background1" w:themeShade="A6"/>
         </w:rPr>
-        <w:t xml:space="preserve">. Funcionalidades de </w:t>
-      </w:r>
-      <w:proofErr w:type="gramStart"/>
-      <w:r>
-        <w:rPr>
-          <w:color w:val="A6A6A6" w:themeColor="background1" w:themeShade="A6"/>
-        </w:rPr>
-        <w:t>Playoff</w:t>
-      </w:r>
-      <w:proofErr w:type="gramEnd"/>
-      <w:r>
-        <w:rPr>
-          <w:color w:val="A6A6A6" w:themeColor="background1" w:themeShade="A6"/>
-        </w:rPr>
-        <w:t xml:space="preserve"> Informática</w:t>
+        <w:t>. Funcionalidades de Playoff Informática</w:t>
       </w:r>
     </w:p>
     <w:p>
@@ -3457,7 +3392,6 @@
         <w:shd w:val="clear" w:color="auto" w:fill="FFFFFF" w:themeFill="background1"/>
         <w:spacing w:before="240" w:after="240"/>
         <w:ind w:left="1416"/>
-        <w:jc w:val="both"/>
       </w:pPr>
       <w:r>
         <w:rPr>
@@ -3523,7 +3457,6 @@
         <w:shd w:val="clear" w:color="auto" w:fill="FFFFFF" w:themeFill="background1"/>
         <w:spacing w:before="240" w:after="240"/>
         <w:ind w:left="1416"/>
-        <w:jc w:val="both"/>
       </w:pPr>
       <w:r>
         <w:rPr>
@@ -3559,7 +3492,6 @@
         <w:shd w:val="clear" w:color="auto" w:fill="FFFFFF" w:themeFill="background1"/>
         <w:spacing w:before="240" w:after="240"/>
         <w:ind w:left="1416"/>
-        <w:jc w:val="both"/>
       </w:pPr>
       <w:r>
         <w:rPr>
@@ -3732,7 +3664,6 @@
         <w:widowControl w:val="0"/>
         <w:shd w:val="clear" w:color="auto" w:fill="FFFFFF" w:themeFill="background1"/>
         <w:spacing w:before="360" w:after="120"/>
-        <w:ind w:left="720"/>
         <w:rPr>
           <w:rFonts w:ascii="Segoe UI" w:eastAsia="Segoe UI" w:hAnsi="Segoe UI" w:cs="Segoe UI"/>
           <w:b/>
@@ -3761,14 +3692,7 @@
           <w:sz w:val="24"/>
         </w:rPr>
       </w:pPr>
-    </w:p>
-    <w:p>
-      <w:pPr>
-        <w:pStyle w:val="Heading4"/>
-        <w:widowControl w:val="0"/>
-        <w:shd w:val="clear" w:color="auto" w:fill="FFFFFF" w:themeFill="background1"/>
-        <w:spacing w:before="360" w:after="120"/>
-        <w:ind w:left="720"/>
+      <w:r>
         <w:rPr>
           <w:rFonts w:ascii="Segoe UI" w:eastAsia="Segoe UI" w:hAnsi="Segoe UI" w:cs="Segoe UI"/>
           <w:b/>
@@ -3778,32 +3702,24 @@
           <w:color w:val="000000" w:themeColor="text1"/>
           <w:sz w:val="24"/>
         </w:rPr>
-      </w:pPr>
-      <w:r>
-        <w:rPr>
-          <w:rFonts w:ascii="Segoe UI" w:eastAsia="Segoe UI" w:hAnsi="Segoe UI" w:cs="Segoe UI"/>
-          <w:b/>
-          <w:bCs/>
+        <w:lastRenderedPageBreak/>
+        <w:t>1.5.2. Viabilidad Económica</w:t>
+      </w:r>
+      <w:r>
+        <w:rPr>
+          <w:rFonts w:ascii="Segoe UI" w:eastAsia="Segoe UI" w:hAnsi="Segoe UI" w:cs="Segoe UI"/>
           <w:i w:val="0"/>
           <w:iCs w:val="0"/>
           <w:color w:val="000000" w:themeColor="text1"/>
           <w:sz w:val="24"/>
         </w:rPr>
-        <w:t>1.5.2. Viabilidad Económica</w:t>
-      </w:r>
-      <w:r>
-        <w:rPr>
-          <w:rFonts w:ascii="Segoe UI" w:eastAsia="Segoe UI" w:hAnsi="Segoe UI" w:cs="Segoe UI"/>
-          <w:i w:val="0"/>
-          <w:iCs w:val="0"/>
-          <w:color w:val="000000" w:themeColor="text1"/>
-          <w:sz w:val="24"/>
-        </w:rPr>
         <w:t xml:space="preserve"> (Estimación de Costes)</w:t>
       </w:r>
     </w:p>
     <w:p>
       <w:pPr>
+        <w:keepNext w:val="0"/>
+        <w:widowControl w:val="0"/>
         <w:shd w:val="clear" w:color="auto" w:fill="FFFFFF" w:themeFill="background1"/>
         <w:spacing w:after="48"/>
         <w:ind w:left="720"/>
@@ -3835,7 +3751,7 @@
           <w:color w:val="212121"/>
           <w:sz w:val="24"/>
         </w:rPr>
-        <w:t xml:space="preserve"> se presenta una estimación del presupuesto como si se tratase de un encargo profesional para el Club Atletismo Ianuarius. Adicionalmente, se han calculado </w:t>
+        <w:t xml:space="preserve"> se presenta una estimación del presupuesto como si se tratase de un encargo profesional para el Club Atletismo Ianuarius. Adicionalmente, se han calculado los costes </w:t>
       </w:r>
       <w:r>
         <w:rPr>
@@ -3843,8 +3759,7 @@
           <w:color w:val="212121"/>
           <w:sz w:val="24"/>
         </w:rPr>
-        <w:lastRenderedPageBreak/>
-        <w:t xml:space="preserve">los costes </w:t>
+        <w:t>periódicos</w:t>
       </w:r>
       <w:r>
         <w:rPr>
@@ -3852,20 +3767,14 @@
           <w:color w:val="212121"/>
           <w:sz w:val="24"/>
         </w:rPr>
-        <w:t>periódicos</w:t>
-      </w:r>
-      <w:r>
-        <w:rPr>
-          <w:rFonts w:ascii="Segoe UI" w:eastAsia="Segoe UI" w:hAnsi="Segoe UI" w:cs="Segoe UI"/>
-          <w:color w:val="212121"/>
-          <w:sz w:val="24"/>
-        </w:rPr>
         <w:t xml:space="preserve"> necesarios para mantener el sistema en producción una vez finalizado el proyecto.</w:t>
       </w:r>
     </w:p>
     <w:p>
       <w:pPr>
         <w:pStyle w:val="Heading5"/>
+        <w:keepNext w:val="0"/>
+        <w:widowControl w:val="0"/>
         <w:spacing w:before="324" w:after="0"/>
         <w:ind w:left="1412"/>
         <w:rPr>
@@ -3915,6 +3824,8 @@
           </w:tcPr>
           <w:p>
             <w:pPr>
+              <w:keepNext w:val="0"/>
+              <w:widowControl w:val="0"/>
               <w:shd w:val="clear" w:color="auto" w:fill="FFFFFF" w:themeFill="background1"/>
               <w:spacing w:after="0"/>
               <w:jc w:val="center"/>
@@ -3948,6 +3859,8 @@
           </w:tcPr>
           <w:p>
             <w:pPr>
+              <w:keepNext w:val="0"/>
+              <w:widowControl w:val="0"/>
               <w:shd w:val="clear" w:color="auto" w:fill="FFFFFF" w:themeFill="background1"/>
               <w:spacing w:after="0"/>
               <w:jc w:val="center"/>
@@ -3981,6 +3894,8 @@
           </w:tcPr>
           <w:p>
             <w:pPr>
+              <w:keepNext w:val="0"/>
+              <w:widowControl w:val="0"/>
               <w:shd w:val="clear" w:color="auto" w:fill="FFFFFF" w:themeFill="background1"/>
               <w:spacing w:after="0"/>
               <w:jc w:val="center"/>
@@ -4029,6 +3944,8 @@
           </w:tcPr>
           <w:p>
             <w:pPr>
+              <w:keepNext w:val="0"/>
+              <w:widowControl w:val="0"/>
               <w:shd w:val="clear" w:color="auto" w:fill="FFFFFF" w:themeFill="background1"/>
               <w:spacing w:after="0"/>
             </w:pPr>
@@ -4055,6 +3972,8 @@
           </w:tcPr>
           <w:p>
             <w:pPr>
+              <w:keepNext w:val="0"/>
+              <w:widowControl w:val="0"/>
               <w:shd w:val="clear" w:color="auto" w:fill="FFFFFF" w:themeFill="background1"/>
               <w:spacing w:after="0"/>
             </w:pPr>
@@ -4091,6 +4010,8 @@
           </w:tcPr>
           <w:p>
             <w:pPr>
+              <w:keepNext w:val="0"/>
+              <w:widowControl w:val="0"/>
               <w:shd w:val="clear" w:color="auto" w:fill="FFFFFF" w:themeFill="background1"/>
               <w:spacing w:after="0"/>
             </w:pPr>
@@ -4120,6 +4041,8 @@
           </w:tcPr>
           <w:p>
             <w:pPr>
+              <w:keepNext w:val="0"/>
+              <w:widowControl w:val="0"/>
               <w:shd w:val="clear" w:color="auto" w:fill="FFFFFF" w:themeFill="background1"/>
               <w:spacing w:after="0"/>
             </w:pPr>
@@ -4146,6 +4069,8 @@
           </w:tcPr>
           <w:p>
             <w:pPr>
+              <w:keepNext w:val="0"/>
+              <w:widowControl w:val="0"/>
               <w:shd w:val="clear" w:color="auto" w:fill="FFFFFF" w:themeFill="background1"/>
               <w:spacing w:after="0"/>
               <w:rPr>
@@ -4185,6 +4110,8 @@
           </w:tcPr>
           <w:p>
             <w:pPr>
+              <w:keepNext w:val="0"/>
+              <w:widowControl w:val="0"/>
               <w:shd w:val="clear" w:color="auto" w:fill="FFFFFF" w:themeFill="background1"/>
               <w:spacing w:after="0"/>
             </w:pPr>
@@ -4214,6 +4141,8 @@
           </w:tcPr>
           <w:p>
             <w:pPr>
+              <w:keepNext w:val="0"/>
+              <w:widowControl w:val="0"/>
               <w:shd w:val="clear" w:color="auto" w:fill="FFFFFF" w:themeFill="background1"/>
               <w:spacing w:after="0"/>
             </w:pPr>
@@ -4240,6 +4169,8 @@
           </w:tcPr>
           <w:p>
             <w:pPr>
+              <w:keepNext w:val="0"/>
+              <w:widowControl w:val="0"/>
               <w:shd w:val="clear" w:color="auto" w:fill="FFFFFF" w:themeFill="background1"/>
               <w:spacing w:after="0"/>
             </w:pPr>
@@ -4264,6 +4195,8 @@
           </w:tcPr>
           <w:p>
             <w:pPr>
+              <w:keepNext w:val="0"/>
+              <w:widowControl w:val="0"/>
               <w:shd w:val="clear" w:color="auto" w:fill="FFFFFF" w:themeFill="background1"/>
               <w:spacing w:after="0"/>
             </w:pPr>
@@ -4293,6 +4226,8 @@
           </w:tcPr>
           <w:p>
             <w:pPr>
+              <w:keepNext w:val="0"/>
+              <w:widowControl w:val="0"/>
               <w:shd w:val="clear" w:color="auto" w:fill="FFFFFF" w:themeFill="background1"/>
               <w:spacing w:after="0"/>
             </w:pPr>
@@ -4319,6 +4254,8 @@
           </w:tcPr>
           <w:p>
             <w:pPr>
+              <w:keepNext w:val="0"/>
+              <w:widowControl w:val="0"/>
               <w:shd w:val="clear" w:color="auto" w:fill="FFFFFF" w:themeFill="background1"/>
               <w:spacing w:after="0"/>
               <w:rPr>
@@ -4330,23 +4267,7 @@
                 <w:color w:val="1F2937"/>
                 <w:lang w:val="en-US"/>
               </w:rPr>
-              <w:t xml:space="preserve">Figma (Plan </w:t>
-            </w:r>
-            <w:proofErr w:type="spellStart"/>
-            <w:r>
-              <w:rPr>
-                <w:color w:val="1F2937"/>
-                <w:lang w:val="en-US"/>
-              </w:rPr>
-              <w:t>gratuito</w:t>
-            </w:r>
-            <w:proofErr w:type="spellEnd"/>
-            <w:r>
-              <w:rPr>
-                <w:color w:val="1F2937"/>
-                <w:lang w:val="en-US"/>
-              </w:rPr>
-              <w:t>), Tailwind CSS.</w:t>
+              <w:t>Figma (Plan gratuito), Tailwind CSS.</w:t>
             </w:r>
           </w:p>
         </w:tc>
@@ -4363,6 +4284,8 @@
           </w:tcPr>
           <w:p>
             <w:pPr>
+              <w:keepNext w:val="0"/>
+              <w:widowControl w:val="0"/>
               <w:shd w:val="clear" w:color="auto" w:fill="FFFFFF" w:themeFill="background1"/>
               <w:spacing w:after="0"/>
             </w:pPr>
@@ -4393,61 +4316,55 @@
           </w:tcPr>
           <w:p>
             <w:pPr>
+              <w:keepNext w:val="0"/>
+              <w:widowControl w:val="0"/>
               <w:shd w:val="clear" w:color="auto" w:fill="FFFFFF" w:themeFill="background1"/>
               <w:spacing w:after="0"/>
               <w:jc w:val="right"/>
             </w:pPr>
-            <w:proofErr w:type="gramStart"/>
             <w:r>
               <w:rPr>
                 <w:b/>
                 <w:bCs/>
                 <w:color w:val="111827"/>
               </w:rPr>
-              <w:t>Total</w:t>
-            </w:r>
-            <w:proofErr w:type="gramEnd"/>
+              <w:t>Total Recursos</w:t>
+            </w:r>
             <w:r>
               <w:rPr>
                 <w:b/>
                 <w:bCs/>
                 <w:color w:val="111827"/>
               </w:rPr>
-              <w:t xml:space="preserve"> Recursos</w:t>
-            </w:r>
+              <w:t>:</w:t>
+            </w:r>
+          </w:p>
+        </w:tc>
+        <w:tc>
+          <w:tcPr>
+            <w:tcW w:w="1785" w:type="dxa"/>
+            <w:tcBorders>
+              <w:top w:val="single" w:sz="7" w:space="0" w:color="D1D5DB"/>
+              <w:left w:val="single" w:sz="7" w:space="0" w:color="D1D5DB"/>
+              <w:bottom w:val="single" w:sz="7" w:space="0" w:color="D1D5DB"/>
+              <w:right w:val="single" w:sz="7" w:space="0" w:color="D1D5DB"/>
+            </w:tcBorders>
+            <w:vAlign w:val="center"/>
+          </w:tcPr>
+          <w:p>
+            <w:pPr>
+              <w:keepNext w:val="0"/>
+              <w:widowControl w:val="0"/>
+              <w:shd w:val="clear" w:color="auto" w:fill="FFFFFF" w:themeFill="background1"/>
+              <w:spacing w:after="0"/>
+              <w:jc w:val="right"/>
+            </w:pPr>
             <w:r>
               <w:rPr>
                 <w:b/>
                 <w:bCs/>
                 <w:color w:val="111827"/>
               </w:rPr>
-              <w:t>:</w:t>
-            </w:r>
-          </w:p>
-        </w:tc>
-        <w:tc>
-          <w:tcPr>
-            <w:tcW w:w="1785" w:type="dxa"/>
-            <w:tcBorders>
-              <w:top w:val="single" w:sz="7" w:space="0" w:color="D1D5DB"/>
-              <w:left w:val="single" w:sz="7" w:space="0" w:color="D1D5DB"/>
-              <w:bottom w:val="single" w:sz="7" w:space="0" w:color="D1D5DB"/>
-              <w:right w:val="single" w:sz="7" w:space="0" w:color="D1D5DB"/>
-            </w:tcBorders>
-            <w:vAlign w:val="center"/>
-          </w:tcPr>
-          <w:p>
-            <w:pPr>
-              <w:shd w:val="clear" w:color="auto" w:fill="FFFFFF" w:themeFill="background1"/>
-              <w:spacing w:after="0"/>
-              <w:jc w:val="right"/>
-            </w:pPr>
-            <w:r>
-              <w:rPr>
-                <w:b/>
-                <w:bCs/>
-                <w:color w:val="111827"/>
-              </w:rPr>
               <w:t>250,00 €</w:t>
             </w:r>
           </w:p>
@@ -4457,6 +4374,8 @@
     <w:p>
       <w:pPr>
         <w:pStyle w:val="Heading5"/>
+        <w:keepNext w:val="0"/>
+        <w:widowControl w:val="0"/>
         <w:spacing w:before="324" w:after="0"/>
         <w:ind w:left="1412"/>
         <w:rPr>
@@ -4506,6 +4425,8 @@
           </w:tcPr>
           <w:p>
             <w:pPr>
+              <w:keepNext w:val="0"/>
+              <w:widowControl w:val="0"/>
               <w:shd w:val="clear" w:color="auto" w:fill="FFFFFF" w:themeFill="background1"/>
               <w:spacing w:after="0"/>
               <w:jc w:val="center"/>
@@ -4534,6 +4455,8 @@
           </w:tcPr>
           <w:p>
             <w:pPr>
+              <w:keepNext w:val="0"/>
+              <w:widowControl w:val="0"/>
               <w:shd w:val="clear" w:color="auto" w:fill="FFFFFF" w:themeFill="background1"/>
               <w:spacing w:after="0"/>
               <w:jc w:val="center"/>
@@ -4578,6 +4501,8 @@
           </w:tcPr>
           <w:p>
             <w:pPr>
+              <w:keepNext w:val="0"/>
+              <w:widowControl w:val="0"/>
               <w:shd w:val="clear" w:color="auto" w:fill="FFFFFF" w:themeFill="background1"/>
               <w:spacing w:after="0"/>
               <w:jc w:val="center"/>
@@ -4610,6 +4535,8 @@
           </w:tcPr>
           <w:p>
             <w:pPr>
+              <w:keepNext w:val="0"/>
+              <w:widowControl w:val="0"/>
               <w:shd w:val="clear" w:color="auto" w:fill="FFFFFF" w:themeFill="background1"/>
               <w:spacing w:after="0"/>
             </w:pPr>
@@ -4634,6 +4561,8 @@
           </w:tcPr>
           <w:p>
             <w:pPr>
+              <w:keepNext w:val="0"/>
+              <w:widowControl w:val="0"/>
               <w:shd w:val="clear" w:color="auto" w:fill="FFFFFF" w:themeFill="background1"/>
               <w:spacing w:after="0"/>
             </w:pPr>
@@ -4658,6 +4587,8 @@
           </w:tcPr>
           <w:p>
             <w:pPr>
+              <w:keepNext w:val="0"/>
+              <w:widowControl w:val="0"/>
               <w:shd w:val="clear" w:color="auto" w:fill="FFFFFF" w:themeFill="background1"/>
               <w:spacing w:after="0"/>
             </w:pPr>
@@ -4687,6 +4618,8 @@
           </w:tcPr>
           <w:p>
             <w:pPr>
+              <w:keepNext w:val="0"/>
+              <w:widowControl w:val="0"/>
               <w:shd w:val="clear" w:color="auto" w:fill="FFFFFF" w:themeFill="background1"/>
               <w:spacing w:after="0"/>
               <w:rPr>
@@ -4728,6 +4661,8 @@
           </w:tcPr>
           <w:p>
             <w:pPr>
+              <w:keepNext w:val="0"/>
+              <w:widowControl w:val="0"/>
               <w:shd w:val="clear" w:color="auto" w:fill="FFFFFF" w:themeFill="background1"/>
               <w:spacing w:after="0"/>
             </w:pPr>
@@ -4752,6 +4687,8 @@
           </w:tcPr>
           <w:p>
             <w:pPr>
+              <w:keepNext w:val="0"/>
+              <w:widowControl w:val="0"/>
               <w:shd w:val="clear" w:color="auto" w:fill="FFFFFF" w:themeFill="background1"/>
               <w:spacing w:after="0"/>
             </w:pPr>
@@ -4781,6 +4718,8 @@
           </w:tcPr>
           <w:p>
             <w:pPr>
+              <w:keepNext w:val="0"/>
+              <w:widowControl w:val="0"/>
               <w:shd w:val="clear" w:color="auto" w:fill="FFFFFF" w:themeFill="background1"/>
               <w:spacing w:after="0"/>
               <w:rPr>
@@ -4808,6 +4747,8 @@
           </w:tcPr>
           <w:p>
             <w:pPr>
+              <w:keepNext w:val="0"/>
+              <w:widowControl w:val="0"/>
               <w:shd w:val="clear" w:color="auto" w:fill="FFFFFF" w:themeFill="background1"/>
               <w:spacing w:after="0"/>
             </w:pPr>
@@ -4832,6 +4773,8 @@
           </w:tcPr>
           <w:p>
             <w:pPr>
+              <w:keepNext w:val="0"/>
+              <w:widowControl w:val="0"/>
               <w:shd w:val="clear" w:color="auto" w:fill="FFFFFF" w:themeFill="background1"/>
               <w:spacing w:after="0"/>
             </w:pPr>
@@ -4861,6 +4804,8 @@
           </w:tcPr>
           <w:p>
             <w:pPr>
+              <w:keepNext w:val="0"/>
+              <w:widowControl w:val="0"/>
               <w:shd w:val="clear" w:color="auto" w:fill="FFFFFF" w:themeFill="background1"/>
               <w:spacing w:after="0"/>
             </w:pPr>
@@ -4885,6 +4830,8 @@
           </w:tcPr>
           <w:p>
             <w:pPr>
+              <w:keepNext w:val="0"/>
+              <w:widowControl w:val="0"/>
               <w:shd w:val="clear" w:color="auto" w:fill="FFFFFF" w:themeFill="background1"/>
               <w:spacing w:after="0"/>
             </w:pPr>
@@ -4909,6 +4856,8 @@
           </w:tcPr>
           <w:p>
             <w:pPr>
+              <w:keepNext w:val="0"/>
+              <w:widowControl w:val="0"/>
               <w:shd w:val="clear" w:color="auto" w:fill="FFFFFF" w:themeFill="background1"/>
               <w:spacing w:after="0"/>
             </w:pPr>
@@ -4938,34 +4887,55 @@
           </w:tcPr>
           <w:p>
             <w:pPr>
+              <w:keepNext w:val="0"/>
+              <w:widowControl w:val="0"/>
               <w:shd w:val="clear" w:color="auto" w:fill="FFFFFF" w:themeFill="background1"/>
               <w:spacing w:after="0"/>
               <w:ind w:left="1080"/>
               <w:jc w:val="right"/>
             </w:pPr>
-            <w:proofErr w:type="gramStart"/>
             <w:r>
               <w:rPr>
                 <w:b/>
                 <w:bCs/>
                 <w:color w:val="111827"/>
               </w:rPr>
-              <w:t>Total</w:t>
-            </w:r>
-            <w:proofErr w:type="gramEnd"/>
+              <w:t>Total Desarrollo</w:t>
+            </w:r>
+          </w:p>
+        </w:tc>
+        <w:tc>
+          <w:tcPr>
+            <w:tcW w:w="2368" w:type="dxa"/>
+            <w:tcBorders>
+              <w:top w:val="single" w:sz="7" w:space="0" w:color="D1D5DB"/>
+              <w:left w:val="single" w:sz="7" w:space="0" w:color="D1D5DB"/>
+              <w:bottom w:val="single" w:sz="7" w:space="0" w:color="D1D5DB"/>
+              <w:right w:val="single" w:sz="7" w:space="0" w:color="D1D5DB"/>
+            </w:tcBorders>
+            <w:vAlign w:val="center"/>
+          </w:tcPr>
+          <w:p>
+            <w:pPr>
+              <w:keepNext w:val="0"/>
+              <w:widowControl w:val="0"/>
+              <w:shd w:val="clear" w:color="auto" w:fill="FFFFFF" w:themeFill="background1"/>
+              <w:spacing w:after="0"/>
+              <w:jc w:val="right"/>
+            </w:pPr>
             <w:r>
               <w:rPr>
                 <w:b/>
                 <w:bCs/>
                 <w:color w:val="111827"/>
               </w:rPr>
-              <w:t xml:space="preserve"> Desarrollo</w:t>
-            </w:r>
-          </w:p>
-        </w:tc>
-        <w:tc>
-          <w:tcPr>
-            <w:tcW w:w="2368" w:type="dxa"/>
+              <w:t>150 h</w:t>
+            </w:r>
+          </w:p>
+        </w:tc>
+        <w:tc>
+          <w:tcPr>
+            <w:tcW w:w="2369" w:type="dxa"/>
             <w:tcBorders>
               <w:top w:val="single" w:sz="7" w:space="0" w:color="D1D5DB"/>
               <w:left w:val="single" w:sz="7" w:space="0" w:color="D1D5DB"/>
@@ -4976,6 +4946,8 @@
           </w:tcPr>
           <w:p>
             <w:pPr>
+              <w:keepNext w:val="0"/>
+              <w:widowControl w:val="0"/>
               <w:shd w:val="clear" w:color="auto" w:fill="FFFFFF" w:themeFill="background1"/>
               <w:spacing w:after="0"/>
               <w:jc w:val="right"/>
@@ -4986,33 +4958,6 @@
                 <w:bCs/>
                 <w:color w:val="111827"/>
               </w:rPr>
-              <w:t>150 h</w:t>
-            </w:r>
-          </w:p>
-        </w:tc>
-        <w:tc>
-          <w:tcPr>
-            <w:tcW w:w="2369" w:type="dxa"/>
-            <w:tcBorders>
-              <w:top w:val="single" w:sz="7" w:space="0" w:color="D1D5DB"/>
-              <w:left w:val="single" w:sz="7" w:space="0" w:color="D1D5DB"/>
-              <w:bottom w:val="single" w:sz="7" w:space="0" w:color="D1D5DB"/>
-              <w:right w:val="single" w:sz="7" w:space="0" w:color="D1D5DB"/>
-            </w:tcBorders>
-            <w:vAlign w:val="center"/>
-          </w:tcPr>
-          <w:p>
-            <w:pPr>
-              <w:shd w:val="clear" w:color="auto" w:fill="FFFFFF" w:themeFill="background1"/>
-              <w:spacing w:after="0"/>
-              <w:jc w:val="right"/>
-            </w:pPr>
-            <w:r>
-              <w:rPr>
-                <w:b/>
-                <w:bCs/>
-                <w:color w:val="111827"/>
-              </w:rPr>
               <w:t>2.700,00 €</w:t>
             </w:r>
           </w:p>
@@ -5022,6 +4967,8 @@
     <w:p>
       <w:pPr>
         <w:pStyle w:val="Heading5"/>
+        <w:keepNext w:val="0"/>
+        <w:widowControl w:val="0"/>
         <w:spacing w:before="324" w:after="0"/>
         <w:ind w:left="1412"/>
         <w:rPr>
@@ -5041,23 +4988,7 @@
           <w:color w:val="303741"/>
           <w:sz w:val="24"/>
         </w:rPr>
-        <w:t>.5.2.3. Costes de Mantenimiento Anual (</w:t>
-      </w:r>
-      <w:proofErr w:type="gramStart"/>
-      <w:r>
-        <w:rPr>
-          <w:color w:val="303741"/>
-          <w:sz w:val="24"/>
-        </w:rPr>
-        <w:t>Post-Desarrollo</w:t>
-      </w:r>
-      <w:proofErr w:type="gramEnd"/>
-      <w:r>
-        <w:rPr>
-          <w:color w:val="303741"/>
-          <w:sz w:val="24"/>
-        </w:rPr>
-        <w:t>)</w:t>
+        <w:t>.5.2.3. Costes de Mantenimiento Anual (Post-Desarrollo)</w:t>
       </w:r>
     </w:p>
     <w:tbl>
@@ -5094,6 +5025,8 @@
           </w:tcPr>
           <w:p>
             <w:pPr>
+              <w:keepNext w:val="0"/>
+              <w:widowControl w:val="0"/>
               <w:shd w:val="clear" w:color="auto" w:fill="FFFFFF" w:themeFill="background1"/>
               <w:spacing w:after="0"/>
               <w:jc w:val="center"/>
@@ -5122,6 +5055,8 @@
           </w:tcPr>
           <w:p>
             <w:pPr>
+              <w:keepNext w:val="0"/>
+              <w:widowControl w:val="0"/>
               <w:shd w:val="clear" w:color="auto" w:fill="FFFFFF" w:themeFill="background1"/>
               <w:spacing w:after="0"/>
               <w:jc w:val="center"/>
@@ -5150,6 +5085,8 @@
           </w:tcPr>
           <w:p>
             <w:pPr>
+              <w:keepNext w:val="0"/>
+              <w:widowControl w:val="0"/>
               <w:shd w:val="clear" w:color="auto" w:fill="FFFFFF" w:themeFill="background1"/>
               <w:spacing w:after="0"/>
               <w:jc w:val="center"/>
@@ -5182,6 +5119,8 @@
           </w:tcPr>
           <w:p>
             <w:pPr>
+              <w:keepNext w:val="0"/>
+              <w:widowControl w:val="0"/>
               <w:shd w:val="clear" w:color="auto" w:fill="FFFFFF" w:themeFill="background1"/>
               <w:spacing w:after="0"/>
             </w:pPr>
@@ -5208,6 +5147,8 @@
           </w:tcPr>
           <w:p>
             <w:pPr>
+              <w:keepNext w:val="0"/>
+              <w:widowControl w:val="0"/>
               <w:shd w:val="clear" w:color="auto" w:fill="FFFFFF" w:themeFill="background1"/>
               <w:spacing w:after="0"/>
             </w:pPr>
@@ -5232,6 +5173,8 @@
           </w:tcPr>
           <w:p>
             <w:pPr>
+              <w:keepNext w:val="0"/>
+              <w:widowControl w:val="0"/>
               <w:shd w:val="clear" w:color="auto" w:fill="FFFFFF" w:themeFill="background1"/>
               <w:spacing w:after="0"/>
             </w:pPr>
@@ -5261,6 +5204,8 @@
           </w:tcPr>
           <w:p>
             <w:pPr>
+              <w:keepNext w:val="0"/>
+              <w:widowControl w:val="0"/>
               <w:shd w:val="clear" w:color="auto" w:fill="FFFFFF" w:themeFill="background1"/>
               <w:spacing w:after="0"/>
             </w:pPr>
@@ -5287,6 +5232,8 @@
           </w:tcPr>
           <w:p>
             <w:pPr>
+              <w:keepNext w:val="0"/>
+              <w:widowControl w:val="0"/>
               <w:shd w:val="clear" w:color="auto" w:fill="FFFFFF" w:themeFill="background1"/>
               <w:spacing w:after="0"/>
             </w:pPr>
@@ -5311,6 +5258,8 @@
           </w:tcPr>
           <w:p>
             <w:pPr>
+              <w:keepNext w:val="0"/>
+              <w:widowControl w:val="0"/>
               <w:shd w:val="clear" w:color="auto" w:fill="FFFFFF" w:themeFill="background1"/>
               <w:spacing w:after="0"/>
             </w:pPr>
@@ -5340,6 +5289,8 @@
           </w:tcPr>
           <w:p>
             <w:pPr>
+              <w:keepNext w:val="0"/>
+              <w:widowControl w:val="0"/>
               <w:shd w:val="clear" w:color="auto" w:fill="FFFFFF" w:themeFill="background1"/>
               <w:spacing w:after="0"/>
             </w:pPr>
@@ -5366,6 +5317,8 @@
           </w:tcPr>
           <w:p>
             <w:pPr>
+              <w:keepNext w:val="0"/>
+              <w:widowControl w:val="0"/>
               <w:shd w:val="clear" w:color="auto" w:fill="FFFFFF" w:themeFill="background1"/>
               <w:spacing w:after="0"/>
               <w:rPr>
@@ -5399,6 +5352,8 @@
           </w:tcPr>
           <w:p>
             <w:pPr>
+              <w:keepNext w:val="0"/>
+              <w:widowControl w:val="0"/>
               <w:shd w:val="clear" w:color="auto" w:fill="FFFFFF" w:themeFill="background1"/>
               <w:spacing w:after="0"/>
             </w:pPr>
@@ -5429,6 +5384,8 @@
           </w:tcPr>
           <w:p>
             <w:pPr>
+              <w:keepNext w:val="0"/>
+              <w:widowControl w:val="0"/>
               <w:shd w:val="clear" w:color="auto" w:fill="FFFFFF" w:themeFill="background1"/>
               <w:spacing w:after="0"/>
               <w:ind w:left="1080"/>
@@ -5439,23 +5396,13 @@
                 <w:color w:val="111827"/>
               </w:rPr>
             </w:pPr>
-            <w:proofErr w:type="gramStart"/>
             <w:r>
               <w:rPr>
                 <w:b/>
                 <w:bCs/>
                 <w:color w:val="111827"/>
               </w:rPr>
-              <w:t>Total</w:t>
-            </w:r>
-            <w:proofErr w:type="gramEnd"/>
-            <w:r>
-              <w:rPr>
-                <w:b/>
-                <w:bCs/>
-                <w:color w:val="111827"/>
-              </w:rPr>
-              <w:t xml:space="preserve"> Mantenimiento Anual</w:t>
+              <w:t>Total Mantenimiento Anual</w:t>
             </w:r>
           </w:p>
         </w:tc>
@@ -5472,6 +5419,8 @@
           </w:tcPr>
           <w:p>
             <w:pPr>
+              <w:keepNext w:val="0"/>
+              <w:widowControl w:val="0"/>
               <w:shd w:val="clear" w:color="auto" w:fill="FFFFFF" w:themeFill="background1"/>
               <w:spacing w:after="0"/>
               <w:jc w:val="right"/>
@@ -5575,6 +5524,8 @@
     <w:p>
       <w:pPr>
         <w:pStyle w:val="Heading2"/>
+        <w:keepNext w:val="0"/>
+        <w:widowControl w:val="0"/>
         <w:pBdr>
           <w:bottom w:val="single" w:sz="7" w:space="0" w:color="374151"/>
         </w:pBdr>
@@ -5597,6 +5548,8 @@
     <w:p>
       <w:pPr>
         <w:pStyle w:val="Heading3"/>
+        <w:keepNext w:val="0"/>
+        <w:widowControl w:val="0"/>
         <w:pBdr>
           <w:bottom w:val="single" w:sz="7" w:space="0" w:color="D1D5DB"/>
         </w:pBdr>
@@ -5612,6 +5565,8 @@
     </w:p>
     <w:p>
       <w:pPr>
+        <w:keepNext w:val="0"/>
+        <w:widowControl w:val="0"/>
         <w:shd w:val="clear" w:color="auto" w:fill="FFFFFF" w:themeFill="background1"/>
         <w:spacing w:after="48"/>
         <w:ind w:left="360"/>
@@ -5629,6 +5584,7 @@
     <w:p>
       <w:pPr>
         <w:pStyle w:val="Heading4"/>
+        <w:widowControl w:val="0"/>
         <w:shd w:val="clear" w:color="auto" w:fill="FFFFFF" w:themeFill="background1"/>
         <w:spacing w:before="360" w:after="120"/>
         <w:ind w:left="720"/>
@@ -7268,16 +7224,8 @@
               <w:rPr>
                 <w:color w:val="1F2937"/>
               </w:rPr>
-              <w:t>Usuario no registrado que accede a la parte pública (</w:t>
-            </w:r>
-            <w:proofErr w:type="gramStart"/>
-            <w:r>
-              <w:rPr>
-                <w:color w:val="1F2937"/>
-              </w:rPr>
-              <w:t>portfolio</w:t>
-            </w:r>
-            <w:proofErr w:type="gramEnd"/>
+              <w:t>Usuario no registrado que accede a la parte pública (portfolio</w:t>
+            </w:r>
             <w:r>
               <w:rPr>
                 <w:color w:val="1F2937"/>
@@ -7745,28 +7693,35 @@
         <w:spacing w:after="0"/>
         <w:ind w:left="720"/>
         <w:jc w:val="center"/>
+        <w:rPr>
+          <w:rFonts w:ascii="Segoe UI" w:eastAsia="Segoe UI" w:hAnsi="Segoe UI" w:cs="Segoe UI"/>
+          <w:i/>
+          <w:iCs/>
+          <w:color w:val="6B7280"/>
+          <w:sz w:val="24"/>
+        </w:rPr>
       </w:pPr>
       <w:r>
         <w:rPr>
           <w:noProof/>
         </w:rPr>
         <w:drawing>
-          <wp:inline distT="0" distB="0" distL="0" distR="0" wp14:anchorId="5879F874" wp14:editId="477E8433">
-            <wp:extent cx="342900" cy="342900"/>
-            <wp:effectExtent l="0" t="0" r="0" b="0"/>
-            <wp:docPr id="351005434" name="drawing" descr="F,{003da8fa-7c6e-49d5-a4ad-5e7a175ee2a1}{70},12.604167,12.604167"/>
+          <wp:inline distT="0" distB="0" distL="0" distR="0" wp14:anchorId="5879F874" wp14:editId="76818F15">
+            <wp:extent cx="5192587" cy="3552825"/>
+            <wp:effectExtent l="0" t="0" r="8255" b="0"/>
+            <wp:docPr id="351005434" name="drawing"/>
             <wp:cNvGraphicFramePr>
-              <a:graphicFrameLocks xmlns:a="http://schemas.openxmlformats.org/drawingml/2006/main"/>
+              <a:graphicFrameLocks xmlns:a="http://schemas.openxmlformats.org/drawingml/2006/main" noChangeAspect="1"/>
             </wp:cNvGraphicFramePr>
             <a:graphic xmlns:a="http://schemas.openxmlformats.org/drawingml/2006/main">
               <a:graphicData uri="http://schemas.openxmlformats.org/drawingml/2006/picture">
                 <pic:pic xmlns:pic="http://schemas.openxmlformats.org/drawingml/2006/picture">
                   <pic:nvPicPr>
-                    <pic:cNvPr id="0" name=""/>
+                    <pic:cNvPr id="351005434" name="drawing"/>
                     <pic:cNvPicPr/>
                   </pic:nvPicPr>
                   <pic:blipFill>
-                    <a:blip r:embed="rId77">
+                    <a:blip r:embed="rId77" cstate="print">
                       <a:extLst>
                         <a:ext uri="{28A0092B-C50C-407E-A947-70E740481C1C}">
                           <a14:useLocalDpi xmlns:a14="http://schemas.microsoft.com/office/drawing/2010/main" val="0"/>
@@ -7780,7 +7735,7 @@
                   <pic:spPr>
                     <a:xfrm>
                       <a:off x="0" y="0"/>
-                      <a:ext cx="342900" cy="342900"/>
+                      <a:ext cx="5249411" cy="3591705"/>
                     </a:xfrm>
                     <a:prstGeom prst="rect">
                       <a:avLst/>
@@ -7792,6 +7747,14 @@
           </wp:inline>
         </w:drawing>
       </w:r>
+    </w:p>
+    <w:p>
+      <w:pPr>
+        <w:shd w:val="clear" w:color="auto" w:fill="FFFFFF" w:themeFill="background1"/>
+        <w:spacing w:after="0"/>
+        <w:ind w:left="720"/>
+        <w:jc w:val="center"/>
+      </w:pPr>
       <w:r>
         <w:rPr>
           <w:rFonts w:ascii="Segoe UI" w:eastAsia="Segoe UI" w:hAnsi="Segoe UI" w:cs="Segoe UI"/>
@@ -7802,6 +7765,23 @@
         </w:rPr>
         <w:t>Figura 3. Diagrama de Casos de Uso del Sistema</w:t>
       </w:r>
+    </w:p>
+    <w:p>
+      <w:pPr>
+        <w:pStyle w:val="Heading4"/>
+        <w:widowControl w:val="0"/>
+        <w:shd w:val="clear" w:color="auto" w:fill="FFFFFF" w:themeFill="background1"/>
+        <w:spacing w:before="360" w:after="120"/>
+        <w:rPr>
+          <w:rFonts w:ascii="Segoe UI" w:eastAsia="Segoe UI" w:hAnsi="Segoe UI" w:cs="Segoe UI"/>
+          <w:b/>
+          <w:bCs/>
+          <w:i w:val="0"/>
+          <w:iCs w:val="0"/>
+          <w:color w:val="000000" w:themeColor="text1"/>
+          <w:sz w:val="24"/>
+        </w:rPr>
+      </w:pPr>
     </w:p>
     <w:p>
       <w:pPr>
@@ -7810,6 +7790,8 @@
         <w:shd w:val="clear" w:color="auto" w:fill="FFFFFF" w:themeFill="background1"/>
         <w:spacing w:before="360" w:after="120"/>
         <w:ind w:left="720"/>
+      </w:pPr>
+      <w:r>
         <w:rPr>
           <w:rFonts w:ascii="Segoe UI" w:eastAsia="Segoe UI" w:hAnsi="Segoe UI" w:cs="Segoe UI"/>
           <w:b/>
@@ -7819,170 +7801,7 @@
           <w:color w:val="000000" w:themeColor="text1"/>
           <w:sz w:val="24"/>
         </w:rPr>
-      </w:pPr>
-    </w:p>
-    <w:p>
-      <w:pPr>
-        <w:pStyle w:val="Heading4"/>
-        <w:widowControl w:val="0"/>
-        <w:shd w:val="clear" w:color="auto" w:fill="FFFFFF" w:themeFill="background1"/>
-        <w:spacing w:before="360" w:after="120"/>
-        <w:ind w:left="720"/>
-        <w:rPr>
-          <w:rFonts w:ascii="Segoe UI" w:eastAsia="Segoe UI" w:hAnsi="Segoe UI" w:cs="Segoe UI"/>
-          <w:b/>
-          <w:bCs/>
-          <w:i w:val="0"/>
-          <w:iCs w:val="0"/>
-          <w:color w:val="000000" w:themeColor="text1"/>
-          <w:sz w:val="24"/>
-        </w:rPr>
-      </w:pPr>
-    </w:p>
-    <w:p>
-      <w:pPr>
-        <w:pStyle w:val="Heading4"/>
-        <w:widowControl w:val="0"/>
-        <w:shd w:val="clear" w:color="auto" w:fill="FFFFFF" w:themeFill="background1"/>
-        <w:spacing w:before="360" w:after="120"/>
-        <w:ind w:left="720"/>
-        <w:rPr>
-          <w:rFonts w:ascii="Segoe UI" w:eastAsia="Segoe UI" w:hAnsi="Segoe UI" w:cs="Segoe UI"/>
-          <w:b/>
-          <w:bCs/>
-          <w:i w:val="0"/>
-          <w:iCs w:val="0"/>
-          <w:color w:val="000000" w:themeColor="text1"/>
-          <w:sz w:val="24"/>
-        </w:rPr>
-      </w:pPr>
-    </w:p>
-    <w:p>
-      <w:pPr>
-        <w:pStyle w:val="Heading4"/>
-        <w:widowControl w:val="0"/>
-        <w:shd w:val="clear" w:color="auto" w:fill="FFFFFF" w:themeFill="background1"/>
-        <w:spacing w:before="360" w:after="120"/>
-        <w:ind w:left="720"/>
-        <w:rPr>
-          <w:rFonts w:ascii="Segoe UI" w:eastAsia="Segoe UI" w:hAnsi="Segoe UI" w:cs="Segoe UI"/>
-          <w:b/>
-          <w:bCs/>
-          <w:i w:val="0"/>
-          <w:iCs w:val="0"/>
-          <w:color w:val="000000" w:themeColor="text1"/>
-          <w:sz w:val="24"/>
-        </w:rPr>
-      </w:pPr>
-    </w:p>
-    <w:p>
-      <w:pPr>
-        <w:pStyle w:val="Heading4"/>
-        <w:widowControl w:val="0"/>
-        <w:shd w:val="clear" w:color="auto" w:fill="FFFFFF" w:themeFill="background1"/>
-        <w:spacing w:before="360" w:after="120"/>
-        <w:ind w:left="720"/>
-        <w:rPr>
-          <w:rFonts w:ascii="Segoe UI" w:eastAsia="Segoe UI" w:hAnsi="Segoe UI" w:cs="Segoe UI"/>
-          <w:b/>
-          <w:bCs/>
-          <w:i w:val="0"/>
-          <w:iCs w:val="0"/>
-          <w:color w:val="000000" w:themeColor="text1"/>
-          <w:sz w:val="24"/>
-        </w:rPr>
-      </w:pPr>
-    </w:p>
-    <w:p>
-      <w:pPr>
-        <w:pStyle w:val="Heading4"/>
-        <w:widowControl w:val="0"/>
-        <w:shd w:val="clear" w:color="auto" w:fill="FFFFFF" w:themeFill="background1"/>
-        <w:spacing w:before="360" w:after="120"/>
-        <w:ind w:left="720"/>
-        <w:rPr>
-          <w:rFonts w:ascii="Segoe UI" w:eastAsia="Segoe UI" w:hAnsi="Segoe UI" w:cs="Segoe UI"/>
-          <w:b/>
-          <w:bCs/>
-          <w:i w:val="0"/>
-          <w:iCs w:val="0"/>
-          <w:color w:val="000000" w:themeColor="text1"/>
-          <w:sz w:val="24"/>
-        </w:rPr>
-      </w:pPr>
-    </w:p>
-    <w:p>
-      <w:pPr>
-        <w:pStyle w:val="Heading4"/>
-        <w:widowControl w:val="0"/>
-        <w:shd w:val="clear" w:color="auto" w:fill="FFFFFF" w:themeFill="background1"/>
-        <w:spacing w:before="360" w:after="120"/>
-        <w:ind w:left="720"/>
-        <w:rPr>
-          <w:rFonts w:ascii="Segoe UI" w:eastAsia="Segoe UI" w:hAnsi="Segoe UI" w:cs="Segoe UI"/>
-          <w:b/>
-          <w:bCs/>
-          <w:i w:val="0"/>
-          <w:iCs w:val="0"/>
-          <w:color w:val="000000" w:themeColor="text1"/>
-          <w:sz w:val="24"/>
-        </w:rPr>
-      </w:pPr>
-    </w:p>
-    <w:p>
-      <w:pPr>
-        <w:pStyle w:val="Heading4"/>
-        <w:widowControl w:val="0"/>
-        <w:shd w:val="clear" w:color="auto" w:fill="FFFFFF" w:themeFill="background1"/>
-        <w:spacing w:before="360" w:after="120"/>
-        <w:ind w:left="720"/>
-        <w:rPr>
-          <w:rFonts w:ascii="Segoe UI" w:eastAsia="Segoe UI" w:hAnsi="Segoe UI" w:cs="Segoe UI"/>
-          <w:b/>
-          <w:bCs/>
-          <w:i w:val="0"/>
-          <w:iCs w:val="0"/>
-          <w:color w:val="000000" w:themeColor="text1"/>
-          <w:sz w:val="24"/>
-        </w:rPr>
-      </w:pPr>
-    </w:p>
-    <w:p>
-      <w:pPr>
-        <w:pStyle w:val="Heading4"/>
-        <w:widowControl w:val="0"/>
-        <w:shd w:val="clear" w:color="auto" w:fill="FFFFFF" w:themeFill="background1"/>
-        <w:spacing w:before="360" w:after="120"/>
-        <w:ind w:left="720"/>
-        <w:rPr>
-          <w:rFonts w:ascii="Segoe UI" w:eastAsia="Segoe UI" w:hAnsi="Segoe UI" w:cs="Segoe UI"/>
-          <w:b/>
-          <w:bCs/>
-          <w:i w:val="0"/>
-          <w:iCs w:val="0"/>
-          <w:color w:val="000000" w:themeColor="text1"/>
-          <w:sz w:val="24"/>
-        </w:rPr>
-      </w:pPr>
-    </w:p>
-    <w:p>
-      <w:pPr>
-        <w:pStyle w:val="Heading4"/>
-        <w:widowControl w:val="0"/>
-        <w:shd w:val="clear" w:color="auto" w:fill="FFFFFF" w:themeFill="background1"/>
-        <w:spacing w:before="360" w:after="120"/>
-        <w:ind w:left="720"/>
-      </w:pPr>
-      <w:r>
-        <w:rPr>
-          <w:rFonts w:ascii="Segoe UI" w:eastAsia="Segoe UI" w:hAnsi="Segoe UI" w:cs="Segoe UI"/>
-          <w:b/>
-          <w:bCs/>
-          <w:i w:val="0"/>
-          <w:iCs w:val="0"/>
-          <w:color w:val="000000" w:themeColor="text1"/>
-          <w:sz w:val="24"/>
-        </w:rPr>
+        <w:lastRenderedPageBreak/>
         <w:t>2.3.2. Especificación de Casos de Uso</w:t>
       </w:r>
     </w:p>
@@ -8167,7 +7986,25 @@
               <w:rPr>
                 <w:color w:val="1F2937"/>
               </w:rPr>
-              <w:t>Crear una cuenta segura, para acceder a un catálogo de funciones más extenso del club.</w:t>
+              <w:t>Crear una cuenta segura, para acceder a un catálogo de funciones</w:t>
+            </w:r>
+            <w:r>
+              <w:rPr>
+                <w:color w:val="1F2937"/>
+              </w:rPr>
+              <w:t xml:space="preserve"> </w:t>
+            </w:r>
+            <w:r>
+              <w:rPr>
+                <w:color w:val="1F2937"/>
+              </w:rPr>
+              <w:t>del club</w:t>
+            </w:r>
+            <w:r>
+              <w:rPr>
+                <w:color w:val="1F2937"/>
+              </w:rPr>
+              <w:t xml:space="preserve"> más extenso.</w:t>
             </w:r>
           </w:p>
         </w:tc>
@@ -8365,7 +8202,7 @@
             <w:tcBorders>
               <w:top w:val="single" w:sz="7" w:space="0" w:color="D1D5DB"/>
               <w:left w:val="single" w:sz="7" w:space="0" w:color="D1D5DB"/>
-              <w:bottom w:val="single" w:sz="7" w:space="0" w:color="D1D5DB"/>
+              <w:bottom w:val="single" w:sz="4" w:space="0" w:color="D1D5DB"/>
               <w:right w:val="single" w:sz="7" w:space="0" w:color="D1D5DB"/>
             </w:tcBorders>
             <w:vAlign w:val="center"/>
@@ -8391,7 +8228,7 @@
             <w:tcBorders>
               <w:top w:val="single" w:sz="7" w:space="0" w:color="D1D5DB"/>
               <w:left w:val="single" w:sz="7" w:space="0" w:color="D1D5DB"/>
-              <w:bottom w:val="single" w:sz="7" w:space="0" w:color="D1D5DB"/>
+              <w:bottom w:val="single" w:sz="4" w:space="0" w:color="D1D5DB"/>
               <w:right w:val="single" w:sz="7" w:space="0" w:color="D1D5DB"/>
             </w:tcBorders>
             <w:vAlign w:val="center"/>
@@ -8407,6 +8244,55 @@
               </w:rPr>
               <w:t>2.a Email existente: El sistema avisa y ofrece recuperar contraseña.</w:t>
             </w:r>
+          </w:p>
+        </w:tc>
+      </w:tr>
+      <w:tr>
+        <w:trPr>
+          <w:trHeight w:val="465"/>
+        </w:trPr>
+        <w:tc>
+          <w:tcPr>
+            <w:tcW w:w="1916" w:type="dxa"/>
+            <w:tcBorders>
+              <w:top w:val="single" w:sz="4" w:space="0" w:color="D1D5DB"/>
+              <w:left w:val="nil"/>
+              <w:bottom w:val="single" w:sz="4" w:space="0" w:color="D1D5DB"/>
+              <w:right w:val="nil"/>
+            </w:tcBorders>
+            <w:vAlign w:val="center"/>
+          </w:tcPr>
+          <w:p>
+            <w:pPr>
+              <w:shd w:val="clear" w:color="auto" w:fill="FFFFFF" w:themeFill="background1"/>
+              <w:spacing w:after="0"/>
+              <w:rPr>
+                <w:b/>
+                <w:bCs/>
+                <w:color w:val="111827"/>
+              </w:rPr>
+            </w:pPr>
+          </w:p>
+        </w:tc>
+        <w:tc>
+          <w:tcPr>
+            <w:tcW w:w="6975" w:type="dxa"/>
+            <w:tcBorders>
+              <w:top w:val="single" w:sz="4" w:space="0" w:color="D1D5DB"/>
+              <w:left w:val="nil"/>
+              <w:bottom w:val="single" w:sz="4" w:space="0" w:color="D1D5DB"/>
+              <w:right w:val="nil"/>
+            </w:tcBorders>
+            <w:vAlign w:val="center"/>
+          </w:tcPr>
+          <w:p>
+            <w:pPr>
+              <w:shd w:val="clear" w:color="auto" w:fill="FFFFFF" w:themeFill="background1"/>
+              <w:spacing w:after="0"/>
+              <w:rPr>
+                <w:color w:val="1F2937"/>
+              </w:rPr>
+            </w:pPr>
           </w:p>
         </w:tc>
       </w:tr>
@@ -8418,7 +8304,7 @@
           <w:tcPr>
             <w:tcW w:w="1916" w:type="dxa"/>
             <w:tcBorders>
-              <w:top w:val="single" w:sz="7" w:space="0" w:color="D1D5DB"/>
+              <w:top w:val="single" w:sz="4" w:space="0" w:color="D1D5DB"/>
               <w:left w:val="single" w:sz="7" w:space="0" w:color="D1D5DB"/>
               <w:bottom w:val="single" w:sz="7" w:space="0" w:color="D1D5DB"/>
               <w:right w:val="single" w:sz="7" w:space="0" w:color="D1D5DB"/>
@@ -8446,7 +8332,7 @@
           <w:tcPr>
             <w:tcW w:w="6975" w:type="dxa"/>
             <w:tcBorders>
-              <w:top w:val="single" w:sz="7" w:space="0" w:color="D1D5DB"/>
+              <w:top w:val="single" w:sz="4" w:space="0" w:color="D1D5DB"/>
               <w:left w:val="single" w:sz="7" w:space="0" w:color="D1D5DB"/>
               <w:bottom w:val="single" w:sz="7" w:space="0" w:color="D1D5DB"/>
               <w:right w:val="single" w:sz="7" w:space="0" w:color="D1D5DB"/>
@@ -10471,7 +10357,6 @@
         <w:widowControl w:val="0"/>
         <w:shd w:val="clear" w:color="auto" w:fill="FFFFFF" w:themeFill="background1"/>
         <w:spacing w:before="360" w:after="120"/>
-        <w:ind w:left="720"/>
         <w:rPr>
           <w:rFonts w:ascii="Segoe UI" w:eastAsia="Segoe UI" w:hAnsi="Segoe UI" w:cs="Segoe UI"/>
           <w:b/>
@@ -10490,6 +10375,8 @@
         <w:shd w:val="clear" w:color="auto" w:fill="FFFFFF" w:themeFill="background1"/>
         <w:spacing w:before="360" w:after="120"/>
         <w:ind w:left="720"/>
+      </w:pPr>
+      <w:r>
         <w:rPr>
           <w:rFonts w:ascii="Segoe UI" w:eastAsia="Segoe UI" w:hAnsi="Segoe UI" w:cs="Segoe UI"/>
           <w:b/>
@@ -10499,26 +10386,7 @@
           <w:color w:val="000000" w:themeColor="text1"/>
           <w:sz w:val="24"/>
         </w:rPr>
-      </w:pPr>
-    </w:p>
-    <w:p>
-      <w:pPr>
-        <w:pStyle w:val="Heading4"/>
-        <w:widowControl w:val="0"/>
-        <w:shd w:val="clear" w:color="auto" w:fill="FFFFFF" w:themeFill="background1"/>
-        <w:spacing w:before="360" w:after="120"/>
-        <w:ind w:left="720"/>
-      </w:pPr>
-      <w:r>
-        <w:rPr>
-          <w:rFonts w:ascii="Segoe UI" w:eastAsia="Segoe UI" w:hAnsi="Segoe UI" w:cs="Segoe UI"/>
-          <w:b/>
-          <w:bCs/>
-          <w:i w:val="0"/>
-          <w:iCs w:val="0"/>
-          <w:color w:val="000000" w:themeColor="text1"/>
-          <w:sz w:val="24"/>
-        </w:rPr>
+        <w:lastRenderedPageBreak/>
         <w:t>2.4.3. Requisitos de Información (IRQ)</w:t>
       </w:r>
     </w:p>
@@ -11010,6 +10878,7 @@
           <w:color w:val="1F2937"/>
           <w:szCs w:val="48"/>
         </w:rPr>
+        <w:lastRenderedPageBreak/>
         <w:t>3. Diseño Tecnológico y Arquitectura</w:t>
       </w:r>
     </w:p>
@@ -11202,25 +11071,7 @@
                 <w:color w:val="212121"/>
                 <w:sz w:val="24"/>
               </w:rPr>
-              <w:t xml:space="preserve"> junto con Tailwind CSS. Se elige esta librería frente a un enfoque tradicional con PHP nativo para evitar interfaces estáticas. React permite desarrollar una aplicación web dinámica, fluida y con una experiencia de usuario muy superior, al comportarse como una “</w:t>
-            </w:r>
-            <w:proofErr w:type="gramStart"/>
-            <w:r>
-              <w:rPr>
-                <w:rFonts w:ascii="Segoe UI" w:eastAsia="Segoe UI" w:hAnsi="Segoe UI" w:cs="Segoe UI"/>
-                <w:color w:val="212121"/>
-                <w:sz w:val="24"/>
-              </w:rPr>
-              <w:t>Single</w:t>
-            </w:r>
-            <w:proofErr w:type="gramEnd"/>
-            <w:r>
-              <w:rPr>
-                <w:rFonts w:ascii="Segoe UI" w:eastAsia="Segoe UI" w:hAnsi="Segoe UI" w:cs="Segoe UI"/>
-                <w:color w:val="212121"/>
-                <w:sz w:val="24"/>
-              </w:rPr>
-              <w:t xml:space="preserve"> Page Application” (SPA).</w:t>
+              <w:t xml:space="preserve"> junto con Tailwind CSS. Se elige esta librería frente a un enfoque tradicional con PHP nativo para evitar interfaces estáticas. React permite desarrollar una aplicación web dinámica, fluida y con una experiencia de usuario muy superior, al comportarse como una “Single Page Application” (SPA).</w:t>
             </w:r>
           </w:p>
           <w:p>
@@ -11966,7 +11817,7 @@
                     <pic:cNvPicPr/>
                   </pic:nvPicPr>
                   <pic:blipFill>
-                    <a:blip r:embed="rId77">
+                    <a:blip r:embed="rId81">
                       <a:extLst>
                         <a:ext uri="{28A0092B-C50C-407E-A947-70E740481C1C}">
                           <a14:useLocalDpi xmlns:a14="http://schemas.microsoft.com/office/drawing/2010/main" val="0"/>
@@ -13035,27 +12886,86 @@
         <w:rPr>
           <w:szCs w:val="24"/>
         </w:rPr>
-        <w:t>4.3. Guion de Trabajo</w:t>
-      </w:r>
-    </w:p>
-    <w:p>
-      <w:pPr>
+        <w:t xml:space="preserve">4.3. </w:t>
+      </w:r>
+      <w:r>
+        <w:rPr>
+          <w:szCs w:val="24"/>
+        </w:rPr>
+        <w:t>Gui</w:t>
+      </w:r>
+      <w:r>
+        <w:rPr>
+          <w:szCs w:val="24"/>
+        </w:rPr>
+        <w:t>o</w:t>
+      </w:r>
+      <w:r>
+        <w:rPr>
+          <w:szCs w:val="24"/>
+        </w:rPr>
+        <w:t>n</w:t>
+      </w:r>
+      <w:r>
+        <w:rPr>
+          <w:szCs w:val="24"/>
+        </w:rPr>
+        <w:t xml:space="preserve"> de Trabajo</w:t>
+      </w:r>
+    </w:p>
+    <w:p>
+      <w:pPr>
+        <w:pStyle w:val="Heading2"/>
         <w:keepNext w:val="0"/>
         <w:widowControl w:val="0"/>
         <w:shd w:val="clear" w:color="auto" w:fill="FFFFFF" w:themeFill="background1"/>
-        <w:spacing w:after="48"/>
-        <w:ind w:left="360"/>
-        <w:jc w:val="both"/>
-      </w:pPr>
-      <w:r>
-        <w:rPr>
-          <w:rFonts w:ascii="Segoe UI" w:eastAsia="Segoe UI" w:hAnsi="Segoe UI" w:cs="Segoe UI"/>
-          <w:i/>
-          <w:iCs/>
+        <w:spacing w:before="0" w:after="360"/>
+        <w:ind w:left="357"/>
+        <w:rPr>
+          <w:rFonts w:ascii="Segoe UI" w:eastAsia="Segoe UI" w:hAnsi="Segoe UI" w:cs="Segoe UI"/>
+          <w:bCs w:val="0"/>
+          <w:i w:val="0"/>
+          <w:iCs w:val="0"/>
           <w:color w:val="212121"/>
           <w:sz w:val="24"/>
-        </w:rPr>
-        <w:t>(Pendiente: Roadmap de hitos clave para el Entregable 1).</w:t>
+          <w:szCs w:val="24"/>
+        </w:rPr>
+      </w:pPr>
+      <w:r>
+        <w:rPr>
+          <w:rFonts w:ascii="Segoe UI" w:eastAsia="Segoe UI" w:hAnsi="Segoe UI" w:cs="Segoe UI"/>
+          <w:bCs w:val="0"/>
+          <w:i w:val="0"/>
+          <w:iCs w:val="0"/>
+          <w:color w:val="212121"/>
+          <w:sz w:val="24"/>
+          <w:szCs w:val="24"/>
+        </w:rPr>
+        <w:t xml:space="preserve">A </w:t>
+      </w:r>
+      <w:r>
+        <w:rPr>
+          <w:rFonts w:ascii="Segoe UI" w:eastAsia="Segoe UI" w:hAnsi="Segoe UI" w:cs="Segoe UI"/>
+          <w:bCs w:val="0"/>
+          <w:i w:val="0"/>
+          <w:iCs w:val="0"/>
+          <w:color w:val="212121"/>
+          <w:sz w:val="24"/>
+          <w:szCs w:val="24"/>
+        </w:rPr>
+        <w:t>continuación,</w:t>
+      </w:r>
+      <w:r>
+        <w:rPr>
+          <w:rFonts w:ascii="Segoe UI" w:eastAsia="Segoe UI" w:hAnsi="Segoe UI" w:cs="Segoe UI"/>
+          <w:bCs w:val="0"/>
+          <w:i w:val="0"/>
+          <w:iCs w:val="0"/>
+          <w:color w:val="212121"/>
+          <w:sz w:val="24"/>
+          <w:szCs w:val="24"/>
+        </w:rPr>
+        <w:t xml:space="preserve"> se detalla el "Roadmap" del proyecto, desglosando las fases de la planificación temporal en tareas técnicas específicas y asignadas por semanas, para garantizar un seguimiento exhaustivo del desarrollo:</w:t>
       </w:r>
     </w:p>
     <w:p>
@@ -13063,40 +12973,868 @@
         <w:pStyle w:val="Heading2"/>
         <w:keepNext w:val="0"/>
         <w:widowControl w:val="0"/>
-        <w:pBdr>
-          <w:bottom w:val="single" w:sz="7" w:space="0" w:color="374151"/>
-        </w:pBdr>
         <w:shd w:val="clear" w:color="auto" w:fill="FFFFFF" w:themeFill="background1"/>
-        <w:spacing w:before="720" w:after="360"/>
+        <w:spacing w:before="0" w:after="360"/>
+        <w:ind w:left="357"/>
         <w:rPr>
           <w:rFonts w:ascii="Segoe UI" w:eastAsia="Segoe UI" w:hAnsi="Segoe UI" w:cs="Segoe UI"/>
           <w:b/>
           <w:i w:val="0"/>
           <w:iCs w:val="0"/>
-          <w:color w:val="1F2937"/>
-          <w:szCs w:val="48"/>
-        </w:rPr>
-      </w:pPr>
+          <w:color w:val="212121"/>
+          <w:sz w:val="24"/>
+        </w:rPr>
+      </w:pPr>
+      <w:r>
+        <w:rPr>
+          <w:rFonts w:ascii="Segoe UI" w:eastAsia="Segoe UI" w:hAnsi="Segoe UI" w:cs="Segoe UI"/>
+          <w:b/>
+          <w:i w:val="0"/>
+          <w:iCs w:val="0"/>
+          <w:color w:val="212121"/>
+          <w:sz w:val="24"/>
+        </w:rPr>
+        <w:t>Fase 1: Análisis y Diseño (Semanas 1 - 4)</w:t>
+      </w:r>
+    </w:p>
+    <w:p>
+      <w:pPr>
+        <w:pStyle w:val="Heading2"/>
+        <w:widowControl w:val="0"/>
+        <w:shd w:val="clear" w:color="auto" w:fill="FFFFFF" w:themeFill="background1"/>
+        <w:spacing w:before="0" w:after="48"/>
+        <w:ind w:left="714"/>
+        <w:rPr>
+          <w:rFonts w:ascii="Segoe UI" w:eastAsia="Segoe UI" w:hAnsi="Segoe UI" w:cs="Segoe UI"/>
+          <w:i w:val="0"/>
+          <w:iCs w:val="0"/>
+          <w:color w:val="212121"/>
+          <w:sz w:val="24"/>
+        </w:rPr>
+      </w:pPr>
+      <w:r>
+        <w:rPr>
+          <w:rFonts w:ascii="Segoe UI" w:eastAsia="Segoe UI" w:hAnsi="Segoe UI" w:cs="Segoe UI"/>
+          <w:b/>
+          <w:i w:val="0"/>
+          <w:iCs w:val="0"/>
+          <w:color w:val="212121"/>
+          <w:sz w:val="24"/>
+        </w:rPr>
+        <w:t>Semana 1-2:</w:t>
+      </w:r>
+      <w:r>
+        <w:rPr>
+          <w:rFonts w:ascii="Segoe UI" w:eastAsia="Segoe UI" w:hAnsi="Segoe UI" w:cs="Segoe UI"/>
+          <w:i w:val="0"/>
+          <w:iCs w:val="0"/>
+          <w:color w:val="212121"/>
+          <w:sz w:val="24"/>
+        </w:rPr>
+        <w:t> Toma de requisitos, análisis de competencia y elaboración de diagramas de Casos de Uso.</w:t>
+      </w:r>
+    </w:p>
+    <w:p>
+      <w:pPr>
+        <w:pStyle w:val="Heading2"/>
+        <w:widowControl w:val="0"/>
+        <w:shd w:val="clear" w:color="auto" w:fill="FFFFFF" w:themeFill="background1"/>
+        <w:spacing w:before="0" w:after="48"/>
+        <w:ind w:left="714"/>
+        <w:rPr>
+          <w:rFonts w:ascii="Segoe UI" w:eastAsia="Segoe UI" w:hAnsi="Segoe UI" w:cs="Segoe UI"/>
+          <w:i w:val="0"/>
+          <w:iCs w:val="0"/>
+          <w:color w:val="212121"/>
+          <w:sz w:val="24"/>
+        </w:rPr>
+      </w:pPr>
+      <w:r>
+        <w:rPr>
+          <w:rFonts w:ascii="Segoe UI" w:eastAsia="Segoe UI" w:hAnsi="Segoe UI" w:cs="Segoe UI"/>
+          <w:b/>
+          <w:i w:val="0"/>
+          <w:iCs w:val="0"/>
+          <w:color w:val="212121"/>
+          <w:sz w:val="24"/>
+        </w:rPr>
+        <w:t>Semana 3:</w:t>
+      </w:r>
+      <w:r>
+        <w:rPr>
+          <w:rFonts w:ascii="Segoe UI" w:eastAsia="Segoe UI" w:hAnsi="Segoe UI" w:cs="Segoe UI"/>
+          <w:i w:val="0"/>
+          <w:iCs w:val="0"/>
+          <w:color w:val="212121"/>
+          <w:sz w:val="24"/>
+        </w:rPr>
+        <w:t> Diseño del modelo Entidad-Relación y creación de los esquemas relacionales (MySQL).</w:t>
+      </w:r>
     </w:p>
     <w:p>
       <w:pPr>
         <w:pStyle w:val="Heading2"/>
         <w:keepNext w:val="0"/>
         <w:widowControl w:val="0"/>
-        <w:pBdr>
-          <w:bottom w:val="single" w:sz="7" w:space="0" w:color="374151"/>
-        </w:pBdr>
         <w:shd w:val="clear" w:color="auto" w:fill="FFFFFF" w:themeFill="background1"/>
-        <w:spacing w:before="720" w:after="360"/>
+        <w:spacing w:before="0" w:after="48"/>
+        <w:ind w:left="714"/>
+        <w:rPr>
+          <w:rFonts w:ascii="Segoe UI" w:eastAsia="Segoe UI" w:hAnsi="Segoe UI" w:cs="Segoe UI"/>
+          <w:i w:val="0"/>
+          <w:iCs w:val="0"/>
+          <w:color w:val="212121"/>
+          <w:sz w:val="24"/>
+        </w:rPr>
+      </w:pPr>
+      <w:r>
         <w:rPr>
           <w:rFonts w:ascii="Segoe UI" w:eastAsia="Segoe UI" w:hAnsi="Segoe UI" w:cs="Segoe UI"/>
           <w:b/>
           <w:i w:val="0"/>
           <w:iCs w:val="0"/>
-          <w:color w:val="1F2937"/>
-          <w:szCs w:val="48"/>
-        </w:rPr>
-      </w:pPr>
+          <w:color w:val="212121"/>
+          <w:sz w:val="24"/>
+        </w:rPr>
+        <w:t>Semana 4:</w:t>
+      </w:r>
+      <w:r>
+        <w:rPr>
+          <w:rFonts w:ascii="Segoe UI" w:eastAsia="Segoe UI" w:hAnsi="Segoe UI" w:cs="Segoe UI"/>
+          <w:i w:val="0"/>
+          <w:iCs w:val="0"/>
+          <w:color w:val="212121"/>
+          <w:sz w:val="24"/>
+        </w:rPr>
+        <w:t xml:space="preserve"> Elaboración de </w:t>
+      </w:r>
+      <w:r>
+        <w:rPr>
+          <w:rFonts w:ascii="Segoe UI" w:eastAsia="Segoe UI" w:hAnsi="Segoe UI" w:cs="Segoe UI"/>
+          <w:i w:val="0"/>
+          <w:iCs w:val="0"/>
+          <w:color w:val="212121"/>
+          <w:sz w:val="24"/>
+        </w:rPr>
+        <w:t>“W</w:t>
+      </w:r>
+      <w:r>
+        <w:rPr>
+          <w:rFonts w:ascii="Segoe UI" w:eastAsia="Segoe UI" w:hAnsi="Segoe UI" w:cs="Segoe UI"/>
+          <w:i w:val="0"/>
+          <w:iCs w:val="0"/>
+          <w:color w:val="212121"/>
+          <w:sz w:val="24"/>
+        </w:rPr>
+        <w:t>ireframes</w:t>
+      </w:r>
+      <w:r>
+        <w:rPr>
+          <w:rFonts w:ascii="Segoe UI" w:eastAsia="Segoe UI" w:hAnsi="Segoe UI" w:cs="Segoe UI"/>
+          <w:i w:val="0"/>
+          <w:iCs w:val="0"/>
+          <w:color w:val="212121"/>
+          <w:sz w:val="24"/>
+        </w:rPr>
+        <w:t>”</w:t>
+      </w:r>
+      <w:r>
+        <w:rPr>
+          <w:rFonts w:ascii="Segoe UI" w:eastAsia="Segoe UI" w:hAnsi="Segoe UI" w:cs="Segoe UI"/>
+          <w:i w:val="0"/>
+          <w:iCs w:val="0"/>
+          <w:color w:val="212121"/>
+          <w:sz w:val="24"/>
+        </w:rPr>
+        <w:t xml:space="preserve"> y </w:t>
+      </w:r>
+      <w:proofErr w:type="gramStart"/>
+      <w:r>
+        <w:rPr>
+          <w:rFonts w:ascii="Segoe UI" w:eastAsia="Segoe UI" w:hAnsi="Segoe UI" w:cs="Segoe UI"/>
+          <w:i w:val="0"/>
+          <w:iCs w:val="0"/>
+          <w:color w:val="212121"/>
+          <w:sz w:val="24"/>
+        </w:rPr>
+        <w:t>maquetado visual</w:t>
+      </w:r>
+      <w:proofErr w:type="gramEnd"/>
+      <w:r>
+        <w:rPr>
+          <w:rFonts w:ascii="Segoe UI" w:eastAsia="Segoe UI" w:hAnsi="Segoe UI" w:cs="Segoe UI"/>
+          <w:i w:val="0"/>
+          <w:iCs w:val="0"/>
+          <w:color w:val="212121"/>
+          <w:sz w:val="24"/>
+        </w:rPr>
+        <w:t xml:space="preserve"> de la interfaz de usuario en Figma</w:t>
+      </w:r>
+      <w:r>
+        <w:rPr>
+          <w:rFonts w:ascii="Segoe UI" w:eastAsia="Segoe UI" w:hAnsi="Segoe UI" w:cs="Segoe UI"/>
+          <w:i w:val="0"/>
+          <w:iCs w:val="0"/>
+          <w:color w:val="212121"/>
+          <w:sz w:val="24"/>
+        </w:rPr>
+        <w:t>.</w:t>
+      </w:r>
+      <w:r>
+        <w:rPr>
+          <w:rFonts w:ascii="Segoe UI" w:eastAsia="Segoe UI" w:hAnsi="Segoe UI" w:cs="Segoe UI"/>
+          <w:b/>
+          <w:i w:val="0"/>
+          <w:iCs w:val="0"/>
+          <w:color w:val="212121"/>
+          <w:sz w:val="24"/>
+        </w:rPr>
+        <w:t xml:space="preserve"> </w:t>
+      </w:r>
+    </w:p>
+    <w:p>
+      <w:pPr>
+        <w:pStyle w:val="Heading2"/>
+        <w:widowControl w:val="0"/>
+        <w:shd w:val="clear" w:color="auto" w:fill="FFFFFF" w:themeFill="background1"/>
+        <w:spacing w:before="0" w:after="120"/>
+        <w:rPr>
+          <w:rFonts w:ascii="Segoe UI" w:eastAsia="Segoe UI" w:hAnsi="Segoe UI" w:cs="Segoe UI"/>
+          <w:b/>
+          <w:i w:val="0"/>
+          <w:iCs w:val="0"/>
+          <w:color w:val="212121"/>
+          <w:sz w:val="24"/>
+        </w:rPr>
+      </w:pPr>
+    </w:p>
+    <w:p>
+      <w:pPr>
+        <w:pStyle w:val="Heading2"/>
+        <w:widowControl w:val="0"/>
+        <w:shd w:val="clear" w:color="auto" w:fill="FFFFFF" w:themeFill="background1"/>
+        <w:spacing w:before="0" w:after="120"/>
+        <w:ind w:firstLine="357"/>
+        <w:rPr>
+          <w:rFonts w:ascii="Segoe UI" w:eastAsia="Segoe UI" w:hAnsi="Segoe UI" w:cs="Segoe UI"/>
+          <w:i w:val="0"/>
+          <w:iCs w:val="0"/>
+          <w:color w:val="212121"/>
+          <w:sz w:val="24"/>
+        </w:rPr>
+      </w:pPr>
+      <w:r>
+        <w:rPr>
+          <w:rFonts w:ascii="Segoe UI" w:eastAsia="Segoe UI" w:hAnsi="Segoe UI" w:cs="Segoe UI"/>
+          <w:b/>
+          <w:i w:val="0"/>
+          <w:iCs w:val="0"/>
+          <w:color w:val="212121"/>
+          <w:sz w:val="24"/>
+        </w:rPr>
+        <w:t>Fase 2: Backend y Base de Datos (Semanas 5 - 8)</w:t>
+      </w:r>
+    </w:p>
+    <w:p>
+      <w:pPr>
+        <w:pStyle w:val="Heading2"/>
+        <w:widowControl w:val="0"/>
+        <w:shd w:val="clear" w:color="auto" w:fill="FFFFFF" w:themeFill="background1"/>
+        <w:spacing w:before="0" w:after="48"/>
+        <w:ind w:left="708"/>
+        <w:rPr>
+          <w:rFonts w:ascii="Segoe UI" w:eastAsia="Segoe UI" w:hAnsi="Segoe UI" w:cs="Segoe UI"/>
+          <w:i w:val="0"/>
+          <w:iCs w:val="0"/>
+          <w:color w:val="212121"/>
+          <w:sz w:val="24"/>
+        </w:rPr>
+      </w:pPr>
+      <w:r>
+        <w:rPr>
+          <w:rFonts w:ascii="Segoe UI" w:eastAsia="Segoe UI" w:hAnsi="Segoe UI" w:cs="Segoe UI"/>
+          <w:b/>
+          <w:i w:val="0"/>
+          <w:iCs w:val="0"/>
+          <w:color w:val="212121"/>
+          <w:sz w:val="24"/>
+        </w:rPr>
+        <w:t>Semana 5:</w:t>
+      </w:r>
+      <w:r>
+        <w:rPr>
+          <w:rFonts w:ascii="Segoe UI" w:eastAsia="Segoe UI" w:hAnsi="Segoe UI" w:cs="Segoe UI"/>
+          <w:i w:val="0"/>
+          <w:iCs w:val="0"/>
+          <w:color w:val="212121"/>
+          <w:sz w:val="24"/>
+        </w:rPr>
+        <w:t> Configuración del entorno (XAMPP), despliegue de la BBDD e implementación de la librería FPDF/TCPDF para la futura generación de documentos.</w:t>
+      </w:r>
+    </w:p>
+    <w:p>
+      <w:pPr>
+        <w:pStyle w:val="Heading2"/>
+        <w:widowControl w:val="0"/>
+        <w:shd w:val="clear" w:color="auto" w:fill="FFFFFF" w:themeFill="background1"/>
+        <w:spacing w:before="0" w:after="48"/>
+        <w:ind w:left="708"/>
+        <w:rPr>
+          <w:rFonts w:ascii="Segoe UI" w:eastAsia="Segoe UI" w:hAnsi="Segoe UI" w:cs="Segoe UI"/>
+          <w:i w:val="0"/>
+          <w:iCs w:val="0"/>
+          <w:color w:val="212121"/>
+          <w:sz w:val="24"/>
+        </w:rPr>
+      </w:pPr>
+      <w:r>
+        <w:rPr>
+          <w:rFonts w:ascii="Segoe UI" w:eastAsia="Segoe UI" w:hAnsi="Segoe UI" w:cs="Segoe UI"/>
+          <w:b/>
+          <w:i w:val="0"/>
+          <w:iCs w:val="0"/>
+          <w:color w:val="212121"/>
+          <w:sz w:val="24"/>
+        </w:rPr>
+        <w:t>Semana 6:</w:t>
+      </w:r>
+      <w:r>
+        <w:rPr>
+          <w:rFonts w:ascii="Segoe UI" w:eastAsia="Segoe UI" w:hAnsi="Segoe UI" w:cs="Segoe UI"/>
+          <w:i w:val="0"/>
+          <w:iCs w:val="0"/>
+          <w:color w:val="212121"/>
+          <w:sz w:val="24"/>
+        </w:rPr>
+        <w:t xml:space="preserve"> Desarrollo de la API REST (PHP 8.2) y creación de los </w:t>
+      </w:r>
+      <w:r>
+        <w:rPr>
+          <w:rFonts w:ascii="Segoe UI" w:eastAsia="Segoe UI" w:hAnsi="Segoe UI" w:cs="Segoe UI"/>
+          <w:i w:val="0"/>
+          <w:iCs w:val="0"/>
+          <w:color w:val="212121"/>
+          <w:sz w:val="24"/>
+        </w:rPr>
+        <w:t>“</w:t>
+      </w:r>
+      <w:r>
+        <w:rPr>
+          <w:rFonts w:ascii="Segoe UI" w:eastAsia="Segoe UI" w:hAnsi="Segoe UI" w:cs="Segoe UI"/>
+          <w:i w:val="0"/>
+          <w:iCs w:val="0"/>
+          <w:color w:val="212121"/>
+          <w:sz w:val="24"/>
+        </w:rPr>
+        <w:t>endpoints</w:t>
+      </w:r>
+      <w:r>
+        <w:rPr>
+          <w:rFonts w:ascii="Segoe UI" w:eastAsia="Segoe UI" w:hAnsi="Segoe UI" w:cs="Segoe UI"/>
+          <w:i w:val="0"/>
+          <w:iCs w:val="0"/>
+          <w:color w:val="212121"/>
+          <w:sz w:val="24"/>
+        </w:rPr>
+        <w:t>”</w:t>
+      </w:r>
+      <w:r>
+        <w:rPr>
+          <w:rFonts w:ascii="Segoe UI" w:eastAsia="Segoe UI" w:hAnsi="Segoe UI" w:cs="Segoe UI"/>
+          <w:i w:val="0"/>
+          <w:iCs w:val="0"/>
+          <w:color w:val="212121"/>
+          <w:sz w:val="24"/>
+        </w:rPr>
+        <w:t xml:space="preserve"> básicos (Registro, Login) con cifrado de contraseñas.</w:t>
+      </w:r>
+    </w:p>
+    <w:p>
+      <w:pPr>
+        <w:pStyle w:val="Heading2"/>
+        <w:widowControl w:val="0"/>
+        <w:shd w:val="clear" w:color="auto" w:fill="FFFFFF" w:themeFill="background1"/>
+        <w:spacing w:before="0" w:after="48"/>
+        <w:ind w:left="708"/>
+        <w:rPr>
+          <w:rFonts w:ascii="Segoe UI" w:eastAsia="Segoe UI" w:hAnsi="Segoe UI" w:cs="Segoe UI"/>
+          <w:i w:val="0"/>
+          <w:iCs w:val="0"/>
+          <w:color w:val="212121"/>
+          <w:sz w:val="24"/>
+        </w:rPr>
+      </w:pPr>
+      <w:r>
+        <w:rPr>
+          <w:rFonts w:ascii="Segoe UI" w:eastAsia="Segoe UI" w:hAnsi="Segoe UI" w:cs="Segoe UI"/>
+          <w:b/>
+          <w:i w:val="0"/>
+          <w:iCs w:val="0"/>
+          <w:color w:val="212121"/>
+          <w:sz w:val="24"/>
+        </w:rPr>
+        <w:t>Semana 7:</w:t>
+      </w:r>
+      <w:r>
+        <w:rPr>
+          <w:rFonts w:ascii="Segoe UI" w:eastAsia="Segoe UI" w:hAnsi="Segoe UI" w:cs="Segoe UI"/>
+          <w:i w:val="0"/>
+          <w:iCs w:val="0"/>
+          <w:color w:val="212121"/>
+          <w:sz w:val="24"/>
+        </w:rPr>
+        <w:t> Programación de la lógica de filtros de marcas deportivas y categorías por edades en el servidor.</w:t>
+      </w:r>
+    </w:p>
+    <w:p>
+      <w:pPr>
+        <w:pStyle w:val="Heading2"/>
+        <w:widowControl w:val="0"/>
+        <w:shd w:val="clear" w:color="auto" w:fill="FFFFFF" w:themeFill="background1"/>
+        <w:spacing w:before="0" w:after="48"/>
+        <w:ind w:left="708"/>
+        <w:rPr>
+          <w:rFonts w:ascii="Segoe UI" w:eastAsia="Segoe UI" w:hAnsi="Segoe UI" w:cs="Segoe UI"/>
+          <w:i w:val="0"/>
+          <w:iCs w:val="0"/>
+          <w:color w:val="212121"/>
+          <w:sz w:val="24"/>
+        </w:rPr>
+      </w:pPr>
+      <w:r>
+        <w:rPr>
+          <w:rFonts w:ascii="Segoe UI" w:eastAsia="Segoe UI" w:hAnsi="Segoe UI" w:cs="Segoe UI"/>
+          <w:b/>
+          <w:i w:val="0"/>
+          <w:iCs w:val="0"/>
+          <w:color w:val="212121"/>
+          <w:sz w:val="24"/>
+        </w:rPr>
+        <w:t>Semana 8:</w:t>
+      </w:r>
+      <w:r>
+        <w:rPr>
+          <w:rFonts w:ascii="Segoe UI" w:eastAsia="Segoe UI" w:hAnsi="Segoe UI" w:cs="Segoe UI"/>
+          <w:i w:val="0"/>
+          <w:iCs w:val="0"/>
+          <w:color w:val="212121"/>
+          <w:sz w:val="24"/>
+        </w:rPr>
+        <w:t> Desarrollo del módulo de control de acceso y protección de directorios para los archivos PDF de los atletas (cumplimiento RGPD).</w:t>
+      </w:r>
+    </w:p>
+    <w:p>
+      <w:pPr>
+        <w:pStyle w:val="Heading1"/>
+        <w:keepNext w:val="0"/>
+        <w:widowControl w:val="0"/>
+        <w:pBdr>
+          <w:bottom w:val="none" w:sz="0" w:space="0" w:color="auto"/>
+        </w:pBdr>
+        <w:spacing w:before="0"/>
+        <w:rPr>
+          <w:sz w:val="24"/>
+          <w:szCs w:val="24"/>
+        </w:rPr>
+      </w:pPr>
+    </w:p>
+    <w:p>
+      <w:pPr>
+        <w:pStyle w:val="Heading2"/>
+        <w:widowControl w:val="0"/>
+        <w:shd w:val="clear" w:color="auto" w:fill="FFFFFF" w:themeFill="background1"/>
+        <w:spacing w:before="0" w:after="360"/>
+        <w:ind w:left="-3" w:firstLine="360"/>
+        <w:rPr>
+          <w:rFonts w:ascii="Segoe UI" w:eastAsia="Segoe UI" w:hAnsi="Segoe UI" w:cs="Segoe UI"/>
+          <w:b/>
+          <w:i w:val="0"/>
+          <w:iCs w:val="0"/>
+          <w:color w:val="212121"/>
+          <w:sz w:val="24"/>
+        </w:rPr>
+      </w:pPr>
+      <w:r>
+        <w:rPr>
+          <w:rFonts w:ascii="Segoe UI" w:eastAsia="Segoe UI" w:hAnsi="Segoe UI" w:cs="Segoe UI"/>
+          <w:b/>
+          <w:i w:val="0"/>
+          <w:iCs w:val="0"/>
+          <w:color w:val="212121"/>
+          <w:sz w:val="24"/>
+        </w:rPr>
+        <w:t>Fase 3: Frontend e Integración (Semanas 9 - 12)</w:t>
+      </w:r>
+    </w:p>
+    <w:p>
+      <w:pPr>
+        <w:pStyle w:val="Heading2"/>
+        <w:widowControl w:val="0"/>
+        <w:shd w:val="clear" w:color="auto" w:fill="FFFFFF" w:themeFill="background1"/>
+        <w:spacing w:before="0" w:after="48"/>
+        <w:ind w:left="708"/>
+        <w:rPr>
+          <w:rFonts w:ascii="Segoe UI" w:eastAsia="Segoe UI" w:hAnsi="Segoe UI" w:cs="Segoe UI"/>
+          <w:i w:val="0"/>
+          <w:iCs w:val="0"/>
+          <w:color w:val="212121"/>
+          <w:sz w:val="24"/>
+        </w:rPr>
+      </w:pPr>
+      <w:r>
+        <w:rPr>
+          <w:rFonts w:ascii="Segoe UI" w:eastAsia="Segoe UI" w:hAnsi="Segoe UI" w:cs="Segoe UI"/>
+          <w:b/>
+          <w:i w:val="0"/>
+          <w:iCs w:val="0"/>
+          <w:color w:val="212121"/>
+          <w:sz w:val="24"/>
+        </w:rPr>
+        <w:t>Semana 9:</w:t>
+      </w:r>
+      <w:r>
+        <w:rPr>
+          <w:rFonts w:ascii="Segoe UI" w:eastAsia="Segoe UI" w:hAnsi="Segoe UI" w:cs="Segoe UI"/>
+          <w:i w:val="0"/>
+          <w:iCs w:val="0"/>
+          <w:color w:val="212121"/>
+          <w:sz w:val="24"/>
+        </w:rPr>
+        <w:t> Inicialización del proyecto en React 18, configuración del enrutamiento y aplicación de Tailwind CSS.</w:t>
+      </w:r>
+    </w:p>
+    <w:p>
+      <w:pPr>
+        <w:pStyle w:val="Heading2"/>
+        <w:widowControl w:val="0"/>
+        <w:shd w:val="clear" w:color="auto" w:fill="FFFFFF" w:themeFill="background1"/>
+        <w:spacing w:before="0" w:after="48"/>
+        <w:ind w:left="708"/>
+        <w:rPr>
+          <w:rFonts w:ascii="Segoe UI" w:eastAsia="Segoe UI" w:hAnsi="Segoe UI" w:cs="Segoe UI"/>
+          <w:i w:val="0"/>
+          <w:iCs w:val="0"/>
+          <w:color w:val="212121"/>
+          <w:sz w:val="24"/>
+        </w:rPr>
+      </w:pPr>
+      <w:r>
+        <w:rPr>
+          <w:rFonts w:ascii="Segoe UI" w:eastAsia="Segoe UI" w:hAnsi="Segoe UI" w:cs="Segoe UI"/>
+          <w:b/>
+          <w:i w:val="0"/>
+          <w:iCs w:val="0"/>
+          <w:color w:val="212121"/>
+          <w:sz w:val="24"/>
+        </w:rPr>
+        <w:t>Semana 10:</w:t>
+      </w:r>
+      <w:r>
+        <w:rPr>
+          <w:rFonts w:ascii="Segoe UI" w:eastAsia="Segoe UI" w:hAnsi="Segoe UI" w:cs="Segoe UI"/>
+          <w:i w:val="0"/>
+          <w:iCs w:val="0"/>
+          <w:color w:val="212121"/>
+          <w:sz w:val="24"/>
+        </w:rPr>
+        <w:t> Maquetación de los paneles de control (dashboard del Entrenador y vista del Atleta).</w:t>
+      </w:r>
+    </w:p>
+    <w:p>
+      <w:pPr>
+        <w:pStyle w:val="Heading2"/>
+        <w:widowControl w:val="0"/>
+        <w:shd w:val="clear" w:color="auto" w:fill="FFFFFF" w:themeFill="background1"/>
+        <w:spacing w:before="0" w:after="48"/>
+        <w:ind w:left="708"/>
+        <w:rPr>
+          <w:rFonts w:ascii="Segoe UI" w:eastAsia="Segoe UI" w:hAnsi="Segoe UI" w:cs="Segoe UI"/>
+          <w:i w:val="0"/>
+          <w:iCs w:val="0"/>
+          <w:color w:val="212121"/>
+          <w:sz w:val="24"/>
+        </w:rPr>
+      </w:pPr>
+      <w:r>
+        <w:rPr>
+          <w:rFonts w:ascii="Segoe UI" w:eastAsia="Segoe UI" w:hAnsi="Segoe UI" w:cs="Segoe UI"/>
+          <w:b/>
+          <w:i w:val="0"/>
+          <w:iCs w:val="0"/>
+          <w:color w:val="212121"/>
+          <w:sz w:val="24"/>
+        </w:rPr>
+        <w:t>Semana 11:</w:t>
+      </w:r>
+      <w:r>
+        <w:rPr>
+          <w:rFonts w:ascii="Segoe UI" w:eastAsia="Segoe UI" w:hAnsi="Segoe UI" w:cs="Segoe UI"/>
+          <w:i w:val="0"/>
+          <w:iCs w:val="0"/>
+          <w:color w:val="212121"/>
+          <w:sz w:val="24"/>
+        </w:rPr>
+        <w:t xml:space="preserve"> Conexión asíncrona (Fetch/Axios) entre el </w:t>
+      </w:r>
+      <w:r>
+        <w:rPr>
+          <w:rFonts w:ascii="Segoe UI" w:eastAsia="Segoe UI" w:hAnsi="Segoe UI" w:cs="Segoe UI"/>
+          <w:i w:val="0"/>
+          <w:iCs w:val="0"/>
+          <w:color w:val="212121"/>
+          <w:sz w:val="24"/>
+        </w:rPr>
+        <w:t>“</w:t>
+      </w:r>
+      <w:r>
+        <w:rPr>
+          <w:rFonts w:ascii="Segoe UI" w:eastAsia="Segoe UI" w:hAnsi="Segoe UI" w:cs="Segoe UI"/>
+          <w:i w:val="0"/>
+          <w:iCs w:val="0"/>
+          <w:color w:val="212121"/>
+          <w:sz w:val="24"/>
+        </w:rPr>
+        <w:t>Frontend</w:t>
+      </w:r>
+      <w:r>
+        <w:rPr>
+          <w:rFonts w:ascii="Segoe UI" w:eastAsia="Segoe UI" w:hAnsi="Segoe UI" w:cs="Segoe UI"/>
+          <w:i w:val="0"/>
+          <w:iCs w:val="0"/>
+          <w:color w:val="212121"/>
+          <w:sz w:val="24"/>
+        </w:rPr>
+        <w:t>”</w:t>
+      </w:r>
+      <w:r>
+        <w:rPr>
+          <w:rFonts w:ascii="Segoe UI" w:eastAsia="Segoe UI" w:hAnsi="Segoe UI" w:cs="Segoe UI"/>
+          <w:i w:val="0"/>
+          <w:iCs w:val="0"/>
+          <w:color w:val="212121"/>
+          <w:sz w:val="24"/>
+        </w:rPr>
+        <w:t xml:space="preserve"> y la API REST para el intercambio de datos JSON.</w:t>
+      </w:r>
+    </w:p>
+    <w:p>
+      <w:pPr>
+        <w:pStyle w:val="Heading2"/>
+        <w:widowControl w:val="0"/>
+        <w:shd w:val="clear" w:color="auto" w:fill="FFFFFF" w:themeFill="background1"/>
+        <w:spacing w:before="0" w:after="48"/>
+        <w:ind w:left="709"/>
+        <w:rPr>
+          <w:rFonts w:ascii="Segoe UI" w:eastAsia="Segoe UI" w:hAnsi="Segoe UI" w:cs="Segoe UI"/>
+          <w:i w:val="0"/>
+          <w:iCs w:val="0"/>
+          <w:color w:val="212121"/>
+          <w:sz w:val="24"/>
+        </w:rPr>
+      </w:pPr>
+      <w:r>
+        <w:rPr>
+          <w:rFonts w:ascii="Segoe UI" w:eastAsia="Segoe UI" w:hAnsi="Segoe UI" w:cs="Segoe UI"/>
+          <w:b/>
+          <w:i w:val="0"/>
+          <w:iCs w:val="0"/>
+          <w:color w:val="212121"/>
+          <w:sz w:val="24"/>
+        </w:rPr>
+        <w:t>Semana 12:</w:t>
+      </w:r>
+      <w:r>
+        <w:rPr>
+          <w:rFonts w:ascii="Segoe UI" w:eastAsia="Segoe UI" w:hAnsi="Segoe UI" w:cs="Segoe UI"/>
+          <w:i w:val="0"/>
+          <w:iCs w:val="0"/>
+          <w:color w:val="212121"/>
+          <w:sz w:val="24"/>
+        </w:rPr>
+        <w:t xml:space="preserve"> Integración del formulario dinámico de inscripciones con el generador de PDF del </w:t>
+      </w:r>
+      <w:r>
+        <w:rPr>
+          <w:rFonts w:ascii="Segoe UI" w:eastAsia="Segoe UI" w:hAnsi="Segoe UI" w:cs="Segoe UI"/>
+          <w:i w:val="0"/>
+          <w:iCs w:val="0"/>
+          <w:color w:val="212121"/>
+          <w:sz w:val="24"/>
+        </w:rPr>
+        <w:t>“Backend”</w:t>
+      </w:r>
+      <w:r>
+        <w:rPr>
+          <w:rFonts w:ascii="Segoe UI" w:eastAsia="Segoe UI" w:hAnsi="Segoe UI" w:cs="Segoe UI"/>
+          <w:i w:val="0"/>
+          <w:iCs w:val="0"/>
+          <w:color w:val="212121"/>
+          <w:sz w:val="24"/>
+        </w:rPr>
+        <w:t>.</w:t>
+      </w:r>
+    </w:p>
+    <w:p>
+      <w:pPr>
+        <w:pStyle w:val="Heading1"/>
+        <w:pBdr>
+          <w:bottom w:val="none" w:sz="0" w:space="0" w:color="auto"/>
+        </w:pBdr>
+        <w:spacing w:before="0"/>
+        <w:rPr>
+          <w:sz w:val="24"/>
+          <w:szCs w:val="24"/>
+        </w:rPr>
+      </w:pPr>
+    </w:p>
+    <w:p>
+      <w:pPr>
+        <w:pStyle w:val="Heading2"/>
+        <w:widowControl w:val="0"/>
+        <w:shd w:val="clear" w:color="auto" w:fill="FFFFFF" w:themeFill="background1"/>
+        <w:spacing w:before="0" w:after="360"/>
+        <w:ind w:left="-3" w:firstLine="360"/>
+        <w:rPr>
+          <w:rFonts w:ascii="Segoe UI" w:eastAsia="Segoe UI" w:hAnsi="Segoe UI" w:cs="Segoe UI"/>
+          <w:b/>
+          <w:i w:val="0"/>
+          <w:iCs w:val="0"/>
+          <w:color w:val="212121"/>
+          <w:sz w:val="24"/>
+        </w:rPr>
+      </w:pPr>
+      <w:r>
+        <w:rPr>
+          <w:rFonts w:ascii="Segoe UI" w:eastAsia="Segoe UI" w:hAnsi="Segoe UI" w:cs="Segoe UI"/>
+          <w:b/>
+          <w:i w:val="0"/>
+          <w:iCs w:val="0"/>
+          <w:color w:val="212121"/>
+          <w:sz w:val="24"/>
+        </w:rPr>
+        <w:t>Fase 4: Pruebas y Despliegue (Semanas 13 - 15)</w:t>
+      </w:r>
+    </w:p>
+    <w:p>
+      <w:pPr>
+        <w:pStyle w:val="Heading2"/>
+        <w:widowControl w:val="0"/>
+        <w:shd w:val="clear" w:color="auto" w:fill="FFFFFF" w:themeFill="background1"/>
+        <w:spacing w:before="0" w:after="48"/>
+        <w:ind w:left="708"/>
+        <w:rPr>
+          <w:rFonts w:ascii="Segoe UI" w:eastAsia="Segoe UI" w:hAnsi="Segoe UI" w:cs="Segoe UI"/>
+          <w:i w:val="0"/>
+          <w:iCs w:val="0"/>
+          <w:color w:val="212121"/>
+          <w:sz w:val="24"/>
+        </w:rPr>
+      </w:pPr>
+      <w:r>
+        <w:rPr>
+          <w:rFonts w:ascii="Segoe UI" w:eastAsia="Segoe UI" w:hAnsi="Segoe UI" w:cs="Segoe UI"/>
+          <w:b/>
+          <w:i w:val="0"/>
+          <w:iCs w:val="0"/>
+          <w:color w:val="212121"/>
+          <w:sz w:val="24"/>
+        </w:rPr>
+        <w:t>Semana 13:</w:t>
+      </w:r>
+      <w:r>
+        <w:rPr>
+          <w:rFonts w:ascii="Segoe UI" w:eastAsia="Segoe UI" w:hAnsi="Segoe UI" w:cs="Segoe UI"/>
+          <w:i w:val="0"/>
+          <w:iCs w:val="0"/>
+          <w:color w:val="212121"/>
+          <w:sz w:val="24"/>
+        </w:rPr>
+        <w:t> Ejecución de pruebas unitarias en formularios y validación de seguridad en la subida de archivos (DNI/Fotos).</w:t>
+      </w:r>
+    </w:p>
+    <w:p>
+      <w:pPr>
+        <w:pStyle w:val="Heading2"/>
+        <w:widowControl w:val="0"/>
+        <w:shd w:val="clear" w:color="auto" w:fill="FFFFFF" w:themeFill="background1"/>
+        <w:spacing w:before="0" w:after="48"/>
+        <w:ind w:left="708"/>
+        <w:rPr>
+          <w:rFonts w:ascii="Segoe UI" w:eastAsia="Segoe UI" w:hAnsi="Segoe UI" w:cs="Segoe UI"/>
+          <w:i w:val="0"/>
+          <w:iCs w:val="0"/>
+          <w:color w:val="212121"/>
+          <w:sz w:val="24"/>
+        </w:rPr>
+      </w:pPr>
+      <w:r>
+        <w:rPr>
+          <w:rFonts w:ascii="Segoe UI" w:eastAsia="Segoe UI" w:hAnsi="Segoe UI" w:cs="Segoe UI"/>
+          <w:b/>
+          <w:i w:val="0"/>
+          <w:iCs w:val="0"/>
+          <w:color w:val="212121"/>
+          <w:sz w:val="24"/>
+        </w:rPr>
+        <w:t>Semana 14:</w:t>
+      </w:r>
+      <w:r>
+        <w:rPr>
+          <w:rFonts w:ascii="Segoe UI" w:eastAsia="Segoe UI" w:hAnsi="Segoe UI" w:cs="Segoe UI"/>
+          <w:i w:val="0"/>
+          <w:iCs w:val="0"/>
+          <w:color w:val="212121"/>
+          <w:sz w:val="24"/>
+        </w:rPr>
+        <w:t> Resolución de errores (testing continuo</w:t>
+      </w:r>
+      <w:r>
+        <w:rPr>
+          <w:rFonts w:ascii="Segoe UI" w:eastAsia="Segoe UI" w:hAnsi="Segoe UI" w:cs="Segoe UI"/>
+          <w:i w:val="0"/>
+          <w:iCs w:val="0"/>
+          <w:color w:val="212121"/>
+          <w:sz w:val="24"/>
+        </w:rPr>
+        <w:t>)</w:t>
+      </w:r>
+    </w:p>
+    <w:p>
+      <w:pPr>
+        <w:pStyle w:val="Heading2"/>
+        <w:widowControl w:val="0"/>
+        <w:shd w:val="clear" w:color="auto" w:fill="FFFFFF" w:themeFill="background1"/>
+        <w:spacing w:before="0" w:after="48"/>
+        <w:ind w:left="708"/>
+        <w:rPr>
+          <w:rFonts w:ascii="Segoe UI" w:eastAsia="Segoe UI" w:hAnsi="Segoe UI" w:cs="Segoe UI"/>
+          <w:i w:val="0"/>
+          <w:iCs w:val="0"/>
+          <w:color w:val="212121"/>
+          <w:sz w:val="24"/>
+        </w:rPr>
+      </w:pPr>
+      <w:r>
+        <w:rPr>
+          <w:rFonts w:ascii="Segoe UI" w:eastAsia="Segoe UI" w:hAnsi="Segoe UI" w:cs="Segoe UI"/>
+          <w:b/>
+          <w:i w:val="0"/>
+          <w:iCs w:val="0"/>
+          <w:color w:val="212121"/>
+          <w:sz w:val="24"/>
+        </w:rPr>
+        <w:t>Semana 15:</w:t>
+      </w:r>
+      <w:r>
+        <w:rPr>
+          <w:rFonts w:ascii="Segoe UI" w:eastAsia="Segoe UI" w:hAnsi="Segoe UI" w:cs="Segoe UI"/>
+          <w:i w:val="0"/>
+          <w:iCs w:val="0"/>
+          <w:color w:val="212121"/>
+          <w:sz w:val="24"/>
+        </w:rPr>
+        <w:t> Despliegue en el servidor de producción (hosting), redacción final de los manuales y preparación de la defensa.</w:t>
+      </w:r>
     </w:p>
     <w:p>
       <w:pPr>
@@ -13820,23 +14558,7 @@
                 <w:rFonts w:ascii="Segoe UI" w:eastAsia="Segoe UI" w:hAnsi="Segoe UI" w:cs="Segoe UI"/>
                 <w:color w:val="1F2937"/>
               </w:rPr>
-              <w:t xml:space="preserve">(Application Programming </w:t>
-            </w:r>
-            <w:proofErr w:type="gramStart"/>
-            <w:r>
-              <w:rPr>
-                <w:rFonts w:ascii="Segoe UI" w:eastAsia="Segoe UI" w:hAnsi="Segoe UI" w:cs="Segoe UI"/>
-                <w:color w:val="1F2937"/>
-              </w:rPr>
-              <w:t>Interface</w:t>
-            </w:r>
-            <w:proofErr w:type="gramEnd"/>
-            <w:r>
-              <w:rPr>
-                <w:rFonts w:ascii="Segoe UI" w:eastAsia="Segoe UI" w:hAnsi="Segoe UI" w:cs="Segoe UI"/>
-                <w:color w:val="1F2937"/>
-              </w:rPr>
-              <w:t>) Interfaz que permite que dos aplicaciones se comuniquen entre sí para intercambiar datos.</w:t>
+              <w:t>(Application Programming Interface) Interfaz que permite que dos aplicaciones se comuniquen entre sí para intercambiar datos.</w:t>
             </w:r>
           </w:p>
         </w:tc>
@@ -14160,12 +14882,12 @@
       </w:r>
     </w:p>
     <w:sectPr>
-      <w:headerReference w:type="even" r:id="rId81"/>
-      <w:headerReference w:type="default" r:id="rId82"/>
-      <w:footerReference w:type="even" r:id="rId83"/>
-      <w:footerReference w:type="default" r:id="rId84"/>
-      <w:headerReference w:type="first" r:id="rId85"/>
-      <w:footerReference w:type="first" r:id="rId86"/>
+      <w:headerReference w:type="even" r:id="rId82"/>
+      <w:headerReference w:type="default" r:id="rId83"/>
+      <w:footerReference w:type="even" r:id="rId84"/>
+      <w:footerReference w:type="default" r:id="rId85"/>
+      <w:headerReference w:type="first" r:id="rId86"/>
+      <w:footerReference w:type="first" r:id="rId87"/>
       <w:type w:val="continuous"/>
       <w:pgSz w:w="11906" w:h="16838"/>
       <w:pgMar w:top="1418" w:right="1418" w:bottom="1418" w:left="1418" w:header="709" w:footer="709" w:gutter="0"/>
@@ -14342,7 +15064,7 @@
             </wp:anchor>
           </w:drawing>
         </mc:Choice>
-        <mc:Fallback xmlns:a="http://schemas.openxmlformats.org/drawingml/2006/main" xmlns:pic="http://schemas.openxmlformats.org/drawingml/2006/picture" xmlns:a14="http://schemas.microsoft.com/office/drawing/2010/main">
+        <mc:Fallback xmlns:a14="http://schemas.microsoft.com/office/drawing/2010/main" xmlns:pic="http://schemas.openxmlformats.org/drawingml/2006/picture" xmlns:a="http://schemas.openxmlformats.org/drawingml/2006/main">
           <w:pict w14:anchorId="44D4DE1A">
             <v:shapetype id="_x0000_t32" coordsize="21600,21600" o:oned="t" filled="f" o:spt="32" path="m,l21600,21600e" w14:anchorId="7996C48F">
               <v:path fillok="f" arrowok="t" o:connecttype="none"/>
@@ -14633,7 +15355,7 @@
             </wp:anchor>
           </w:drawing>
         </mc:Choice>
-        <mc:Fallback xmlns:a="http://schemas.openxmlformats.org/drawingml/2006/main" xmlns:pic="http://schemas.openxmlformats.org/drawingml/2006/picture" xmlns:a14="http://schemas.microsoft.com/office/drawing/2010/main">
+        <mc:Fallback xmlns:a14="http://schemas.microsoft.com/office/drawing/2010/main" xmlns:pic="http://schemas.openxmlformats.org/drawingml/2006/picture" xmlns:a="http://schemas.openxmlformats.org/drawingml/2006/main">
           <w:pict w14:anchorId="18211A6C">
             <v:shapetype id="_x0000_t32" coordsize="21600,21600" o:oned="t" filled="f" o:spt="32" path="m,l21600,21600e" w14:anchorId="1F7B267B">
               <v:path fillok="f" arrowok="t" o:connecttype="none"/>
@@ -14936,7 +15658,7 @@
             </wp:anchor>
           </w:drawing>
         </mc:Choice>
-        <mc:Fallback xmlns:a="http://schemas.openxmlformats.org/drawingml/2006/main" xmlns:a14="http://schemas.microsoft.com/office/drawing/2010/main">
+        <mc:Fallback xmlns:a14="http://schemas.microsoft.com/office/drawing/2010/main" xmlns:a="http://schemas.openxmlformats.org/drawingml/2006/main">
           <w:pict w14:anchorId="2258254A">
             <v:shapetype id="_x0000_t32" coordsize="21600,21600" o:oned="t" filled="f" o:spt="32" path="m,l21600,21600e" w14:anchorId="4BB0A5D0">
               <v:path fillok="f" arrowok="t" o:connecttype="none"/>
@@ -15068,7 +15790,7 @@
             </wp:anchor>
           </w:drawing>
         </mc:Choice>
-        <mc:Fallback xmlns:a="http://schemas.openxmlformats.org/drawingml/2006/main" xmlns:a14="http://schemas.microsoft.com/office/drawing/2010/main">
+        <mc:Fallback xmlns:a14="http://schemas.microsoft.com/office/drawing/2010/main" xmlns:a="http://schemas.openxmlformats.org/drawingml/2006/main">
           <w:pict w14:anchorId="50FA3E29">
             <v:shapetype id="_x0000_t32" coordsize="21600,21600" o:oned="t" filled="f" o:spt="32" path="m,l21600,21600e" w14:anchorId="66A82D6C">
               <v:path fillok="f" arrowok="t" o:connecttype="none"/>
@@ -15463,6 +16185,119 @@
     </w:lvl>
   </w:abstractNum>
   <w:abstractNum w:abstractNumId="11" w15:restartNumberingAfterBreak="0">
+    <w:nsid w:val="04A14EF7"/>
+    <w:multiLevelType w:val="hybridMultilevel"/>
+    <w:tmpl w:val="472825FE"/>
+    <w:lvl w:ilvl="0" w:tplc="0C0A0001">
+      <w:start w:val="1"/>
+      <w:numFmt w:val="bullet"/>
+      <w:lvlText w:val=""/>
+      <w:lvlJc w:val="left"/>
+      <w:pPr>
+        <w:ind w:left="1077" w:hanging="360"/>
+      </w:pPr>
+      <w:rPr>
+        <w:rFonts w:ascii="Symbol" w:hAnsi="Symbol" w:hint="default"/>
+      </w:rPr>
+    </w:lvl>
+    <w:lvl w:ilvl="1" w:tplc="0C0A0003" w:tentative="1">
+      <w:start w:val="1"/>
+      <w:numFmt w:val="bullet"/>
+      <w:lvlText w:val="o"/>
+      <w:lvlJc w:val="left"/>
+      <w:pPr>
+        <w:ind w:left="1797" w:hanging="360"/>
+      </w:pPr>
+      <w:rPr>
+        <w:rFonts w:ascii="Courier New" w:hAnsi="Courier New" w:cs="Courier New" w:hint="default"/>
+      </w:rPr>
+    </w:lvl>
+    <w:lvl w:ilvl="2" w:tplc="0C0A0005" w:tentative="1">
+      <w:start w:val="1"/>
+      <w:numFmt w:val="bullet"/>
+      <w:lvlText w:val=""/>
+      <w:lvlJc w:val="left"/>
+      <w:pPr>
+        <w:ind w:left="2517" w:hanging="360"/>
+      </w:pPr>
+      <w:rPr>
+        <w:rFonts w:ascii="Wingdings" w:hAnsi="Wingdings" w:hint="default"/>
+      </w:rPr>
+    </w:lvl>
+    <w:lvl w:ilvl="3" w:tplc="0C0A0001" w:tentative="1">
+      <w:start w:val="1"/>
+      <w:numFmt w:val="bullet"/>
+      <w:lvlText w:val=""/>
+      <w:lvlJc w:val="left"/>
+      <w:pPr>
+        <w:ind w:left="3237" w:hanging="360"/>
+      </w:pPr>
+      <w:rPr>
+        <w:rFonts w:ascii="Symbol" w:hAnsi="Symbol" w:hint="default"/>
+      </w:rPr>
+    </w:lvl>
+    <w:lvl w:ilvl="4" w:tplc="0C0A0003" w:tentative="1">
+      <w:start w:val="1"/>
+      <w:numFmt w:val="bullet"/>
+      <w:lvlText w:val="o"/>
+      <w:lvlJc w:val="left"/>
+      <w:pPr>
+        <w:ind w:left="3957" w:hanging="360"/>
+      </w:pPr>
+      <w:rPr>
+        <w:rFonts w:ascii="Courier New" w:hAnsi="Courier New" w:cs="Courier New" w:hint="default"/>
+      </w:rPr>
+    </w:lvl>
+    <w:lvl w:ilvl="5" w:tplc="0C0A0005" w:tentative="1">
+      <w:start w:val="1"/>
+      <w:numFmt w:val="bullet"/>
+      <w:lvlText w:val=""/>
+      <w:lvlJc w:val="left"/>
+      <w:pPr>
+        <w:ind w:left="4677" w:hanging="360"/>
+      </w:pPr>
+      <w:rPr>
+        <w:rFonts w:ascii="Wingdings" w:hAnsi="Wingdings" w:hint="default"/>
+      </w:rPr>
+    </w:lvl>
+    <w:lvl w:ilvl="6" w:tplc="0C0A0001" w:tentative="1">
+      <w:start w:val="1"/>
+      <w:numFmt w:val="bullet"/>
+      <w:lvlText w:val=""/>
+      <w:lvlJc w:val="left"/>
+      <w:pPr>
+        <w:ind w:left="5397" w:hanging="360"/>
+      </w:pPr>
+      <w:rPr>
+        <w:rFonts w:ascii="Symbol" w:hAnsi="Symbol" w:hint="default"/>
+      </w:rPr>
+    </w:lvl>
+    <w:lvl w:ilvl="7" w:tplc="0C0A0003" w:tentative="1">
+      <w:start w:val="1"/>
+      <w:numFmt w:val="bullet"/>
+      <w:lvlText w:val="o"/>
+      <w:lvlJc w:val="left"/>
+      <w:pPr>
+        <w:ind w:left="6117" w:hanging="360"/>
+      </w:pPr>
+      <w:rPr>
+        <w:rFonts w:ascii="Courier New" w:hAnsi="Courier New" w:cs="Courier New" w:hint="default"/>
+      </w:rPr>
+    </w:lvl>
+    <w:lvl w:ilvl="8" w:tplc="0C0A0005" w:tentative="1">
+      <w:start w:val="1"/>
+      <w:numFmt w:val="bullet"/>
+      <w:lvlText w:val=""/>
+      <w:lvlJc w:val="left"/>
+      <w:pPr>
+        <w:ind w:left="6837" w:hanging="360"/>
+      </w:pPr>
+      <w:rPr>
+        <w:rFonts w:ascii="Wingdings" w:hAnsi="Wingdings" w:hint="default"/>
+      </w:rPr>
+    </w:lvl>
+  </w:abstractNum>
+  <w:abstractNum w:abstractNumId="12" w15:restartNumberingAfterBreak="0">
     <w:nsid w:val="0552590E"/>
     <w:multiLevelType w:val="multilevel"/>
     <w:tmpl w:val="6AB66012"/>
@@ -15611,7 +16446,7 @@
       </w:rPr>
     </w:lvl>
   </w:abstractNum>
-  <w:abstractNum w:abstractNumId="12" w15:restartNumberingAfterBreak="0">
+  <w:abstractNum w:abstractNumId="13" w15:restartNumberingAfterBreak="0">
     <w:nsid w:val="07126C6A"/>
     <w:multiLevelType w:val="multilevel"/>
     <w:tmpl w:val="CFB85098"/>
@@ -15760,7 +16595,7 @@
       </w:rPr>
     </w:lvl>
   </w:abstractNum>
-  <w:abstractNum w:abstractNumId="13" w15:restartNumberingAfterBreak="0">
+  <w:abstractNum w:abstractNumId="14" w15:restartNumberingAfterBreak="0">
     <w:nsid w:val="0ABC069A"/>
     <w:multiLevelType w:val="multilevel"/>
     <w:tmpl w:val="FAE6D9B2"/>
@@ -15873,7 +16708,7 @@
       </w:pPr>
     </w:lvl>
   </w:abstractNum>
-  <w:abstractNum w:abstractNumId="14" w15:restartNumberingAfterBreak="0">
+  <w:abstractNum w:abstractNumId="15" w15:restartNumberingAfterBreak="0">
     <w:nsid w:val="0FC77EE1"/>
     <w:multiLevelType w:val="multilevel"/>
     <w:tmpl w:val="A90469EA"/>
@@ -15990,7 +16825,120 @@
       </w:pPr>
     </w:lvl>
   </w:abstractNum>
-  <w:abstractNum w:abstractNumId="15" w15:restartNumberingAfterBreak="0">
+  <w:abstractNum w:abstractNumId="16" w15:restartNumberingAfterBreak="0">
+    <w:nsid w:val="155F076E"/>
+    <w:multiLevelType w:val="hybridMultilevel"/>
+    <w:tmpl w:val="68CCC1E0"/>
+    <w:lvl w:ilvl="0" w:tplc="0C0A0001">
+      <w:start w:val="1"/>
+      <w:numFmt w:val="bullet"/>
+      <w:lvlText w:val=""/>
+      <w:lvlJc w:val="left"/>
+      <w:pPr>
+        <w:ind w:left="1077" w:hanging="360"/>
+      </w:pPr>
+      <w:rPr>
+        <w:rFonts w:ascii="Symbol" w:hAnsi="Symbol" w:hint="default"/>
+      </w:rPr>
+    </w:lvl>
+    <w:lvl w:ilvl="1" w:tplc="0C0A0003" w:tentative="1">
+      <w:start w:val="1"/>
+      <w:numFmt w:val="bullet"/>
+      <w:lvlText w:val="o"/>
+      <w:lvlJc w:val="left"/>
+      <w:pPr>
+        <w:ind w:left="1797" w:hanging="360"/>
+      </w:pPr>
+      <w:rPr>
+        <w:rFonts w:ascii="Courier New" w:hAnsi="Courier New" w:cs="Courier New" w:hint="default"/>
+      </w:rPr>
+    </w:lvl>
+    <w:lvl w:ilvl="2" w:tplc="0C0A0005" w:tentative="1">
+      <w:start w:val="1"/>
+      <w:numFmt w:val="bullet"/>
+      <w:lvlText w:val=""/>
+      <w:lvlJc w:val="left"/>
+      <w:pPr>
+        <w:ind w:left="2517" w:hanging="360"/>
+      </w:pPr>
+      <w:rPr>
+        <w:rFonts w:ascii="Wingdings" w:hAnsi="Wingdings" w:hint="default"/>
+      </w:rPr>
+    </w:lvl>
+    <w:lvl w:ilvl="3" w:tplc="0C0A0001" w:tentative="1">
+      <w:start w:val="1"/>
+      <w:numFmt w:val="bullet"/>
+      <w:lvlText w:val=""/>
+      <w:lvlJc w:val="left"/>
+      <w:pPr>
+        <w:ind w:left="3237" w:hanging="360"/>
+      </w:pPr>
+      <w:rPr>
+        <w:rFonts w:ascii="Symbol" w:hAnsi="Symbol" w:hint="default"/>
+      </w:rPr>
+    </w:lvl>
+    <w:lvl w:ilvl="4" w:tplc="0C0A0003" w:tentative="1">
+      <w:start w:val="1"/>
+      <w:numFmt w:val="bullet"/>
+      <w:lvlText w:val="o"/>
+      <w:lvlJc w:val="left"/>
+      <w:pPr>
+        <w:ind w:left="3957" w:hanging="360"/>
+      </w:pPr>
+      <w:rPr>
+        <w:rFonts w:ascii="Courier New" w:hAnsi="Courier New" w:cs="Courier New" w:hint="default"/>
+      </w:rPr>
+    </w:lvl>
+    <w:lvl w:ilvl="5" w:tplc="0C0A0005" w:tentative="1">
+      <w:start w:val="1"/>
+      <w:numFmt w:val="bullet"/>
+      <w:lvlText w:val=""/>
+      <w:lvlJc w:val="left"/>
+      <w:pPr>
+        <w:ind w:left="4677" w:hanging="360"/>
+      </w:pPr>
+      <w:rPr>
+        <w:rFonts w:ascii="Wingdings" w:hAnsi="Wingdings" w:hint="default"/>
+      </w:rPr>
+    </w:lvl>
+    <w:lvl w:ilvl="6" w:tplc="0C0A0001" w:tentative="1">
+      <w:start w:val="1"/>
+      <w:numFmt w:val="bullet"/>
+      <w:lvlText w:val=""/>
+      <w:lvlJc w:val="left"/>
+      <w:pPr>
+        <w:ind w:left="5397" w:hanging="360"/>
+      </w:pPr>
+      <w:rPr>
+        <w:rFonts w:ascii="Symbol" w:hAnsi="Symbol" w:hint="default"/>
+      </w:rPr>
+    </w:lvl>
+    <w:lvl w:ilvl="7" w:tplc="0C0A0003" w:tentative="1">
+      <w:start w:val="1"/>
+      <w:numFmt w:val="bullet"/>
+      <w:lvlText w:val="o"/>
+      <w:lvlJc w:val="left"/>
+      <w:pPr>
+        <w:ind w:left="6117" w:hanging="360"/>
+      </w:pPr>
+      <w:rPr>
+        <w:rFonts w:ascii="Courier New" w:hAnsi="Courier New" w:cs="Courier New" w:hint="default"/>
+      </w:rPr>
+    </w:lvl>
+    <w:lvl w:ilvl="8" w:tplc="0C0A0005" w:tentative="1">
+      <w:start w:val="1"/>
+      <w:numFmt w:val="bullet"/>
+      <w:lvlText w:val=""/>
+      <w:lvlJc w:val="left"/>
+      <w:pPr>
+        <w:ind w:left="6837" w:hanging="360"/>
+      </w:pPr>
+      <w:rPr>
+        <w:rFonts w:ascii="Wingdings" w:hAnsi="Wingdings" w:hint="default"/>
+      </w:rPr>
+    </w:lvl>
+  </w:abstractNum>
+  <w:abstractNum w:abstractNumId="17" w15:restartNumberingAfterBreak="0">
     <w:nsid w:val="15B5726D"/>
     <w:multiLevelType w:val="multilevel"/>
     <w:tmpl w:val="14B601A0"/>
@@ -16103,7 +17051,7 @@
       </w:pPr>
     </w:lvl>
   </w:abstractNum>
-  <w:abstractNum w:abstractNumId="16" w15:restartNumberingAfterBreak="0">
+  <w:abstractNum w:abstractNumId="18" w15:restartNumberingAfterBreak="0">
     <w:nsid w:val="17D16090"/>
     <w:multiLevelType w:val="hybridMultilevel"/>
     <w:tmpl w:val="A33CE50E"/>
@@ -16216,7 +17164,7 @@
       </w:rPr>
     </w:lvl>
   </w:abstractNum>
-  <w:abstractNum w:abstractNumId="17" w15:restartNumberingAfterBreak="0">
+  <w:abstractNum w:abstractNumId="19" w15:restartNumberingAfterBreak="0">
     <w:nsid w:val="1AD87688"/>
     <w:multiLevelType w:val="multilevel"/>
     <w:tmpl w:val="076647A4"/>
@@ -16365,7 +17313,7 @@
       </w:rPr>
     </w:lvl>
   </w:abstractNum>
-  <w:abstractNum w:abstractNumId="18" w15:restartNumberingAfterBreak="0">
+  <w:abstractNum w:abstractNumId="20" w15:restartNumberingAfterBreak="0">
     <w:nsid w:val="1B7E5BCD"/>
     <w:multiLevelType w:val="multilevel"/>
     <w:tmpl w:val="FD460818"/>
@@ -16478,7 +17426,7 @@
       </w:pPr>
     </w:lvl>
   </w:abstractNum>
-  <w:abstractNum w:abstractNumId="19" w15:restartNumberingAfterBreak="0">
+  <w:abstractNum w:abstractNumId="21" w15:restartNumberingAfterBreak="0">
     <w:nsid w:val="210C706E"/>
     <w:multiLevelType w:val="multilevel"/>
     <w:tmpl w:val="EDFA514A"/>
@@ -16595,7 +17543,7 @@
       </w:pPr>
     </w:lvl>
   </w:abstractNum>
-  <w:abstractNum w:abstractNumId="20" w15:restartNumberingAfterBreak="0">
+  <w:abstractNum w:abstractNumId="22" w15:restartNumberingAfterBreak="0">
     <w:nsid w:val="216B39DA"/>
     <w:multiLevelType w:val="multilevel"/>
     <w:tmpl w:val="45D66E00"/>
@@ -16735,7 +17683,120 @@
       </w:rPr>
     </w:lvl>
   </w:abstractNum>
-  <w:abstractNum w:abstractNumId="21" w15:restartNumberingAfterBreak="0">
+  <w:abstractNum w:abstractNumId="23" w15:restartNumberingAfterBreak="0">
+    <w:nsid w:val="2BCA168A"/>
+    <w:multiLevelType w:val="hybridMultilevel"/>
+    <w:tmpl w:val="C0341F4E"/>
+    <w:lvl w:ilvl="0" w:tplc="0C0A0001">
+      <w:start w:val="1"/>
+      <w:numFmt w:val="bullet"/>
+      <w:lvlText w:val=""/>
+      <w:lvlJc w:val="left"/>
+      <w:pPr>
+        <w:ind w:left="1077" w:hanging="360"/>
+      </w:pPr>
+      <w:rPr>
+        <w:rFonts w:ascii="Symbol" w:hAnsi="Symbol" w:hint="default"/>
+      </w:rPr>
+    </w:lvl>
+    <w:lvl w:ilvl="1" w:tplc="0C0A0003" w:tentative="1">
+      <w:start w:val="1"/>
+      <w:numFmt w:val="bullet"/>
+      <w:lvlText w:val="o"/>
+      <w:lvlJc w:val="left"/>
+      <w:pPr>
+        <w:ind w:left="1797" w:hanging="360"/>
+      </w:pPr>
+      <w:rPr>
+        <w:rFonts w:ascii="Courier New" w:hAnsi="Courier New" w:cs="Courier New" w:hint="default"/>
+      </w:rPr>
+    </w:lvl>
+    <w:lvl w:ilvl="2" w:tplc="0C0A0005" w:tentative="1">
+      <w:start w:val="1"/>
+      <w:numFmt w:val="bullet"/>
+      <w:lvlText w:val=""/>
+      <w:lvlJc w:val="left"/>
+      <w:pPr>
+        <w:ind w:left="2517" w:hanging="360"/>
+      </w:pPr>
+      <w:rPr>
+        <w:rFonts w:ascii="Wingdings" w:hAnsi="Wingdings" w:hint="default"/>
+      </w:rPr>
+    </w:lvl>
+    <w:lvl w:ilvl="3" w:tplc="0C0A0001" w:tentative="1">
+      <w:start w:val="1"/>
+      <w:numFmt w:val="bullet"/>
+      <w:lvlText w:val=""/>
+      <w:lvlJc w:val="left"/>
+      <w:pPr>
+        <w:ind w:left="3237" w:hanging="360"/>
+      </w:pPr>
+      <w:rPr>
+        <w:rFonts w:ascii="Symbol" w:hAnsi="Symbol" w:hint="default"/>
+      </w:rPr>
+    </w:lvl>
+    <w:lvl w:ilvl="4" w:tplc="0C0A0003" w:tentative="1">
+      <w:start w:val="1"/>
+      <w:numFmt w:val="bullet"/>
+      <w:lvlText w:val="o"/>
+      <w:lvlJc w:val="left"/>
+      <w:pPr>
+        <w:ind w:left="3957" w:hanging="360"/>
+      </w:pPr>
+      <w:rPr>
+        <w:rFonts w:ascii="Courier New" w:hAnsi="Courier New" w:cs="Courier New" w:hint="default"/>
+      </w:rPr>
+    </w:lvl>
+    <w:lvl w:ilvl="5" w:tplc="0C0A0005" w:tentative="1">
+      <w:start w:val="1"/>
+      <w:numFmt w:val="bullet"/>
+      <w:lvlText w:val=""/>
+      <w:lvlJc w:val="left"/>
+      <w:pPr>
+        <w:ind w:left="4677" w:hanging="360"/>
+      </w:pPr>
+      <w:rPr>
+        <w:rFonts w:ascii="Wingdings" w:hAnsi="Wingdings" w:hint="default"/>
+      </w:rPr>
+    </w:lvl>
+    <w:lvl w:ilvl="6" w:tplc="0C0A0001" w:tentative="1">
+      <w:start w:val="1"/>
+      <w:numFmt w:val="bullet"/>
+      <w:lvlText w:val=""/>
+      <w:lvlJc w:val="left"/>
+      <w:pPr>
+        <w:ind w:left="5397" w:hanging="360"/>
+      </w:pPr>
+      <w:rPr>
+        <w:rFonts w:ascii="Symbol" w:hAnsi="Symbol" w:hint="default"/>
+      </w:rPr>
+    </w:lvl>
+    <w:lvl w:ilvl="7" w:tplc="0C0A0003" w:tentative="1">
+      <w:start w:val="1"/>
+      <w:numFmt w:val="bullet"/>
+      <w:lvlText w:val="o"/>
+      <w:lvlJc w:val="left"/>
+      <w:pPr>
+        <w:ind w:left="6117" w:hanging="360"/>
+      </w:pPr>
+      <w:rPr>
+        <w:rFonts w:ascii="Courier New" w:hAnsi="Courier New" w:cs="Courier New" w:hint="default"/>
+      </w:rPr>
+    </w:lvl>
+    <w:lvl w:ilvl="8" w:tplc="0C0A0005" w:tentative="1">
+      <w:start w:val="1"/>
+      <w:numFmt w:val="bullet"/>
+      <w:lvlText w:val=""/>
+      <w:lvlJc w:val="left"/>
+      <w:pPr>
+        <w:ind w:left="6837" w:hanging="360"/>
+      </w:pPr>
+      <w:rPr>
+        <w:rFonts w:ascii="Wingdings" w:hAnsi="Wingdings" w:hint="default"/>
+      </w:rPr>
+    </w:lvl>
+  </w:abstractNum>
+  <w:abstractNum w:abstractNumId="24" w15:restartNumberingAfterBreak="0">
     <w:nsid w:val="2BEE0818"/>
     <w:multiLevelType w:val="multilevel"/>
     <w:tmpl w:val="6DBEAC04"/>
@@ -16884,7 +17945,7 @@
       </w:rPr>
     </w:lvl>
   </w:abstractNum>
-  <w:abstractNum w:abstractNumId="22" w15:restartNumberingAfterBreak="0">
+  <w:abstractNum w:abstractNumId="25" w15:restartNumberingAfterBreak="0">
     <w:nsid w:val="2CED3286"/>
     <w:multiLevelType w:val="multilevel"/>
     <w:tmpl w:val="0DCEFBEC"/>
@@ -16979,7 +18040,7 @@
       </w:pPr>
     </w:lvl>
   </w:abstractNum>
-  <w:abstractNum w:abstractNumId="23" w15:restartNumberingAfterBreak="0">
+  <w:abstractNum w:abstractNumId="26" w15:restartNumberingAfterBreak="0">
     <w:nsid w:val="34B844AD"/>
     <w:multiLevelType w:val="multilevel"/>
     <w:tmpl w:val="AE628106"/>
@@ -17092,7 +18153,7 @@
       </w:pPr>
     </w:lvl>
   </w:abstractNum>
-  <w:abstractNum w:abstractNumId="24" w15:restartNumberingAfterBreak="0">
+  <w:abstractNum w:abstractNumId="27" w15:restartNumberingAfterBreak="0">
     <w:nsid w:val="35ED0668"/>
     <w:multiLevelType w:val="multilevel"/>
     <w:tmpl w:val="F9CA6292"/>
@@ -17241,7 +18302,305 @@
       </w:rPr>
     </w:lvl>
   </w:abstractNum>
-  <w:abstractNum w:abstractNumId="25" w15:restartNumberingAfterBreak="0">
+  <w:abstractNum w:abstractNumId="28" w15:restartNumberingAfterBreak="0">
+    <w:nsid w:val="360108D2"/>
+    <w:multiLevelType w:val="multilevel"/>
+    <w:tmpl w:val="021649F8"/>
+    <w:lvl w:ilvl="0">
+      <w:start w:val="1"/>
+      <w:numFmt w:val="bullet"/>
+      <w:lvlText w:val=""/>
+      <w:lvlJc w:val="left"/>
+      <w:pPr>
+        <w:tabs>
+          <w:tab w:val="num" w:pos="720"/>
+        </w:tabs>
+        <w:ind w:left="720" w:hanging="360"/>
+      </w:pPr>
+      <w:rPr>
+        <w:rFonts w:ascii="Symbol" w:hAnsi="Symbol" w:hint="default"/>
+        <w:sz w:val="20"/>
+      </w:rPr>
+    </w:lvl>
+    <w:lvl w:ilvl="1" w:tentative="1">
+      <w:start w:val="1"/>
+      <w:numFmt w:val="bullet"/>
+      <w:lvlText w:val="o"/>
+      <w:lvlJc w:val="left"/>
+      <w:pPr>
+        <w:tabs>
+          <w:tab w:val="num" w:pos="1440"/>
+        </w:tabs>
+        <w:ind w:left="1440" w:hanging="360"/>
+      </w:pPr>
+      <w:rPr>
+        <w:rFonts w:ascii="Courier New" w:hAnsi="Courier New" w:hint="default"/>
+        <w:sz w:val="20"/>
+      </w:rPr>
+    </w:lvl>
+    <w:lvl w:ilvl="2" w:tentative="1">
+      <w:start w:val="1"/>
+      <w:numFmt w:val="bullet"/>
+      <w:lvlText w:val=""/>
+      <w:lvlJc w:val="left"/>
+      <w:pPr>
+        <w:tabs>
+          <w:tab w:val="num" w:pos="2160"/>
+        </w:tabs>
+        <w:ind w:left="2160" w:hanging="360"/>
+      </w:pPr>
+      <w:rPr>
+        <w:rFonts w:ascii="Wingdings" w:hAnsi="Wingdings" w:hint="default"/>
+        <w:sz w:val="20"/>
+      </w:rPr>
+    </w:lvl>
+    <w:lvl w:ilvl="3" w:tentative="1">
+      <w:start w:val="1"/>
+      <w:numFmt w:val="bullet"/>
+      <w:lvlText w:val=""/>
+      <w:lvlJc w:val="left"/>
+      <w:pPr>
+        <w:tabs>
+          <w:tab w:val="num" w:pos="2880"/>
+        </w:tabs>
+        <w:ind w:left="2880" w:hanging="360"/>
+      </w:pPr>
+      <w:rPr>
+        <w:rFonts w:ascii="Wingdings" w:hAnsi="Wingdings" w:hint="default"/>
+        <w:sz w:val="20"/>
+      </w:rPr>
+    </w:lvl>
+    <w:lvl w:ilvl="4" w:tentative="1">
+      <w:start w:val="1"/>
+      <w:numFmt w:val="bullet"/>
+      <w:lvlText w:val=""/>
+      <w:lvlJc w:val="left"/>
+      <w:pPr>
+        <w:tabs>
+          <w:tab w:val="num" w:pos="3600"/>
+        </w:tabs>
+        <w:ind w:left="3600" w:hanging="360"/>
+      </w:pPr>
+      <w:rPr>
+        <w:rFonts w:ascii="Wingdings" w:hAnsi="Wingdings" w:hint="default"/>
+        <w:sz w:val="20"/>
+      </w:rPr>
+    </w:lvl>
+    <w:lvl w:ilvl="5" w:tentative="1">
+      <w:start w:val="1"/>
+      <w:numFmt w:val="bullet"/>
+      <w:lvlText w:val=""/>
+      <w:lvlJc w:val="left"/>
+      <w:pPr>
+        <w:tabs>
+          <w:tab w:val="num" w:pos="4320"/>
+        </w:tabs>
+        <w:ind w:left="4320" w:hanging="360"/>
+      </w:pPr>
+      <w:rPr>
+        <w:rFonts w:ascii="Wingdings" w:hAnsi="Wingdings" w:hint="default"/>
+        <w:sz w:val="20"/>
+      </w:rPr>
+    </w:lvl>
+    <w:lvl w:ilvl="6" w:tentative="1">
+      <w:start w:val="1"/>
+      <w:numFmt w:val="bullet"/>
+      <w:lvlText w:val=""/>
+      <w:lvlJc w:val="left"/>
+      <w:pPr>
+        <w:tabs>
+          <w:tab w:val="num" w:pos="5040"/>
+        </w:tabs>
+        <w:ind w:left="5040" w:hanging="360"/>
+      </w:pPr>
+      <w:rPr>
+        <w:rFonts w:ascii="Wingdings" w:hAnsi="Wingdings" w:hint="default"/>
+        <w:sz w:val="20"/>
+      </w:rPr>
+    </w:lvl>
+    <w:lvl w:ilvl="7" w:tentative="1">
+      <w:start w:val="1"/>
+      <w:numFmt w:val="bullet"/>
+      <w:lvlText w:val=""/>
+      <w:lvlJc w:val="left"/>
+      <w:pPr>
+        <w:tabs>
+          <w:tab w:val="num" w:pos="5760"/>
+        </w:tabs>
+        <w:ind w:left="5760" w:hanging="360"/>
+      </w:pPr>
+      <w:rPr>
+        <w:rFonts w:ascii="Wingdings" w:hAnsi="Wingdings" w:hint="default"/>
+        <w:sz w:val="20"/>
+      </w:rPr>
+    </w:lvl>
+    <w:lvl w:ilvl="8" w:tentative="1">
+      <w:start w:val="1"/>
+      <w:numFmt w:val="bullet"/>
+      <w:lvlText w:val=""/>
+      <w:lvlJc w:val="left"/>
+      <w:pPr>
+        <w:tabs>
+          <w:tab w:val="num" w:pos="6480"/>
+        </w:tabs>
+        <w:ind w:left="6480" w:hanging="360"/>
+      </w:pPr>
+      <w:rPr>
+        <w:rFonts w:ascii="Wingdings" w:hAnsi="Wingdings" w:hint="default"/>
+        <w:sz w:val="20"/>
+      </w:rPr>
+    </w:lvl>
+  </w:abstractNum>
+  <w:abstractNum w:abstractNumId="29" w15:restartNumberingAfterBreak="0">
+    <w:nsid w:val="36080AF2"/>
+    <w:multiLevelType w:val="multilevel"/>
+    <w:tmpl w:val="161ED680"/>
+    <w:lvl w:ilvl="0">
+      <w:start w:val="1"/>
+      <w:numFmt w:val="bullet"/>
+      <w:lvlText w:val=""/>
+      <w:lvlJc w:val="left"/>
+      <w:pPr>
+        <w:tabs>
+          <w:tab w:val="num" w:pos="720"/>
+        </w:tabs>
+        <w:ind w:left="720" w:hanging="360"/>
+      </w:pPr>
+      <w:rPr>
+        <w:rFonts w:ascii="Symbol" w:hAnsi="Symbol" w:hint="default"/>
+        <w:sz w:val="20"/>
+      </w:rPr>
+    </w:lvl>
+    <w:lvl w:ilvl="1" w:tentative="1">
+      <w:start w:val="1"/>
+      <w:numFmt w:val="bullet"/>
+      <w:lvlText w:val="o"/>
+      <w:lvlJc w:val="left"/>
+      <w:pPr>
+        <w:tabs>
+          <w:tab w:val="num" w:pos="1440"/>
+        </w:tabs>
+        <w:ind w:left="1440" w:hanging="360"/>
+      </w:pPr>
+      <w:rPr>
+        <w:rFonts w:ascii="Courier New" w:hAnsi="Courier New" w:hint="default"/>
+        <w:sz w:val="20"/>
+      </w:rPr>
+    </w:lvl>
+    <w:lvl w:ilvl="2" w:tentative="1">
+      <w:start w:val="1"/>
+      <w:numFmt w:val="bullet"/>
+      <w:lvlText w:val=""/>
+      <w:lvlJc w:val="left"/>
+      <w:pPr>
+        <w:tabs>
+          <w:tab w:val="num" w:pos="2160"/>
+        </w:tabs>
+        <w:ind w:left="2160" w:hanging="360"/>
+      </w:pPr>
+      <w:rPr>
+        <w:rFonts w:ascii="Wingdings" w:hAnsi="Wingdings" w:hint="default"/>
+        <w:sz w:val="20"/>
+      </w:rPr>
+    </w:lvl>
+    <w:lvl w:ilvl="3" w:tentative="1">
+      <w:start w:val="1"/>
+      <w:numFmt w:val="bullet"/>
+      <w:lvlText w:val=""/>
+      <w:lvlJc w:val="left"/>
+      <w:pPr>
+        <w:tabs>
+          <w:tab w:val="num" w:pos="2880"/>
+        </w:tabs>
+        <w:ind w:left="2880" w:hanging="360"/>
+      </w:pPr>
+      <w:rPr>
+        <w:rFonts w:ascii="Wingdings" w:hAnsi="Wingdings" w:hint="default"/>
+        <w:sz w:val="20"/>
+      </w:rPr>
+    </w:lvl>
+    <w:lvl w:ilvl="4" w:tentative="1">
+      <w:start w:val="1"/>
+      <w:numFmt w:val="bullet"/>
+      <w:lvlText w:val=""/>
+      <w:lvlJc w:val="left"/>
+      <w:pPr>
+        <w:tabs>
+          <w:tab w:val="num" w:pos="3600"/>
+        </w:tabs>
+        <w:ind w:left="3600" w:hanging="360"/>
+      </w:pPr>
+      <w:rPr>
+        <w:rFonts w:ascii="Wingdings" w:hAnsi="Wingdings" w:hint="default"/>
+        <w:sz w:val="20"/>
+      </w:rPr>
+    </w:lvl>
+    <w:lvl w:ilvl="5" w:tentative="1">
+      <w:start w:val="1"/>
+      <w:numFmt w:val="bullet"/>
+      <w:lvlText w:val=""/>
+      <w:lvlJc w:val="left"/>
+      <w:pPr>
+        <w:tabs>
+          <w:tab w:val="num" w:pos="4320"/>
+        </w:tabs>
+        <w:ind w:left="4320" w:hanging="360"/>
+      </w:pPr>
+      <w:rPr>
+        <w:rFonts w:ascii="Wingdings" w:hAnsi="Wingdings" w:hint="default"/>
+        <w:sz w:val="20"/>
+      </w:rPr>
+    </w:lvl>
+    <w:lvl w:ilvl="6" w:tentative="1">
+      <w:start w:val="1"/>
+      <w:numFmt w:val="bullet"/>
+      <w:lvlText w:val=""/>
+      <w:lvlJc w:val="left"/>
+      <w:pPr>
+        <w:tabs>
+          <w:tab w:val="num" w:pos="5040"/>
+        </w:tabs>
+        <w:ind w:left="5040" w:hanging="360"/>
+      </w:pPr>
+      <w:rPr>
+        <w:rFonts w:ascii="Wingdings" w:hAnsi="Wingdings" w:hint="default"/>
+        <w:sz w:val="20"/>
+      </w:rPr>
+    </w:lvl>
+    <w:lvl w:ilvl="7" w:tentative="1">
+      <w:start w:val="1"/>
+      <w:numFmt w:val="bullet"/>
+      <w:lvlText w:val=""/>
+      <w:lvlJc w:val="left"/>
+      <w:pPr>
+        <w:tabs>
+          <w:tab w:val="num" w:pos="5760"/>
+        </w:tabs>
+        <w:ind w:left="5760" w:hanging="360"/>
+      </w:pPr>
+      <w:rPr>
+        <w:rFonts w:ascii="Wingdings" w:hAnsi="Wingdings" w:hint="default"/>
+        <w:sz w:val="20"/>
+      </w:rPr>
+    </w:lvl>
+    <w:lvl w:ilvl="8" w:tentative="1">
+      <w:start w:val="1"/>
+      <w:numFmt w:val="bullet"/>
+      <w:lvlText w:val=""/>
+      <w:lvlJc w:val="left"/>
+      <w:pPr>
+        <w:tabs>
+          <w:tab w:val="num" w:pos="6480"/>
+        </w:tabs>
+        <w:ind w:left="6480" w:hanging="360"/>
+      </w:pPr>
+      <w:rPr>
+        <w:rFonts w:ascii="Wingdings" w:hAnsi="Wingdings" w:hint="default"/>
+        <w:sz w:val="20"/>
+      </w:rPr>
+    </w:lvl>
+  </w:abstractNum>
+  <w:abstractNum w:abstractNumId="30" w15:restartNumberingAfterBreak="0">
     <w:nsid w:val="3D10441D"/>
     <w:multiLevelType w:val="multilevel"/>
     <w:tmpl w:val="A2EA6756"/>
@@ -17381,7 +18740,7 @@
       </w:rPr>
     </w:lvl>
   </w:abstractNum>
-  <w:abstractNum w:abstractNumId="26" w15:restartNumberingAfterBreak="0">
+  <w:abstractNum w:abstractNumId="31" w15:restartNumberingAfterBreak="0">
     <w:nsid w:val="480C30B5"/>
     <w:multiLevelType w:val="multilevel"/>
     <w:tmpl w:val="B3A2EC8E"/>
@@ -17521,7 +18880,7 @@
       </w:rPr>
     </w:lvl>
   </w:abstractNum>
-  <w:abstractNum w:abstractNumId="27" w15:restartNumberingAfterBreak="0">
+  <w:abstractNum w:abstractNumId="32" w15:restartNumberingAfterBreak="0">
     <w:nsid w:val="49B745FC"/>
     <w:multiLevelType w:val="hybridMultilevel"/>
     <w:tmpl w:val="0A6413E0"/>
@@ -17634,7 +18993,269 @@
       </w:rPr>
     </w:lvl>
   </w:abstractNum>
-  <w:abstractNum w:abstractNumId="28" w15:restartNumberingAfterBreak="0">
+  <w:abstractNum w:abstractNumId="33" w15:restartNumberingAfterBreak="0">
+    <w:nsid w:val="4DD40B20"/>
+    <w:multiLevelType w:val="multilevel"/>
+    <w:tmpl w:val="F83CD016"/>
+    <w:lvl w:ilvl="0">
+      <w:start w:val="1"/>
+      <w:numFmt w:val="bullet"/>
+      <w:lvlText w:val=""/>
+      <w:lvlJc w:val="left"/>
+      <w:pPr>
+        <w:tabs>
+          <w:tab w:val="num" w:pos="3600"/>
+        </w:tabs>
+        <w:ind w:left="3600" w:hanging="360"/>
+      </w:pPr>
+      <w:rPr>
+        <w:rFonts w:ascii="Symbol" w:hAnsi="Symbol" w:hint="default"/>
+        <w:sz w:val="20"/>
+      </w:rPr>
+    </w:lvl>
+    <w:lvl w:ilvl="1" w:tentative="1">
+      <w:start w:val="1"/>
+      <w:numFmt w:val="bullet"/>
+      <w:lvlText w:val="o"/>
+      <w:lvlJc w:val="left"/>
+      <w:pPr>
+        <w:tabs>
+          <w:tab w:val="num" w:pos="4320"/>
+        </w:tabs>
+        <w:ind w:left="4320" w:hanging="360"/>
+      </w:pPr>
+      <w:rPr>
+        <w:rFonts w:ascii="Courier New" w:hAnsi="Courier New" w:hint="default"/>
+        <w:sz w:val="20"/>
+      </w:rPr>
+    </w:lvl>
+    <w:lvl w:ilvl="2" w:tentative="1">
+      <w:start w:val="1"/>
+      <w:numFmt w:val="bullet"/>
+      <w:lvlText w:val=""/>
+      <w:lvlJc w:val="left"/>
+      <w:pPr>
+        <w:tabs>
+          <w:tab w:val="num" w:pos="5040"/>
+        </w:tabs>
+        <w:ind w:left="5040" w:hanging="360"/>
+      </w:pPr>
+      <w:rPr>
+        <w:rFonts w:ascii="Wingdings" w:hAnsi="Wingdings" w:hint="default"/>
+        <w:sz w:val="20"/>
+      </w:rPr>
+    </w:lvl>
+    <w:lvl w:ilvl="3" w:tentative="1">
+      <w:start w:val="1"/>
+      <w:numFmt w:val="bullet"/>
+      <w:lvlText w:val=""/>
+      <w:lvlJc w:val="left"/>
+      <w:pPr>
+        <w:tabs>
+          <w:tab w:val="num" w:pos="5760"/>
+        </w:tabs>
+        <w:ind w:left="5760" w:hanging="360"/>
+      </w:pPr>
+      <w:rPr>
+        <w:rFonts w:ascii="Wingdings" w:hAnsi="Wingdings" w:hint="default"/>
+        <w:sz w:val="20"/>
+      </w:rPr>
+    </w:lvl>
+    <w:lvl w:ilvl="4" w:tentative="1">
+      <w:start w:val="1"/>
+      <w:numFmt w:val="bullet"/>
+      <w:lvlText w:val=""/>
+      <w:lvlJc w:val="left"/>
+      <w:pPr>
+        <w:tabs>
+          <w:tab w:val="num" w:pos="6480"/>
+        </w:tabs>
+        <w:ind w:left="6480" w:hanging="360"/>
+      </w:pPr>
+      <w:rPr>
+        <w:rFonts w:ascii="Wingdings" w:hAnsi="Wingdings" w:hint="default"/>
+        <w:sz w:val="20"/>
+      </w:rPr>
+    </w:lvl>
+    <w:lvl w:ilvl="5" w:tentative="1">
+      <w:start w:val="1"/>
+      <w:numFmt w:val="bullet"/>
+      <w:lvlText w:val=""/>
+      <w:lvlJc w:val="left"/>
+      <w:pPr>
+        <w:tabs>
+          <w:tab w:val="num" w:pos="7200"/>
+        </w:tabs>
+        <w:ind w:left="7200" w:hanging="360"/>
+      </w:pPr>
+      <w:rPr>
+        <w:rFonts w:ascii="Wingdings" w:hAnsi="Wingdings" w:hint="default"/>
+        <w:sz w:val="20"/>
+      </w:rPr>
+    </w:lvl>
+    <w:lvl w:ilvl="6" w:tentative="1">
+      <w:start w:val="1"/>
+      <w:numFmt w:val="bullet"/>
+      <w:lvlText w:val=""/>
+      <w:lvlJc w:val="left"/>
+      <w:pPr>
+        <w:tabs>
+          <w:tab w:val="num" w:pos="7920"/>
+        </w:tabs>
+        <w:ind w:left="7920" w:hanging="360"/>
+      </w:pPr>
+      <w:rPr>
+        <w:rFonts w:ascii="Wingdings" w:hAnsi="Wingdings" w:hint="default"/>
+        <w:sz w:val="20"/>
+      </w:rPr>
+    </w:lvl>
+    <w:lvl w:ilvl="7" w:tentative="1">
+      <w:start w:val="1"/>
+      <w:numFmt w:val="bullet"/>
+      <w:lvlText w:val=""/>
+      <w:lvlJc w:val="left"/>
+      <w:pPr>
+        <w:tabs>
+          <w:tab w:val="num" w:pos="8640"/>
+        </w:tabs>
+        <w:ind w:left="8640" w:hanging="360"/>
+      </w:pPr>
+      <w:rPr>
+        <w:rFonts w:ascii="Wingdings" w:hAnsi="Wingdings" w:hint="default"/>
+        <w:sz w:val="20"/>
+      </w:rPr>
+    </w:lvl>
+    <w:lvl w:ilvl="8" w:tentative="1">
+      <w:start w:val="1"/>
+      <w:numFmt w:val="bullet"/>
+      <w:lvlText w:val=""/>
+      <w:lvlJc w:val="left"/>
+      <w:pPr>
+        <w:tabs>
+          <w:tab w:val="num" w:pos="9360"/>
+        </w:tabs>
+        <w:ind w:left="9360" w:hanging="360"/>
+      </w:pPr>
+      <w:rPr>
+        <w:rFonts w:ascii="Wingdings" w:hAnsi="Wingdings" w:hint="default"/>
+        <w:sz w:val="20"/>
+      </w:rPr>
+    </w:lvl>
+  </w:abstractNum>
+  <w:abstractNum w:abstractNumId="34" w15:restartNumberingAfterBreak="0">
+    <w:nsid w:val="50DA01E7"/>
+    <w:multiLevelType w:val="hybridMultilevel"/>
+    <w:tmpl w:val="7096A168"/>
+    <w:lvl w:ilvl="0" w:tplc="0C0A0001">
+      <w:start w:val="1"/>
+      <w:numFmt w:val="bullet"/>
+      <w:lvlText w:val=""/>
+      <w:lvlJc w:val="left"/>
+      <w:pPr>
+        <w:ind w:left="1428" w:hanging="360"/>
+      </w:pPr>
+      <w:rPr>
+        <w:rFonts w:ascii="Symbol" w:hAnsi="Symbol" w:hint="default"/>
+      </w:rPr>
+    </w:lvl>
+    <w:lvl w:ilvl="1" w:tplc="0C0A0003" w:tentative="1">
+      <w:start w:val="1"/>
+      <w:numFmt w:val="bullet"/>
+      <w:lvlText w:val="o"/>
+      <w:lvlJc w:val="left"/>
+      <w:pPr>
+        <w:ind w:left="2148" w:hanging="360"/>
+      </w:pPr>
+      <w:rPr>
+        <w:rFonts w:ascii="Courier New" w:hAnsi="Courier New" w:cs="Courier New" w:hint="default"/>
+      </w:rPr>
+    </w:lvl>
+    <w:lvl w:ilvl="2" w:tplc="0C0A0005" w:tentative="1">
+      <w:start w:val="1"/>
+      <w:numFmt w:val="bullet"/>
+      <w:lvlText w:val=""/>
+      <w:lvlJc w:val="left"/>
+      <w:pPr>
+        <w:ind w:left="2868" w:hanging="360"/>
+      </w:pPr>
+      <w:rPr>
+        <w:rFonts w:ascii="Wingdings" w:hAnsi="Wingdings" w:hint="default"/>
+      </w:rPr>
+    </w:lvl>
+    <w:lvl w:ilvl="3" w:tplc="0C0A0001" w:tentative="1">
+      <w:start w:val="1"/>
+      <w:numFmt w:val="bullet"/>
+      <w:lvlText w:val=""/>
+      <w:lvlJc w:val="left"/>
+      <w:pPr>
+        <w:ind w:left="3588" w:hanging="360"/>
+      </w:pPr>
+      <w:rPr>
+        <w:rFonts w:ascii="Symbol" w:hAnsi="Symbol" w:hint="default"/>
+      </w:rPr>
+    </w:lvl>
+    <w:lvl w:ilvl="4" w:tplc="0C0A0003" w:tentative="1">
+      <w:start w:val="1"/>
+      <w:numFmt w:val="bullet"/>
+      <w:lvlText w:val="o"/>
+      <w:lvlJc w:val="left"/>
+      <w:pPr>
+        <w:ind w:left="4308" w:hanging="360"/>
+      </w:pPr>
+      <w:rPr>
+        <w:rFonts w:ascii="Courier New" w:hAnsi="Courier New" w:cs="Courier New" w:hint="default"/>
+      </w:rPr>
+    </w:lvl>
+    <w:lvl w:ilvl="5" w:tplc="0C0A0005" w:tentative="1">
+      <w:start w:val="1"/>
+      <w:numFmt w:val="bullet"/>
+      <w:lvlText w:val=""/>
+      <w:lvlJc w:val="left"/>
+      <w:pPr>
+        <w:ind w:left="5028" w:hanging="360"/>
+      </w:pPr>
+      <w:rPr>
+        <w:rFonts w:ascii="Wingdings" w:hAnsi="Wingdings" w:hint="default"/>
+      </w:rPr>
+    </w:lvl>
+    <w:lvl w:ilvl="6" w:tplc="0C0A0001" w:tentative="1">
+      <w:start w:val="1"/>
+      <w:numFmt w:val="bullet"/>
+      <w:lvlText w:val=""/>
+      <w:lvlJc w:val="left"/>
+      <w:pPr>
+        <w:ind w:left="5748" w:hanging="360"/>
+      </w:pPr>
+      <w:rPr>
+        <w:rFonts w:ascii="Symbol" w:hAnsi="Symbol" w:hint="default"/>
+      </w:rPr>
+    </w:lvl>
+    <w:lvl w:ilvl="7" w:tplc="0C0A0003" w:tentative="1">
+      <w:start w:val="1"/>
+      <w:numFmt w:val="bullet"/>
+      <w:lvlText w:val="o"/>
+      <w:lvlJc w:val="left"/>
+      <w:pPr>
+        <w:ind w:left="6468" w:hanging="360"/>
+      </w:pPr>
+      <w:rPr>
+        <w:rFonts w:ascii="Courier New" w:hAnsi="Courier New" w:cs="Courier New" w:hint="default"/>
+      </w:rPr>
+    </w:lvl>
+    <w:lvl w:ilvl="8" w:tplc="0C0A0005" w:tentative="1">
+      <w:start w:val="1"/>
+      <w:numFmt w:val="bullet"/>
+      <w:lvlText w:val=""/>
+      <w:lvlJc w:val="left"/>
+      <w:pPr>
+        <w:ind w:left="7188" w:hanging="360"/>
+      </w:pPr>
+      <w:rPr>
+        <w:rFonts w:ascii="Wingdings" w:hAnsi="Wingdings" w:hint="default"/>
+      </w:rPr>
+    </w:lvl>
+  </w:abstractNum>
+  <w:abstractNum w:abstractNumId="35" w15:restartNumberingAfterBreak="0">
     <w:nsid w:val="528A44CC"/>
     <w:multiLevelType w:val="multilevel"/>
     <w:tmpl w:val="FF12F8EA"/>
@@ -17774,7 +19395,7 @@
       </w:rPr>
     </w:lvl>
   </w:abstractNum>
-  <w:abstractNum w:abstractNumId="29" w15:restartNumberingAfterBreak="0">
+  <w:abstractNum w:abstractNumId="36" w15:restartNumberingAfterBreak="0">
     <w:nsid w:val="56EA1EAF"/>
     <w:multiLevelType w:val="multilevel"/>
     <w:tmpl w:val="C79C3080"/>
@@ -17887,7 +19508,7 @@
       </w:pPr>
     </w:lvl>
   </w:abstractNum>
-  <w:abstractNum w:abstractNumId="30" w15:restartNumberingAfterBreak="0">
+  <w:abstractNum w:abstractNumId="37" w15:restartNumberingAfterBreak="0">
     <w:nsid w:val="61292A82"/>
     <w:multiLevelType w:val="multilevel"/>
     <w:tmpl w:val="10F0450A"/>
@@ -18027,7 +19648,7 @@
       </w:rPr>
     </w:lvl>
   </w:abstractNum>
-  <w:abstractNum w:abstractNumId="31" w15:restartNumberingAfterBreak="0">
+  <w:abstractNum w:abstractNumId="38" w15:restartNumberingAfterBreak="0">
     <w:nsid w:val="614B5575"/>
     <w:multiLevelType w:val="hybridMultilevel"/>
     <w:tmpl w:val="0406A6C8"/>
@@ -18141,7 +19762,7 @@
       </w:rPr>
     </w:lvl>
   </w:abstractNum>
-  <w:abstractNum w:abstractNumId="32" w15:restartNumberingAfterBreak="0">
+  <w:abstractNum w:abstractNumId="39" w15:restartNumberingAfterBreak="0">
     <w:nsid w:val="61FF33FD"/>
     <w:multiLevelType w:val="multilevel"/>
     <w:tmpl w:val="70B65930"/>
@@ -18281,7 +19902,7 @@
       </w:rPr>
     </w:lvl>
   </w:abstractNum>
-  <w:abstractNum w:abstractNumId="33" w15:restartNumberingAfterBreak="0">
+  <w:abstractNum w:abstractNumId="40" w15:restartNumberingAfterBreak="0">
     <w:nsid w:val="65913E8C"/>
     <w:multiLevelType w:val="multilevel"/>
     <w:tmpl w:val="970643DA"/>
@@ -18430,7 +20051,7 @@
       </w:rPr>
     </w:lvl>
   </w:abstractNum>
-  <w:abstractNum w:abstractNumId="34" w15:restartNumberingAfterBreak="0">
+  <w:abstractNum w:abstractNumId="41" w15:restartNumberingAfterBreak="0">
     <w:nsid w:val="6BF31981"/>
     <w:multiLevelType w:val="multilevel"/>
     <w:tmpl w:val="2C64408A"/>
@@ -18570,7 +20191,7 @@
       </w:rPr>
     </w:lvl>
   </w:abstractNum>
-  <w:abstractNum w:abstractNumId="35" w15:restartNumberingAfterBreak="0">
+  <w:abstractNum w:abstractNumId="42" w15:restartNumberingAfterBreak="0">
     <w:nsid w:val="73B4C88C"/>
     <w:multiLevelType w:val="hybridMultilevel"/>
     <w:tmpl w:val="6D8C17A2"/>
@@ -18656,7 +20277,156 @@
       </w:pPr>
     </w:lvl>
   </w:abstractNum>
-  <w:abstractNum w:abstractNumId="36" w15:restartNumberingAfterBreak="0">
+  <w:abstractNum w:abstractNumId="43" w15:restartNumberingAfterBreak="0">
+    <w:nsid w:val="75354E8A"/>
+    <w:multiLevelType w:val="multilevel"/>
+    <w:tmpl w:val="A78C158A"/>
+    <w:lvl w:ilvl="0">
+      <w:start w:val="1"/>
+      <w:numFmt w:val="bullet"/>
+      <w:lvlText w:val=""/>
+      <w:lvlJc w:val="left"/>
+      <w:pPr>
+        <w:tabs>
+          <w:tab w:val="num" w:pos="720"/>
+        </w:tabs>
+        <w:ind w:left="720" w:hanging="360"/>
+      </w:pPr>
+      <w:rPr>
+        <w:rFonts w:ascii="Symbol" w:hAnsi="Symbol" w:hint="default"/>
+        <w:sz w:val="20"/>
+      </w:rPr>
+    </w:lvl>
+    <w:lvl w:ilvl="1" w:tentative="1">
+      <w:start w:val="1"/>
+      <w:numFmt w:val="bullet"/>
+      <w:lvlText w:val="o"/>
+      <w:lvlJc w:val="left"/>
+      <w:pPr>
+        <w:tabs>
+          <w:tab w:val="num" w:pos="1440"/>
+        </w:tabs>
+        <w:ind w:left="1440" w:hanging="360"/>
+      </w:pPr>
+      <w:rPr>
+        <w:rFonts w:ascii="Courier New" w:hAnsi="Courier New" w:hint="default"/>
+        <w:sz w:val="20"/>
+      </w:rPr>
+    </w:lvl>
+    <w:lvl w:ilvl="2" w:tentative="1">
+      <w:start w:val="1"/>
+      <w:numFmt w:val="bullet"/>
+      <w:lvlText w:val=""/>
+      <w:lvlJc w:val="left"/>
+      <w:pPr>
+        <w:tabs>
+          <w:tab w:val="num" w:pos="2160"/>
+        </w:tabs>
+        <w:ind w:left="2160" w:hanging="360"/>
+      </w:pPr>
+      <w:rPr>
+        <w:rFonts w:ascii="Wingdings" w:hAnsi="Wingdings" w:hint="default"/>
+        <w:sz w:val="20"/>
+      </w:rPr>
+    </w:lvl>
+    <w:lvl w:ilvl="3" w:tentative="1">
+      <w:start w:val="1"/>
+      <w:numFmt w:val="bullet"/>
+      <w:lvlText w:val=""/>
+      <w:lvlJc w:val="left"/>
+      <w:pPr>
+        <w:tabs>
+          <w:tab w:val="num" w:pos="2880"/>
+        </w:tabs>
+        <w:ind w:left="2880" w:hanging="360"/>
+      </w:pPr>
+      <w:rPr>
+        <w:rFonts w:ascii="Wingdings" w:hAnsi="Wingdings" w:hint="default"/>
+        <w:sz w:val="20"/>
+      </w:rPr>
+    </w:lvl>
+    <w:lvl w:ilvl="4" w:tentative="1">
+      <w:start w:val="1"/>
+      <w:numFmt w:val="bullet"/>
+      <w:lvlText w:val=""/>
+      <w:lvlJc w:val="left"/>
+      <w:pPr>
+        <w:tabs>
+          <w:tab w:val="num" w:pos="3600"/>
+        </w:tabs>
+        <w:ind w:left="3600" w:hanging="360"/>
+      </w:pPr>
+      <w:rPr>
+        <w:rFonts w:ascii="Wingdings" w:hAnsi="Wingdings" w:hint="default"/>
+        <w:sz w:val="20"/>
+      </w:rPr>
+    </w:lvl>
+    <w:lvl w:ilvl="5" w:tentative="1">
+      <w:start w:val="1"/>
+      <w:numFmt w:val="bullet"/>
+      <w:lvlText w:val=""/>
+      <w:lvlJc w:val="left"/>
+      <w:pPr>
+        <w:tabs>
+          <w:tab w:val="num" w:pos="4320"/>
+        </w:tabs>
+        <w:ind w:left="4320" w:hanging="360"/>
+      </w:pPr>
+      <w:rPr>
+        <w:rFonts w:ascii="Wingdings" w:hAnsi="Wingdings" w:hint="default"/>
+        <w:sz w:val="20"/>
+      </w:rPr>
+    </w:lvl>
+    <w:lvl w:ilvl="6" w:tentative="1">
+      <w:start w:val="1"/>
+      <w:numFmt w:val="bullet"/>
+      <w:lvlText w:val=""/>
+      <w:lvlJc w:val="left"/>
+      <w:pPr>
+        <w:tabs>
+          <w:tab w:val="num" w:pos="5040"/>
+        </w:tabs>
+        <w:ind w:left="5040" w:hanging="360"/>
+      </w:pPr>
+      <w:rPr>
+        <w:rFonts w:ascii="Wingdings" w:hAnsi="Wingdings" w:hint="default"/>
+        <w:sz w:val="20"/>
+      </w:rPr>
+    </w:lvl>
+    <w:lvl w:ilvl="7" w:tentative="1">
+      <w:start w:val="1"/>
+      <w:numFmt w:val="bullet"/>
+      <w:lvlText w:val=""/>
+      <w:lvlJc w:val="left"/>
+      <w:pPr>
+        <w:tabs>
+          <w:tab w:val="num" w:pos="5760"/>
+        </w:tabs>
+        <w:ind w:left="5760" w:hanging="360"/>
+      </w:pPr>
+      <w:rPr>
+        <w:rFonts w:ascii="Wingdings" w:hAnsi="Wingdings" w:hint="default"/>
+        <w:sz w:val="20"/>
+      </w:rPr>
+    </w:lvl>
+    <w:lvl w:ilvl="8" w:tentative="1">
+      <w:start w:val="1"/>
+      <w:numFmt w:val="bullet"/>
+      <w:lvlText w:val=""/>
+      <w:lvlJc w:val="left"/>
+      <w:pPr>
+        <w:tabs>
+          <w:tab w:val="num" w:pos="6480"/>
+        </w:tabs>
+        <w:ind w:left="6480" w:hanging="360"/>
+      </w:pPr>
+      <w:rPr>
+        <w:rFonts w:ascii="Wingdings" w:hAnsi="Wingdings" w:hint="default"/>
+        <w:sz w:val="20"/>
+      </w:rPr>
+    </w:lvl>
+  </w:abstractNum>
+  <w:abstractNum w:abstractNumId="44" w15:restartNumberingAfterBreak="0">
     <w:nsid w:val="76723588"/>
     <w:multiLevelType w:val="multilevel"/>
     <w:tmpl w:val="DA28D350"/>
@@ -18769,7 +20539,7 @@
       </w:pPr>
     </w:lvl>
   </w:abstractNum>
-  <w:abstractNum w:abstractNumId="37" w15:restartNumberingAfterBreak="0">
+  <w:abstractNum w:abstractNumId="45" w15:restartNumberingAfterBreak="0">
     <w:nsid w:val="774B49F8"/>
     <w:multiLevelType w:val="multilevel"/>
     <w:tmpl w:val="CBFAD1F2"/>
@@ -18909,7 +20679,7 @@
       </w:rPr>
     </w:lvl>
   </w:abstractNum>
-  <w:abstractNum w:abstractNumId="38" w15:restartNumberingAfterBreak="0">
+  <w:abstractNum w:abstractNumId="46" w15:restartNumberingAfterBreak="0">
     <w:nsid w:val="799C31B5"/>
     <w:multiLevelType w:val="multilevel"/>
     <w:tmpl w:val="70889FAE"/>
@@ -19050,52 +20820,52 @@
     </w:lvl>
   </w:abstractNum>
   <w:num w:numId="1" w16cid:durableId="2113014704">
+    <w:abstractNumId w:val="42"/>
+  </w:num>
+  <w:num w:numId="2" w16cid:durableId="846021626">
+    <w:abstractNumId w:val="25"/>
+  </w:num>
+  <w:num w:numId="3" w16cid:durableId="856044585">
+    <w:abstractNumId w:val="22"/>
+  </w:num>
+  <w:num w:numId="4" w16cid:durableId="101271883">
+    <w:abstractNumId w:val="31"/>
+  </w:num>
+  <w:num w:numId="5" w16cid:durableId="1243026041">
+    <w:abstractNumId w:val="37"/>
+  </w:num>
+  <w:num w:numId="6" w16cid:durableId="824787241">
+    <w:abstractNumId w:val="45"/>
+  </w:num>
+  <w:num w:numId="7" w16cid:durableId="1391535419">
+    <w:abstractNumId w:val="36"/>
+  </w:num>
+  <w:num w:numId="8" w16cid:durableId="1032150560">
+    <w:abstractNumId w:val="46"/>
+  </w:num>
+  <w:num w:numId="9" w16cid:durableId="499126505">
+    <w:abstractNumId w:val="30"/>
+  </w:num>
+  <w:num w:numId="10" w16cid:durableId="266085855">
+    <w:abstractNumId w:val="41"/>
+  </w:num>
+  <w:num w:numId="11" w16cid:durableId="779959250">
+    <w:abstractNumId w:val="26"/>
+  </w:num>
+  <w:num w:numId="12" w16cid:durableId="1604873041">
+    <w:abstractNumId w:val="20"/>
+  </w:num>
+  <w:num w:numId="13" w16cid:durableId="511842705">
+    <w:abstractNumId w:val="44"/>
+  </w:num>
+  <w:num w:numId="14" w16cid:durableId="840504318">
+    <w:abstractNumId w:val="17"/>
+  </w:num>
+  <w:num w:numId="15" w16cid:durableId="768357962">
     <w:abstractNumId w:val="35"/>
   </w:num>
-  <w:num w:numId="2" w16cid:durableId="846021626">
-    <w:abstractNumId w:val="22"/>
-  </w:num>
-  <w:num w:numId="3" w16cid:durableId="856044585">
-    <w:abstractNumId w:val="20"/>
-  </w:num>
-  <w:num w:numId="4" w16cid:durableId="101271883">
-    <w:abstractNumId w:val="26"/>
-  </w:num>
-  <w:num w:numId="5" w16cid:durableId="1243026041">
-    <w:abstractNumId w:val="30"/>
-  </w:num>
-  <w:num w:numId="6" w16cid:durableId="824787241">
-    <w:abstractNumId w:val="37"/>
-  </w:num>
-  <w:num w:numId="7" w16cid:durableId="1391535419">
-    <w:abstractNumId w:val="29"/>
-  </w:num>
-  <w:num w:numId="8" w16cid:durableId="1032150560">
-    <w:abstractNumId w:val="38"/>
-  </w:num>
-  <w:num w:numId="9" w16cid:durableId="499126505">
-    <w:abstractNumId w:val="25"/>
-  </w:num>
-  <w:num w:numId="10" w16cid:durableId="266085855">
-    <w:abstractNumId w:val="34"/>
-  </w:num>
-  <w:num w:numId="11" w16cid:durableId="779959250">
-    <w:abstractNumId w:val="23"/>
-  </w:num>
-  <w:num w:numId="12" w16cid:durableId="1604873041">
-    <w:abstractNumId w:val="18"/>
-  </w:num>
-  <w:num w:numId="13" w16cid:durableId="511842705">
-    <w:abstractNumId w:val="36"/>
-  </w:num>
-  <w:num w:numId="14" w16cid:durableId="840504318">
-    <w:abstractNumId w:val="15"/>
-  </w:num>
-  <w:num w:numId="15" w16cid:durableId="768357962">
-    <w:abstractNumId w:val="28"/>
-  </w:num>
   <w:num w:numId="16" w16cid:durableId="440878550">
-    <w:abstractNumId w:val="32"/>
+    <w:abstractNumId w:val="39"/>
   </w:num>
   <w:num w:numId="17" w16cid:durableId="1772043573">
     <w:abstractNumId w:val="8"/>
@@ -19128,43 +20898,67 @@
     <w:abstractNumId w:val="4"/>
   </w:num>
   <w:num w:numId="27" w16cid:durableId="1585871920">
-    <w:abstractNumId w:val="16"/>
+    <w:abstractNumId w:val="18"/>
   </w:num>
   <w:num w:numId="28" w16cid:durableId="368651360">
-    <w:abstractNumId w:val="31"/>
+    <w:abstractNumId w:val="38"/>
   </w:num>
   <w:num w:numId="29" w16cid:durableId="879130581">
+    <w:abstractNumId w:val="32"/>
+  </w:num>
+  <w:num w:numId="30" w16cid:durableId="1805462885">
+    <w:abstractNumId w:val="15"/>
+  </w:num>
+  <w:num w:numId="31" w16cid:durableId="451554970">
+    <w:abstractNumId w:val="14"/>
+  </w:num>
+  <w:num w:numId="32" w16cid:durableId="817457399">
+    <w:abstractNumId w:val="40"/>
+  </w:num>
+  <w:num w:numId="33" w16cid:durableId="1996567190">
+    <w:abstractNumId w:val="21"/>
+  </w:num>
+  <w:num w:numId="34" w16cid:durableId="1299992438">
+    <w:abstractNumId w:val="24"/>
+  </w:num>
+  <w:num w:numId="35" w16cid:durableId="352653858">
+    <w:abstractNumId w:val="12"/>
+  </w:num>
+  <w:num w:numId="36" w16cid:durableId="1840121875">
+    <w:abstractNumId w:val="19"/>
+  </w:num>
+  <w:num w:numId="37" w16cid:durableId="1831170911">
     <w:abstractNumId w:val="27"/>
   </w:num>
-  <w:num w:numId="30" w16cid:durableId="1805462885">
-    <w:abstractNumId w:val="14"/>
-  </w:num>
-  <w:num w:numId="31" w16cid:durableId="451554970">
+  <w:num w:numId="38" w16cid:durableId="827136442">
     <w:abstractNumId w:val="13"/>
-  </w:num>
-  <w:num w:numId="32" w16cid:durableId="817457399">
-    <w:abstractNumId w:val="33"/>
-  </w:num>
-  <w:num w:numId="33" w16cid:durableId="1996567190">
-    <w:abstractNumId w:val="19"/>
-  </w:num>
-  <w:num w:numId="34" w16cid:durableId="1299992438">
-    <w:abstractNumId w:val="21"/>
-  </w:num>
-  <w:num w:numId="35" w16cid:durableId="352653858">
-    <w:abstractNumId w:val="11"/>
-  </w:num>
-  <w:num w:numId="36" w16cid:durableId="1840121875">
-    <w:abstractNumId w:val="17"/>
-  </w:num>
-  <w:num w:numId="37" w16cid:durableId="1831170911">
-    <w:abstractNumId w:val="24"/>
-  </w:num>
-  <w:num w:numId="38" w16cid:durableId="827136442">
-    <w:abstractNumId w:val="12"/>
   </w:num>
   <w:num w:numId="39" w16cid:durableId="446969884">
     <w:abstractNumId w:val="10"/>
+  </w:num>
+  <w:num w:numId="40" w16cid:durableId="1595548902">
+    <w:abstractNumId w:val="43"/>
+  </w:num>
+  <w:num w:numId="41" w16cid:durableId="1314915956">
+    <w:abstractNumId w:val="29"/>
+  </w:num>
+  <w:num w:numId="42" w16cid:durableId="905383881">
+    <w:abstractNumId w:val="33"/>
+  </w:num>
+  <w:num w:numId="43" w16cid:durableId="320549036">
+    <w:abstractNumId w:val="28"/>
+  </w:num>
+  <w:num w:numId="44" w16cid:durableId="696350055">
+    <w:abstractNumId w:val="34"/>
+  </w:num>
+  <w:num w:numId="45" w16cid:durableId="1826817514">
+    <w:abstractNumId w:val="11"/>
+  </w:num>
+  <w:num w:numId="46" w16cid:durableId="1975022890">
+    <w:abstractNumId w:val="23"/>
+  </w:num>
+  <w:num w:numId="47" w16cid:durableId="1615819707">
+    <w:abstractNumId w:val="16"/>
   </w:num>
 </w:numbering>
 </file>
@@ -19705,7 +21499,6 @@
   <w:style w:type="character" w:default="1" w:styleId="DefaultParagraphFont">
     <w:name w:val="Default Paragraph Font"/>
     <w:uiPriority w:val="1"/>
-    <w:semiHidden/>
     <w:unhideWhenUsed/>
   </w:style>
   <w:style w:type="table" w:default="1" w:styleId="TableNormal">
@@ -20947,10 +22740,27 @@
 </file>
 
 <file path=customXml/item1.xml><?xml version="1.0" encoding="utf-8"?>
+<p:properties xmlns:p="http://schemas.microsoft.com/office/2006/metadata/properties" xmlns:xsi="http://www.w3.org/2001/XMLSchema-instance" xmlns:pc="http://schemas.microsoft.com/office/infopath/2007/PartnerControls">
+  <documentManagement>
+    <_activity xmlns="0dd81e3e-32c4-45c3-852a-33c36a8ca9a2" xsi:nil="true"/>
+  </documentManagement>
+</p:properties>
+</file>
+
+<file path=customXml/item2.xml><?xml version="1.0" encoding="utf-8"?>
 <b:Sources xmlns:b="http://schemas.openxmlformats.org/officeDocument/2006/bibliography" xmlns="http://schemas.openxmlformats.org/officeDocument/2006/bibliography" SelectedStyle="\APA.XSL" StyleName="APA Fifth Edition"/>
 </file>
 
-<file path=customXml/item2.xml><?xml version="1.0" encoding="utf-8"?>
+<file path=customXml/item3.xml><?xml version="1.0" encoding="utf-8"?>
+<?mso-contentType ?>
+<FormTemplates xmlns="http://schemas.microsoft.com/sharepoint/v3/contenttype/forms">
+  <Display>DocumentLibraryForm</Display>
+  <Edit>DocumentLibraryForm</Edit>
+  <New>DocumentLibraryForm</New>
+</FormTemplates>
+</file>
+
+<file path=customXml/item4.xml><?xml version="1.0" encoding="utf-8"?>
 <ct:contentTypeSchema xmlns:ct="http://schemas.microsoft.com/office/2006/metadata/contentType" xmlns:ma="http://schemas.microsoft.com/office/2006/metadata/properties/metaAttributes" ct:_="" ma:_="" ma:contentTypeName="Documento" ma:contentTypeID="0x01010025101D0885731048B0CD21D432E8305A" ma:contentTypeVersion="11" ma:contentTypeDescription="Crear nuevo documento." ma:contentTypeScope="" ma:versionID="81bcf49ec1edc4061c6f9fddaf17e5a4">
   <xsd:schema xmlns:xsd="http://www.w3.org/2001/XMLSchema" xmlns:xs="http://www.w3.org/2001/XMLSchema" xmlns:p="http://schemas.microsoft.com/office/2006/metadata/properties" xmlns:ns3="0dd81e3e-32c4-45c3-852a-33c36a8ca9a2" targetNamespace="http://schemas.microsoft.com/office/2006/metadata/properties" ma:root="true" ma:fieldsID="e214c24f35242a31bbaa59618cd4f46f" ns3:_="">
     <xsd:import namespace="0dd81e3e-32c4-45c3-852a-33c36a8ca9a2"/>
@@ -21138,24 +22948,17 @@
 </ct:contentTypeSchema>
 </file>
 
-<file path=customXml/item3.xml><?xml version="1.0" encoding="utf-8"?>
-<p:properties xmlns:p="http://schemas.microsoft.com/office/2006/metadata/properties" xmlns:xsi="http://www.w3.org/2001/XMLSchema-instance" xmlns:pc="http://schemas.microsoft.com/office/infopath/2007/PartnerControls">
-  <documentManagement>
-    <_activity xmlns="0dd81e3e-32c4-45c3-852a-33c36a8ca9a2" xsi:nil="true"/>
-  </documentManagement>
-</p:properties>
+<file path=customXml/itemProps1.xml><?xml version="1.0" encoding="utf-8"?>
+<ds:datastoreItem xmlns:ds="http://schemas.openxmlformats.org/officeDocument/2006/customXml" ds:itemID="{56B03E1A-13FD-4632-B7FD-6FEC8181D718}">
+  <ds:schemaRefs>
+    <ds:schemaRef ds:uri="http://schemas.microsoft.com/office/2006/metadata/properties"/>
+    <ds:schemaRef ds:uri="http://schemas.microsoft.com/office/infopath/2007/PartnerControls"/>
+    <ds:schemaRef ds:uri="0dd81e3e-32c4-45c3-852a-33c36a8ca9a2"/>
+  </ds:schemaRefs>
+</ds:datastoreItem>
 </file>
 
-<file path=customXml/item4.xml><?xml version="1.0" encoding="utf-8"?>
-<?mso-contentType ?>
-<FormTemplates xmlns="http://schemas.microsoft.com/sharepoint/v3/contenttype/forms">
-  <Display>DocumentLibraryForm</Display>
-  <Edit>DocumentLibraryForm</Edit>
-  <New>DocumentLibraryForm</New>
-</FormTemplates>
-</file>
-
-<file path=customXml/itemProps1.xml><?xml version="1.0" encoding="utf-8"?>
+<file path=customXml/itemProps2.xml><?xml version="1.0" encoding="utf-8"?>
 <ds:datastoreItem xmlns:ds="http://schemas.openxmlformats.org/officeDocument/2006/customXml" ds:itemID="{16C71FD4-B25F-4F52-875D-9049229978E5}">
   <ds:schemaRefs>
     <ds:schemaRef ds:uri="http://schemas.openxmlformats.org/officeDocument/2006/bibliography"/>
@@ -21163,7 +22966,15 @@
 </ds:datastoreItem>
 </file>
 
-<file path=customXml/itemProps2.xml><?xml version="1.0" encoding="utf-8"?>
+<file path=customXml/itemProps3.xml><?xml version="1.0" encoding="utf-8"?>
+<ds:datastoreItem xmlns:ds="http://schemas.openxmlformats.org/officeDocument/2006/customXml" ds:itemID="{D6C383AF-1EC1-4F0E-B800-E4A39F6E2FAF}">
+  <ds:schemaRefs>
+    <ds:schemaRef ds:uri="http://schemas.microsoft.com/sharepoint/v3/contenttype/forms"/>
+  </ds:schemaRefs>
+</ds:datastoreItem>
+</file>
+
+<file path=customXml/itemProps4.xml><?xml version="1.0" encoding="utf-8"?>
 <ds:datastoreItem xmlns:ds="http://schemas.openxmlformats.org/officeDocument/2006/customXml" ds:itemID="{DCD06B4A-01B4-46AA-8422-B68B8898A05E}">
   <ds:schemaRefs>
     <ds:schemaRef ds:uri="http://schemas.microsoft.com/office/2006/metadata/contentType"/>
@@ -21179,22 +22990,4 @@
     <ds:schemaRef ds:uri="http://schemas.microsoft.com/internal/obd"/>
   </ds:schemaRefs>
 </ds:datastoreItem>
-</file>
-
-<file path=customXml/itemProps3.xml><?xml version="1.0" encoding="utf-8"?>
-<ds:datastoreItem xmlns:ds="http://schemas.openxmlformats.org/officeDocument/2006/customXml" ds:itemID="{56B03E1A-13FD-4632-B7FD-6FEC8181D718}">
-  <ds:schemaRefs>
-    <ds:schemaRef ds:uri="http://schemas.microsoft.com/office/2006/metadata/properties"/>
-    <ds:schemaRef ds:uri="http://schemas.microsoft.com/office/infopath/2007/PartnerControls"/>
-    <ds:schemaRef ds:uri="0dd81e3e-32c4-45c3-852a-33c36a8ca9a2"/>
-  </ds:schemaRefs>
-</ds:datastoreItem>
-</file>
-
-<file path=customXml/itemProps4.xml><?xml version="1.0" encoding="utf-8"?>
-<ds:datastoreItem xmlns:ds="http://schemas.openxmlformats.org/officeDocument/2006/customXml" ds:itemID="{D6C383AF-1EC1-4F0E-B800-E4A39F6E2FAF}">
-  <ds:schemaRefs>
-    <ds:schemaRef ds:uri="http://schemas.microsoft.com/sharepoint/v3/contenttype/forms"/>
-  </ds:schemaRefs>
-</ds:datastoreItem>
 </file>
</xml_diff>

<commit_message>
añadidos casos de uso y alguna cosa mas
</commit_message>
<xml_diff>
--- a/MemoriaTFG-IvanMartinNieto.docx
+++ b/MemoriaTFG-IvanMartinNieto.docx
@@ -83,7 +83,7 @@
               </wp:anchor>
             </w:drawing>
           </mc:Choice>
-          <mc:Fallback xmlns:pic="http://schemas.openxmlformats.org/drawingml/2006/picture" xmlns:a14="http://schemas.microsoft.com/office/drawing/2010/main" xmlns:a="http://schemas.openxmlformats.org/drawingml/2006/main">
+          <mc:Fallback xmlns:a="http://schemas.openxmlformats.org/drawingml/2006/main" xmlns:a14="http://schemas.microsoft.com/office/drawing/2010/main" xmlns:pic="http://schemas.openxmlformats.org/drawingml/2006/picture">
             <w:pict w14:anchorId="0829D9D1">
               <v:shapetype id="_x0000_t32" coordsize="21600,21600" o:oned="t" filled="f" o:spt="32" path="m,l21600,21600e" w14:anchorId="38844837">
                 <v:path fillok="f" arrowok="t" o:connecttype="none"/>
@@ -2727,6 +2727,7 @@
       <w:r>
         <w:rPr>
           <w:rFonts w:ascii="Segoe UI" w:eastAsia="Segoe UI" w:hAnsi="Segoe UI" w:cs="Segoe UI"/>
+          <w:noProof/>
           <w:color w:val="212121"/>
           <w:sz w:val="24"/>
         </w:rPr>
@@ -3775,17 +3776,26 @@
         <w:pStyle w:val="Heading5"/>
         <w:keepNext w:val="0"/>
         <w:widowControl w:val="0"/>
-        <w:spacing w:before="324" w:after="0"/>
-        <w:ind w:left="1412"/>
-        <w:rPr>
-          <w:color w:val="303741"/>
+        <w:pBdr>
+          <w:bottom w:val="none" w:sz="0" w:space="0" w:color="auto"/>
+        </w:pBdr>
+        <w:spacing w:before="240" w:after="120"/>
+        <w:ind w:left="1418"/>
+        <w:rPr>
+          <w:b/>
+          <w:bCs/>
+          <w:color w:val="111827"/>
           <w:sz w:val="24"/>
-        </w:rPr>
-      </w:pPr>
-      <w:r>
-        <w:rPr>
-          <w:color w:val="303741"/>
+          <w:szCs w:val="24"/>
+        </w:rPr>
+      </w:pPr>
+      <w:r>
+        <w:rPr>
+          <w:b/>
+          <w:bCs/>
+          <w:color w:val="111827"/>
           <w:sz w:val="24"/>
+          <w:szCs w:val="24"/>
         </w:rPr>
         <w:t>1.5.2.1. Costes de Hardware y Software</w:t>
       </w:r>
@@ -3793,6 +3803,7 @@
     <w:tbl>
       <w:tblPr>
         <w:tblW w:w="7900" w:type="dxa"/>
+        <w:tblInd w:w="574" w:type="dxa"/>
         <w:tblBorders>
           <w:top w:val="single" w:sz="0" w:space="0" w:color="auto"/>
           <w:left w:val="single" w:sz="0" w:space="0" w:color="auto"/>
@@ -4376,17 +4387,26 @@
         <w:pStyle w:val="Heading5"/>
         <w:keepNext w:val="0"/>
         <w:widowControl w:val="0"/>
-        <w:spacing w:before="324" w:after="0"/>
-        <w:ind w:left="1412"/>
-        <w:rPr>
-          <w:color w:val="303741"/>
+        <w:pBdr>
+          <w:bottom w:val="none" w:sz="0" w:space="0" w:color="auto"/>
+        </w:pBdr>
+        <w:spacing w:before="240" w:after="120"/>
+        <w:ind w:left="1418"/>
+        <w:rPr>
+          <w:b/>
+          <w:bCs/>
+          <w:color w:val="111827"/>
           <w:sz w:val="24"/>
-        </w:rPr>
-      </w:pPr>
-      <w:r>
-        <w:rPr>
-          <w:color w:val="303741"/>
+          <w:szCs w:val="24"/>
+        </w:rPr>
+      </w:pPr>
+      <w:r>
+        <w:rPr>
+          <w:b/>
+          <w:bCs/>
+          <w:color w:val="111827"/>
           <w:sz w:val="24"/>
+          <w:szCs w:val="24"/>
         </w:rPr>
         <w:t>1.5.2.2. Costes de Personal (Desarrollo)</w:t>
       </w:r>
@@ -4394,6 +4414,7 @@
     <w:tbl>
       <w:tblPr>
         <w:tblW w:w="0" w:type="auto"/>
+        <w:tblInd w:w="625" w:type="dxa"/>
         <w:tblBorders>
           <w:top w:val="single" w:sz="0" w:space="0" w:color="auto"/>
           <w:left w:val="single" w:sz="0" w:space="0" w:color="auto"/>
@@ -4969,24 +4990,36 @@
         <w:pStyle w:val="Heading5"/>
         <w:keepNext w:val="0"/>
         <w:widowControl w:val="0"/>
-        <w:spacing w:before="324" w:after="0"/>
-        <w:ind w:left="1412"/>
-        <w:rPr>
-          <w:color w:val="303741"/>
+        <w:pBdr>
+          <w:bottom w:val="none" w:sz="0" w:space="0" w:color="auto"/>
+        </w:pBdr>
+        <w:spacing w:before="240" w:after="120"/>
+        <w:ind w:left="1418"/>
+        <w:rPr>
+          <w:b/>
+          <w:bCs/>
+          <w:color w:val="111827"/>
           <w:sz w:val="24"/>
-        </w:rPr>
-      </w:pPr>
-      <w:r>
-        <w:rPr>
-          <w:color w:val="303741"/>
+          <w:szCs w:val="24"/>
+        </w:rPr>
+      </w:pPr>
+      <w:r>
+        <w:rPr>
+          <w:b/>
+          <w:bCs/>
+          <w:color w:val="111827"/>
           <w:sz w:val="24"/>
+          <w:szCs w:val="24"/>
         </w:rPr>
         <w:t>1</w:t>
       </w:r>
       <w:r>
         <w:rPr>
-          <w:color w:val="303741"/>
+          <w:b/>
+          <w:bCs/>
+          <w:color w:val="111827"/>
           <w:sz w:val="24"/>
+          <w:szCs w:val="24"/>
         </w:rPr>
         <w:t>.5.2.3. Costes de Mantenimiento Anual (Post-Desarrollo)</w:t>
       </w:r>
@@ -4994,6 +5027,7 @@
     <w:tbl>
       <w:tblPr>
         <w:tblW w:w="0" w:type="auto"/>
+        <w:tblInd w:w="633" w:type="dxa"/>
         <w:tblBorders>
           <w:top w:val="single" w:sz="0" w:space="0" w:color="auto"/>
           <w:left w:val="single" w:sz="0" w:space="0" w:color="auto"/>
@@ -7838,6 +7872,8 @@
           </w:tcPr>
           <w:p>
             <w:pPr>
+              <w:keepNext w:val="0"/>
+              <w:widowControl w:val="0"/>
               <w:shd w:val="clear" w:color="auto" w:fill="FFFFFF" w:themeFill="background1"/>
               <w:spacing w:after="0"/>
               <w:jc w:val="center"/>
@@ -7866,6 +7902,8 @@
           </w:tcPr>
           <w:p>
             <w:pPr>
+              <w:keepNext w:val="0"/>
+              <w:widowControl w:val="0"/>
               <w:shd w:val="clear" w:color="auto" w:fill="FFFFFF" w:themeFill="background1"/>
               <w:spacing w:after="0"/>
               <w:jc w:val="center"/>
@@ -7898,6 +7936,8 @@
           </w:tcPr>
           <w:p>
             <w:pPr>
+              <w:keepNext w:val="0"/>
+              <w:widowControl w:val="0"/>
               <w:shd w:val="clear" w:color="auto" w:fill="FFFFFF" w:themeFill="background1"/>
               <w:spacing w:after="0"/>
             </w:pPr>
@@ -7924,6 +7964,8 @@
           </w:tcPr>
           <w:p>
             <w:pPr>
+              <w:keepNext w:val="0"/>
+              <w:widowControl w:val="0"/>
               <w:shd w:val="clear" w:color="auto" w:fill="FFFFFF" w:themeFill="background1"/>
               <w:spacing w:after="0"/>
             </w:pPr>
@@ -7953,6 +7995,8 @@
           </w:tcPr>
           <w:p>
             <w:pPr>
+              <w:keepNext w:val="0"/>
+              <w:widowControl w:val="0"/>
               <w:shd w:val="clear" w:color="auto" w:fill="FFFFFF" w:themeFill="background1"/>
               <w:spacing w:after="0"/>
             </w:pPr>
@@ -7979,6 +8023,8 @@
           </w:tcPr>
           <w:p>
             <w:pPr>
+              <w:keepNext w:val="0"/>
+              <w:widowControl w:val="0"/>
               <w:shd w:val="clear" w:color="auto" w:fill="FFFFFF" w:themeFill="background1"/>
               <w:spacing w:after="0"/>
             </w:pPr>
@@ -8026,6 +8072,8 @@
           </w:tcPr>
           <w:p>
             <w:pPr>
+              <w:keepNext w:val="0"/>
+              <w:widowControl w:val="0"/>
               <w:shd w:val="clear" w:color="auto" w:fill="FFFFFF" w:themeFill="background1"/>
               <w:spacing w:after="0"/>
             </w:pPr>
@@ -8052,6 +8100,8 @@
           </w:tcPr>
           <w:p>
             <w:pPr>
+              <w:keepNext w:val="0"/>
+              <w:widowControl w:val="0"/>
               <w:shd w:val="clear" w:color="auto" w:fill="FFFFFF" w:themeFill="background1"/>
               <w:spacing w:after="0"/>
             </w:pPr>
@@ -8081,6 +8131,8 @@
           </w:tcPr>
           <w:p>
             <w:pPr>
+              <w:keepNext w:val="0"/>
+              <w:widowControl w:val="0"/>
               <w:shd w:val="clear" w:color="auto" w:fill="FFFFFF" w:themeFill="background1"/>
               <w:spacing w:after="0"/>
             </w:pPr>
@@ -8107,6 +8159,8 @@
           </w:tcPr>
           <w:p>
             <w:pPr>
+              <w:keepNext w:val="0"/>
+              <w:widowControl w:val="0"/>
               <w:shd w:val="clear" w:color="auto" w:fill="FFFFFF" w:themeFill="background1"/>
               <w:spacing w:after="0"/>
             </w:pPr>
@@ -8136,6 +8190,8 @@
           </w:tcPr>
           <w:p>
             <w:pPr>
+              <w:keepNext w:val="0"/>
+              <w:widowControl w:val="0"/>
               <w:shd w:val="clear" w:color="auto" w:fill="FFFFFF" w:themeFill="background1"/>
               <w:spacing w:after="0"/>
             </w:pPr>
@@ -8162,6 +8218,8 @@
           </w:tcPr>
           <w:p>
             <w:pPr>
+              <w:keepNext w:val="0"/>
+              <w:widowControl w:val="0"/>
               <w:shd w:val="clear" w:color="auto" w:fill="FFFFFF" w:themeFill="background1"/>
               <w:spacing w:after="0"/>
             </w:pPr>
@@ -8209,6 +8267,8 @@
           </w:tcPr>
           <w:p>
             <w:pPr>
+              <w:keepNext w:val="0"/>
+              <w:widowControl w:val="0"/>
               <w:shd w:val="clear" w:color="auto" w:fill="FFFFFF" w:themeFill="background1"/>
               <w:spacing w:after="0"/>
             </w:pPr>
@@ -8235,6 +8295,8 @@
           </w:tcPr>
           <w:p>
             <w:pPr>
+              <w:keepNext w:val="0"/>
+              <w:widowControl w:val="0"/>
               <w:shd w:val="clear" w:color="auto" w:fill="FFFFFF" w:themeFill="background1"/>
               <w:spacing w:after="0"/>
             </w:pPr>
@@ -8242,7 +8304,51 @@
               <w:rPr>
                 <w:color w:val="1F2937"/>
               </w:rPr>
-              <w:t>2.a Email existente: El sistema avisa y ofrece recuperar contraseña.</w:t>
+              <w:t>2</w:t>
+            </w:r>
+            <w:r>
+              <w:rPr>
+                <w:color w:val="1F2937"/>
+              </w:rPr>
+              <w:t>.a Credenciales inválidas: El sistema muestra error.</w:t>
+            </w:r>
+            <w:r>
+              <w:rPr>
+                <w:color w:val="1F2937"/>
+              </w:rPr>
+              <w:br/>
+            </w:r>
+            <w:r>
+              <w:rPr>
+                <w:color w:val="1F2937"/>
+              </w:rPr>
+              <w:t>2</w:t>
+            </w:r>
+            <w:r>
+              <w:rPr>
+                <w:color w:val="1F2937"/>
+              </w:rPr>
+              <w:t>.b</w:t>
+            </w:r>
+            <w:r>
+              <w:rPr>
+                <w:color w:val="1F2937"/>
+              </w:rPr>
+              <w:t xml:space="preserve"> Olvido de clave: Se ejecuta la extensión </w:t>
+            </w:r>
+            <w:r>
+              <w:rPr>
+                <w:i/>
+                <w:iCs/>
+                <w:color w:val="1F2937"/>
+              </w:rPr>
+              <w:t>Recuperar contraseña</w:t>
+            </w:r>
+            <w:r>
+              <w:rPr>
+                <w:color w:val="1F2937"/>
+              </w:rPr>
+              <w:t>.</w:t>
             </w:r>
           </w:p>
         </w:tc>
@@ -8264,6 +8370,8 @@
           </w:tcPr>
           <w:p>
             <w:pPr>
+              <w:keepNext w:val="0"/>
+              <w:widowControl w:val="0"/>
               <w:shd w:val="clear" w:color="auto" w:fill="FFFFFF" w:themeFill="background1"/>
               <w:spacing w:after="0"/>
               <w:rPr>
@@ -8287,6 +8395,8 @@
           </w:tcPr>
           <w:p>
             <w:pPr>
+              <w:keepNext w:val="0"/>
+              <w:widowControl w:val="0"/>
               <w:shd w:val="clear" w:color="auto" w:fill="FFFFFF" w:themeFill="background1"/>
               <w:spacing w:after="0"/>
               <w:rPr>
@@ -8314,6 +8424,8 @@
           </w:tcPr>
           <w:p>
             <w:pPr>
+              <w:keepNext w:val="0"/>
+              <w:widowControl w:val="0"/>
               <w:shd w:val="clear" w:color="auto" w:fill="FFFFFF" w:themeFill="background1"/>
               <w:spacing w:after="0"/>
               <w:jc w:val="center"/>
@@ -8342,6 +8454,8 @@
           </w:tcPr>
           <w:p>
             <w:pPr>
+              <w:keepNext w:val="0"/>
+              <w:widowControl w:val="0"/>
               <w:shd w:val="clear" w:color="auto" w:fill="FFFFFF" w:themeFill="background1"/>
               <w:spacing w:after="0"/>
               <w:jc w:val="center"/>
@@ -8352,7 +8466,15 @@
                 <w:bCs/>
                 <w:color w:val="991B1B"/>
               </w:rPr>
-              <w:t>Generar Inscripción Online</w:t>
+              <w:t>Realizar</w:t>
+            </w:r>
+            <w:r>
+              <w:rPr>
+                <w:b/>
+                <w:bCs/>
+                <w:color w:val="991B1B"/>
+              </w:rPr>
+              <w:t xml:space="preserve"> Inscripción Online</w:t>
             </w:r>
           </w:p>
         </w:tc>
@@ -8374,6 +8496,8 @@
           </w:tcPr>
           <w:p>
             <w:pPr>
+              <w:keepNext w:val="0"/>
+              <w:widowControl w:val="0"/>
               <w:shd w:val="clear" w:color="auto" w:fill="FFFFFF" w:themeFill="background1"/>
               <w:spacing w:after="0"/>
             </w:pPr>
@@ -8400,6 +8524,8 @@
           </w:tcPr>
           <w:p>
             <w:pPr>
+              <w:keepNext w:val="0"/>
+              <w:widowControl w:val="0"/>
               <w:shd w:val="clear" w:color="auto" w:fill="FFFFFF" w:themeFill="background1"/>
               <w:spacing w:after="0"/>
             </w:pPr>
@@ -8429,6 +8555,8 @@
           </w:tcPr>
           <w:p>
             <w:pPr>
+              <w:keepNext w:val="0"/>
+              <w:widowControl w:val="0"/>
               <w:shd w:val="clear" w:color="auto" w:fill="FFFFFF" w:themeFill="background1"/>
               <w:spacing w:after="0"/>
             </w:pPr>
@@ -8455,6 +8583,8 @@
           </w:tcPr>
           <w:p>
             <w:pPr>
+              <w:keepNext w:val="0"/>
+              <w:widowControl w:val="0"/>
               <w:shd w:val="clear" w:color="auto" w:fill="FFFFFF" w:themeFill="background1"/>
               <w:spacing w:after="0"/>
             </w:pPr>
@@ -8484,6 +8614,8 @@
           </w:tcPr>
           <w:p>
             <w:pPr>
+              <w:keepNext w:val="0"/>
+              <w:widowControl w:val="0"/>
               <w:shd w:val="clear" w:color="auto" w:fill="FFFFFF" w:themeFill="background1"/>
               <w:spacing w:after="0"/>
             </w:pPr>
@@ -8510,6 +8642,8 @@
           </w:tcPr>
           <w:p>
             <w:pPr>
+              <w:keepNext w:val="0"/>
+              <w:widowControl w:val="0"/>
               <w:shd w:val="clear" w:color="auto" w:fill="FFFFFF" w:themeFill="background1"/>
               <w:spacing w:after="0"/>
             </w:pPr>
@@ -8539,6 +8673,8 @@
           </w:tcPr>
           <w:p>
             <w:pPr>
+              <w:keepNext w:val="0"/>
+              <w:widowControl w:val="0"/>
               <w:shd w:val="clear" w:color="auto" w:fill="FFFFFF" w:themeFill="background1"/>
               <w:spacing w:after="0"/>
             </w:pPr>
@@ -8565,14 +8701,30 @@
           </w:tcPr>
           <w:p>
             <w:pPr>
-              <w:shd w:val="clear" w:color="auto" w:fill="FFFFFF" w:themeFill="background1"/>
-              <w:spacing w:after="0"/>
-            </w:pPr>
-            <w:r>
-              <w:rPr>
+              <w:keepNext w:val="0"/>
+              <w:widowControl w:val="0"/>
+              <w:shd w:val="clear" w:color="auto" w:fill="FFFFFF" w:themeFill="background1"/>
+              <w:spacing w:after="0"/>
+            </w:pPr>
+            <w:r>
+              <w:rPr>
+                <w:i/>
+                <w:iCs/>
                 <w:color w:val="1F2937"/>
               </w:rPr>
-              <w:t>PDF generado, guardado en el perfil y enviado por correo.</w:t>
+              <w:t>Generación de PDF Oficial</w:t>
+            </w:r>
+            <w:r>
+              <w:rPr>
+                <w:color w:val="1F2937"/>
+              </w:rPr>
+              <w:t xml:space="preserve"> automática</w:t>
+            </w:r>
+            <w:r>
+              <w:rPr>
+                <w:color w:val="1F2937"/>
+              </w:rPr>
+              <w:t>, guardado en el perfil y enviado por correo.</w:t>
             </w:r>
           </w:p>
         </w:tc>
@@ -8594,6 +8746,8 @@
           </w:tcPr>
           <w:p>
             <w:pPr>
+              <w:keepNext w:val="0"/>
+              <w:widowControl w:val="0"/>
               <w:shd w:val="clear" w:color="auto" w:fill="FFFFFF" w:themeFill="background1"/>
               <w:spacing w:after="0"/>
             </w:pPr>
@@ -8620,6 +8774,8 @@
           </w:tcPr>
           <w:p>
             <w:pPr>
+              <w:keepNext w:val="0"/>
+              <w:widowControl w:val="0"/>
               <w:shd w:val="clear" w:color="auto" w:fill="FFFFFF" w:themeFill="background1"/>
               <w:spacing w:after="0"/>
             </w:pPr>
@@ -8669,13 +8825,15 @@
             <w:tcBorders>
               <w:top w:val="single" w:sz="7" w:space="0" w:color="D1D5DB"/>
               <w:left w:val="single" w:sz="7" w:space="0" w:color="D1D5DB"/>
-              <w:bottom w:val="single" w:sz="7" w:space="0" w:color="D1D5DB"/>
-              <w:right w:val="single" w:sz="7" w:space="0" w:color="D1D5DB"/>
-            </w:tcBorders>
-            <w:vAlign w:val="center"/>
-          </w:tcPr>
-          <w:p>
-            <w:pPr>
+              <w:bottom w:val="single" w:sz="4" w:space="0" w:color="D1D5DB"/>
+              <w:right w:val="single" w:sz="7" w:space="0" w:color="D1D5DB"/>
+            </w:tcBorders>
+            <w:vAlign w:val="center"/>
+          </w:tcPr>
+          <w:p>
+            <w:pPr>
+              <w:keepNext w:val="0"/>
+              <w:widowControl w:val="0"/>
               <w:shd w:val="clear" w:color="auto" w:fill="FFFFFF" w:themeFill="background1"/>
               <w:spacing w:after="0"/>
             </w:pPr>
@@ -8695,82 +8853,2149 @@
             <w:tcBorders>
               <w:top w:val="single" w:sz="7" w:space="0" w:color="D1D5DB"/>
               <w:left w:val="single" w:sz="7" w:space="0" w:color="D1D5DB"/>
-              <w:bottom w:val="single" w:sz="7" w:space="0" w:color="D1D5DB"/>
-              <w:right w:val="single" w:sz="7" w:space="0" w:color="D1D5DB"/>
-            </w:tcBorders>
-            <w:vAlign w:val="center"/>
-          </w:tcPr>
-          <w:p>
-            <w:pPr>
-              <w:shd w:val="clear" w:color="auto" w:fill="FFFFFF" w:themeFill="background1"/>
-              <w:spacing w:after="0"/>
-            </w:pPr>
-            <w:r>
+              <w:bottom w:val="single" w:sz="4" w:space="0" w:color="D1D5DB"/>
+              <w:right w:val="single" w:sz="7" w:space="0" w:color="D1D5DB"/>
+            </w:tcBorders>
+            <w:vAlign w:val="center"/>
+          </w:tcPr>
+          <w:p>
+            <w:pPr>
+              <w:keepNext w:val="0"/>
+              <w:widowControl w:val="0"/>
+              <w:shd w:val="clear" w:color="auto" w:fill="FFFFFF" w:themeFill="background1"/>
+              <w:spacing w:after="0"/>
+            </w:pPr>
+            <w:r>
+              <w:t>2.</w:t>
+            </w:r>
+            <w:r>
+              <w:t>a</w:t>
+            </w:r>
+            <w:r>
+              <w:t xml:space="preserve"> Archivo no anexado: Se requiere ejecutar la extensión </w:t>
+            </w:r>
+            <w:r>
+              <w:t>UC-03 (Subir DNI/ archivo físico escaneado)</w:t>
+            </w:r>
+          </w:p>
+          <w:p>
+            <w:pPr>
+              <w:keepNext w:val="0"/>
+              <w:widowControl w:val="0"/>
+              <w:shd w:val="clear" w:color="auto" w:fill="FFFFFF" w:themeFill="background1"/>
+              <w:spacing w:after="0"/>
+            </w:pPr>
+          </w:p>
+        </w:tc>
+      </w:tr>
+      <w:tr>
+        <w:trPr>
+          <w:trHeight w:val="465"/>
+        </w:trPr>
+        <w:tc>
+          <w:tcPr>
+            <w:tcW w:w="1916" w:type="dxa"/>
+            <w:tcBorders>
+              <w:top w:val="single" w:sz="4" w:space="0" w:color="D1D5DB"/>
+              <w:left w:val="nil"/>
+              <w:bottom w:val="single" w:sz="4" w:space="0" w:color="D1D5DB"/>
+              <w:right w:val="nil"/>
+            </w:tcBorders>
+            <w:vAlign w:val="center"/>
+          </w:tcPr>
+          <w:p>
+            <w:pPr>
+              <w:keepNext w:val="0"/>
+              <w:widowControl w:val="0"/>
+              <w:shd w:val="clear" w:color="auto" w:fill="FFFFFF" w:themeFill="background1"/>
+              <w:spacing w:after="0"/>
+              <w:rPr>
+                <w:b/>
+                <w:bCs/>
+                <w:color w:val="111827"/>
+              </w:rPr>
+            </w:pPr>
+          </w:p>
+          <w:p>
+            <w:pPr>
+              <w:keepNext w:val="0"/>
+              <w:widowControl w:val="0"/>
+              <w:shd w:val="clear" w:color="auto" w:fill="FFFFFF" w:themeFill="background1"/>
+              <w:spacing w:after="0"/>
+              <w:rPr>
+                <w:b/>
+                <w:bCs/>
+                <w:color w:val="111827"/>
+              </w:rPr>
+            </w:pPr>
+          </w:p>
+          <w:p>
+            <w:pPr>
+              <w:keepNext w:val="0"/>
+              <w:widowControl w:val="0"/>
+              <w:shd w:val="clear" w:color="auto" w:fill="FFFFFF" w:themeFill="background1"/>
+              <w:spacing w:after="0"/>
+              <w:rPr>
+                <w:b/>
+                <w:bCs/>
+                <w:color w:val="111827"/>
+              </w:rPr>
+            </w:pPr>
+          </w:p>
+          <w:p>
+            <w:pPr>
+              <w:keepNext w:val="0"/>
+              <w:widowControl w:val="0"/>
+              <w:shd w:val="clear" w:color="auto" w:fill="FFFFFF" w:themeFill="background1"/>
+              <w:spacing w:after="0"/>
+              <w:rPr>
+                <w:b/>
+                <w:bCs/>
+                <w:color w:val="111827"/>
+              </w:rPr>
+            </w:pPr>
+          </w:p>
+          <w:p>
+            <w:pPr>
+              <w:keepNext w:val="0"/>
+              <w:widowControl w:val="0"/>
+              <w:shd w:val="clear" w:color="auto" w:fill="FFFFFF" w:themeFill="background1"/>
+              <w:spacing w:after="0"/>
+              <w:rPr>
+                <w:b/>
+                <w:bCs/>
+                <w:color w:val="111827"/>
+              </w:rPr>
+            </w:pPr>
+          </w:p>
+          <w:p>
+            <w:pPr>
+              <w:keepNext w:val="0"/>
+              <w:widowControl w:val="0"/>
+              <w:shd w:val="clear" w:color="auto" w:fill="FFFFFF" w:themeFill="background1"/>
+              <w:spacing w:after="0"/>
+              <w:rPr>
+                <w:b/>
+                <w:bCs/>
+                <w:color w:val="111827"/>
+              </w:rPr>
+            </w:pPr>
+          </w:p>
+          <w:p>
+            <w:pPr>
+              <w:keepNext w:val="0"/>
+              <w:widowControl w:val="0"/>
+              <w:shd w:val="clear" w:color="auto" w:fill="FFFFFF" w:themeFill="background1"/>
+              <w:spacing w:after="0"/>
+              <w:rPr>
+                <w:b/>
+                <w:bCs/>
+                <w:color w:val="111827"/>
+              </w:rPr>
+            </w:pPr>
+          </w:p>
+          <w:p>
+            <w:pPr>
+              <w:keepNext w:val="0"/>
+              <w:widowControl w:val="0"/>
+              <w:shd w:val="clear" w:color="auto" w:fill="FFFFFF" w:themeFill="background1"/>
+              <w:spacing w:after="0"/>
+              <w:rPr>
+                <w:b/>
+                <w:bCs/>
+                <w:color w:val="111827"/>
+              </w:rPr>
+            </w:pPr>
+          </w:p>
+          <w:p>
+            <w:pPr>
+              <w:keepNext w:val="0"/>
+              <w:widowControl w:val="0"/>
+              <w:shd w:val="clear" w:color="auto" w:fill="FFFFFF" w:themeFill="background1"/>
+              <w:spacing w:after="0"/>
+              <w:rPr>
+                <w:b/>
+                <w:bCs/>
+                <w:color w:val="111827"/>
+              </w:rPr>
+            </w:pPr>
+          </w:p>
+          <w:p>
+            <w:pPr>
+              <w:keepNext w:val="0"/>
+              <w:widowControl w:val="0"/>
+              <w:shd w:val="clear" w:color="auto" w:fill="FFFFFF" w:themeFill="background1"/>
+              <w:spacing w:after="0"/>
+              <w:rPr>
+                <w:b/>
+                <w:bCs/>
+                <w:color w:val="111827"/>
+              </w:rPr>
+            </w:pPr>
+          </w:p>
+          <w:p>
+            <w:pPr>
+              <w:keepNext w:val="0"/>
+              <w:widowControl w:val="0"/>
+              <w:shd w:val="clear" w:color="auto" w:fill="FFFFFF" w:themeFill="background1"/>
+              <w:spacing w:after="0"/>
+              <w:rPr>
+                <w:b/>
+                <w:bCs/>
+                <w:color w:val="111827"/>
+              </w:rPr>
+            </w:pPr>
+          </w:p>
+          <w:p>
+            <w:pPr>
+              <w:keepNext w:val="0"/>
+              <w:widowControl w:val="0"/>
+              <w:shd w:val="clear" w:color="auto" w:fill="FFFFFF" w:themeFill="background1"/>
+              <w:spacing w:after="0"/>
+              <w:rPr>
+                <w:b/>
+                <w:bCs/>
+                <w:color w:val="111827"/>
+              </w:rPr>
+            </w:pPr>
+          </w:p>
+          <w:p>
+            <w:pPr>
+              <w:keepNext w:val="0"/>
+              <w:widowControl w:val="0"/>
+              <w:shd w:val="clear" w:color="auto" w:fill="FFFFFF" w:themeFill="background1"/>
+              <w:spacing w:after="0"/>
+              <w:rPr>
+                <w:b/>
+                <w:bCs/>
+                <w:color w:val="111827"/>
+              </w:rPr>
+            </w:pPr>
+          </w:p>
+          <w:p>
+            <w:pPr>
+              <w:keepNext w:val="0"/>
+              <w:widowControl w:val="0"/>
+              <w:shd w:val="clear" w:color="auto" w:fill="FFFFFF" w:themeFill="background1"/>
+              <w:spacing w:after="0"/>
+              <w:rPr>
+                <w:b/>
+                <w:bCs/>
+                <w:color w:val="111827"/>
+              </w:rPr>
+            </w:pPr>
+          </w:p>
+        </w:tc>
+        <w:tc>
+          <w:tcPr>
+            <w:tcW w:w="6975" w:type="dxa"/>
+            <w:tcBorders>
+              <w:top w:val="single" w:sz="4" w:space="0" w:color="D1D5DB"/>
+              <w:left w:val="nil"/>
+              <w:bottom w:val="single" w:sz="4" w:space="0" w:color="D1D5DB"/>
+              <w:right w:val="nil"/>
+            </w:tcBorders>
+            <w:vAlign w:val="center"/>
+          </w:tcPr>
+          <w:p>
+            <w:pPr>
+              <w:keepNext w:val="0"/>
+              <w:widowControl w:val="0"/>
+              <w:shd w:val="clear" w:color="auto" w:fill="FFFFFF" w:themeFill="background1"/>
+              <w:spacing w:after="0"/>
               <w:rPr>
                 <w:color w:val="1F2937"/>
               </w:rPr>
-              <w:t>2.a Archivo no soportado: El sistema rechaza la imagen e indica formatos válidos (JPG/PNG).</w:t>
+            </w:pPr>
+          </w:p>
+        </w:tc>
+      </w:tr>
+      <w:tr>
+        <w:trPr>
+          <w:trHeight w:val="629"/>
+        </w:trPr>
+        <w:tc>
+          <w:tcPr>
+            <w:tcW w:w="1916" w:type="dxa"/>
+            <w:tcBorders>
+              <w:top w:val="single" w:sz="4" w:space="0" w:color="D1D5DB"/>
+              <w:left w:val="single" w:sz="8" w:space="0" w:color="D1D5DB"/>
+              <w:bottom w:val="single" w:sz="8" w:space="0" w:color="D1D5DB"/>
+              <w:right w:val="single" w:sz="8" w:space="0" w:color="D1D5DB"/>
+            </w:tcBorders>
+            <w:shd w:val="clear" w:color="auto" w:fill="FEE2E2"/>
+            <w:vAlign w:val="center"/>
+          </w:tcPr>
+          <w:p>
+            <w:pPr>
+              <w:keepNext w:val="0"/>
+              <w:widowControl w:val="0"/>
+              <w:shd w:val="clear" w:color="auto" w:fill="FFFFFF" w:themeFill="background1"/>
+              <w:spacing w:after="0"/>
+              <w:jc w:val="center"/>
+              <w:rPr>
+                <w:b/>
+                <w:bCs/>
+                <w:color w:val="991B1B"/>
+              </w:rPr>
+            </w:pPr>
+            <w:r>
+              <w:rPr>
+                <w:b/>
+                <w:bCs/>
+                <w:color w:val="991B1B"/>
+              </w:rPr>
+              <w:lastRenderedPageBreak/>
+              <w:t>UC-0</w:t>
+            </w:r>
+            <w:r>
+              <w:rPr>
+                <w:b/>
+                <w:bCs/>
+                <w:color w:val="991B1B"/>
+              </w:rPr>
+              <w:t>3</w:t>
+            </w:r>
+          </w:p>
+        </w:tc>
+        <w:tc>
+          <w:tcPr>
+            <w:tcW w:w="6975" w:type="dxa"/>
+            <w:tcBorders>
+              <w:top w:val="single" w:sz="4" w:space="0" w:color="D1D5DB"/>
+              <w:left w:val="single" w:sz="8" w:space="0" w:color="D1D5DB"/>
+              <w:bottom w:val="single" w:sz="8" w:space="0" w:color="D1D5DB"/>
+              <w:right w:val="single" w:sz="8" w:space="0" w:color="D1D5DB"/>
+            </w:tcBorders>
+            <w:shd w:val="clear" w:color="auto" w:fill="FEE2E2"/>
+            <w:vAlign w:val="center"/>
+          </w:tcPr>
+          <w:p>
+            <w:pPr>
+              <w:keepNext w:val="0"/>
+              <w:widowControl w:val="0"/>
+              <w:shd w:val="clear" w:color="auto" w:fill="FFFFFF" w:themeFill="background1"/>
+              <w:spacing w:after="0"/>
+              <w:jc w:val="center"/>
+              <w:rPr>
+                <w:b/>
+                <w:bCs/>
+                <w:color w:val="991B1B"/>
+              </w:rPr>
+            </w:pPr>
+            <w:r>
+              <w:rPr>
+                <w:b/>
+                <w:bCs/>
+                <w:color w:val="991B1B"/>
+              </w:rPr>
+              <w:t>Subir archivo Físico / DNI</w:t>
+            </w:r>
+          </w:p>
+        </w:tc>
+      </w:tr>
+      <w:tr>
+        <w:trPr>
+          <w:trHeight w:val="465"/>
+        </w:trPr>
+        <w:tc>
+          <w:tcPr>
+            <w:tcW w:w="1916" w:type="dxa"/>
+            <w:tcBorders>
+              <w:top w:val="single" w:sz="8" w:space="0" w:color="D1D5DB"/>
+              <w:left w:val="single" w:sz="7" w:space="0" w:color="D1D5DB"/>
+              <w:bottom w:val="single" w:sz="7" w:space="0" w:color="D1D5DB"/>
+              <w:right w:val="single" w:sz="7" w:space="0" w:color="D1D5DB"/>
+            </w:tcBorders>
+            <w:vAlign w:val="center"/>
+          </w:tcPr>
+          <w:p>
+            <w:pPr>
+              <w:keepNext w:val="0"/>
+              <w:widowControl w:val="0"/>
+              <w:shd w:val="clear" w:color="auto" w:fill="FFFFFF" w:themeFill="background1"/>
+              <w:spacing w:after="0"/>
+              <w:rPr>
+                <w:b/>
+                <w:bCs/>
+                <w:color w:val="111827"/>
+              </w:rPr>
+            </w:pPr>
+            <w:r>
+              <w:rPr>
+                <w:b/>
+                <w:bCs/>
+                <w:color w:val="111827"/>
+              </w:rPr>
+              <w:t>Actor</w:t>
+            </w:r>
+          </w:p>
+        </w:tc>
+        <w:tc>
+          <w:tcPr>
+            <w:tcW w:w="6975" w:type="dxa"/>
+            <w:tcBorders>
+              <w:top w:val="single" w:sz="8" w:space="0" w:color="D1D5DB"/>
+              <w:left w:val="single" w:sz="7" w:space="0" w:color="D1D5DB"/>
+              <w:bottom w:val="single" w:sz="7" w:space="0" w:color="D1D5DB"/>
+              <w:right w:val="single" w:sz="7" w:space="0" w:color="D1D5DB"/>
+            </w:tcBorders>
+            <w:vAlign w:val="center"/>
+          </w:tcPr>
+          <w:p>
+            <w:pPr>
+              <w:keepNext w:val="0"/>
+              <w:widowControl w:val="0"/>
+              <w:shd w:val="clear" w:color="auto" w:fill="FFFFFF" w:themeFill="background1"/>
+              <w:spacing w:after="0"/>
+              <w:rPr>
+                <w:color w:val="1F2937"/>
+              </w:rPr>
+            </w:pPr>
+            <w:r>
+              <w:rPr>
+                <w:color w:val="1F2937"/>
+              </w:rPr>
+              <w:t xml:space="preserve">Atleta / </w:t>
+            </w:r>
+            <w:r>
+              <w:rPr>
+                <w:color w:val="1F2937"/>
+              </w:rPr>
+              <w:t>Entrenador</w:t>
+            </w:r>
+          </w:p>
+        </w:tc>
+      </w:tr>
+      <w:tr>
+        <w:trPr>
+          <w:trHeight w:val="465"/>
+        </w:trPr>
+        <w:tc>
+          <w:tcPr>
+            <w:tcW w:w="1916" w:type="dxa"/>
+            <w:tcBorders>
+              <w:top w:val="single" w:sz="7" w:space="0" w:color="D1D5DB"/>
+              <w:left w:val="single" w:sz="7" w:space="0" w:color="D1D5DB"/>
+              <w:bottom w:val="single" w:sz="7" w:space="0" w:color="D1D5DB"/>
+              <w:right w:val="single" w:sz="7" w:space="0" w:color="D1D5DB"/>
+            </w:tcBorders>
+            <w:vAlign w:val="center"/>
+          </w:tcPr>
+          <w:p>
+            <w:pPr>
+              <w:keepNext w:val="0"/>
+              <w:widowControl w:val="0"/>
+              <w:shd w:val="clear" w:color="auto" w:fill="FFFFFF" w:themeFill="background1"/>
+              <w:spacing w:after="0"/>
+              <w:rPr>
+                <w:b/>
+                <w:bCs/>
+                <w:color w:val="111827"/>
+              </w:rPr>
+            </w:pPr>
+            <w:r>
+              <w:rPr>
+                <w:b/>
+                <w:bCs/>
+                <w:color w:val="111827"/>
+              </w:rPr>
+              <w:t>Interés</w:t>
+            </w:r>
+          </w:p>
+        </w:tc>
+        <w:tc>
+          <w:tcPr>
+            <w:tcW w:w="6975" w:type="dxa"/>
+            <w:tcBorders>
+              <w:top w:val="single" w:sz="7" w:space="0" w:color="D1D5DB"/>
+              <w:left w:val="single" w:sz="7" w:space="0" w:color="D1D5DB"/>
+              <w:bottom w:val="single" w:sz="7" w:space="0" w:color="D1D5DB"/>
+              <w:right w:val="single" w:sz="7" w:space="0" w:color="D1D5DB"/>
+            </w:tcBorders>
+            <w:vAlign w:val="center"/>
+          </w:tcPr>
+          <w:p>
+            <w:pPr>
+              <w:keepNext w:val="0"/>
+              <w:widowControl w:val="0"/>
+              <w:shd w:val="clear" w:color="auto" w:fill="FFFFFF" w:themeFill="background1"/>
+              <w:spacing w:after="0"/>
+              <w:rPr>
+                <w:color w:val="1F2937"/>
+              </w:rPr>
+            </w:pPr>
+            <w:r>
+              <w:rPr>
+                <w:color w:val="1F2937"/>
+              </w:rPr>
+              <w:t>Adjuntar documentación obligatoria (DNI) o fichas antiguas escaneadas al sistema.</w:t>
+            </w:r>
+          </w:p>
+        </w:tc>
+      </w:tr>
+      <w:tr>
+        <w:trPr>
+          <w:trHeight w:val="465"/>
+        </w:trPr>
+        <w:tc>
+          <w:tcPr>
+            <w:tcW w:w="1916" w:type="dxa"/>
+            <w:tcBorders>
+              <w:top w:val="single" w:sz="7" w:space="0" w:color="D1D5DB"/>
+              <w:left w:val="single" w:sz="7" w:space="0" w:color="D1D5DB"/>
+              <w:bottom w:val="single" w:sz="7" w:space="0" w:color="D1D5DB"/>
+              <w:right w:val="single" w:sz="7" w:space="0" w:color="D1D5DB"/>
+            </w:tcBorders>
+            <w:vAlign w:val="center"/>
+          </w:tcPr>
+          <w:p>
+            <w:pPr>
+              <w:keepNext w:val="0"/>
+              <w:widowControl w:val="0"/>
+              <w:shd w:val="clear" w:color="auto" w:fill="FFFFFF" w:themeFill="background1"/>
+              <w:spacing w:after="0"/>
+              <w:rPr>
+                <w:b/>
+                <w:bCs/>
+                <w:color w:val="111827"/>
+              </w:rPr>
+            </w:pPr>
+            <w:r>
+              <w:rPr>
+                <w:b/>
+                <w:bCs/>
+                <w:color w:val="111827"/>
+              </w:rPr>
+              <w:t>Precondición</w:t>
+            </w:r>
+          </w:p>
+        </w:tc>
+        <w:tc>
+          <w:tcPr>
+            <w:tcW w:w="6975" w:type="dxa"/>
+            <w:tcBorders>
+              <w:top w:val="single" w:sz="7" w:space="0" w:color="D1D5DB"/>
+              <w:left w:val="single" w:sz="7" w:space="0" w:color="D1D5DB"/>
+              <w:bottom w:val="single" w:sz="7" w:space="0" w:color="D1D5DB"/>
+              <w:right w:val="single" w:sz="7" w:space="0" w:color="D1D5DB"/>
+            </w:tcBorders>
+            <w:vAlign w:val="center"/>
+          </w:tcPr>
+          <w:p>
+            <w:pPr>
+              <w:keepNext w:val="0"/>
+              <w:widowControl w:val="0"/>
+              <w:shd w:val="clear" w:color="auto" w:fill="FFFFFF" w:themeFill="background1"/>
+              <w:spacing w:after="0"/>
+              <w:rPr>
+                <w:color w:val="1F2937"/>
+              </w:rPr>
+            </w:pPr>
+            <w:r>
+              <w:rPr>
+                <w:color w:val="1F2937"/>
+              </w:rPr>
+              <w:t>Haber iniciado sesión</w:t>
+            </w:r>
+            <w:r>
+              <w:rPr>
+                <w:color w:val="1F2937"/>
+              </w:rPr>
+              <w:t xml:space="preserve"> (UC-01)</w:t>
+            </w:r>
+            <w:r>
+              <w:rPr>
+                <w:color w:val="1F2937"/>
+              </w:rPr>
+              <w:t xml:space="preserve"> y estar en el proceso de inscripción (UC-02) o edición de perfil.</w:t>
+            </w:r>
+          </w:p>
+        </w:tc>
+      </w:tr>
+      <w:tr>
+        <w:trPr>
+          <w:trHeight w:val="465"/>
+        </w:trPr>
+        <w:tc>
+          <w:tcPr>
+            <w:tcW w:w="1916" w:type="dxa"/>
+            <w:tcBorders>
+              <w:top w:val="single" w:sz="7" w:space="0" w:color="D1D5DB"/>
+              <w:left w:val="single" w:sz="7" w:space="0" w:color="D1D5DB"/>
+              <w:bottom w:val="single" w:sz="7" w:space="0" w:color="D1D5DB"/>
+              <w:right w:val="single" w:sz="7" w:space="0" w:color="D1D5DB"/>
+            </w:tcBorders>
+            <w:vAlign w:val="center"/>
+          </w:tcPr>
+          <w:p>
+            <w:pPr>
+              <w:keepNext w:val="0"/>
+              <w:widowControl w:val="0"/>
+              <w:shd w:val="clear" w:color="auto" w:fill="FFFFFF" w:themeFill="background1"/>
+              <w:spacing w:after="0"/>
+              <w:rPr>
+                <w:b/>
+                <w:bCs/>
+                <w:color w:val="111827"/>
+              </w:rPr>
+            </w:pPr>
+            <w:r>
+              <w:rPr>
+                <w:b/>
+                <w:bCs/>
+                <w:color w:val="111827"/>
+              </w:rPr>
+              <w:t>Garantía</w:t>
+            </w:r>
+          </w:p>
+        </w:tc>
+        <w:tc>
+          <w:tcPr>
+            <w:tcW w:w="6975" w:type="dxa"/>
+            <w:tcBorders>
+              <w:top w:val="single" w:sz="7" w:space="0" w:color="D1D5DB"/>
+              <w:left w:val="single" w:sz="7" w:space="0" w:color="D1D5DB"/>
+              <w:bottom w:val="single" w:sz="7" w:space="0" w:color="D1D5DB"/>
+              <w:right w:val="single" w:sz="7" w:space="0" w:color="D1D5DB"/>
+            </w:tcBorders>
+            <w:vAlign w:val="center"/>
+          </w:tcPr>
+          <w:p>
+            <w:pPr>
+              <w:keepNext w:val="0"/>
+              <w:widowControl w:val="0"/>
+              <w:shd w:val="clear" w:color="auto" w:fill="FFFFFF" w:themeFill="background1"/>
+              <w:spacing w:after="0"/>
+              <w:rPr>
+                <w:color w:val="1F2937"/>
+              </w:rPr>
+            </w:pPr>
+            <w:r>
+              <w:rPr>
+                <w:color w:val="1F2937"/>
+              </w:rPr>
+              <w:t>El archivo se sube al servidor protegido y se vincula a la ficha del usuario.</w:t>
+            </w:r>
+          </w:p>
+        </w:tc>
+      </w:tr>
+      <w:tr>
+        <w:trPr>
+          <w:trHeight w:val="465"/>
+        </w:trPr>
+        <w:tc>
+          <w:tcPr>
+            <w:tcW w:w="1916" w:type="dxa"/>
+            <w:tcBorders>
+              <w:top w:val="single" w:sz="7" w:space="0" w:color="D1D5DB"/>
+              <w:left w:val="single" w:sz="7" w:space="0" w:color="D1D5DB"/>
+              <w:bottom w:val="single" w:sz="7" w:space="0" w:color="D1D5DB"/>
+              <w:right w:val="single" w:sz="7" w:space="0" w:color="D1D5DB"/>
+            </w:tcBorders>
+            <w:vAlign w:val="center"/>
+          </w:tcPr>
+          <w:p>
+            <w:pPr>
+              <w:keepNext w:val="0"/>
+              <w:widowControl w:val="0"/>
+              <w:shd w:val="clear" w:color="auto" w:fill="FFFFFF" w:themeFill="background1"/>
+              <w:spacing w:after="0"/>
+              <w:rPr>
+                <w:b/>
+                <w:bCs/>
+                <w:color w:val="111827"/>
+              </w:rPr>
+            </w:pPr>
+            <w:r>
+              <w:rPr>
+                <w:b/>
+                <w:bCs/>
+                <w:color w:val="111827"/>
+              </w:rPr>
+              <w:t>Flujo Básico</w:t>
+            </w:r>
+          </w:p>
+        </w:tc>
+        <w:tc>
+          <w:tcPr>
+            <w:tcW w:w="6975" w:type="dxa"/>
+            <w:tcBorders>
+              <w:top w:val="single" w:sz="7" w:space="0" w:color="D1D5DB"/>
+              <w:left w:val="single" w:sz="7" w:space="0" w:color="D1D5DB"/>
+              <w:bottom w:val="single" w:sz="7" w:space="0" w:color="D1D5DB"/>
+              <w:right w:val="single" w:sz="7" w:space="0" w:color="D1D5DB"/>
+            </w:tcBorders>
+            <w:vAlign w:val="center"/>
+          </w:tcPr>
+          <w:p>
+            <w:pPr>
+              <w:keepNext w:val="0"/>
+              <w:widowControl w:val="0"/>
+              <w:shd w:val="clear" w:color="auto" w:fill="FFFFFF" w:themeFill="background1"/>
+              <w:spacing w:after="0"/>
+              <w:rPr>
+                <w:color w:val="1F2937"/>
+              </w:rPr>
+            </w:pPr>
+            <w:r>
+              <w:rPr>
+                <w:color w:val="1F2937"/>
+              </w:rPr>
+              <w:t>1. El usuario selecciona la opción de adjuntar documento.</w:t>
+            </w:r>
+            <w:r>
+              <w:rPr>
+                <w:color w:val="1F2937"/>
+              </w:rPr>
+              <w:br/>
+              <w:t>2. El sistema solicita el archivo desde el dispositivo.</w:t>
+            </w:r>
+            <w:r>
+              <w:rPr>
+                <w:color w:val="1F2937"/>
+              </w:rPr>
+              <w:br/>
+              <w:t>3. El usuario sube un archivo en formato JPG o PDF.</w:t>
+            </w:r>
+            <w:r>
+              <w:rPr>
+                <w:color w:val="1F2937"/>
+              </w:rPr>
+              <w:br/>
+              <w:t>4. El sistema valida la extensión y el peso máximo.</w:t>
+            </w:r>
+            <w:r>
+              <w:rPr>
+                <w:color w:val="1F2937"/>
+              </w:rPr>
+              <w:br/>
+              <w:t>5. El archivo se almacena de forma segura.</w:t>
+            </w:r>
+          </w:p>
+        </w:tc>
+      </w:tr>
+      <w:tr>
+        <w:trPr>
+          <w:trHeight w:val="465"/>
+        </w:trPr>
+        <w:tc>
+          <w:tcPr>
+            <w:tcW w:w="1916" w:type="dxa"/>
+            <w:tcBorders>
+              <w:top w:val="single" w:sz="7" w:space="0" w:color="D1D5DB"/>
+              <w:left w:val="single" w:sz="7" w:space="0" w:color="D1D5DB"/>
+              <w:bottom w:val="single" w:sz="7" w:space="0" w:color="D1D5DB"/>
+              <w:right w:val="single" w:sz="7" w:space="0" w:color="D1D5DB"/>
+            </w:tcBorders>
+            <w:vAlign w:val="center"/>
+          </w:tcPr>
+          <w:p>
+            <w:pPr>
+              <w:shd w:val="clear" w:color="auto" w:fill="FFFFFF" w:themeFill="background1"/>
+              <w:spacing w:after="0"/>
+              <w:rPr>
+                <w:b/>
+                <w:bCs/>
+                <w:color w:val="111827"/>
+              </w:rPr>
+            </w:pPr>
+            <w:r>
+              <w:rPr>
+                <w:b/>
+                <w:bCs/>
+                <w:color w:val="111827"/>
+              </w:rPr>
+              <w:t>Excepciones</w:t>
+            </w:r>
+          </w:p>
+        </w:tc>
+        <w:tc>
+          <w:tcPr>
+            <w:tcW w:w="6975" w:type="dxa"/>
+            <w:tcBorders>
+              <w:top w:val="single" w:sz="7" w:space="0" w:color="D1D5DB"/>
+              <w:left w:val="single" w:sz="7" w:space="0" w:color="D1D5DB"/>
+              <w:bottom w:val="single" w:sz="7" w:space="0" w:color="D1D5DB"/>
+              <w:right w:val="single" w:sz="7" w:space="0" w:color="D1D5DB"/>
+            </w:tcBorders>
+            <w:vAlign w:val="center"/>
+          </w:tcPr>
+          <w:p>
+            <w:pPr>
+              <w:shd w:val="clear" w:color="auto" w:fill="FFFFFF" w:themeFill="background1"/>
+              <w:spacing w:after="0"/>
+              <w:rPr>
+                <w:color w:val="1F2937"/>
+              </w:rPr>
+            </w:pPr>
+            <w:r>
+              <w:rPr>
+                <w:color w:val="1F2937"/>
+              </w:rPr>
+              <w:t>4</w:t>
+            </w:r>
+            <w:r>
+              <w:rPr>
+                <w:color w:val="1F2937"/>
+              </w:rPr>
+              <w:t>.a Formato o peso inválido: El sistema rechaza la subida y avisa de los requisitos.</w:t>
+            </w:r>
+          </w:p>
+        </w:tc>
+      </w:tr>
+      <w:tr>
+        <w:trPr>
+          <w:trHeight w:val="465"/>
+        </w:trPr>
+        <w:tc>
+          <w:tcPr>
+            <w:tcW w:w="1916" w:type="dxa"/>
+            <w:tcBorders>
+              <w:top w:val="single" w:sz="4" w:space="0" w:color="D1D5DB"/>
+              <w:left w:val="nil"/>
+              <w:bottom w:val="nil"/>
+              <w:right w:val="nil"/>
+            </w:tcBorders>
+            <w:vAlign w:val="center"/>
+          </w:tcPr>
+          <w:p>
+            <w:pPr>
+              <w:keepNext w:val="0"/>
+              <w:widowControl w:val="0"/>
+              <w:shd w:val="clear" w:color="auto" w:fill="FFFFFF" w:themeFill="background1"/>
+              <w:spacing w:after="0"/>
+              <w:rPr>
+                <w:b/>
+                <w:bCs/>
+                <w:color w:val="111827"/>
+              </w:rPr>
+            </w:pPr>
+          </w:p>
+          <w:p>
+            <w:pPr>
+              <w:keepNext w:val="0"/>
+              <w:widowControl w:val="0"/>
+              <w:shd w:val="clear" w:color="auto" w:fill="FFFFFF" w:themeFill="background1"/>
+              <w:spacing w:after="0"/>
+              <w:rPr>
+                <w:b/>
+                <w:bCs/>
+                <w:color w:val="111827"/>
+              </w:rPr>
+            </w:pPr>
+          </w:p>
+        </w:tc>
+        <w:tc>
+          <w:tcPr>
+            <w:tcW w:w="6975" w:type="dxa"/>
+            <w:tcBorders>
+              <w:top w:val="single" w:sz="4" w:space="0" w:color="D1D5DB"/>
+              <w:left w:val="nil"/>
+              <w:bottom w:val="nil"/>
+              <w:right w:val="nil"/>
+            </w:tcBorders>
+            <w:vAlign w:val="center"/>
+          </w:tcPr>
+          <w:p>
+            <w:pPr>
+              <w:keepNext w:val="0"/>
+              <w:widowControl w:val="0"/>
+              <w:shd w:val="clear" w:color="auto" w:fill="FFFFFF" w:themeFill="background1"/>
+              <w:spacing w:after="0"/>
+              <w:rPr>
+                <w:color w:val="1F2937"/>
+              </w:rPr>
+            </w:pPr>
+          </w:p>
+        </w:tc>
+      </w:tr>
+      <w:tr>
+        <w:trPr>
+          <w:trHeight w:val="629"/>
+        </w:trPr>
+        <w:tc>
+          <w:tcPr>
+            <w:tcW w:w="1916" w:type="dxa"/>
+            <w:tcBorders>
+              <w:top w:val="single" w:sz="4" w:space="0" w:color="D1D5DB"/>
+              <w:left w:val="single" w:sz="7" w:space="0" w:color="D1D5DB"/>
+              <w:bottom w:val="single" w:sz="7" w:space="0" w:color="D1D5DB"/>
+              <w:right w:val="single" w:sz="7" w:space="0" w:color="D1D5DB"/>
+            </w:tcBorders>
+            <w:shd w:val="clear" w:color="auto" w:fill="FEE2E2"/>
+            <w:vAlign w:val="center"/>
+          </w:tcPr>
+          <w:p>
+            <w:pPr>
+              <w:keepNext w:val="0"/>
+              <w:widowControl w:val="0"/>
+              <w:shd w:val="clear" w:color="auto" w:fill="FFFFFF" w:themeFill="background1"/>
+              <w:spacing w:after="0"/>
+              <w:jc w:val="center"/>
+              <w:rPr>
+                <w:b/>
+                <w:bCs/>
+                <w:color w:val="991B1B"/>
+              </w:rPr>
+            </w:pPr>
+            <w:r>
+              <w:rPr>
+                <w:b/>
+                <w:bCs/>
+                <w:color w:val="991B1B"/>
+              </w:rPr>
+              <w:t>UC-0</w:t>
+            </w:r>
+            <w:r>
+              <w:rPr>
+                <w:b/>
+                <w:bCs/>
+                <w:color w:val="991B1B"/>
+              </w:rPr>
+              <w:t>4</w:t>
+            </w:r>
+          </w:p>
+        </w:tc>
+        <w:tc>
+          <w:tcPr>
+            <w:tcW w:w="6975" w:type="dxa"/>
+            <w:tcBorders>
+              <w:top w:val="single" w:sz="4" w:space="0" w:color="D1D5DB"/>
+              <w:left w:val="single" w:sz="7" w:space="0" w:color="D1D5DB"/>
+              <w:bottom w:val="single" w:sz="7" w:space="0" w:color="D1D5DB"/>
+              <w:right w:val="single" w:sz="7" w:space="0" w:color="D1D5DB"/>
+            </w:tcBorders>
+            <w:shd w:val="clear" w:color="auto" w:fill="FEE2E2"/>
+            <w:vAlign w:val="center"/>
+          </w:tcPr>
+          <w:p>
+            <w:pPr>
+              <w:keepNext w:val="0"/>
+              <w:widowControl w:val="0"/>
+              <w:shd w:val="clear" w:color="auto" w:fill="FFFFFF" w:themeFill="background1"/>
+              <w:spacing w:after="0"/>
+              <w:jc w:val="center"/>
+              <w:rPr>
+                <w:b/>
+                <w:bCs/>
+                <w:color w:val="991B1B"/>
+              </w:rPr>
+            </w:pPr>
+            <w:r>
+              <w:rPr>
+                <w:b/>
+                <w:bCs/>
+                <w:color w:val="991B1B"/>
+              </w:rPr>
+              <w:t>Filtrar Fichas Globales</w:t>
+            </w:r>
+          </w:p>
+        </w:tc>
+      </w:tr>
+      <w:tr>
+        <w:trPr>
+          <w:trHeight w:val="465"/>
+        </w:trPr>
+        <w:tc>
+          <w:tcPr>
+            <w:tcW w:w="1916" w:type="dxa"/>
+            <w:tcBorders>
+              <w:top w:val="single" w:sz="7" w:space="0" w:color="D1D5DB"/>
+              <w:left w:val="single" w:sz="7" w:space="0" w:color="D1D5DB"/>
+              <w:bottom w:val="single" w:sz="7" w:space="0" w:color="D1D5DB"/>
+              <w:right w:val="single" w:sz="7" w:space="0" w:color="D1D5DB"/>
+            </w:tcBorders>
+            <w:vAlign w:val="center"/>
+          </w:tcPr>
+          <w:p>
+            <w:pPr>
+              <w:keepNext w:val="0"/>
+              <w:widowControl w:val="0"/>
+              <w:shd w:val="clear" w:color="auto" w:fill="FFFFFF" w:themeFill="background1"/>
+              <w:spacing w:after="0"/>
+              <w:rPr>
+                <w:b/>
+                <w:bCs/>
+                <w:color w:val="111827"/>
+              </w:rPr>
+            </w:pPr>
+            <w:r>
+              <w:rPr>
+                <w:b/>
+                <w:bCs/>
+                <w:color w:val="111827"/>
+              </w:rPr>
+              <w:t>Actor</w:t>
+            </w:r>
+          </w:p>
+        </w:tc>
+        <w:tc>
+          <w:tcPr>
+            <w:tcW w:w="6975" w:type="dxa"/>
+            <w:tcBorders>
+              <w:top w:val="single" w:sz="7" w:space="0" w:color="D1D5DB"/>
+              <w:left w:val="single" w:sz="7" w:space="0" w:color="D1D5DB"/>
+              <w:bottom w:val="single" w:sz="7" w:space="0" w:color="D1D5DB"/>
+              <w:right w:val="single" w:sz="7" w:space="0" w:color="D1D5DB"/>
+            </w:tcBorders>
+            <w:vAlign w:val="center"/>
+          </w:tcPr>
+          <w:p>
+            <w:pPr>
+              <w:keepNext w:val="0"/>
+              <w:widowControl w:val="0"/>
+              <w:shd w:val="clear" w:color="auto" w:fill="FFFFFF" w:themeFill="background1"/>
+              <w:spacing w:after="0"/>
+              <w:rPr>
+                <w:color w:val="1F2937"/>
+              </w:rPr>
+            </w:pPr>
+            <w:r>
+              <w:rPr>
+                <w:color w:val="1F2937"/>
+              </w:rPr>
+              <w:t>Entrenador</w:t>
+            </w:r>
+            <w:r>
+              <w:rPr>
+                <w:color w:val="1F2937"/>
+              </w:rPr>
+              <w:t xml:space="preserve"> (Admin)</w:t>
+            </w:r>
+          </w:p>
+        </w:tc>
+      </w:tr>
+      <w:tr>
+        <w:trPr>
+          <w:trHeight w:val="465"/>
+        </w:trPr>
+        <w:tc>
+          <w:tcPr>
+            <w:tcW w:w="1916" w:type="dxa"/>
+            <w:tcBorders>
+              <w:top w:val="single" w:sz="7" w:space="0" w:color="D1D5DB"/>
+              <w:left w:val="single" w:sz="7" w:space="0" w:color="D1D5DB"/>
+              <w:bottom w:val="single" w:sz="7" w:space="0" w:color="D1D5DB"/>
+              <w:right w:val="single" w:sz="7" w:space="0" w:color="D1D5DB"/>
+            </w:tcBorders>
+            <w:vAlign w:val="center"/>
+          </w:tcPr>
+          <w:p>
+            <w:pPr>
+              <w:keepNext w:val="0"/>
+              <w:widowControl w:val="0"/>
+              <w:shd w:val="clear" w:color="auto" w:fill="FFFFFF" w:themeFill="background1"/>
+              <w:spacing w:after="0"/>
+              <w:rPr>
+                <w:b/>
+                <w:bCs/>
+                <w:color w:val="111827"/>
+              </w:rPr>
+            </w:pPr>
+            <w:r>
+              <w:rPr>
+                <w:b/>
+                <w:bCs/>
+                <w:color w:val="111827"/>
+              </w:rPr>
+              <w:t>Interés</w:t>
+            </w:r>
+          </w:p>
+        </w:tc>
+        <w:tc>
+          <w:tcPr>
+            <w:tcW w:w="6975" w:type="dxa"/>
+            <w:tcBorders>
+              <w:top w:val="single" w:sz="7" w:space="0" w:color="D1D5DB"/>
+              <w:left w:val="single" w:sz="7" w:space="0" w:color="D1D5DB"/>
+              <w:bottom w:val="single" w:sz="7" w:space="0" w:color="D1D5DB"/>
+              <w:right w:val="single" w:sz="7" w:space="0" w:color="D1D5DB"/>
+            </w:tcBorders>
+            <w:vAlign w:val="center"/>
+          </w:tcPr>
+          <w:p>
+            <w:pPr>
+              <w:keepNext w:val="0"/>
+              <w:widowControl w:val="0"/>
+              <w:shd w:val="clear" w:color="auto" w:fill="FFFFFF" w:themeFill="background1"/>
+              <w:spacing w:after="0"/>
+              <w:rPr>
+                <w:color w:val="1F2937"/>
+              </w:rPr>
+            </w:pPr>
+            <w:r>
+              <w:rPr>
+                <w:color w:val="1F2937"/>
+              </w:rPr>
+              <w:t>Buscar y listar atletas según criterios deportivos o de edad.</w:t>
+            </w:r>
+          </w:p>
+        </w:tc>
+      </w:tr>
+      <w:tr>
+        <w:trPr>
+          <w:trHeight w:val="465"/>
+        </w:trPr>
+        <w:tc>
+          <w:tcPr>
+            <w:tcW w:w="1916" w:type="dxa"/>
+            <w:tcBorders>
+              <w:top w:val="single" w:sz="7" w:space="0" w:color="D1D5DB"/>
+              <w:left w:val="single" w:sz="7" w:space="0" w:color="D1D5DB"/>
+              <w:bottom w:val="single" w:sz="7" w:space="0" w:color="D1D5DB"/>
+              <w:right w:val="single" w:sz="7" w:space="0" w:color="D1D5DB"/>
+            </w:tcBorders>
+            <w:vAlign w:val="center"/>
+          </w:tcPr>
+          <w:p>
+            <w:pPr>
+              <w:keepNext w:val="0"/>
+              <w:widowControl w:val="0"/>
+              <w:shd w:val="clear" w:color="auto" w:fill="FFFFFF" w:themeFill="background1"/>
+              <w:spacing w:after="0"/>
+              <w:rPr>
+                <w:b/>
+                <w:bCs/>
+                <w:color w:val="111827"/>
+              </w:rPr>
+            </w:pPr>
+            <w:r>
+              <w:rPr>
+                <w:b/>
+                <w:bCs/>
+                <w:color w:val="111827"/>
+              </w:rPr>
+              <w:t>Precondición</w:t>
+            </w:r>
+          </w:p>
+        </w:tc>
+        <w:tc>
+          <w:tcPr>
+            <w:tcW w:w="6975" w:type="dxa"/>
+            <w:tcBorders>
+              <w:top w:val="single" w:sz="7" w:space="0" w:color="D1D5DB"/>
+              <w:left w:val="single" w:sz="7" w:space="0" w:color="D1D5DB"/>
+              <w:bottom w:val="single" w:sz="7" w:space="0" w:color="D1D5DB"/>
+              <w:right w:val="single" w:sz="7" w:space="0" w:color="D1D5DB"/>
+            </w:tcBorders>
+            <w:vAlign w:val="center"/>
+          </w:tcPr>
+          <w:p>
+            <w:pPr>
+              <w:keepNext w:val="0"/>
+              <w:widowControl w:val="0"/>
+              <w:shd w:val="clear" w:color="auto" w:fill="FFFFFF" w:themeFill="background1"/>
+              <w:spacing w:after="0"/>
+              <w:rPr>
+                <w:color w:val="1F2937"/>
+              </w:rPr>
+            </w:pPr>
+            <w:r>
+              <w:rPr>
+                <w:color w:val="1F2937"/>
+              </w:rPr>
+              <w:t xml:space="preserve">Haber iniciado sesión </w:t>
+            </w:r>
+            <w:r>
+              <w:rPr>
+                <w:color w:val="1F2937"/>
+              </w:rPr>
+              <w:t>(UC-01)</w:t>
+            </w:r>
+            <w:r>
+              <w:rPr>
+                <w:color w:val="1F2937"/>
+              </w:rPr>
+              <w:t xml:space="preserve"> </w:t>
+            </w:r>
+            <w:r>
+              <w:rPr>
+                <w:color w:val="1F2937"/>
+              </w:rPr>
+              <w:t>con rol de Administrador.</w:t>
+            </w:r>
+          </w:p>
+        </w:tc>
+      </w:tr>
+      <w:tr>
+        <w:trPr>
+          <w:trHeight w:val="465"/>
+        </w:trPr>
+        <w:tc>
+          <w:tcPr>
+            <w:tcW w:w="1916" w:type="dxa"/>
+            <w:tcBorders>
+              <w:top w:val="single" w:sz="7" w:space="0" w:color="D1D5DB"/>
+              <w:left w:val="single" w:sz="7" w:space="0" w:color="D1D5DB"/>
+              <w:bottom w:val="single" w:sz="7" w:space="0" w:color="D1D5DB"/>
+              <w:right w:val="single" w:sz="7" w:space="0" w:color="D1D5DB"/>
+            </w:tcBorders>
+            <w:vAlign w:val="center"/>
+          </w:tcPr>
+          <w:p>
+            <w:pPr>
+              <w:keepNext w:val="0"/>
+              <w:widowControl w:val="0"/>
+              <w:shd w:val="clear" w:color="auto" w:fill="FFFFFF" w:themeFill="background1"/>
+              <w:spacing w:after="0"/>
+              <w:rPr>
+                <w:b/>
+                <w:bCs/>
+                <w:color w:val="111827"/>
+              </w:rPr>
+            </w:pPr>
+            <w:r>
+              <w:rPr>
+                <w:b/>
+                <w:bCs/>
+                <w:color w:val="111827"/>
+              </w:rPr>
+              <w:t>Garantía</w:t>
+            </w:r>
+          </w:p>
+        </w:tc>
+        <w:tc>
+          <w:tcPr>
+            <w:tcW w:w="6975" w:type="dxa"/>
+            <w:tcBorders>
+              <w:top w:val="single" w:sz="7" w:space="0" w:color="D1D5DB"/>
+              <w:left w:val="single" w:sz="7" w:space="0" w:color="D1D5DB"/>
+              <w:bottom w:val="single" w:sz="7" w:space="0" w:color="D1D5DB"/>
+              <w:right w:val="single" w:sz="7" w:space="0" w:color="D1D5DB"/>
+            </w:tcBorders>
+            <w:vAlign w:val="center"/>
+          </w:tcPr>
+          <w:p>
+            <w:pPr>
+              <w:keepNext w:val="0"/>
+              <w:widowControl w:val="0"/>
+              <w:shd w:val="clear" w:color="auto" w:fill="FFFFFF" w:themeFill="background1"/>
+              <w:spacing w:after="0"/>
+              <w:rPr>
+                <w:color w:val="1F2937"/>
+              </w:rPr>
+            </w:pPr>
+            <w:r>
+              <w:rPr>
+                <w:color w:val="1F2937"/>
+              </w:rPr>
+              <w:t>Listado de atletas actualizado según el criterio de búsqueda.</w:t>
+            </w:r>
+          </w:p>
+        </w:tc>
+      </w:tr>
+      <w:tr>
+        <w:trPr>
+          <w:trHeight w:val="465"/>
+        </w:trPr>
+        <w:tc>
+          <w:tcPr>
+            <w:tcW w:w="1916" w:type="dxa"/>
+            <w:tcBorders>
+              <w:top w:val="single" w:sz="7" w:space="0" w:color="D1D5DB"/>
+              <w:left w:val="single" w:sz="7" w:space="0" w:color="D1D5DB"/>
+              <w:bottom w:val="single" w:sz="7" w:space="0" w:color="D1D5DB"/>
+              <w:right w:val="single" w:sz="7" w:space="0" w:color="D1D5DB"/>
+            </w:tcBorders>
+            <w:vAlign w:val="center"/>
+          </w:tcPr>
+          <w:p>
+            <w:pPr>
+              <w:keepNext w:val="0"/>
+              <w:widowControl w:val="0"/>
+              <w:shd w:val="clear" w:color="auto" w:fill="FFFFFF" w:themeFill="background1"/>
+              <w:spacing w:after="0"/>
+              <w:rPr>
+                <w:b/>
+                <w:bCs/>
+                <w:color w:val="111827"/>
+              </w:rPr>
+            </w:pPr>
+            <w:r>
+              <w:rPr>
+                <w:b/>
+                <w:bCs/>
+                <w:color w:val="111827"/>
+              </w:rPr>
+              <w:t>Flujo Básico</w:t>
+            </w:r>
+          </w:p>
+        </w:tc>
+        <w:tc>
+          <w:tcPr>
+            <w:tcW w:w="6975" w:type="dxa"/>
+            <w:tcBorders>
+              <w:top w:val="single" w:sz="7" w:space="0" w:color="D1D5DB"/>
+              <w:left w:val="single" w:sz="7" w:space="0" w:color="D1D5DB"/>
+              <w:bottom w:val="single" w:sz="7" w:space="0" w:color="D1D5DB"/>
+              <w:right w:val="single" w:sz="7" w:space="0" w:color="D1D5DB"/>
+            </w:tcBorders>
+            <w:vAlign w:val="center"/>
+          </w:tcPr>
+          <w:p>
+            <w:pPr>
+              <w:keepNext w:val="0"/>
+              <w:widowControl w:val="0"/>
+              <w:shd w:val="clear" w:color="auto" w:fill="FFFFFF" w:themeFill="background1"/>
+              <w:spacing w:after="0"/>
+              <w:rPr>
+                <w:color w:val="1F2937"/>
+              </w:rPr>
+            </w:pPr>
+            <w:r>
+              <w:rPr>
+                <w:color w:val="1F2937"/>
+              </w:rPr>
+              <w:t>1. El entrenador accede al panel global de gestión.</w:t>
+            </w:r>
+            <w:r>
+              <w:rPr>
+                <w:color w:val="1F2937"/>
+              </w:rPr>
+              <w:br/>
+              <w:t>2. Selecciona los filtros deseados (ej. Categoría Sub-16).</w:t>
+            </w:r>
+            <w:r>
+              <w:rPr>
+                <w:color w:val="1F2937"/>
+              </w:rPr>
+              <w:br/>
+              <w:t>3. El sistema consulta a la BBDD y devuelve los resultados ordenados.</w:t>
+            </w:r>
+          </w:p>
+        </w:tc>
+      </w:tr>
+      <w:tr>
+        <w:trPr>
+          <w:trHeight w:val="465"/>
+        </w:trPr>
+        <w:tc>
+          <w:tcPr>
+            <w:tcW w:w="1916" w:type="dxa"/>
+            <w:tcBorders>
+              <w:top w:val="single" w:sz="7" w:space="0" w:color="D1D5DB"/>
+              <w:left w:val="single" w:sz="7" w:space="0" w:color="D1D5DB"/>
+              <w:bottom w:val="single" w:sz="7" w:space="0" w:color="D1D5DB"/>
+              <w:right w:val="single" w:sz="7" w:space="0" w:color="D1D5DB"/>
+            </w:tcBorders>
+            <w:vAlign w:val="center"/>
+          </w:tcPr>
+          <w:p>
+            <w:pPr>
+              <w:keepNext w:val="0"/>
+              <w:widowControl w:val="0"/>
+              <w:shd w:val="clear" w:color="auto" w:fill="FFFFFF" w:themeFill="background1"/>
+              <w:spacing w:after="0"/>
+              <w:rPr>
+                <w:b/>
+                <w:bCs/>
+                <w:color w:val="111827"/>
+              </w:rPr>
+            </w:pPr>
+            <w:r>
+              <w:rPr>
+                <w:b/>
+                <w:bCs/>
+                <w:color w:val="111827"/>
+              </w:rPr>
+              <w:t>Excepciones</w:t>
+            </w:r>
+          </w:p>
+        </w:tc>
+        <w:tc>
+          <w:tcPr>
+            <w:tcW w:w="6975" w:type="dxa"/>
+            <w:tcBorders>
+              <w:top w:val="single" w:sz="7" w:space="0" w:color="D1D5DB"/>
+              <w:left w:val="single" w:sz="7" w:space="0" w:color="D1D5DB"/>
+              <w:bottom w:val="single" w:sz="7" w:space="0" w:color="D1D5DB"/>
+              <w:right w:val="single" w:sz="7" w:space="0" w:color="D1D5DB"/>
+            </w:tcBorders>
+            <w:vAlign w:val="center"/>
+          </w:tcPr>
+          <w:p>
+            <w:pPr>
+              <w:keepNext w:val="0"/>
+              <w:widowControl w:val="0"/>
+              <w:shd w:val="clear" w:color="auto" w:fill="FFFFFF" w:themeFill="background1"/>
+              <w:spacing w:after="0"/>
+              <w:rPr>
+                <w:color w:val="1F2937"/>
+              </w:rPr>
+            </w:pPr>
+            <w:r>
+              <w:rPr>
+                <w:color w:val="1F2937"/>
+              </w:rPr>
+              <w:t>3.a Ningún resultado: El sistema avisa de que no hay atletas en esa categoría.</w:t>
+            </w:r>
+          </w:p>
+        </w:tc>
+      </w:tr>
+      <w:tr>
+        <w:trPr>
+          <w:trHeight w:val="465"/>
+        </w:trPr>
+        <w:tc>
+          <w:tcPr>
+            <w:tcW w:w="1916" w:type="dxa"/>
+            <w:tcBorders>
+              <w:top w:val="single" w:sz="7" w:space="0" w:color="D1D5DB"/>
+              <w:left w:val="nil"/>
+              <w:bottom w:val="single" w:sz="7" w:space="0" w:color="D1D5DB"/>
+              <w:right w:val="nil"/>
+            </w:tcBorders>
+            <w:vAlign w:val="center"/>
+          </w:tcPr>
+          <w:p>
+            <w:pPr>
+              <w:keepNext w:val="0"/>
+              <w:widowControl w:val="0"/>
+              <w:shd w:val="clear" w:color="auto" w:fill="FFFFFF" w:themeFill="background1"/>
+              <w:spacing w:after="0"/>
+              <w:rPr>
+                <w:b/>
+                <w:bCs/>
+                <w:color w:val="111827"/>
+              </w:rPr>
+            </w:pPr>
+          </w:p>
+          <w:p>
+            <w:pPr>
+              <w:keepNext w:val="0"/>
+              <w:widowControl w:val="0"/>
+              <w:shd w:val="clear" w:color="auto" w:fill="FFFFFF" w:themeFill="background1"/>
+              <w:spacing w:after="0"/>
+              <w:rPr>
+                <w:b/>
+                <w:bCs/>
+                <w:color w:val="111827"/>
+              </w:rPr>
+            </w:pPr>
+          </w:p>
+          <w:p>
+            <w:pPr>
+              <w:keepNext w:val="0"/>
+              <w:widowControl w:val="0"/>
+              <w:shd w:val="clear" w:color="auto" w:fill="FFFFFF" w:themeFill="background1"/>
+              <w:spacing w:after="0"/>
+              <w:rPr>
+                <w:b/>
+                <w:bCs/>
+                <w:color w:val="111827"/>
+              </w:rPr>
+            </w:pPr>
+          </w:p>
+          <w:p>
+            <w:pPr>
+              <w:keepNext w:val="0"/>
+              <w:widowControl w:val="0"/>
+              <w:shd w:val="clear" w:color="auto" w:fill="FFFFFF" w:themeFill="background1"/>
+              <w:spacing w:after="0"/>
+              <w:rPr>
+                <w:b/>
+                <w:bCs/>
+                <w:color w:val="111827"/>
+              </w:rPr>
+            </w:pPr>
+          </w:p>
+          <w:p>
+            <w:pPr>
+              <w:keepNext w:val="0"/>
+              <w:widowControl w:val="0"/>
+              <w:shd w:val="clear" w:color="auto" w:fill="FFFFFF" w:themeFill="background1"/>
+              <w:spacing w:after="0"/>
+              <w:rPr>
+                <w:b/>
+                <w:bCs/>
+                <w:color w:val="111827"/>
+              </w:rPr>
+            </w:pPr>
+          </w:p>
+          <w:p>
+            <w:pPr>
+              <w:keepNext w:val="0"/>
+              <w:widowControl w:val="0"/>
+              <w:shd w:val="clear" w:color="auto" w:fill="FFFFFF" w:themeFill="background1"/>
+              <w:spacing w:after="0"/>
+              <w:rPr>
+                <w:b/>
+                <w:bCs/>
+                <w:color w:val="111827"/>
+              </w:rPr>
+            </w:pPr>
+          </w:p>
+          <w:p>
+            <w:pPr>
+              <w:keepNext w:val="0"/>
+              <w:widowControl w:val="0"/>
+              <w:shd w:val="clear" w:color="auto" w:fill="FFFFFF" w:themeFill="background1"/>
+              <w:spacing w:after="0"/>
+              <w:rPr>
+                <w:b/>
+                <w:bCs/>
+                <w:color w:val="111827"/>
+              </w:rPr>
+            </w:pPr>
+          </w:p>
+          <w:p>
+            <w:pPr>
+              <w:keepNext w:val="0"/>
+              <w:widowControl w:val="0"/>
+              <w:shd w:val="clear" w:color="auto" w:fill="FFFFFF" w:themeFill="background1"/>
+              <w:spacing w:after="0"/>
+              <w:rPr>
+                <w:b/>
+                <w:bCs/>
+                <w:color w:val="111827"/>
+              </w:rPr>
+            </w:pPr>
+          </w:p>
+          <w:p>
+            <w:pPr>
+              <w:keepNext w:val="0"/>
+              <w:widowControl w:val="0"/>
+              <w:shd w:val="clear" w:color="auto" w:fill="FFFFFF" w:themeFill="background1"/>
+              <w:spacing w:after="0"/>
+              <w:rPr>
+                <w:b/>
+                <w:bCs/>
+                <w:color w:val="111827"/>
+              </w:rPr>
+            </w:pPr>
+          </w:p>
+          <w:p>
+            <w:pPr>
+              <w:keepNext w:val="0"/>
+              <w:widowControl w:val="0"/>
+              <w:shd w:val="clear" w:color="auto" w:fill="FFFFFF" w:themeFill="background1"/>
+              <w:spacing w:after="0"/>
+              <w:rPr>
+                <w:b/>
+                <w:bCs/>
+                <w:color w:val="111827"/>
+              </w:rPr>
+            </w:pPr>
+          </w:p>
+          <w:p>
+            <w:pPr>
+              <w:keepNext w:val="0"/>
+              <w:widowControl w:val="0"/>
+              <w:shd w:val="clear" w:color="auto" w:fill="FFFFFF" w:themeFill="background1"/>
+              <w:spacing w:after="0"/>
+              <w:rPr>
+                <w:b/>
+                <w:bCs/>
+                <w:color w:val="111827"/>
+              </w:rPr>
+            </w:pPr>
+          </w:p>
+          <w:p>
+            <w:pPr>
+              <w:keepNext w:val="0"/>
+              <w:widowControl w:val="0"/>
+              <w:shd w:val="clear" w:color="auto" w:fill="FFFFFF" w:themeFill="background1"/>
+              <w:spacing w:after="0"/>
+              <w:rPr>
+                <w:b/>
+                <w:bCs/>
+                <w:color w:val="111827"/>
+              </w:rPr>
+            </w:pPr>
+          </w:p>
+          <w:p>
+            <w:pPr>
+              <w:keepNext w:val="0"/>
+              <w:widowControl w:val="0"/>
+              <w:shd w:val="clear" w:color="auto" w:fill="FFFFFF" w:themeFill="background1"/>
+              <w:spacing w:after="0"/>
+              <w:rPr>
+                <w:b/>
+                <w:bCs/>
+                <w:color w:val="111827"/>
+              </w:rPr>
+            </w:pPr>
+          </w:p>
+          <w:p>
+            <w:pPr>
+              <w:keepNext w:val="0"/>
+              <w:widowControl w:val="0"/>
+              <w:shd w:val="clear" w:color="auto" w:fill="FFFFFF" w:themeFill="background1"/>
+              <w:spacing w:after="0"/>
+              <w:rPr>
+                <w:b/>
+                <w:bCs/>
+                <w:color w:val="111827"/>
+              </w:rPr>
+            </w:pPr>
+          </w:p>
+          <w:p>
+            <w:pPr>
+              <w:keepNext w:val="0"/>
+              <w:widowControl w:val="0"/>
+              <w:shd w:val="clear" w:color="auto" w:fill="FFFFFF" w:themeFill="background1"/>
+              <w:spacing w:after="0"/>
+              <w:rPr>
+                <w:b/>
+                <w:bCs/>
+                <w:color w:val="111827"/>
+              </w:rPr>
+            </w:pPr>
+          </w:p>
+        </w:tc>
+        <w:tc>
+          <w:tcPr>
+            <w:tcW w:w="6975" w:type="dxa"/>
+            <w:tcBorders>
+              <w:top w:val="single" w:sz="7" w:space="0" w:color="D1D5DB"/>
+              <w:left w:val="nil"/>
+              <w:bottom w:val="single" w:sz="7" w:space="0" w:color="D1D5DB"/>
+              <w:right w:val="nil"/>
+            </w:tcBorders>
+            <w:vAlign w:val="center"/>
+          </w:tcPr>
+          <w:p>
+            <w:pPr>
+              <w:keepNext w:val="0"/>
+              <w:widowControl w:val="0"/>
+              <w:shd w:val="clear" w:color="auto" w:fill="FFFFFF" w:themeFill="background1"/>
+              <w:spacing w:after="0"/>
+              <w:rPr>
+                <w:color w:val="1F2937"/>
+              </w:rPr>
+            </w:pPr>
+          </w:p>
+        </w:tc>
+      </w:tr>
+      <w:tr>
+        <w:trPr>
+          <w:trHeight w:val="629"/>
+        </w:trPr>
+        <w:tc>
+          <w:tcPr>
+            <w:tcW w:w="1916" w:type="dxa"/>
+            <w:tcBorders>
+              <w:top w:val="single" w:sz="4" w:space="0" w:color="D1D5DB"/>
+              <w:left w:val="single" w:sz="7" w:space="0" w:color="D1D5DB"/>
+              <w:bottom w:val="single" w:sz="7" w:space="0" w:color="D1D5DB"/>
+              <w:right w:val="single" w:sz="7" w:space="0" w:color="D1D5DB"/>
+            </w:tcBorders>
+            <w:shd w:val="clear" w:color="auto" w:fill="FEE2E2"/>
+            <w:vAlign w:val="center"/>
+          </w:tcPr>
+          <w:p>
+            <w:pPr>
+              <w:keepNext w:val="0"/>
+              <w:widowControl w:val="0"/>
+              <w:shd w:val="clear" w:color="auto" w:fill="FFFFFF" w:themeFill="background1"/>
+              <w:spacing w:after="0"/>
+              <w:jc w:val="center"/>
+              <w:rPr>
+                <w:b/>
+                <w:bCs/>
+                <w:color w:val="991B1B"/>
+              </w:rPr>
+            </w:pPr>
+            <w:r>
+              <w:rPr>
+                <w:b/>
+                <w:bCs/>
+                <w:color w:val="991B1B"/>
+              </w:rPr>
+              <w:lastRenderedPageBreak/>
+              <w:t>UC-0</w:t>
+            </w:r>
+            <w:r>
+              <w:rPr>
+                <w:b/>
+                <w:bCs/>
+                <w:color w:val="991B1B"/>
+              </w:rPr>
+              <w:t>5</w:t>
+            </w:r>
+          </w:p>
+        </w:tc>
+        <w:tc>
+          <w:tcPr>
+            <w:tcW w:w="6975" w:type="dxa"/>
+            <w:tcBorders>
+              <w:top w:val="single" w:sz="4" w:space="0" w:color="D1D5DB"/>
+              <w:left w:val="single" w:sz="7" w:space="0" w:color="D1D5DB"/>
+              <w:bottom w:val="single" w:sz="7" w:space="0" w:color="D1D5DB"/>
+              <w:right w:val="single" w:sz="7" w:space="0" w:color="D1D5DB"/>
+            </w:tcBorders>
+            <w:shd w:val="clear" w:color="auto" w:fill="FEE2E2"/>
+            <w:vAlign w:val="center"/>
+          </w:tcPr>
+          <w:p>
+            <w:pPr>
+              <w:keepNext w:val="0"/>
+              <w:widowControl w:val="0"/>
+              <w:shd w:val="clear" w:color="auto" w:fill="FFFFFF" w:themeFill="background1"/>
+              <w:spacing w:after="0"/>
+              <w:jc w:val="center"/>
+              <w:rPr>
+                <w:b/>
+                <w:bCs/>
+                <w:color w:val="991B1B"/>
+              </w:rPr>
+            </w:pPr>
+            <w:r>
+              <w:rPr>
+                <w:b/>
+                <w:bCs/>
+                <w:color w:val="991B1B"/>
+              </w:rPr>
+              <w:t>Realizar Inscripción Online</w:t>
+            </w:r>
+          </w:p>
+        </w:tc>
+      </w:tr>
+      <w:tr>
+        <w:trPr>
+          <w:trHeight w:val="465"/>
+        </w:trPr>
+        <w:tc>
+          <w:tcPr>
+            <w:tcW w:w="1916" w:type="dxa"/>
+            <w:tcBorders>
+              <w:top w:val="single" w:sz="7" w:space="0" w:color="D1D5DB"/>
+              <w:left w:val="single" w:sz="7" w:space="0" w:color="D1D5DB"/>
+              <w:bottom w:val="single" w:sz="7" w:space="0" w:color="D1D5DB"/>
+              <w:right w:val="single" w:sz="7" w:space="0" w:color="D1D5DB"/>
+            </w:tcBorders>
+            <w:vAlign w:val="center"/>
+          </w:tcPr>
+          <w:p>
+            <w:pPr>
+              <w:keepNext w:val="0"/>
+              <w:widowControl w:val="0"/>
+              <w:shd w:val="clear" w:color="auto" w:fill="FFFFFF" w:themeFill="background1"/>
+              <w:spacing w:after="0"/>
+              <w:rPr>
+                <w:b/>
+                <w:bCs/>
+                <w:color w:val="111827"/>
+              </w:rPr>
+            </w:pPr>
+            <w:r>
+              <w:rPr>
+                <w:b/>
+                <w:bCs/>
+                <w:color w:val="111827"/>
+              </w:rPr>
+              <w:t>Actor</w:t>
+            </w:r>
+          </w:p>
+        </w:tc>
+        <w:tc>
+          <w:tcPr>
+            <w:tcW w:w="6975" w:type="dxa"/>
+            <w:tcBorders>
+              <w:top w:val="single" w:sz="7" w:space="0" w:color="D1D5DB"/>
+              <w:left w:val="single" w:sz="7" w:space="0" w:color="D1D5DB"/>
+              <w:bottom w:val="single" w:sz="7" w:space="0" w:color="D1D5DB"/>
+              <w:right w:val="single" w:sz="7" w:space="0" w:color="D1D5DB"/>
+            </w:tcBorders>
+            <w:vAlign w:val="center"/>
+          </w:tcPr>
+          <w:p>
+            <w:pPr>
+              <w:keepNext w:val="0"/>
+              <w:widowControl w:val="0"/>
+              <w:shd w:val="clear" w:color="auto" w:fill="FFFFFF" w:themeFill="background1"/>
+              <w:spacing w:after="0"/>
+              <w:rPr>
+                <w:color w:val="1F2937"/>
+              </w:rPr>
+            </w:pPr>
+            <w:r>
+              <w:rPr>
+                <w:color w:val="1F2937"/>
+              </w:rPr>
+              <w:t>Atlet</w:t>
+            </w:r>
+            <w:r>
+              <w:rPr>
+                <w:color w:val="1F2937"/>
+              </w:rPr>
+              <w:t>a</w:t>
+            </w:r>
+          </w:p>
+        </w:tc>
+      </w:tr>
+      <w:tr>
+        <w:trPr>
+          <w:trHeight w:val="465"/>
+        </w:trPr>
+        <w:tc>
+          <w:tcPr>
+            <w:tcW w:w="1916" w:type="dxa"/>
+            <w:tcBorders>
+              <w:top w:val="single" w:sz="7" w:space="0" w:color="D1D5DB"/>
+              <w:left w:val="single" w:sz="7" w:space="0" w:color="D1D5DB"/>
+              <w:bottom w:val="single" w:sz="7" w:space="0" w:color="D1D5DB"/>
+              <w:right w:val="single" w:sz="7" w:space="0" w:color="D1D5DB"/>
+            </w:tcBorders>
+            <w:vAlign w:val="center"/>
+          </w:tcPr>
+          <w:p>
+            <w:pPr>
+              <w:keepNext w:val="0"/>
+              <w:widowControl w:val="0"/>
+              <w:shd w:val="clear" w:color="auto" w:fill="FFFFFF" w:themeFill="background1"/>
+              <w:spacing w:after="0"/>
+              <w:rPr>
+                <w:b/>
+                <w:bCs/>
+                <w:color w:val="111827"/>
+              </w:rPr>
+            </w:pPr>
+            <w:r>
+              <w:rPr>
+                <w:b/>
+                <w:bCs/>
+                <w:color w:val="111827"/>
+              </w:rPr>
+              <w:t>Interés</w:t>
+            </w:r>
+          </w:p>
+        </w:tc>
+        <w:tc>
+          <w:tcPr>
+            <w:tcW w:w="6975" w:type="dxa"/>
+            <w:tcBorders>
+              <w:top w:val="single" w:sz="7" w:space="0" w:color="D1D5DB"/>
+              <w:left w:val="single" w:sz="7" w:space="0" w:color="D1D5DB"/>
+              <w:bottom w:val="single" w:sz="7" w:space="0" w:color="D1D5DB"/>
+              <w:right w:val="single" w:sz="7" w:space="0" w:color="D1D5DB"/>
+            </w:tcBorders>
+            <w:vAlign w:val="center"/>
+          </w:tcPr>
+          <w:p>
+            <w:pPr>
+              <w:keepNext w:val="0"/>
+              <w:widowControl w:val="0"/>
+              <w:shd w:val="clear" w:color="auto" w:fill="FFFFFF" w:themeFill="background1"/>
+              <w:spacing w:after="0"/>
+              <w:rPr>
+                <w:color w:val="1F2937"/>
+              </w:rPr>
+            </w:pPr>
+            <w:r>
+              <w:rPr>
+                <w:color w:val="1F2937"/>
+              </w:rPr>
+              <w:t>Anotar sensaciones y estado físico tras una sesión en pista.</w:t>
+            </w:r>
+          </w:p>
+        </w:tc>
+      </w:tr>
+      <w:tr>
+        <w:trPr>
+          <w:trHeight w:val="465"/>
+        </w:trPr>
+        <w:tc>
+          <w:tcPr>
+            <w:tcW w:w="1916" w:type="dxa"/>
+            <w:tcBorders>
+              <w:top w:val="single" w:sz="7" w:space="0" w:color="D1D5DB"/>
+              <w:left w:val="single" w:sz="7" w:space="0" w:color="D1D5DB"/>
+              <w:bottom w:val="single" w:sz="7" w:space="0" w:color="D1D5DB"/>
+              <w:right w:val="single" w:sz="7" w:space="0" w:color="D1D5DB"/>
+            </w:tcBorders>
+            <w:vAlign w:val="center"/>
+          </w:tcPr>
+          <w:p>
+            <w:pPr>
+              <w:keepNext w:val="0"/>
+              <w:widowControl w:val="0"/>
+              <w:shd w:val="clear" w:color="auto" w:fill="FFFFFF" w:themeFill="background1"/>
+              <w:spacing w:after="0"/>
+              <w:rPr>
+                <w:b/>
+                <w:bCs/>
+                <w:color w:val="111827"/>
+              </w:rPr>
+            </w:pPr>
+            <w:r>
+              <w:rPr>
+                <w:b/>
+                <w:bCs/>
+                <w:color w:val="111827"/>
+              </w:rPr>
+              <w:t>Precondición</w:t>
+            </w:r>
+          </w:p>
+        </w:tc>
+        <w:tc>
+          <w:tcPr>
+            <w:tcW w:w="6975" w:type="dxa"/>
+            <w:tcBorders>
+              <w:top w:val="single" w:sz="7" w:space="0" w:color="D1D5DB"/>
+              <w:left w:val="single" w:sz="7" w:space="0" w:color="D1D5DB"/>
+              <w:bottom w:val="single" w:sz="7" w:space="0" w:color="D1D5DB"/>
+              <w:right w:val="single" w:sz="7" w:space="0" w:color="D1D5DB"/>
+            </w:tcBorders>
+            <w:vAlign w:val="center"/>
+          </w:tcPr>
+          <w:p>
+            <w:pPr>
+              <w:keepNext w:val="0"/>
+              <w:widowControl w:val="0"/>
+              <w:shd w:val="clear" w:color="auto" w:fill="FFFFFF" w:themeFill="background1"/>
+              <w:spacing w:after="0"/>
+              <w:rPr>
+                <w:color w:val="1F2937"/>
+              </w:rPr>
+            </w:pPr>
+            <w:r>
+              <w:rPr>
+                <w:color w:val="1F2937"/>
+              </w:rPr>
+              <w:t>Haber iniciado sesión (UC-01).</w:t>
+            </w:r>
+          </w:p>
+        </w:tc>
+      </w:tr>
+      <w:tr>
+        <w:trPr>
+          <w:trHeight w:val="465"/>
+        </w:trPr>
+        <w:tc>
+          <w:tcPr>
+            <w:tcW w:w="1916" w:type="dxa"/>
+            <w:tcBorders>
+              <w:top w:val="single" w:sz="7" w:space="0" w:color="D1D5DB"/>
+              <w:left w:val="single" w:sz="7" w:space="0" w:color="D1D5DB"/>
+              <w:bottom w:val="single" w:sz="7" w:space="0" w:color="D1D5DB"/>
+              <w:right w:val="single" w:sz="7" w:space="0" w:color="D1D5DB"/>
+            </w:tcBorders>
+            <w:vAlign w:val="center"/>
+          </w:tcPr>
+          <w:p>
+            <w:pPr>
+              <w:keepNext w:val="0"/>
+              <w:widowControl w:val="0"/>
+              <w:shd w:val="clear" w:color="auto" w:fill="FFFFFF" w:themeFill="background1"/>
+              <w:spacing w:after="0"/>
+              <w:rPr>
+                <w:b/>
+                <w:bCs/>
+                <w:color w:val="111827"/>
+              </w:rPr>
+            </w:pPr>
+            <w:r>
+              <w:rPr>
+                <w:b/>
+                <w:bCs/>
+                <w:color w:val="111827"/>
+              </w:rPr>
+              <w:t>Garantía</w:t>
+            </w:r>
+          </w:p>
+        </w:tc>
+        <w:tc>
+          <w:tcPr>
+            <w:tcW w:w="6975" w:type="dxa"/>
+            <w:tcBorders>
+              <w:top w:val="single" w:sz="7" w:space="0" w:color="D1D5DB"/>
+              <w:left w:val="single" w:sz="7" w:space="0" w:color="D1D5DB"/>
+              <w:bottom w:val="single" w:sz="7" w:space="0" w:color="D1D5DB"/>
+              <w:right w:val="single" w:sz="7" w:space="0" w:color="D1D5DB"/>
+            </w:tcBorders>
+            <w:vAlign w:val="center"/>
+          </w:tcPr>
+          <w:p>
+            <w:pPr>
+              <w:keepNext w:val="0"/>
+              <w:widowControl w:val="0"/>
+              <w:shd w:val="clear" w:color="auto" w:fill="FFFFFF" w:themeFill="background1"/>
+              <w:spacing w:after="0"/>
+              <w:rPr>
+                <w:color w:val="1F2937"/>
+              </w:rPr>
+            </w:pPr>
+            <w:r>
+              <w:rPr>
+                <w:color w:val="1F2937"/>
+              </w:rPr>
+              <w:t>El registro queda guardado en el historial deportivo del atleta.</w:t>
+            </w:r>
+          </w:p>
+        </w:tc>
+      </w:tr>
+      <w:tr>
+        <w:trPr>
+          <w:trHeight w:val="465"/>
+        </w:trPr>
+        <w:tc>
+          <w:tcPr>
+            <w:tcW w:w="1916" w:type="dxa"/>
+            <w:tcBorders>
+              <w:top w:val="single" w:sz="7" w:space="0" w:color="D1D5DB"/>
+              <w:left w:val="single" w:sz="7" w:space="0" w:color="D1D5DB"/>
+              <w:bottom w:val="single" w:sz="7" w:space="0" w:color="D1D5DB"/>
+              <w:right w:val="single" w:sz="7" w:space="0" w:color="D1D5DB"/>
+            </w:tcBorders>
+            <w:vAlign w:val="center"/>
+          </w:tcPr>
+          <w:p>
+            <w:pPr>
+              <w:keepNext w:val="0"/>
+              <w:widowControl w:val="0"/>
+              <w:shd w:val="clear" w:color="auto" w:fill="FFFFFF" w:themeFill="background1"/>
+              <w:spacing w:after="0"/>
+              <w:rPr>
+                <w:b/>
+                <w:bCs/>
+                <w:color w:val="111827"/>
+              </w:rPr>
+            </w:pPr>
+            <w:r>
+              <w:rPr>
+                <w:b/>
+                <w:bCs/>
+                <w:color w:val="111827"/>
+              </w:rPr>
+              <w:t>Flujo Básico</w:t>
+            </w:r>
+          </w:p>
+        </w:tc>
+        <w:tc>
+          <w:tcPr>
+            <w:tcW w:w="6975" w:type="dxa"/>
+            <w:tcBorders>
+              <w:top w:val="single" w:sz="7" w:space="0" w:color="D1D5DB"/>
+              <w:left w:val="single" w:sz="7" w:space="0" w:color="D1D5DB"/>
+              <w:bottom w:val="single" w:sz="7" w:space="0" w:color="D1D5DB"/>
+              <w:right w:val="single" w:sz="7" w:space="0" w:color="D1D5DB"/>
+            </w:tcBorders>
+            <w:vAlign w:val="center"/>
+          </w:tcPr>
+          <w:p>
+            <w:pPr>
+              <w:keepNext w:val="0"/>
+              <w:widowControl w:val="0"/>
+              <w:shd w:val="clear" w:color="auto" w:fill="FFFFFF" w:themeFill="background1"/>
+              <w:spacing w:after="0"/>
+              <w:rPr>
+                <w:color w:val="1F2937"/>
+              </w:rPr>
+            </w:pPr>
+            <w:r>
+              <w:rPr>
+                <w:color w:val="1F2937"/>
+              </w:rPr>
+              <w:t>1. El atleta entra en su área personal (</w:t>
+            </w:r>
+            <w:r>
+              <w:rPr>
+                <w:i/>
+                <w:iCs/>
+                <w:color w:val="1F2937"/>
+              </w:rPr>
+              <w:t>Gestionar perfil e historial</w:t>
+            </w:r>
+            <w:r>
+              <w:rPr>
+                <w:color w:val="1F2937"/>
+              </w:rPr>
+              <w:t>).</w:t>
+            </w:r>
+            <w:r>
+              <w:rPr>
+                <w:color w:val="1F2937"/>
+              </w:rPr>
+              <w:br/>
+              <w:t>2. Accede al apartado de feedback.</w:t>
+            </w:r>
+            <w:r>
+              <w:rPr>
+                <w:color w:val="1F2937"/>
+              </w:rPr>
+              <w:br/>
+              <w:t>3. Rellena el formulario de sensaciones.</w:t>
+            </w:r>
+            <w:r>
+              <w:rPr>
+                <w:color w:val="1F2937"/>
+              </w:rPr>
+              <w:br/>
+              <w:t>4. El sistema guarda la entrada en la base de datos.</w:t>
+            </w:r>
+          </w:p>
+        </w:tc>
+      </w:tr>
+      <w:tr>
+        <w:trPr>
+          <w:trHeight w:val="465"/>
+        </w:trPr>
+        <w:tc>
+          <w:tcPr>
+            <w:tcW w:w="1916" w:type="dxa"/>
+            <w:tcBorders>
+              <w:top w:val="single" w:sz="7" w:space="0" w:color="D1D5DB"/>
+              <w:left w:val="single" w:sz="7" w:space="0" w:color="D1D5DB"/>
+              <w:bottom w:val="single" w:sz="7" w:space="0" w:color="D1D5DB"/>
+              <w:right w:val="single" w:sz="7" w:space="0" w:color="D1D5DB"/>
+            </w:tcBorders>
+            <w:vAlign w:val="center"/>
+          </w:tcPr>
+          <w:p>
+            <w:pPr>
+              <w:keepNext w:val="0"/>
+              <w:widowControl w:val="0"/>
+              <w:shd w:val="clear" w:color="auto" w:fill="FFFFFF" w:themeFill="background1"/>
+              <w:spacing w:after="0"/>
+              <w:rPr>
+                <w:b/>
+                <w:bCs/>
+                <w:color w:val="111827"/>
+              </w:rPr>
+            </w:pPr>
+            <w:r>
+              <w:rPr>
+                <w:b/>
+                <w:bCs/>
+                <w:color w:val="111827"/>
+              </w:rPr>
+              <w:t>Excepciones</w:t>
+            </w:r>
+          </w:p>
+        </w:tc>
+        <w:tc>
+          <w:tcPr>
+            <w:tcW w:w="6975" w:type="dxa"/>
+            <w:tcBorders>
+              <w:top w:val="single" w:sz="7" w:space="0" w:color="D1D5DB"/>
+              <w:left w:val="single" w:sz="7" w:space="0" w:color="D1D5DB"/>
+              <w:bottom w:val="single" w:sz="7" w:space="0" w:color="D1D5DB"/>
+              <w:right w:val="single" w:sz="7" w:space="0" w:color="D1D5DB"/>
+            </w:tcBorders>
+            <w:vAlign w:val="center"/>
+          </w:tcPr>
+          <w:p>
+            <w:pPr>
+              <w:keepNext w:val="0"/>
+              <w:widowControl w:val="0"/>
+              <w:shd w:val="clear" w:color="auto" w:fill="FFFFFF" w:themeFill="background1"/>
+              <w:spacing w:after="0"/>
+              <w:rPr>
+                <w:color w:val="1F2937"/>
+              </w:rPr>
+            </w:pPr>
+            <w:r>
+              <w:rPr>
+                <w:color w:val="1F2937"/>
+              </w:rPr>
+              <w:t>3.a Formulario incompleto: El sistema pide rellenar los campos obligatorios.</w:t>
             </w:r>
           </w:p>
         </w:tc>
       </w:tr>
     </w:tbl>
-    <w:p>
-      <w:pPr>
-        <w:pStyle w:val="SubHeading3"/>
-        <w:rPr>
-          <w:rFonts w:eastAsia="Segoe UI"/>
-        </w:rPr>
-      </w:pPr>
-    </w:p>
-    <w:p>
-      <w:pPr>
-        <w:pStyle w:val="SubHeading3"/>
-        <w:rPr>
-          <w:rFonts w:eastAsia="Segoe UI"/>
-        </w:rPr>
-      </w:pPr>
-    </w:p>
-    <w:p>
-      <w:pPr>
-        <w:pStyle w:val="SubHeading3"/>
-        <w:rPr>
-          <w:rFonts w:eastAsia="Segoe UI"/>
-        </w:rPr>
-      </w:pPr>
-    </w:p>
-    <w:p>
-      <w:pPr>
-        <w:pStyle w:val="SubHeading3"/>
-        <w:rPr>
-          <w:rFonts w:eastAsia="Segoe UI"/>
-        </w:rPr>
-      </w:pPr>
-    </w:p>
-    <w:p>
-      <w:pPr>
-        <w:pStyle w:val="SubHeading3"/>
-        <w:rPr>
-          <w:rFonts w:eastAsia="Segoe UI"/>
-        </w:rPr>
-      </w:pPr>
-    </w:p>
-    <w:p>
-      <w:pPr>
-        <w:pStyle w:val="SubHeading3"/>
-        <w:rPr>
-          <w:rFonts w:eastAsia="Segoe UI"/>
-        </w:rPr>
-      </w:pPr>
-    </w:p>
-    <w:p>
-      <w:pPr>
-        <w:pStyle w:val="SubHeading3"/>
-        <w:rPr>
-          <w:rFonts w:eastAsia="Segoe UI"/>
-        </w:rPr>
-      </w:pPr>
-    </w:p>
     <w:p>
       <w:pPr>
         <w:pStyle w:val="Heading3"/>
@@ -9942,8 +12167,6 @@
         <w:shd w:val="clear" w:color="auto" w:fill="FFFFFF" w:themeFill="background1"/>
         <w:spacing w:before="360" w:after="120"/>
         <w:ind w:left="720"/>
-      </w:pPr>
-      <w:r>
         <w:rPr>
           <w:rFonts w:ascii="Segoe UI" w:eastAsia="Segoe UI" w:hAnsi="Segoe UI" w:cs="Segoe UI"/>
           <w:b/>
@@ -9953,6 +12176,60 @@
           <w:color w:val="000000" w:themeColor="text1"/>
           <w:sz w:val="24"/>
         </w:rPr>
+      </w:pPr>
+    </w:p>
+    <w:p>
+      <w:pPr>
+        <w:pStyle w:val="Heading4"/>
+        <w:shd w:val="clear" w:color="auto" w:fill="FFFFFF" w:themeFill="background1"/>
+        <w:spacing w:before="360" w:after="120"/>
+        <w:ind w:left="720"/>
+        <w:rPr>
+          <w:rFonts w:ascii="Segoe UI" w:eastAsia="Segoe UI" w:hAnsi="Segoe UI" w:cs="Segoe UI"/>
+          <w:b/>
+          <w:bCs/>
+          <w:i w:val="0"/>
+          <w:iCs w:val="0"/>
+          <w:color w:val="000000" w:themeColor="text1"/>
+          <w:sz w:val="24"/>
+        </w:rPr>
+      </w:pPr>
+    </w:p>
+    <w:p>
+      <w:pPr>
+        <w:pStyle w:val="Heading4"/>
+        <w:shd w:val="clear" w:color="auto" w:fill="FFFFFF" w:themeFill="background1"/>
+        <w:spacing w:before="360" w:after="120"/>
+        <w:ind w:left="720"/>
+        <w:rPr>
+          <w:rFonts w:ascii="Segoe UI" w:eastAsia="Segoe UI" w:hAnsi="Segoe UI" w:cs="Segoe UI"/>
+          <w:b/>
+          <w:bCs/>
+          <w:i w:val="0"/>
+          <w:iCs w:val="0"/>
+          <w:color w:val="000000" w:themeColor="text1"/>
+          <w:sz w:val="24"/>
+        </w:rPr>
+      </w:pPr>
+    </w:p>
+    <w:p>
+      <w:pPr>
+        <w:pStyle w:val="Heading4"/>
+        <w:shd w:val="clear" w:color="auto" w:fill="FFFFFF" w:themeFill="background1"/>
+        <w:spacing w:before="360" w:after="120"/>
+        <w:ind w:left="720"/>
+      </w:pPr>
+      <w:r>
+        <w:rPr>
+          <w:rFonts w:ascii="Segoe UI" w:eastAsia="Segoe UI" w:hAnsi="Segoe UI" w:cs="Segoe UI"/>
+          <w:b/>
+          <w:bCs/>
+          <w:i w:val="0"/>
+          <w:iCs w:val="0"/>
+          <w:color w:val="000000" w:themeColor="text1"/>
+          <w:sz w:val="24"/>
+        </w:rPr>
+        <w:lastRenderedPageBreak/>
         <w:t>2.4.2. Requisitos No Funcionales (RNF)</w:t>
       </w:r>
     </w:p>
@@ -10302,9 +12579,12 @@
     <w:p>
       <w:pPr>
         <w:pStyle w:val="Heading4"/>
+        <w:widowControl w:val="0"/>
         <w:shd w:val="clear" w:color="auto" w:fill="FFFFFF" w:themeFill="background1"/>
         <w:spacing w:before="360" w:after="120"/>
-        <w:ind w:left="720"/>
+        <w:ind w:firstLine="708"/>
+      </w:pPr>
+      <w:r>
         <w:rPr>
           <w:rFonts w:ascii="Segoe UI" w:eastAsia="Segoe UI" w:hAnsi="Segoe UI" w:cs="Segoe UI"/>
           <w:b/>
@@ -10314,79 +12594,6 @@
           <w:color w:val="000000" w:themeColor="text1"/>
           <w:sz w:val="24"/>
         </w:rPr>
-      </w:pPr>
-    </w:p>
-    <w:p>
-      <w:pPr>
-        <w:pStyle w:val="Heading4"/>
-        <w:shd w:val="clear" w:color="auto" w:fill="FFFFFF" w:themeFill="background1"/>
-        <w:spacing w:before="360" w:after="120"/>
-        <w:ind w:left="720"/>
-        <w:rPr>
-          <w:rFonts w:ascii="Segoe UI" w:eastAsia="Segoe UI" w:hAnsi="Segoe UI" w:cs="Segoe UI"/>
-          <w:b/>
-          <w:bCs/>
-          <w:i w:val="0"/>
-          <w:iCs w:val="0"/>
-          <w:color w:val="000000" w:themeColor="text1"/>
-          <w:sz w:val="24"/>
-        </w:rPr>
-      </w:pPr>
-    </w:p>
-    <w:p>
-      <w:pPr>
-        <w:pStyle w:val="Heading4"/>
-        <w:widowControl w:val="0"/>
-        <w:shd w:val="clear" w:color="auto" w:fill="FFFFFF" w:themeFill="background1"/>
-        <w:spacing w:before="360" w:after="120"/>
-        <w:ind w:left="720"/>
-        <w:rPr>
-          <w:rFonts w:ascii="Segoe UI" w:eastAsia="Segoe UI" w:hAnsi="Segoe UI" w:cs="Segoe UI"/>
-          <w:b/>
-          <w:bCs/>
-          <w:i w:val="0"/>
-          <w:iCs w:val="0"/>
-          <w:color w:val="000000" w:themeColor="text1"/>
-          <w:sz w:val="24"/>
-        </w:rPr>
-      </w:pPr>
-    </w:p>
-    <w:p>
-      <w:pPr>
-        <w:pStyle w:val="Heading4"/>
-        <w:widowControl w:val="0"/>
-        <w:shd w:val="clear" w:color="auto" w:fill="FFFFFF" w:themeFill="background1"/>
-        <w:spacing w:before="360" w:after="120"/>
-        <w:rPr>
-          <w:rFonts w:ascii="Segoe UI" w:eastAsia="Segoe UI" w:hAnsi="Segoe UI" w:cs="Segoe UI"/>
-          <w:b/>
-          <w:bCs/>
-          <w:i w:val="0"/>
-          <w:iCs w:val="0"/>
-          <w:color w:val="000000" w:themeColor="text1"/>
-          <w:sz w:val="24"/>
-        </w:rPr>
-      </w:pPr>
-    </w:p>
-    <w:p>
-      <w:pPr>
-        <w:pStyle w:val="Heading4"/>
-        <w:widowControl w:val="0"/>
-        <w:shd w:val="clear" w:color="auto" w:fill="FFFFFF" w:themeFill="background1"/>
-        <w:spacing w:before="360" w:after="120"/>
-        <w:ind w:left="720"/>
-      </w:pPr>
-      <w:r>
-        <w:rPr>
-          <w:rFonts w:ascii="Segoe UI" w:eastAsia="Segoe UI" w:hAnsi="Segoe UI" w:cs="Segoe UI"/>
-          <w:b/>
-          <w:bCs/>
-          <w:i w:val="0"/>
-          <w:iCs w:val="0"/>
-          <w:color w:val="000000" w:themeColor="text1"/>
-          <w:sz w:val="24"/>
-        </w:rPr>
-        <w:lastRenderedPageBreak/>
         <w:t>2.4.3. Requisitos de Información (IRQ)</w:t>
       </w:r>
     </w:p>
@@ -10423,6 +12630,8 @@
           </w:tcPr>
           <w:p>
             <w:pPr>
+              <w:keepNext w:val="0"/>
+              <w:widowControl w:val="0"/>
               <w:shd w:val="clear" w:color="auto" w:fill="FFFFFF" w:themeFill="background1"/>
               <w:spacing w:after="0"/>
               <w:jc w:val="center"/>
@@ -10451,6 +12660,8 @@
           </w:tcPr>
           <w:p>
             <w:pPr>
+              <w:keepNext w:val="0"/>
+              <w:widowControl w:val="0"/>
               <w:shd w:val="clear" w:color="auto" w:fill="FFFFFF" w:themeFill="background1"/>
               <w:spacing w:after="0"/>
               <w:jc w:val="center"/>
@@ -10483,6 +12694,8 @@
           </w:tcPr>
           <w:p>
             <w:pPr>
+              <w:keepNext w:val="0"/>
+              <w:widowControl w:val="0"/>
               <w:shd w:val="clear" w:color="auto" w:fill="FFFFFF" w:themeFill="background1"/>
               <w:spacing w:after="0"/>
             </w:pPr>
@@ -10509,6 +12722,8 @@
           </w:tcPr>
           <w:p>
             <w:pPr>
+              <w:keepNext w:val="0"/>
+              <w:widowControl w:val="0"/>
               <w:shd w:val="clear" w:color="auto" w:fill="FFFFFF" w:themeFill="background1"/>
               <w:spacing w:after="0"/>
             </w:pPr>
@@ -10538,6 +12753,8 @@
           </w:tcPr>
           <w:p>
             <w:pPr>
+              <w:keepNext w:val="0"/>
+              <w:widowControl w:val="0"/>
               <w:shd w:val="clear" w:color="auto" w:fill="FFFFFF" w:themeFill="background1"/>
               <w:spacing w:after="0"/>
             </w:pPr>
@@ -10564,6 +12781,8 @@
           </w:tcPr>
           <w:p>
             <w:pPr>
+              <w:keepNext w:val="0"/>
+              <w:widowControl w:val="0"/>
               <w:shd w:val="clear" w:color="auto" w:fill="FFFFFF" w:themeFill="background1"/>
               <w:spacing w:after="0"/>
             </w:pPr>
@@ -10607,11 +12826,13 @@
     <w:p>
       <w:pPr>
         <w:pStyle w:val="Heading3"/>
+        <w:keepNext w:val="0"/>
+        <w:widowControl w:val="0"/>
         <w:pBdr>
           <w:bottom w:val="single" w:sz="7" w:space="0" w:color="D1D5DB"/>
         </w:pBdr>
         <w:spacing w:before="360" w:after="120"/>
-        <w:ind w:left="360"/>
+        <w:ind w:left="357"/>
       </w:pPr>
       <w:r>
         <w:rPr>
@@ -10622,9 +12843,11 @@
     </w:p>
     <w:p>
       <w:pPr>
+        <w:keepNext w:val="0"/>
+        <w:widowControl w:val="0"/>
         <w:shd w:val="clear" w:color="auto" w:fill="FFFFFF" w:themeFill="background1"/>
         <w:spacing w:after="48"/>
-        <w:ind w:left="360"/>
+        <w:ind w:left="357"/>
         <w:jc w:val="both"/>
       </w:pPr>
       <w:r>
@@ -10638,9 +12861,11 @@
     </w:p>
     <w:p>
       <w:pPr>
+        <w:keepNext w:val="0"/>
+        <w:widowControl w:val="0"/>
         <w:shd w:val="clear" w:color="auto" w:fill="FFFFFF" w:themeFill="background1"/>
         <w:spacing w:before="240" w:after="240"/>
-        <w:ind w:left="360"/>
+        <w:ind w:left="357"/>
         <w:jc w:val="both"/>
       </w:pPr>
       <w:r>
@@ -10680,9 +12905,11 @@
     </w:p>
     <w:p>
       <w:pPr>
+        <w:keepNext w:val="0"/>
+        <w:widowControl w:val="0"/>
         <w:shd w:val="clear" w:color="auto" w:fill="FFFFFF" w:themeFill="background1"/>
         <w:spacing w:before="240" w:after="240"/>
-        <w:ind w:left="360"/>
+        <w:ind w:left="357"/>
         <w:jc w:val="both"/>
       </w:pPr>
       <w:r>
@@ -10714,9 +12941,11 @@
     </w:p>
     <w:p>
       <w:pPr>
+        <w:keepNext w:val="0"/>
+        <w:widowControl w:val="0"/>
         <w:shd w:val="clear" w:color="auto" w:fill="FFFFFF" w:themeFill="background1"/>
         <w:spacing w:before="240" w:after="240"/>
-        <w:ind w:left="360"/>
+        <w:ind w:left="357"/>
         <w:jc w:val="both"/>
       </w:pPr>
       <w:r>
@@ -10748,9 +12977,11 @@
     </w:p>
     <w:p>
       <w:pPr>
+        <w:keepNext w:val="0"/>
+        <w:widowControl w:val="0"/>
         <w:shd w:val="clear" w:color="auto" w:fill="FFFFFF" w:themeFill="background1"/>
         <w:spacing w:before="240" w:after="240"/>
-        <w:ind w:left="360"/>
+        <w:ind w:left="357"/>
         <w:jc w:val="both"/>
       </w:pPr>
       <w:r>
@@ -10779,64 +13010,6 @@
         </w:rPr>
         <w:t xml:space="preserve"> Tecnologías libres (HTML, CSS, PHP, MySQL), Tailwind CSS (MIT) y librerías de generación de PDF (MIT/GPL).</w:t>
       </w:r>
-    </w:p>
-    <w:p>
-      <w:pPr>
-        <w:pStyle w:val="Heading2"/>
-        <w:pBdr>
-          <w:bottom w:val="single" w:sz="7" w:space="0" w:color="374151"/>
-        </w:pBdr>
-        <w:shd w:val="clear" w:color="auto" w:fill="FFFFFF" w:themeFill="background1"/>
-        <w:spacing w:before="720" w:after="360"/>
-        <w:rPr>
-          <w:rFonts w:ascii="Segoe UI" w:eastAsia="Segoe UI" w:hAnsi="Segoe UI" w:cs="Segoe UI"/>
-          <w:b/>
-          <w:i w:val="0"/>
-          <w:iCs w:val="0"/>
-          <w:color w:val="1F2937"/>
-          <w:szCs w:val="48"/>
-        </w:rPr>
-      </w:pPr>
-    </w:p>
-    <w:p>
-      <w:pPr>
-        <w:pStyle w:val="Heading2"/>
-        <w:keepNext w:val="0"/>
-        <w:widowControl w:val="0"/>
-        <w:pBdr>
-          <w:bottom w:val="single" w:sz="7" w:space="0" w:color="374151"/>
-        </w:pBdr>
-        <w:shd w:val="clear" w:color="auto" w:fill="FFFFFF" w:themeFill="background1"/>
-        <w:spacing w:before="720" w:after="360"/>
-        <w:rPr>
-          <w:rFonts w:ascii="Segoe UI" w:eastAsia="Segoe UI" w:hAnsi="Segoe UI" w:cs="Segoe UI"/>
-          <w:b/>
-          <w:i w:val="0"/>
-          <w:iCs w:val="0"/>
-          <w:color w:val="1F2937"/>
-          <w:szCs w:val="48"/>
-        </w:rPr>
-      </w:pPr>
-    </w:p>
-    <w:p>
-      <w:pPr>
-        <w:pStyle w:val="Heading2"/>
-        <w:keepNext w:val="0"/>
-        <w:widowControl w:val="0"/>
-        <w:pBdr>
-          <w:bottom w:val="single" w:sz="7" w:space="0" w:color="374151"/>
-        </w:pBdr>
-        <w:shd w:val="clear" w:color="auto" w:fill="FFFFFF" w:themeFill="background1"/>
-        <w:spacing w:before="720" w:after="360"/>
-        <w:rPr>
-          <w:rFonts w:ascii="Segoe UI" w:eastAsia="Segoe UI" w:hAnsi="Segoe UI" w:cs="Segoe UI"/>
-          <w:b/>
-          <w:i w:val="0"/>
-          <w:iCs w:val="0"/>
-          <w:color w:val="1F2937"/>
-          <w:szCs w:val="48"/>
-        </w:rPr>
-      </w:pPr>
     </w:p>
     <w:p>
       <w:pPr>
@@ -15064,7 +17237,7 @@
             </wp:anchor>
           </w:drawing>
         </mc:Choice>
-        <mc:Fallback xmlns:a14="http://schemas.microsoft.com/office/drawing/2010/main" xmlns:pic="http://schemas.openxmlformats.org/drawingml/2006/picture" xmlns:a="http://schemas.openxmlformats.org/drawingml/2006/main">
+        <mc:Fallback xmlns:a="http://schemas.openxmlformats.org/drawingml/2006/main" xmlns:pic="http://schemas.openxmlformats.org/drawingml/2006/picture" xmlns:a14="http://schemas.microsoft.com/office/drawing/2010/main">
           <w:pict w14:anchorId="44D4DE1A">
             <v:shapetype id="_x0000_t32" coordsize="21600,21600" o:oned="t" filled="f" o:spt="32" path="m,l21600,21600e" w14:anchorId="7996C48F">
               <v:path fillok="f" arrowok="t" o:connecttype="none"/>
@@ -15355,7 +17528,7 @@
             </wp:anchor>
           </w:drawing>
         </mc:Choice>
-        <mc:Fallback xmlns:a14="http://schemas.microsoft.com/office/drawing/2010/main" xmlns:pic="http://schemas.openxmlformats.org/drawingml/2006/picture" xmlns:a="http://schemas.openxmlformats.org/drawingml/2006/main">
+        <mc:Fallback xmlns:a="http://schemas.openxmlformats.org/drawingml/2006/main" xmlns:pic="http://schemas.openxmlformats.org/drawingml/2006/picture" xmlns:a14="http://schemas.microsoft.com/office/drawing/2010/main">
           <w:pict w14:anchorId="18211A6C">
             <v:shapetype id="_x0000_t32" coordsize="21600,21600" o:oned="t" filled="f" o:spt="32" path="m,l21600,21600e" w14:anchorId="1F7B267B">
               <v:path fillok="f" arrowok="t" o:connecttype="none"/>
@@ -15658,7 +17831,7 @@
             </wp:anchor>
           </w:drawing>
         </mc:Choice>
-        <mc:Fallback xmlns:a14="http://schemas.microsoft.com/office/drawing/2010/main" xmlns:a="http://schemas.openxmlformats.org/drawingml/2006/main">
+        <mc:Fallback xmlns:a="http://schemas.openxmlformats.org/drawingml/2006/main" xmlns:a14="http://schemas.microsoft.com/office/drawing/2010/main">
           <w:pict w14:anchorId="2258254A">
             <v:shapetype id="_x0000_t32" coordsize="21600,21600" o:oned="t" filled="f" o:spt="32" path="m,l21600,21600e" w14:anchorId="4BB0A5D0">
               <v:path fillok="f" arrowok="t" o:connecttype="none"/>
@@ -15790,7 +17963,7 @@
             </wp:anchor>
           </w:drawing>
         </mc:Choice>
-        <mc:Fallback xmlns:a14="http://schemas.microsoft.com/office/drawing/2010/main" xmlns:a="http://schemas.openxmlformats.org/drawingml/2006/main">
+        <mc:Fallback xmlns:a="http://schemas.openxmlformats.org/drawingml/2006/main" xmlns:a14="http://schemas.microsoft.com/office/drawing/2010/main">
           <w:pict w14:anchorId="50FA3E29">
             <v:shapetype id="_x0000_t32" coordsize="21600,21600" o:oned="t" filled="f" o:spt="32" path="m,l21600,21600e" w14:anchorId="66A82D6C">
               <v:path fillok="f" arrowok="t" o:connecttype="none"/>
@@ -21360,7 +23533,7 @@
   </w:latentStyles>
   <w:style w:type="paragraph" w:default="1" w:styleId="Normal">
     <w:name w:val="Normal"/>
-    <w:rsid w:val="004B2E61"/>
+    <w:rsid w:val="00533148"/>
     <w:pPr>
       <w:keepNext/>
       <w:suppressAutoHyphens/>
@@ -21803,6 +23976,8 @@
   <w:style w:type="character" w:styleId="Emphasis">
     <w:name w:val="Emphasis"/>
     <w:basedOn w:val="DefaultParagraphFont"/>
+    <w:uiPriority w:val="20"/>
+    <w:qFormat/>
     <w:rsid w:val="00493830"/>
     <w:rPr>
       <w:i/>
@@ -22740,18 +24915,6 @@
 </file>
 
 <file path=customXml/item1.xml><?xml version="1.0" encoding="utf-8"?>
-<p:properties xmlns:p="http://schemas.microsoft.com/office/2006/metadata/properties" xmlns:xsi="http://www.w3.org/2001/XMLSchema-instance" xmlns:pc="http://schemas.microsoft.com/office/infopath/2007/PartnerControls">
-  <documentManagement>
-    <_activity xmlns="0dd81e3e-32c4-45c3-852a-33c36a8ca9a2" xsi:nil="true"/>
-  </documentManagement>
-</p:properties>
-</file>
-
-<file path=customXml/item2.xml><?xml version="1.0" encoding="utf-8"?>
-<b:Sources xmlns:b="http://schemas.openxmlformats.org/officeDocument/2006/bibliography" xmlns="http://schemas.openxmlformats.org/officeDocument/2006/bibliography" SelectedStyle="\APA.XSL" StyleName="APA Fifth Edition"/>
-</file>
-
-<file path=customXml/item3.xml><?xml version="1.0" encoding="utf-8"?>
 <?mso-contentType ?>
 <FormTemplates xmlns="http://schemas.microsoft.com/sharepoint/v3/contenttype/forms">
   <Display>DocumentLibraryForm</Display>
@@ -22760,7 +24923,15 @@
 </FormTemplates>
 </file>
 
-<file path=customXml/item4.xml><?xml version="1.0" encoding="utf-8"?>
+<file path=customXml/item2.xml><?xml version="1.0" encoding="utf-8"?>
+<p:properties xmlns:p="http://schemas.microsoft.com/office/2006/metadata/properties" xmlns:xsi="http://www.w3.org/2001/XMLSchema-instance" xmlns:pc="http://schemas.microsoft.com/office/infopath/2007/PartnerControls">
+  <documentManagement>
+    <_activity xmlns="0dd81e3e-32c4-45c3-852a-33c36a8ca9a2" xsi:nil="true"/>
+  </documentManagement>
+</p:properties>
+</file>
+
+<file path=customXml/item3.xml><?xml version="1.0" encoding="utf-8"?>
 <ct:contentTypeSchema xmlns:ct="http://schemas.microsoft.com/office/2006/metadata/contentType" xmlns:ma="http://schemas.microsoft.com/office/2006/metadata/properties/metaAttributes" ct:_="" ma:_="" ma:contentTypeName="Documento" ma:contentTypeID="0x01010025101D0885731048B0CD21D432E8305A" ma:contentTypeVersion="11" ma:contentTypeDescription="Crear nuevo documento." ma:contentTypeScope="" ma:versionID="81bcf49ec1edc4061c6f9fddaf17e5a4">
   <xsd:schema xmlns:xsd="http://www.w3.org/2001/XMLSchema" xmlns:xs="http://www.w3.org/2001/XMLSchema" xmlns:p="http://schemas.microsoft.com/office/2006/metadata/properties" xmlns:ns3="0dd81e3e-32c4-45c3-852a-33c36a8ca9a2" targetNamespace="http://schemas.microsoft.com/office/2006/metadata/properties" ma:root="true" ma:fieldsID="e214c24f35242a31bbaa59618cd4f46f" ns3:_="">
     <xsd:import namespace="0dd81e3e-32c4-45c3-852a-33c36a8ca9a2"/>
@@ -22948,7 +25119,19 @@
 </ct:contentTypeSchema>
 </file>
 
+<file path=customXml/item4.xml><?xml version="1.0" encoding="utf-8"?>
+<b:Sources xmlns:b="http://schemas.openxmlformats.org/officeDocument/2006/bibliography" xmlns="http://schemas.openxmlformats.org/officeDocument/2006/bibliography" SelectedStyle="\APA.XSL" StyleName="APA Fifth Edition"/>
+</file>
+
 <file path=customXml/itemProps1.xml><?xml version="1.0" encoding="utf-8"?>
+<ds:datastoreItem xmlns:ds="http://schemas.openxmlformats.org/officeDocument/2006/customXml" ds:itemID="{D6C383AF-1EC1-4F0E-B800-E4A39F6E2FAF}">
+  <ds:schemaRefs>
+    <ds:schemaRef ds:uri="http://schemas.microsoft.com/sharepoint/v3/contenttype/forms"/>
+  </ds:schemaRefs>
+</ds:datastoreItem>
+</file>
+
+<file path=customXml/itemProps2.xml><?xml version="1.0" encoding="utf-8"?>
 <ds:datastoreItem xmlns:ds="http://schemas.openxmlformats.org/officeDocument/2006/customXml" ds:itemID="{56B03E1A-13FD-4632-B7FD-6FEC8181D718}">
   <ds:schemaRefs>
     <ds:schemaRef ds:uri="http://schemas.microsoft.com/office/2006/metadata/properties"/>
@@ -22958,23 +25141,7 @@
 </ds:datastoreItem>
 </file>
 
-<file path=customXml/itemProps2.xml><?xml version="1.0" encoding="utf-8"?>
-<ds:datastoreItem xmlns:ds="http://schemas.openxmlformats.org/officeDocument/2006/customXml" ds:itemID="{16C71FD4-B25F-4F52-875D-9049229978E5}">
-  <ds:schemaRefs>
-    <ds:schemaRef ds:uri="http://schemas.openxmlformats.org/officeDocument/2006/bibliography"/>
-  </ds:schemaRefs>
-</ds:datastoreItem>
-</file>
-
 <file path=customXml/itemProps3.xml><?xml version="1.0" encoding="utf-8"?>
-<ds:datastoreItem xmlns:ds="http://schemas.openxmlformats.org/officeDocument/2006/customXml" ds:itemID="{D6C383AF-1EC1-4F0E-B800-E4A39F6E2FAF}">
-  <ds:schemaRefs>
-    <ds:schemaRef ds:uri="http://schemas.microsoft.com/sharepoint/v3/contenttype/forms"/>
-  </ds:schemaRefs>
-</ds:datastoreItem>
-</file>
-
-<file path=customXml/itemProps4.xml><?xml version="1.0" encoding="utf-8"?>
 <ds:datastoreItem xmlns:ds="http://schemas.openxmlformats.org/officeDocument/2006/customXml" ds:itemID="{DCD06B4A-01B4-46AA-8422-B68B8898A05E}">
   <ds:schemaRefs>
     <ds:schemaRef ds:uri="http://schemas.microsoft.com/office/2006/metadata/contentType"/>
@@ -22990,4 +25157,12 @@
     <ds:schemaRef ds:uri="http://schemas.microsoft.com/internal/obd"/>
   </ds:schemaRefs>
 </ds:datastoreItem>
+</file>
+
+<file path=customXml/itemProps4.xml><?xml version="1.0" encoding="utf-8"?>
+<ds:datastoreItem xmlns:ds="http://schemas.openxmlformats.org/officeDocument/2006/customXml" ds:itemID="{16C71FD4-B25F-4F52-875D-9049229978E5}">
+  <ds:schemaRefs>
+    <ds:schemaRef ds:uri="http://schemas.openxmlformats.org/officeDocument/2006/bibliography"/>
+  </ds:schemaRefs>
+</ds:datastoreItem>
 </file>
</xml_diff>

<commit_message>
More content updated to the memory
</commit_message>
<xml_diff>
--- a/MemoriaTFG-IvanMartinNieto.docx
+++ b/MemoriaTFG-IvanMartinNieto.docx
@@ -83,7 +83,7 @@
               </wp:anchor>
             </w:drawing>
           </mc:Choice>
-          <mc:Fallback xmlns:asvg="http://schemas.microsoft.com/office/drawing/2016/SVG/main" xmlns:a="http://schemas.openxmlformats.org/drawingml/2006/main" xmlns:a14="http://schemas.microsoft.com/office/drawing/2010/main" xmlns:pic="http://schemas.openxmlformats.org/drawingml/2006/picture">
+          <mc:Fallback xmlns:pic="http://schemas.openxmlformats.org/drawingml/2006/picture" xmlns:a14="http://schemas.microsoft.com/office/drawing/2010/main" xmlns:a="http://schemas.openxmlformats.org/drawingml/2006/main" xmlns:asvg="http://schemas.microsoft.com/office/drawing/2016/SVG/main">
             <w:pict w14:anchorId="0829D9D1">
               <v:shapetype id="_x0000_t32" coordsize="21600,21600" o:oned="t" filled="f" o:spt="32" path="m,l21600,21600e" w14:anchorId="38844837">
                 <v:path fillok="f" arrowok="t" o:connecttype="none"/>
@@ -16129,6 +16129,7 @@
       <w:r>
         <w:rPr>
           <w:rFonts w:ascii="Segoe UI" w:eastAsia="Segoe UI" w:hAnsi="Segoe UI" w:cs="Segoe UI"/>
+          <w:noProof/>
           <w:color w:val="212121"/>
           <w:sz w:val="24"/>
           <w:lang w:val="en-US"/>
@@ -23519,7 +23520,7 @@
           <w:color w:val="212121"/>
           <w:sz w:val="24"/>
         </w:rPr>
-        <w:t>3.4.</w:t>
+        <w:t xml:space="preserve">3.4.7. </w:t>
       </w:r>
       <w:r>
         <w:rPr>
@@ -23529,8 +23530,9 @@
           <w:color w:val="212121"/>
           <w:sz w:val="24"/>
         </w:rPr>
-        <w:t>7</w:t>
-      </w:r>
+        <w:t xml:space="preserve">Tabla: </w:t>
+      </w:r>
+      <w:proofErr w:type="spellStart"/>
       <w:r>
         <w:rPr>
           <w:rFonts w:ascii="Segoe UI" w:eastAsia="Segoe UI" w:hAnsi="Segoe UI" w:cs="Segoe UI"/>
@@ -23539,48 +23541,7 @@
           <w:color w:val="212121"/>
           <w:sz w:val="24"/>
         </w:rPr>
-        <w:t xml:space="preserve">. </w:t>
-      </w:r>
-      <w:r>
-        <w:rPr>
-          <w:rFonts w:ascii="Segoe UI" w:eastAsia="Segoe UI" w:hAnsi="Segoe UI" w:cs="Segoe UI"/>
-          <w:b/>
-          <w:bCs/>
-          <w:color w:val="212121"/>
-          <w:sz w:val="24"/>
-        </w:rPr>
-        <w:t xml:space="preserve">Tabla: </w:t>
-      </w:r>
-      <w:proofErr w:type="spellStart"/>
-      <w:r>
-        <w:rPr>
-          <w:rFonts w:ascii="Segoe UI" w:eastAsia="Segoe UI" w:hAnsi="Segoe UI" w:cs="Segoe UI"/>
-          <w:b/>
-          <w:bCs/>
-          <w:color w:val="212121"/>
-          <w:sz w:val="24"/>
-        </w:rPr>
-        <w:t>eventos</w:t>
-      </w:r>
-      <w:r>
-        <w:rPr>
-          <w:rFonts w:ascii="Segoe UI" w:eastAsia="Segoe UI" w:hAnsi="Segoe UI" w:cs="Segoe UI"/>
-          <w:b/>
-          <w:bCs/>
-          <w:color w:val="212121"/>
-          <w:sz w:val="24"/>
-        </w:rPr>
-        <w:t>_</w:t>
-      </w:r>
-      <w:r>
-        <w:rPr>
-          <w:rFonts w:ascii="Segoe UI" w:eastAsia="Segoe UI" w:hAnsi="Segoe UI" w:cs="Segoe UI"/>
-          <w:b/>
-          <w:bCs/>
-          <w:color w:val="212121"/>
-          <w:sz w:val="24"/>
-        </w:rPr>
-        <w:t>calendario</w:t>
+        <w:t>eventos_calendario</w:t>
       </w:r>
       <w:proofErr w:type="spellEnd"/>
     </w:p>
@@ -25143,178 +25104,1239 @@
         <w:t>Paleta de Colores</w:t>
       </w:r>
     </w:p>
-    <w:p>
-      <w:pPr>
-        <w:pStyle w:val="Heading2"/>
-        <w:keepNext w:val="0"/>
-        <w:widowControl w:val="0"/>
-        <w:shd w:val="clear" w:color="auto" w:fill="FFFFFF" w:themeFill="background1"/>
-        <w:spacing w:before="0" w:after="48"/>
-        <w:ind w:left="708"/>
-        <w:rPr>
-          <w:rFonts w:ascii="Segoe UI" w:eastAsia="Segoe UI" w:hAnsi="Segoe UI" w:cs="Segoe UI"/>
-          <w:i w:val="0"/>
-          <w:iCs w:val="0"/>
-          <w:color w:val="212121"/>
-          <w:sz w:val="24"/>
-        </w:rPr>
-      </w:pPr>
-      <w:r>
-        <w:rPr>
-          <w:rFonts w:ascii="Segoe UI" w:eastAsia="Segoe UI" w:hAnsi="Segoe UI" w:cs="Segoe UI"/>
-          <w:i w:val="0"/>
-          <w:iCs w:val="0"/>
-          <w:color w:val="212121"/>
-          <w:sz w:val="24"/>
-        </w:rPr>
-        <w:t>Se definirá una paleta cromática basada en la identidad corporativa del Club de Atletismo Ianuarius, priorizando el contraste y la legibilidad para entornos con mucha luz (exteriores):</w:t>
-      </w:r>
-    </w:p>
-    <w:p>
-      <w:pPr>
-        <w:pStyle w:val="Heading2"/>
-        <w:keepNext w:val="0"/>
-        <w:widowControl w:val="0"/>
-        <w:numPr>
-          <w:ilvl w:val="0"/>
-          <w:numId w:val="48"/>
-        </w:numPr>
-        <w:shd w:val="clear" w:color="auto" w:fill="FFFFFF" w:themeFill="background1"/>
-        <w:tabs>
-          <w:tab w:val="clear" w:pos="3240"/>
-          <w:tab w:val="num" w:pos="1080"/>
-        </w:tabs>
-        <w:spacing w:before="0" w:after="48"/>
-        <w:ind w:left="1066" w:hanging="357"/>
-        <w:rPr>
-          <w:rFonts w:ascii="Segoe UI" w:eastAsia="Segoe UI" w:hAnsi="Segoe UI" w:cs="Segoe UI"/>
-          <w:i w:val="0"/>
-          <w:iCs w:val="0"/>
-          <w:color w:val="212121"/>
-          <w:sz w:val="24"/>
-        </w:rPr>
-      </w:pPr>
-      <w:r>
-        <w:rPr>
-          <w:sz w:val="24"/>
-          <w:szCs w:val="24"/>
-        </w:rPr>
-        <w:tab/>
-      </w:r>
-      <w:r>
-        <w:rPr>
-          <w:rFonts w:ascii="Segoe UI" w:eastAsia="Segoe UI" w:hAnsi="Segoe UI" w:cs="Segoe UI"/>
-          <w:b/>
-          <w:i w:val="0"/>
-          <w:iCs w:val="0"/>
-          <w:color w:val="212121"/>
-          <w:sz w:val="24"/>
-        </w:rPr>
-        <w:t>Color Principal (Identidad Club):</w:t>
-      </w:r>
-      <w:r>
-        <w:rPr>
-          <w:rFonts w:ascii="Segoe UI" w:eastAsia="Segoe UI" w:hAnsi="Segoe UI" w:cs="Segoe UI"/>
-          <w:i w:val="0"/>
-          <w:iCs w:val="0"/>
-          <w:color w:val="212121"/>
-          <w:sz w:val="24"/>
-        </w:rPr>
-        <w:t> Rojo Ianuarius (#E63946) - Se reserva para los botones de acción principal (como enviar inscripciones), enlaces destacados y elementos de marca.</w:t>
-      </w:r>
-    </w:p>
-    <w:p>
-      <w:pPr>
-        <w:pStyle w:val="Heading2"/>
-        <w:keepNext w:val="0"/>
-        <w:widowControl w:val="0"/>
-        <w:numPr>
-          <w:ilvl w:val="0"/>
-          <w:numId w:val="48"/>
-        </w:numPr>
-        <w:shd w:val="clear" w:color="auto" w:fill="FFFFFF" w:themeFill="background1"/>
-        <w:tabs>
-          <w:tab w:val="clear" w:pos="3240"/>
-          <w:tab w:val="num" w:pos="1080"/>
-        </w:tabs>
-        <w:spacing w:before="0" w:after="48"/>
-        <w:ind w:left="1066" w:hanging="357"/>
-        <w:rPr>
-          <w:rFonts w:ascii="Segoe UI" w:eastAsia="Segoe UI" w:hAnsi="Segoe UI" w:cs="Segoe UI"/>
-          <w:i w:val="0"/>
-          <w:iCs w:val="0"/>
-          <w:color w:val="212121"/>
-          <w:sz w:val="24"/>
-        </w:rPr>
-      </w:pPr>
-      <w:r>
-        <w:rPr>
-          <w:rFonts w:ascii="Segoe UI" w:eastAsia="Segoe UI" w:hAnsi="Segoe UI" w:cs="Segoe UI"/>
-          <w:b/>
-          <w:i w:val="0"/>
-          <w:iCs w:val="0"/>
-          <w:color w:val="212121"/>
-          <w:sz w:val="24"/>
-        </w:rPr>
-        <w:t>Colores Neutros:</w:t>
-      </w:r>
-      <w:r>
-        <w:rPr>
-          <w:rFonts w:ascii="Segoe UI" w:eastAsia="Segoe UI" w:hAnsi="Segoe UI" w:cs="Segoe UI"/>
-          <w:i w:val="0"/>
-          <w:iCs w:val="0"/>
-          <w:color w:val="212121"/>
-          <w:sz w:val="24"/>
-        </w:rPr>
-        <w:t> Escala de grises (desde #F8F9FA para fondos hasta #212529 para textos principales) para estructurar el contenido sin fatigar la vista.</w:t>
-      </w:r>
-    </w:p>
-    <w:p>
-      <w:pPr>
-        <w:pStyle w:val="Heading2"/>
-        <w:keepNext w:val="0"/>
-        <w:widowControl w:val="0"/>
-        <w:numPr>
-          <w:ilvl w:val="0"/>
-          <w:numId w:val="48"/>
-        </w:numPr>
-        <w:shd w:val="clear" w:color="auto" w:fill="FFFFFF" w:themeFill="background1"/>
-        <w:tabs>
-          <w:tab w:val="clear" w:pos="3240"/>
-          <w:tab w:val="num" w:pos="1080"/>
-        </w:tabs>
-        <w:spacing w:before="0" w:after="48"/>
-        <w:ind w:left="1066" w:hanging="357"/>
-        <w:rPr>
-          <w:rFonts w:ascii="Segoe UI" w:eastAsia="Segoe UI" w:hAnsi="Segoe UI" w:cs="Segoe UI"/>
-          <w:i w:val="0"/>
-          <w:iCs w:val="0"/>
-          <w:color w:val="212121"/>
-          <w:sz w:val="24"/>
-        </w:rPr>
-      </w:pPr>
-      <w:r>
-        <w:rPr>
-          <w:rFonts w:ascii="Segoe UI" w:eastAsia="Segoe UI" w:hAnsi="Segoe UI" w:cs="Segoe UI"/>
-          <w:b/>
-          <w:i w:val="0"/>
-          <w:iCs w:val="0"/>
-          <w:color w:val="212121"/>
-          <w:sz w:val="24"/>
-        </w:rPr>
-        <w:t>Colores de Estado:</w:t>
-      </w:r>
-      <w:r>
-        <w:rPr>
-          <w:rFonts w:ascii="Segoe UI" w:eastAsia="Segoe UI" w:hAnsi="Segoe UI" w:cs="Segoe UI"/>
-          <w:i w:val="0"/>
-          <w:iCs w:val="0"/>
-          <w:color w:val="212121"/>
-          <w:sz w:val="24"/>
-        </w:rPr>
-        <w:t> Verde (#2A9D8F) para alertas de éxito (feedback guardado, PDF generado) y Naranja (#F4A261) para advertencias o campos incompletos.</w:t>
-      </w:r>
-    </w:p>
+    <w:tbl>
+      <w:tblPr>
+        <w:tblW w:w="11058" w:type="dxa"/>
+        <w:tblInd w:w="-1003" w:type="dxa"/>
+        <w:tblCellMar>
+          <w:left w:w="70" w:type="dxa"/>
+          <w:right w:w="70" w:type="dxa"/>
+        </w:tblCellMar>
+        <w:tblLook w:val="04A0" w:firstRow="1" w:lastRow="0" w:firstColumn="1" w:lastColumn="0" w:noHBand="0" w:noVBand="1"/>
+      </w:tblPr>
+      <w:tblGrid>
+        <w:gridCol w:w="1339"/>
+        <w:gridCol w:w="1409"/>
+        <w:gridCol w:w="1205"/>
+        <w:gridCol w:w="2250"/>
+        <w:gridCol w:w="4855"/>
+      </w:tblGrid>
+      <w:tr>
+        <w:trPr>
+          <w:trHeight w:val="720"/>
+        </w:trPr>
+        <w:tc>
+          <w:tcPr>
+            <w:tcW w:w="1339" w:type="dxa"/>
+            <w:tcBorders>
+              <w:top w:val="single" w:sz="4" w:space="0" w:color="D1D5DB"/>
+              <w:left w:val="single" w:sz="4" w:space="0" w:color="D1D5DB"/>
+              <w:bottom w:val="single" w:sz="4" w:space="0" w:color="D1D5DB"/>
+              <w:right w:val="single" w:sz="4" w:space="0" w:color="D1D5DB"/>
+            </w:tcBorders>
+            <w:shd w:val="clear" w:color="auto" w:fill="FEE2E2"/>
+            <w:vAlign w:val="center"/>
+            <w:hideMark/>
+          </w:tcPr>
+          <w:p>
+            <w:pPr>
+              <w:keepNext w:val="0"/>
+              <w:widowControl w:val="0"/>
+              <w:shd w:val="clear" w:color="auto" w:fill="FFFFFF" w:themeFill="background1"/>
+              <w:spacing w:after="0"/>
+              <w:jc w:val="center"/>
+              <w:rPr>
+                <w:b/>
+                <w:bCs/>
+                <w:color w:val="991B1B"/>
+              </w:rPr>
+            </w:pPr>
+            <w:r>
+              <w:rPr>
+                <w:b/>
+                <w:bCs/>
+                <w:color w:val="991B1B"/>
+              </w:rPr>
+              <w:t>Tipo</w:t>
+            </w:r>
+          </w:p>
+        </w:tc>
+        <w:tc>
+          <w:tcPr>
+            <w:tcW w:w="1409" w:type="dxa"/>
+            <w:tcBorders>
+              <w:top w:val="single" w:sz="4" w:space="0" w:color="D1D5DB"/>
+              <w:left w:val="single" w:sz="4" w:space="0" w:color="D1D5DB"/>
+              <w:bottom w:val="single" w:sz="4" w:space="0" w:color="D1D5DB"/>
+              <w:right w:val="single" w:sz="4" w:space="0" w:color="D1D5DB"/>
+            </w:tcBorders>
+            <w:shd w:val="clear" w:color="auto" w:fill="FEE2E2"/>
+            <w:vAlign w:val="center"/>
+            <w:hideMark/>
+          </w:tcPr>
+          <w:p>
+            <w:pPr>
+              <w:keepNext w:val="0"/>
+              <w:widowControl w:val="0"/>
+              <w:shd w:val="clear" w:color="auto" w:fill="FFFFFF" w:themeFill="background1"/>
+              <w:spacing w:after="0"/>
+              <w:jc w:val="center"/>
+              <w:rPr>
+                <w:b/>
+                <w:bCs/>
+                <w:color w:val="991B1B"/>
+              </w:rPr>
+            </w:pPr>
+            <w:r>
+              <w:rPr>
+                <w:b/>
+                <w:bCs/>
+                <w:color w:val="991B1B"/>
+              </w:rPr>
+              <w:t>Color (</w:t>
+            </w:r>
+            <w:proofErr w:type="spellStart"/>
+            <w:r>
+              <w:rPr>
+                <w:b/>
+                <w:bCs/>
+                <w:color w:val="991B1B"/>
+              </w:rPr>
+              <w:t>Hex</w:t>
+            </w:r>
+            <w:proofErr w:type="spellEnd"/>
+            <w:r>
+              <w:rPr>
+                <w:b/>
+                <w:bCs/>
+                <w:color w:val="991B1B"/>
+              </w:rPr>
+              <w:t>)</w:t>
+            </w:r>
+          </w:p>
+        </w:tc>
+        <w:tc>
+          <w:tcPr>
+            <w:tcW w:w="1205" w:type="dxa"/>
+            <w:tcBorders>
+              <w:top w:val="single" w:sz="4" w:space="0" w:color="D1D5DB"/>
+              <w:left w:val="single" w:sz="4" w:space="0" w:color="D1D5DB"/>
+              <w:bottom w:val="single" w:sz="4" w:space="0" w:color="D1D5DB"/>
+              <w:right w:val="single" w:sz="4" w:space="0" w:color="D1D5DB"/>
+            </w:tcBorders>
+            <w:shd w:val="clear" w:color="auto" w:fill="FEE2E2"/>
+            <w:vAlign w:val="center"/>
+            <w:hideMark/>
+          </w:tcPr>
+          <w:p>
+            <w:pPr>
+              <w:keepNext w:val="0"/>
+              <w:widowControl w:val="0"/>
+              <w:shd w:val="clear" w:color="auto" w:fill="FFFFFF" w:themeFill="background1"/>
+              <w:spacing w:after="0"/>
+              <w:jc w:val="center"/>
+              <w:rPr>
+                <w:b/>
+                <w:bCs/>
+                <w:color w:val="991B1B"/>
+              </w:rPr>
+            </w:pPr>
+            <w:r>
+              <w:rPr>
+                <w:b/>
+                <w:bCs/>
+                <w:color w:val="991B1B"/>
+              </w:rPr>
+              <w:t>Muestra</w:t>
+            </w:r>
+          </w:p>
+        </w:tc>
+        <w:tc>
+          <w:tcPr>
+            <w:tcW w:w="2250" w:type="dxa"/>
+            <w:tcBorders>
+              <w:top w:val="single" w:sz="4" w:space="0" w:color="D1D5DB"/>
+              <w:left w:val="single" w:sz="4" w:space="0" w:color="D1D5DB"/>
+              <w:bottom w:val="single" w:sz="4" w:space="0" w:color="D1D5DB"/>
+              <w:right w:val="single" w:sz="4" w:space="0" w:color="D1D5DB"/>
+            </w:tcBorders>
+            <w:shd w:val="clear" w:color="auto" w:fill="FEE2E2"/>
+            <w:vAlign w:val="center"/>
+            <w:hideMark/>
+          </w:tcPr>
+          <w:p>
+            <w:pPr>
+              <w:keepNext w:val="0"/>
+              <w:widowControl w:val="0"/>
+              <w:shd w:val="clear" w:color="auto" w:fill="FFFFFF" w:themeFill="background1"/>
+              <w:spacing w:after="0"/>
+              <w:jc w:val="center"/>
+              <w:rPr>
+                <w:b/>
+                <w:bCs/>
+                <w:color w:val="991B1B"/>
+              </w:rPr>
+            </w:pPr>
+            <w:r>
+              <w:rPr>
+                <w:b/>
+                <w:bCs/>
+                <w:color w:val="991B1B"/>
+              </w:rPr>
+              <w:t>Uso en la</w:t>
+            </w:r>
+            <w:r>
+              <w:rPr>
+                <w:b/>
+                <w:bCs/>
+                <w:color w:val="991B1B"/>
+              </w:rPr>
+              <w:t xml:space="preserve"> </w:t>
+            </w:r>
+            <w:r>
+              <w:rPr>
+                <w:b/>
+                <w:bCs/>
+                <w:color w:val="991B1B"/>
+              </w:rPr>
+              <w:t>Aplicación</w:t>
+            </w:r>
+          </w:p>
+        </w:tc>
+        <w:tc>
+          <w:tcPr>
+            <w:tcW w:w="4855" w:type="dxa"/>
+            <w:tcBorders>
+              <w:top w:val="single" w:sz="4" w:space="0" w:color="D1D5DB"/>
+              <w:left w:val="single" w:sz="4" w:space="0" w:color="D1D5DB"/>
+              <w:bottom w:val="single" w:sz="4" w:space="0" w:color="D1D5DB"/>
+              <w:right w:val="single" w:sz="4" w:space="0" w:color="D1D5DB"/>
+            </w:tcBorders>
+            <w:shd w:val="clear" w:color="auto" w:fill="FEE2E2"/>
+            <w:vAlign w:val="center"/>
+            <w:hideMark/>
+          </w:tcPr>
+          <w:p>
+            <w:pPr>
+              <w:keepNext w:val="0"/>
+              <w:widowControl w:val="0"/>
+              <w:shd w:val="clear" w:color="auto" w:fill="FFFFFF" w:themeFill="background1"/>
+              <w:spacing w:after="0"/>
+              <w:jc w:val="center"/>
+              <w:rPr>
+                <w:b/>
+                <w:bCs/>
+                <w:color w:val="991B1B"/>
+              </w:rPr>
+            </w:pPr>
+            <w:r>
+              <w:rPr>
+                <w:b/>
+                <w:bCs/>
+                <w:color w:val="991B1B"/>
+              </w:rPr>
+              <w:t>Justificación</w:t>
+            </w:r>
+          </w:p>
+        </w:tc>
+      </w:tr>
+      <w:tr>
+        <w:trPr>
+          <w:trHeight w:val="1021"/>
+        </w:trPr>
+        <w:tc>
+          <w:tcPr>
+            <w:tcW w:w="1339" w:type="dxa"/>
+            <w:tcBorders>
+              <w:top w:val="single" w:sz="4" w:space="0" w:color="D1D5DB"/>
+              <w:left w:val="single" w:sz="4" w:space="0" w:color="D1D5DB"/>
+              <w:bottom w:val="single" w:sz="4" w:space="0" w:color="D1D5DB"/>
+              <w:right w:val="single" w:sz="4" w:space="0" w:color="D1D5DB"/>
+            </w:tcBorders>
+            <w:vAlign w:val="center"/>
+            <w:hideMark/>
+          </w:tcPr>
+          <w:p>
+            <w:pPr>
+              <w:keepNext w:val="0"/>
+              <w:suppressAutoHyphens w:val="0"/>
+              <w:spacing w:after="0" w:line="240" w:lineRule="auto"/>
+              <w:rPr>
+                <w:rFonts w:ascii="Segoe UI" w:hAnsi="Segoe UI" w:cs="Segoe UI"/>
+                <w:b/>
+                <w:bCs/>
+                <w:color w:val="1F1F1F"/>
+                <w:sz w:val="19"/>
+                <w:szCs w:val="19"/>
+              </w:rPr>
+            </w:pPr>
+            <w:r>
+              <w:rPr>
+                <w:rFonts w:ascii="Segoe UI" w:hAnsi="Segoe UI" w:cs="Segoe UI"/>
+                <w:b/>
+                <w:bCs/>
+                <w:color w:val="1F1F1F"/>
+                <w:sz w:val="19"/>
+                <w:szCs w:val="19"/>
+              </w:rPr>
+              <w:t>Acento / Principal</w:t>
+            </w:r>
+          </w:p>
+        </w:tc>
+        <w:tc>
+          <w:tcPr>
+            <w:tcW w:w="1409" w:type="dxa"/>
+            <w:tcBorders>
+              <w:top w:val="single" w:sz="4" w:space="0" w:color="D1D5DB"/>
+              <w:left w:val="single" w:sz="4" w:space="0" w:color="D1D5DB"/>
+              <w:bottom w:val="single" w:sz="4" w:space="0" w:color="D1D5DB"/>
+              <w:right w:val="single" w:sz="4" w:space="0" w:color="D1D5DB"/>
+            </w:tcBorders>
+            <w:vAlign w:val="center"/>
+            <w:hideMark/>
+          </w:tcPr>
+          <w:p>
+            <w:pPr>
+              <w:keepNext w:val="0"/>
+              <w:suppressAutoHyphens w:val="0"/>
+              <w:spacing w:after="0" w:line="240" w:lineRule="auto"/>
+              <w:rPr>
+                <w:rFonts w:ascii="Segoe UI" w:hAnsi="Segoe UI" w:cs="Segoe UI"/>
+                <w:b/>
+                <w:bCs/>
+                <w:color w:val="1F1F1F"/>
+                <w:sz w:val="19"/>
+                <w:szCs w:val="19"/>
+              </w:rPr>
+            </w:pPr>
+            <w:r>
+              <w:rPr>
+                <w:rFonts w:ascii="Segoe UI" w:hAnsi="Segoe UI" w:cs="Segoe UI"/>
+                <w:b/>
+                <w:bCs/>
+                <w:color w:val="1F1F1F"/>
+                <w:sz w:val="19"/>
+                <w:szCs w:val="19"/>
+              </w:rPr>
+              <w:t>#FE0000</w:t>
+            </w:r>
+          </w:p>
+        </w:tc>
+        <w:tc>
+          <w:tcPr>
+            <w:tcW w:w="1205" w:type="dxa"/>
+            <w:tcBorders>
+              <w:top w:val="single" w:sz="4" w:space="0" w:color="D1D5DB"/>
+              <w:left w:val="single" w:sz="4" w:space="0" w:color="D1D5DB"/>
+              <w:bottom w:val="single" w:sz="4" w:space="0" w:color="D1D5DB"/>
+              <w:right w:val="single" w:sz="4" w:space="0" w:color="D1D5DB"/>
+            </w:tcBorders>
+            <w:vAlign w:val="center"/>
+            <w:hideMark/>
+          </w:tcPr>
+          <w:p>
+            <w:pPr>
+              <w:keepNext w:val="0"/>
+              <w:suppressAutoHyphens w:val="0"/>
+              <w:spacing w:after="0" w:line="240" w:lineRule="auto"/>
+              <w:rPr>
+                <w:rFonts w:ascii="Segoe UI" w:hAnsi="Segoe UI" w:cs="Segoe UI"/>
+                <w:color w:val="1F1F1F"/>
+                <w:sz w:val="19"/>
+                <w:szCs w:val="19"/>
+              </w:rPr>
+            </w:pPr>
+            <w:r>
+              <w:rPr>
+                <w:rFonts w:ascii="Segoe UI" w:hAnsi="Segoe UI" w:cs="Segoe UI"/>
+                <w:color w:val="1F1F1F"/>
+                <w:sz w:val="19"/>
+                <w:szCs w:val="19"/>
+              </w:rPr>
+              <w:t>Rojo Ianuarius</w:t>
+            </w:r>
+          </w:p>
+        </w:tc>
+        <w:tc>
+          <w:tcPr>
+            <w:tcW w:w="2250" w:type="dxa"/>
+            <w:tcBorders>
+              <w:top w:val="single" w:sz="4" w:space="0" w:color="D1D5DB"/>
+              <w:left w:val="single" w:sz="4" w:space="0" w:color="D1D5DB"/>
+              <w:bottom w:val="single" w:sz="4" w:space="0" w:color="D1D5DB"/>
+              <w:right w:val="single" w:sz="4" w:space="0" w:color="D1D5DB"/>
+            </w:tcBorders>
+            <w:vAlign w:val="center"/>
+            <w:hideMark/>
+          </w:tcPr>
+          <w:p>
+            <w:pPr>
+              <w:keepNext w:val="0"/>
+              <w:suppressAutoHyphens w:val="0"/>
+              <w:spacing w:after="0" w:line="240" w:lineRule="auto"/>
+              <w:rPr>
+                <w:rFonts w:ascii="Segoe UI" w:hAnsi="Segoe UI" w:cs="Segoe UI"/>
+                <w:color w:val="1F1F1F"/>
+                <w:sz w:val="19"/>
+                <w:szCs w:val="19"/>
+              </w:rPr>
+            </w:pPr>
+            <w:r>
+              <w:rPr>
+                <w:rFonts w:ascii="Segoe UI" w:hAnsi="Segoe UI" w:cs="Segoe UI"/>
+                <w:color w:val="1F1F1F"/>
+                <w:sz w:val="19"/>
+                <w:szCs w:val="19"/>
+              </w:rPr>
+              <w:t xml:space="preserve">Botón de "Inscribirse", bordes de tarjetas destacadas, </w:t>
+            </w:r>
+            <w:proofErr w:type="spellStart"/>
+            <w:r>
+              <w:rPr>
+                <w:rFonts w:ascii="Segoe UI" w:hAnsi="Segoe UI" w:cs="Segoe UI"/>
+                <w:color w:val="1F1F1F"/>
+                <w:sz w:val="19"/>
+                <w:szCs w:val="19"/>
+              </w:rPr>
+              <w:t>hover</w:t>
+            </w:r>
+            <w:proofErr w:type="spellEnd"/>
+            <w:r>
+              <w:rPr>
+                <w:rFonts w:ascii="Segoe UI" w:hAnsi="Segoe UI" w:cs="Segoe UI"/>
+                <w:color w:val="1F1F1F"/>
+                <w:sz w:val="19"/>
+                <w:szCs w:val="19"/>
+              </w:rPr>
+              <w:t xml:space="preserve"> de enlaces y textos de impacto.</w:t>
+            </w:r>
+          </w:p>
+        </w:tc>
+        <w:tc>
+          <w:tcPr>
+            <w:tcW w:w="4855" w:type="dxa"/>
+            <w:tcBorders>
+              <w:top w:val="single" w:sz="4" w:space="0" w:color="D1D5DB"/>
+              <w:left w:val="single" w:sz="4" w:space="0" w:color="D1D5DB"/>
+              <w:bottom w:val="single" w:sz="4" w:space="0" w:color="D1D5DB"/>
+              <w:right w:val="single" w:sz="4" w:space="0" w:color="D1D5DB"/>
+            </w:tcBorders>
+            <w:vAlign w:val="center"/>
+            <w:hideMark/>
+          </w:tcPr>
+          <w:p>
+            <w:pPr>
+              <w:keepNext w:val="0"/>
+              <w:suppressAutoHyphens w:val="0"/>
+              <w:spacing w:after="0" w:line="240" w:lineRule="auto"/>
+              <w:rPr>
+                <w:rFonts w:ascii="Segoe UI" w:hAnsi="Segoe UI" w:cs="Segoe UI"/>
+                <w:color w:val="1F1F1F"/>
+                <w:sz w:val="19"/>
+                <w:szCs w:val="19"/>
+              </w:rPr>
+            </w:pPr>
+            <w:r>
+              <w:rPr>
+                <w:rFonts w:ascii="Segoe UI" w:hAnsi="Segoe UI" w:cs="Segoe UI"/>
+                <w:color w:val="1F1F1F"/>
+                <w:sz w:val="19"/>
+                <w:szCs w:val="19"/>
+              </w:rPr>
+              <w:t>Es el color corporativo del escudo. Transmite la energía, agresividad y velocidad del atletismo. Actúa como llamada a la acción (CTA) perfecta sobre fondos oscuros.</w:t>
+            </w:r>
+          </w:p>
+        </w:tc>
+      </w:tr>
+      <w:tr>
+        <w:trPr>
+          <w:trHeight w:val="824"/>
+        </w:trPr>
+        <w:tc>
+          <w:tcPr>
+            <w:tcW w:w="1339" w:type="dxa"/>
+            <w:tcBorders>
+              <w:top w:val="single" w:sz="4" w:space="0" w:color="D1D5DB"/>
+              <w:left w:val="single" w:sz="4" w:space="0" w:color="D1D5DB"/>
+              <w:bottom w:val="single" w:sz="4" w:space="0" w:color="D1D5DB"/>
+              <w:right w:val="single" w:sz="4" w:space="0" w:color="D1D5DB"/>
+            </w:tcBorders>
+            <w:vAlign w:val="center"/>
+            <w:hideMark/>
+          </w:tcPr>
+          <w:p>
+            <w:pPr>
+              <w:keepNext w:val="0"/>
+              <w:suppressAutoHyphens w:val="0"/>
+              <w:spacing w:after="0" w:line="240" w:lineRule="auto"/>
+              <w:rPr>
+                <w:rFonts w:ascii="Segoe UI" w:hAnsi="Segoe UI" w:cs="Segoe UI"/>
+                <w:b/>
+                <w:bCs/>
+                <w:color w:val="1F1F1F"/>
+                <w:sz w:val="19"/>
+                <w:szCs w:val="19"/>
+              </w:rPr>
+            </w:pPr>
+            <w:r>
+              <w:rPr>
+                <w:rFonts w:ascii="Segoe UI" w:hAnsi="Segoe UI" w:cs="Segoe UI"/>
+                <w:b/>
+                <w:bCs/>
+                <w:color w:val="1F1F1F"/>
+                <w:sz w:val="19"/>
+                <w:szCs w:val="19"/>
+              </w:rPr>
+              <w:t>Fondo Principal</w:t>
+            </w:r>
+          </w:p>
+        </w:tc>
+        <w:tc>
+          <w:tcPr>
+            <w:tcW w:w="1409" w:type="dxa"/>
+            <w:tcBorders>
+              <w:top w:val="single" w:sz="4" w:space="0" w:color="D1D5DB"/>
+              <w:left w:val="single" w:sz="4" w:space="0" w:color="D1D5DB"/>
+              <w:bottom w:val="single" w:sz="4" w:space="0" w:color="D1D5DB"/>
+              <w:right w:val="single" w:sz="4" w:space="0" w:color="D1D5DB"/>
+            </w:tcBorders>
+            <w:vAlign w:val="center"/>
+            <w:hideMark/>
+          </w:tcPr>
+          <w:p>
+            <w:pPr>
+              <w:keepNext w:val="0"/>
+              <w:suppressAutoHyphens w:val="0"/>
+              <w:spacing w:after="0" w:line="240" w:lineRule="auto"/>
+              <w:rPr>
+                <w:rFonts w:ascii="Segoe UI" w:hAnsi="Segoe UI" w:cs="Segoe UI"/>
+                <w:b/>
+                <w:bCs/>
+                <w:color w:val="1F1F1F"/>
+                <w:sz w:val="19"/>
+                <w:szCs w:val="19"/>
+              </w:rPr>
+            </w:pPr>
+            <w:r>
+              <w:rPr>
+                <w:rFonts w:ascii="Segoe UI" w:hAnsi="Segoe UI" w:cs="Segoe UI"/>
+                <w:b/>
+                <w:bCs/>
+                <w:color w:val="1F1F1F"/>
+                <w:sz w:val="19"/>
+                <w:szCs w:val="19"/>
+              </w:rPr>
+              <w:t>#171717</w:t>
+            </w:r>
+          </w:p>
+        </w:tc>
+        <w:tc>
+          <w:tcPr>
+            <w:tcW w:w="1205" w:type="dxa"/>
+            <w:tcBorders>
+              <w:top w:val="single" w:sz="4" w:space="0" w:color="D1D5DB"/>
+              <w:left w:val="single" w:sz="4" w:space="0" w:color="D1D5DB"/>
+              <w:bottom w:val="single" w:sz="4" w:space="0" w:color="D1D5DB"/>
+              <w:right w:val="single" w:sz="4" w:space="0" w:color="D1D5DB"/>
+            </w:tcBorders>
+            <w:vAlign w:val="center"/>
+            <w:hideMark/>
+          </w:tcPr>
+          <w:p>
+            <w:pPr>
+              <w:keepNext w:val="0"/>
+              <w:suppressAutoHyphens w:val="0"/>
+              <w:spacing w:after="0" w:line="240" w:lineRule="auto"/>
+              <w:rPr>
+                <w:rFonts w:ascii="Segoe UI" w:hAnsi="Segoe UI" w:cs="Segoe UI"/>
+                <w:color w:val="1F1F1F"/>
+                <w:sz w:val="19"/>
+                <w:szCs w:val="19"/>
+              </w:rPr>
+            </w:pPr>
+            <w:r>
+              <w:rPr>
+                <w:rFonts w:ascii="Segoe UI" w:hAnsi="Segoe UI" w:cs="Segoe UI"/>
+                <w:color w:val="1F1F1F"/>
+                <w:sz w:val="19"/>
+                <w:szCs w:val="19"/>
+              </w:rPr>
+              <w:t>Oscuro</w:t>
+            </w:r>
+          </w:p>
+        </w:tc>
+        <w:tc>
+          <w:tcPr>
+            <w:tcW w:w="2250" w:type="dxa"/>
+            <w:tcBorders>
+              <w:top w:val="single" w:sz="4" w:space="0" w:color="D1D5DB"/>
+              <w:left w:val="single" w:sz="4" w:space="0" w:color="D1D5DB"/>
+              <w:bottom w:val="single" w:sz="4" w:space="0" w:color="D1D5DB"/>
+              <w:right w:val="single" w:sz="4" w:space="0" w:color="D1D5DB"/>
+            </w:tcBorders>
+            <w:vAlign w:val="center"/>
+            <w:hideMark/>
+          </w:tcPr>
+          <w:p>
+            <w:pPr>
+              <w:keepNext w:val="0"/>
+              <w:suppressAutoHyphens w:val="0"/>
+              <w:spacing w:after="0" w:line="240" w:lineRule="auto"/>
+              <w:rPr>
+                <w:rFonts w:ascii="Segoe UI" w:hAnsi="Segoe UI" w:cs="Segoe UI"/>
+                <w:color w:val="1F1F1F"/>
+                <w:sz w:val="19"/>
+                <w:szCs w:val="19"/>
+              </w:rPr>
+            </w:pPr>
+            <w:r>
+              <w:rPr>
+                <w:rFonts w:ascii="Segoe UI" w:hAnsi="Segoe UI" w:cs="Segoe UI"/>
+                <w:color w:val="1F1F1F"/>
+                <w:sz w:val="19"/>
+                <w:szCs w:val="19"/>
+              </w:rPr>
+              <w:t>Color base para todo el fondo de la página y secciones principales.</w:t>
+            </w:r>
+          </w:p>
+        </w:tc>
+        <w:tc>
+          <w:tcPr>
+            <w:tcW w:w="4855" w:type="dxa"/>
+            <w:tcBorders>
+              <w:top w:val="single" w:sz="4" w:space="0" w:color="D1D5DB"/>
+              <w:left w:val="single" w:sz="4" w:space="0" w:color="D1D5DB"/>
+              <w:bottom w:val="single" w:sz="4" w:space="0" w:color="D1D5DB"/>
+              <w:right w:val="single" w:sz="4" w:space="0" w:color="D1D5DB"/>
+            </w:tcBorders>
+            <w:vAlign w:val="center"/>
+            <w:hideMark/>
+          </w:tcPr>
+          <w:p>
+            <w:pPr>
+              <w:keepNext w:val="0"/>
+              <w:suppressAutoHyphens w:val="0"/>
+              <w:spacing w:after="0" w:line="240" w:lineRule="auto"/>
+              <w:rPr>
+                <w:rFonts w:ascii="Segoe UI" w:hAnsi="Segoe UI" w:cs="Segoe UI"/>
+                <w:color w:val="1F1F1F"/>
+                <w:sz w:val="19"/>
+                <w:szCs w:val="19"/>
+              </w:rPr>
+            </w:pPr>
+            <w:r>
+              <w:rPr>
+                <w:rFonts w:ascii="Segoe UI" w:hAnsi="Segoe UI" w:cs="Segoe UI"/>
+                <w:color w:val="1F1F1F"/>
+                <w:sz w:val="19"/>
+                <w:szCs w:val="19"/>
+              </w:rPr>
+              <w:t>Proporciona una estética moderna, inmersiva y "premium". Reduce el cansancio visual y hace que el rojo resalte de forma brutal.</w:t>
+            </w:r>
+          </w:p>
+        </w:tc>
+      </w:tr>
+      <w:tr>
+        <w:trPr>
+          <w:trHeight w:val="835"/>
+        </w:trPr>
+        <w:tc>
+          <w:tcPr>
+            <w:tcW w:w="1339" w:type="dxa"/>
+            <w:tcBorders>
+              <w:top w:val="single" w:sz="4" w:space="0" w:color="D1D5DB"/>
+              <w:left w:val="single" w:sz="4" w:space="0" w:color="D1D5DB"/>
+              <w:bottom w:val="single" w:sz="4" w:space="0" w:color="D1D5DB"/>
+              <w:right w:val="single" w:sz="4" w:space="0" w:color="D1D5DB"/>
+            </w:tcBorders>
+            <w:vAlign w:val="center"/>
+            <w:hideMark/>
+          </w:tcPr>
+          <w:p>
+            <w:pPr>
+              <w:keepNext w:val="0"/>
+              <w:suppressAutoHyphens w:val="0"/>
+              <w:spacing w:after="0" w:line="240" w:lineRule="auto"/>
+              <w:rPr>
+                <w:rFonts w:ascii="Segoe UI" w:hAnsi="Segoe UI" w:cs="Segoe UI"/>
+                <w:b/>
+                <w:bCs/>
+                <w:color w:val="1F1F1F"/>
+                <w:sz w:val="19"/>
+                <w:szCs w:val="19"/>
+              </w:rPr>
+            </w:pPr>
+            <w:r>
+              <w:rPr>
+                <w:rFonts w:ascii="Segoe UI" w:hAnsi="Segoe UI" w:cs="Segoe UI"/>
+                <w:b/>
+                <w:bCs/>
+                <w:color w:val="1F1F1F"/>
+                <w:sz w:val="19"/>
+                <w:szCs w:val="19"/>
+              </w:rPr>
+              <w:t>Fondo Secundario</w:t>
+            </w:r>
+          </w:p>
+        </w:tc>
+        <w:tc>
+          <w:tcPr>
+            <w:tcW w:w="1409" w:type="dxa"/>
+            <w:tcBorders>
+              <w:top w:val="single" w:sz="4" w:space="0" w:color="D1D5DB"/>
+              <w:left w:val="single" w:sz="4" w:space="0" w:color="D1D5DB"/>
+              <w:bottom w:val="single" w:sz="4" w:space="0" w:color="D1D5DB"/>
+              <w:right w:val="single" w:sz="4" w:space="0" w:color="D1D5DB"/>
+            </w:tcBorders>
+            <w:vAlign w:val="center"/>
+            <w:hideMark/>
+          </w:tcPr>
+          <w:p>
+            <w:pPr>
+              <w:keepNext w:val="0"/>
+              <w:suppressAutoHyphens w:val="0"/>
+              <w:spacing w:after="0" w:line="240" w:lineRule="auto"/>
+              <w:rPr>
+                <w:rFonts w:ascii="Segoe UI" w:hAnsi="Segoe UI" w:cs="Segoe UI"/>
+                <w:b/>
+                <w:bCs/>
+                <w:color w:val="1F1F1F"/>
+                <w:sz w:val="19"/>
+                <w:szCs w:val="19"/>
+              </w:rPr>
+            </w:pPr>
+            <w:r>
+              <w:rPr>
+                <w:rFonts w:ascii="Segoe UI" w:hAnsi="Segoe UI" w:cs="Segoe UI"/>
+                <w:b/>
+                <w:bCs/>
+                <w:color w:val="1F1F1F"/>
+                <w:sz w:val="19"/>
+                <w:szCs w:val="19"/>
+              </w:rPr>
+              <w:t>#262626</w:t>
+            </w:r>
+          </w:p>
+        </w:tc>
+        <w:tc>
+          <w:tcPr>
+            <w:tcW w:w="1205" w:type="dxa"/>
+            <w:tcBorders>
+              <w:top w:val="single" w:sz="4" w:space="0" w:color="D1D5DB"/>
+              <w:left w:val="single" w:sz="4" w:space="0" w:color="D1D5DB"/>
+              <w:bottom w:val="single" w:sz="4" w:space="0" w:color="D1D5DB"/>
+              <w:right w:val="single" w:sz="4" w:space="0" w:color="D1D5DB"/>
+            </w:tcBorders>
+            <w:vAlign w:val="center"/>
+            <w:hideMark/>
+          </w:tcPr>
+          <w:p>
+            <w:pPr>
+              <w:keepNext w:val="0"/>
+              <w:suppressAutoHyphens w:val="0"/>
+              <w:spacing w:after="0" w:line="240" w:lineRule="auto"/>
+              <w:rPr>
+                <w:rFonts w:ascii="Segoe UI" w:hAnsi="Segoe UI" w:cs="Segoe UI"/>
+                <w:color w:val="1F1F1F"/>
+                <w:sz w:val="19"/>
+                <w:szCs w:val="19"/>
+              </w:rPr>
+            </w:pPr>
+            <w:r>
+              <w:rPr>
+                <w:rFonts w:ascii="Segoe UI" w:hAnsi="Segoe UI" w:cs="Segoe UI"/>
+                <w:color w:val="1F1F1F"/>
+                <w:sz w:val="19"/>
+                <w:szCs w:val="19"/>
+              </w:rPr>
+              <w:t>Gris</w:t>
+            </w:r>
+          </w:p>
+        </w:tc>
+        <w:tc>
+          <w:tcPr>
+            <w:tcW w:w="2250" w:type="dxa"/>
+            <w:tcBorders>
+              <w:top w:val="single" w:sz="4" w:space="0" w:color="D1D5DB"/>
+              <w:left w:val="single" w:sz="4" w:space="0" w:color="D1D5DB"/>
+              <w:bottom w:val="single" w:sz="4" w:space="0" w:color="D1D5DB"/>
+              <w:right w:val="single" w:sz="4" w:space="0" w:color="D1D5DB"/>
+            </w:tcBorders>
+            <w:vAlign w:val="center"/>
+            <w:hideMark/>
+          </w:tcPr>
+          <w:p>
+            <w:pPr>
+              <w:keepNext w:val="0"/>
+              <w:suppressAutoHyphens w:val="0"/>
+              <w:spacing w:after="0" w:line="240" w:lineRule="auto"/>
+              <w:rPr>
+                <w:rFonts w:ascii="Segoe UI" w:hAnsi="Segoe UI" w:cs="Segoe UI"/>
+                <w:color w:val="1F1F1F"/>
+                <w:sz w:val="19"/>
+                <w:szCs w:val="19"/>
+              </w:rPr>
+            </w:pPr>
+            <w:r>
+              <w:rPr>
+                <w:rFonts w:ascii="Segoe UI" w:hAnsi="Segoe UI" w:cs="Segoe UI"/>
+                <w:color w:val="1F1F1F"/>
+                <w:sz w:val="19"/>
+                <w:szCs w:val="19"/>
+              </w:rPr>
+              <w:t>Fondo de las tarjetas de contenido (como la de noticias) y menús superpuestos.</w:t>
+            </w:r>
+          </w:p>
+        </w:tc>
+        <w:tc>
+          <w:tcPr>
+            <w:tcW w:w="4855" w:type="dxa"/>
+            <w:tcBorders>
+              <w:top w:val="single" w:sz="4" w:space="0" w:color="D1D5DB"/>
+              <w:left w:val="single" w:sz="4" w:space="0" w:color="D1D5DB"/>
+              <w:bottom w:val="single" w:sz="4" w:space="0" w:color="D1D5DB"/>
+              <w:right w:val="single" w:sz="4" w:space="0" w:color="D1D5DB"/>
+            </w:tcBorders>
+            <w:vAlign w:val="center"/>
+            <w:hideMark/>
+          </w:tcPr>
+          <w:p>
+            <w:pPr>
+              <w:keepNext w:val="0"/>
+              <w:suppressAutoHyphens w:val="0"/>
+              <w:spacing w:after="0" w:line="240" w:lineRule="auto"/>
+              <w:rPr>
+                <w:rFonts w:ascii="Segoe UI" w:hAnsi="Segoe UI" w:cs="Segoe UI"/>
+                <w:color w:val="1F1F1F"/>
+                <w:sz w:val="19"/>
+                <w:szCs w:val="19"/>
+              </w:rPr>
+            </w:pPr>
+            <w:r>
+              <w:rPr>
+                <w:rFonts w:ascii="Segoe UI" w:hAnsi="Segoe UI" w:cs="Segoe UI"/>
+                <w:color w:val="1F1F1F"/>
+                <w:sz w:val="19"/>
+                <w:szCs w:val="19"/>
+              </w:rPr>
+              <w:t>Crea profundidad y jerarquía visual. Al ser ligeramente más claro que el fondo principal, permite que las tarjetas "floten" sin necesidad de bordes gruesos.</w:t>
+            </w:r>
+          </w:p>
+        </w:tc>
+      </w:tr>
+      <w:tr>
+        <w:trPr>
+          <w:trHeight w:val="834"/>
+        </w:trPr>
+        <w:tc>
+          <w:tcPr>
+            <w:tcW w:w="1339" w:type="dxa"/>
+            <w:tcBorders>
+              <w:top w:val="single" w:sz="4" w:space="0" w:color="D1D5DB"/>
+              <w:left w:val="single" w:sz="4" w:space="0" w:color="D1D5DB"/>
+              <w:bottom w:val="single" w:sz="4" w:space="0" w:color="D1D5DB"/>
+              <w:right w:val="single" w:sz="4" w:space="0" w:color="D1D5DB"/>
+            </w:tcBorders>
+            <w:vAlign w:val="center"/>
+            <w:hideMark/>
+          </w:tcPr>
+          <w:p>
+            <w:pPr>
+              <w:keepNext w:val="0"/>
+              <w:suppressAutoHyphens w:val="0"/>
+              <w:spacing w:after="0" w:line="240" w:lineRule="auto"/>
+              <w:rPr>
+                <w:rFonts w:ascii="Segoe UI" w:hAnsi="Segoe UI" w:cs="Segoe UI"/>
+                <w:b/>
+                <w:bCs/>
+                <w:color w:val="1F1F1F"/>
+                <w:sz w:val="19"/>
+                <w:szCs w:val="19"/>
+              </w:rPr>
+            </w:pPr>
+            <w:r>
+              <w:rPr>
+                <w:rFonts w:ascii="Segoe UI" w:hAnsi="Segoe UI" w:cs="Segoe UI"/>
+                <w:b/>
+                <w:bCs/>
+                <w:color w:val="1F1F1F"/>
+                <w:sz w:val="19"/>
+                <w:szCs w:val="19"/>
+              </w:rPr>
+              <w:t>Texto Principal</w:t>
+            </w:r>
+          </w:p>
+        </w:tc>
+        <w:tc>
+          <w:tcPr>
+            <w:tcW w:w="1409" w:type="dxa"/>
+            <w:tcBorders>
+              <w:top w:val="single" w:sz="4" w:space="0" w:color="D1D5DB"/>
+              <w:left w:val="single" w:sz="4" w:space="0" w:color="D1D5DB"/>
+              <w:bottom w:val="single" w:sz="4" w:space="0" w:color="D1D5DB"/>
+              <w:right w:val="single" w:sz="4" w:space="0" w:color="D1D5DB"/>
+            </w:tcBorders>
+            <w:vAlign w:val="center"/>
+            <w:hideMark/>
+          </w:tcPr>
+          <w:p>
+            <w:pPr>
+              <w:keepNext w:val="0"/>
+              <w:suppressAutoHyphens w:val="0"/>
+              <w:spacing w:after="0" w:line="240" w:lineRule="auto"/>
+              <w:rPr>
+                <w:rFonts w:ascii="Segoe UI" w:hAnsi="Segoe UI" w:cs="Segoe UI"/>
+                <w:b/>
+                <w:bCs/>
+                <w:color w:val="1F1F1F"/>
+                <w:sz w:val="19"/>
+                <w:szCs w:val="19"/>
+              </w:rPr>
+            </w:pPr>
+            <w:r>
+              <w:rPr>
+                <w:rFonts w:ascii="Segoe UI" w:hAnsi="Segoe UI" w:cs="Segoe UI"/>
+                <w:b/>
+                <w:bCs/>
+                <w:color w:val="1F1F1F"/>
+                <w:sz w:val="19"/>
+                <w:szCs w:val="19"/>
+              </w:rPr>
+              <w:t>#FFFFFF</w:t>
+            </w:r>
+          </w:p>
+        </w:tc>
+        <w:tc>
+          <w:tcPr>
+            <w:tcW w:w="1205" w:type="dxa"/>
+            <w:tcBorders>
+              <w:top w:val="single" w:sz="4" w:space="0" w:color="D1D5DB"/>
+              <w:left w:val="single" w:sz="4" w:space="0" w:color="D1D5DB"/>
+              <w:bottom w:val="single" w:sz="4" w:space="0" w:color="D1D5DB"/>
+              <w:right w:val="single" w:sz="4" w:space="0" w:color="D1D5DB"/>
+            </w:tcBorders>
+            <w:vAlign w:val="center"/>
+            <w:hideMark/>
+          </w:tcPr>
+          <w:p>
+            <w:pPr>
+              <w:keepNext w:val="0"/>
+              <w:suppressAutoHyphens w:val="0"/>
+              <w:spacing w:after="0" w:line="240" w:lineRule="auto"/>
+              <w:rPr>
+                <w:rFonts w:ascii="Segoe UI" w:hAnsi="Segoe UI" w:cs="Segoe UI"/>
+                <w:color w:val="1F1F1F"/>
+                <w:sz w:val="19"/>
+                <w:szCs w:val="19"/>
+              </w:rPr>
+            </w:pPr>
+            <w:r>
+              <w:rPr>
+                <w:rFonts w:ascii="Segoe UI" w:hAnsi="Segoe UI" w:cs="Segoe UI"/>
+                <w:color w:val="1F1F1F"/>
+                <w:sz w:val="19"/>
+                <w:szCs w:val="19"/>
+              </w:rPr>
+              <w:t>Blanco</w:t>
+            </w:r>
+          </w:p>
+        </w:tc>
+        <w:tc>
+          <w:tcPr>
+            <w:tcW w:w="2250" w:type="dxa"/>
+            <w:tcBorders>
+              <w:top w:val="single" w:sz="4" w:space="0" w:color="D1D5DB"/>
+              <w:left w:val="single" w:sz="4" w:space="0" w:color="D1D5DB"/>
+              <w:bottom w:val="single" w:sz="4" w:space="0" w:color="D1D5DB"/>
+              <w:right w:val="single" w:sz="4" w:space="0" w:color="D1D5DB"/>
+            </w:tcBorders>
+            <w:vAlign w:val="center"/>
+            <w:hideMark/>
+          </w:tcPr>
+          <w:p>
+            <w:pPr>
+              <w:keepNext w:val="0"/>
+              <w:suppressAutoHyphens w:val="0"/>
+              <w:spacing w:after="0" w:line="240" w:lineRule="auto"/>
+              <w:rPr>
+                <w:rFonts w:ascii="Segoe UI" w:hAnsi="Segoe UI" w:cs="Segoe UI"/>
+                <w:color w:val="1F1F1F"/>
+                <w:sz w:val="19"/>
+                <w:szCs w:val="19"/>
+              </w:rPr>
+            </w:pPr>
+            <w:r>
+              <w:rPr>
+                <w:rFonts w:ascii="Segoe UI" w:hAnsi="Segoe UI" w:cs="Segoe UI"/>
+                <w:color w:val="1F1F1F"/>
+                <w:sz w:val="19"/>
+                <w:szCs w:val="19"/>
+              </w:rPr>
+              <w:t>Títulos principales (h1, h2, h3) y elementos de navegación.</w:t>
+            </w:r>
+          </w:p>
+        </w:tc>
+        <w:tc>
+          <w:tcPr>
+            <w:tcW w:w="4855" w:type="dxa"/>
+            <w:tcBorders>
+              <w:top w:val="single" w:sz="4" w:space="0" w:color="D1D5DB"/>
+              <w:left w:val="single" w:sz="4" w:space="0" w:color="D1D5DB"/>
+              <w:bottom w:val="single" w:sz="4" w:space="0" w:color="D1D5DB"/>
+              <w:right w:val="single" w:sz="4" w:space="0" w:color="D1D5DB"/>
+            </w:tcBorders>
+            <w:vAlign w:val="center"/>
+            <w:hideMark/>
+          </w:tcPr>
+          <w:p>
+            <w:pPr>
+              <w:keepNext w:val="0"/>
+              <w:suppressAutoHyphens w:val="0"/>
+              <w:spacing w:after="0" w:line="240" w:lineRule="auto"/>
+              <w:rPr>
+                <w:rFonts w:ascii="Segoe UI" w:hAnsi="Segoe UI" w:cs="Segoe UI"/>
+                <w:color w:val="1F1F1F"/>
+                <w:sz w:val="19"/>
+                <w:szCs w:val="19"/>
+              </w:rPr>
+            </w:pPr>
+            <w:r>
+              <w:rPr>
+                <w:rFonts w:ascii="Segoe UI" w:hAnsi="Segoe UI" w:cs="Segoe UI"/>
+                <w:color w:val="1F1F1F"/>
+                <w:sz w:val="19"/>
+                <w:szCs w:val="19"/>
+              </w:rPr>
+              <w:t>Máximo contraste contra los fondos oscuros (</w:t>
+            </w:r>
+            <w:r>
+              <w:rPr>
+                <w:rFonts w:ascii="Segoe UI" w:hAnsi="Segoe UI" w:cs="Segoe UI"/>
+                <w:color w:val="444746"/>
+                <w:sz w:val="19"/>
+                <w:szCs w:val="19"/>
+              </w:rPr>
+              <w:t>#171717</w:t>
+            </w:r>
+            <w:r>
+              <w:rPr>
+                <w:rFonts w:ascii="Segoe UI" w:hAnsi="Segoe UI" w:cs="Segoe UI"/>
+                <w:color w:val="1F1F1F"/>
+                <w:sz w:val="19"/>
+                <w:szCs w:val="19"/>
+              </w:rPr>
+              <w:t xml:space="preserve"> y </w:t>
+            </w:r>
+            <w:r>
+              <w:rPr>
+                <w:rFonts w:ascii="Segoe UI" w:hAnsi="Segoe UI" w:cs="Segoe UI"/>
+                <w:color w:val="444746"/>
+                <w:sz w:val="19"/>
+                <w:szCs w:val="19"/>
+              </w:rPr>
+              <w:t>#262626</w:t>
+            </w:r>
+            <w:r>
+              <w:rPr>
+                <w:rFonts w:ascii="Segoe UI" w:hAnsi="Segoe UI" w:cs="Segoe UI"/>
+                <w:color w:val="1F1F1F"/>
+                <w:sz w:val="19"/>
+                <w:szCs w:val="19"/>
+              </w:rPr>
+              <w:t>), garantizando la legibilidad perfecta y el cumplimiento de accesibilidad.</w:t>
+            </w:r>
+          </w:p>
+        </w:tc>
+      </w:tr>
+      <w:tr>
+        <w:trPr>
+          <w:trHeight w:val="819"/>
+        </w:trPr>
+        <w:tc>
+          <w:tcPr>
+            <w:tcW w:w="1339" w:type="dxa"/>
+            <w:tcBorders>
+              <w:top w:val="single" w:sz="4" w:space="0" w:color="D1D5DB"/>
+              <w:left w:val="single" w:sz="4" w:space="0" w:color="D1D5DB"/>
+              <w:bottom w:val="single" w:sz="4" w:space="0" w:color="D1D5DB"/>
+              <w:right w:val="single" w:sz="4" w:space="0" w:color="D1D5DB"/>
+            </w:tcBorders>
+            <w:vAlign w:val="center"/>
+            <w:hideMark/>
+          </w:tcPr>
+          <w:p>
+            <w:pPr>
+              <w:keepNext w:val="0"/>
+              <w:suppressAutoHyphens w:val="0"/>
+              <w:spacing w:after="0" w:line="240" w:lineRule="auto"/>
+              <w:rPr>
+                <w:rFonts w:ascii="Segoe UI" w:hAnsi="Segoe UI" w:cs="Segoe UI"/>
+                <w:b/>
+                <w:bCs/>
+                <w:color w:val="1F1F1F"/>
+                <w:sz w:val="19"/>
+                <w:szCs w:val="19"/>
+              </w:rPr>
+            </w:pPr>
+            <w:r>
+              <w:rPr>
+                <w:rFonts w:ascii="Segoe UI" w:hAnsi="Segoe UI" w:cs="Segoe UI"/>
+                <w:b/>
+                <w:bCs/>
+                <w:color w:val="1F1F1F"/>
+                <w:sz w:val="19"/>
+                <w:szCs w:val="19"/>
+              </w:rPr>
+              <w:t>Texto Secundario</w:t>
+            </w:r>
+          </w:p>
+        </w:tc>
+        <w:tc>
+          <w:tcPr>
+            <w:tcW w:w="1409" w:type="dxa"/>
+            <w:tcBorders>
+              <w:top w:val="single" w:sz="4" w:space="0" w:color="D1D5DB"/>
+              <w:left w:val="single" w:sz="4" w:space="0" w:color="D1D5DB"/>
+              <w:bottom w:val="single" w:sz="4" w:space="0" w:color="D1D5DB"/>
+              <w:right w:val="single" w:sz="4" w:space="0" w:color="D1D5DB"/>
+            </w:tcBorders>
+            <w:vAlign w:val="center"/>
+            <w:hideMark/>
+          </w:tcPr>
+          <w:p>
+            <w:pPr>
+              <w:keepNext w:val="0"/>
+              <w:suppressAutoHyphens w:val="0"/>
+              <w:spacing w:after="0" w:line="240" w:lineRule="auto"/>
+              <w:rPr>
+                <w:rFonts w:ascii="Segoe UI" w:hAnsi="Segoe UI" w:cs="Segoe UI"/>
+                <w:b/>
+                <w:bCs/>
+                <w:color w:val="1F1F1F"/>
+                <w:sz w:val="19"/>
+                <w:szCs w:val="19"/>
+              </w:rPr>
+            </w:pPr>
+            <w:r>
+              <w:rPr>
+                <w:rFonts w:ascii="Segoe UI" w:hAnsi="Segoe UI" w:cs="Segoe UI"/>
+                <w:b/>
+                <w:bCs/>
+                <w:color w:val="1F1F1F"/>
+                <w:sz w:val="19"/>
+                <w:szCs w:val="19"/>
+              </w:rPr>
+              <w:t>#9CA3AF</w:t>
+            </w:r>
+          </w:p>
+        </w:tc>
+        <w:tc>
+          <w:tcPr>
+            <w:tcW w:w="1205" w:type="dxa"/>
+            <w:tcBorders>
+              <w:top w:val="single" w:sz="4" w:space="0" w:color="D1D5DB"/>
+              <w:left w:val="single" w:sz="4" w:space="0" w:color="D1D5DB"/>
+              <w:bottom w:val="single" w:sz="4" w:space="0" w:color="D1D5DB"/>
+              <w:right w:val="single" w:sz="4" w:space="0" w:color="D1D5DB"/>
+            </w:tcBorders>
+            <w:vAlign w:val="center"/>
+            <w:hideMark/>
+          </w:tcPr>
+          <w:p>
+            <w:pPr>
+              <w:keepNext w:val="0"/>
+              <w:suppressAutoHyphens w:val="0"/>
+              <w:spacing w:after="0" w:line="240" w:lineRule="auto"/>
+              <w:rPr>
+                <w:rFonts w:ascii="Segoe UI" w:hAnsi="Segoe UI" w:cs="Segoe UI"/>
+                <w:color w:val="1F1F1F"/>
+                <w:sz w:val="19"/>
+                <w:szCs w:val="19"/>
+              </w:rPr>
+            </w:pPr>
+            <w:r>
+              <w:rPr>
+                <w:rFonts w:ascii="Segoe UI" w:hAnsi="Segoe UI" w:cs="Segoe UI"/>
+                <w:color w:val="1F1F1F"/>
+                <w:sz w:val="19"/>
+                <w:szCs w:val="19"/>
+              </w:rPr>
+              <w:t>Gris Claro</w:t>
+            </w:r>
+          </w:p>
+        </w:tc>
+        <w:tc>
+          <w:tcPr>
+            <w:tcW w:w="2250" w:type="dxa"/>
+            <w:tcBorders>
+              <w:top w:val="single" w:sz="4" w:space="0" w:color="D1D5DB"/>
+              <w:left w:val="single" w:sz="4" w:space="0" w:color="D1D5DB"/>
+              <w:bottom w:val="single" w:sz="4" w:space="0" w:color="D1D5DB"/>
+              <w:right w:val="single" w:sz="4" w:space="0" w:color="D1D5DB"/>
+            </w:tcBorders>
+            <w:vAlign w:val="center"/>
+            <w:hideMark/>
+          </w:tcPr>
+          <w:p>
+            <w:pPr>
+              <w:keepNext w:val="0"/>
+              <w:suppressAutoHyphens w:val="0"/>
+              <w:spacing w:after="0" w:line="240" w:lineRule="auto"/>
+              <w:rPr>
+                <w:rFonts w:ascii="Segoe UI" w:hAnsi="Segoe UI" w:cs="Segoe UI"/>
+                <w:color w:val="1F1F1F"/>
+                <w:sz w:val="19"/>
+                <w:szCs w:val="19"/>
+              </w:rPr>
+            </w:pPr>
+            <w:r>
+              <w:rPr>
+                <w:rFonts w:ascii="Segoe UI" w:hAnsi="Segoe UI" w:cs="Segoe UI"/>
+                <w:color w:val="1F1F1F"/>
+                <w:sz w:val="19"/>
+                <w:szCs w:val="19"/>
+              </w:rPr>
+              <w:t>Párrafos descriptivos, textos largos y enlaces inactivos.</w:t>
+            </w:r>
+          </w:p>
+        </w:tc>
+        <w:tc>
+          <w:tcPr>
+            <w:tcW w:w="4855" w:type="dxa"/>
+            <w:tcBorders>
+              <w:top w:val="single" w:sz="4" w:space="0" w:color="D1D5DB"/>
+              <w:left w:val="single" w:sz="4" w:space="0" w:color="D1D5DB"/>
+              <w:bottom w:val="single" w:sz="4" w:space="0" w:color="D1D5DB"/>
+              <w:right w:val="single" w:sz="4" w:space="0" w:color="D1D5DB"/>
+            </w:tcBorders>
+            <w:vAlign w:val="center"/>
+            <w:hideMark/>
+          </w:tcPr>
+          <w:p>
+            <w:pPr>
+              <w:keepNext w:val="0"/>
+              <w:suppressAutoHyphens w:val="0"/>
+              <w:spacing w:after="0" w:line="240" w:lineRule="auto"/>
+              <w:rPr>
+                <w:rFonts w:ascii="Segoe UI" w:hAnsi="Segoe UI" w:cs="Segoe UI"/>
+                <w:color w:val="1F1F1F"/>
+                <w:sz w:val="19"/>
+                <w:szCs w:val="19"/>
+              </w:rPr>
+            </w:pPr>
+            <w:r>
+              <w:rPr>
+                <w:rFonts w:ascii="Segoe UI" w:hAnsi="Segoe UI" w:cs="Segoe UI"/>
+                <w:color w:val="1F1F1F"/>
+                <w:sz w:val="19"/>
+                <w:szCs w:val="19"/>
+              </w:rPr>
+              <w:t>Suaviza la lectura en bloques de texto grandes para que el contraste puro blanco/negro no sature la vista del usuario.</w:t>
+            </w:r>
+          </w:p>
+        </w:tc>
+      </w:tr>
+    </w:tbl>
     <w:p>
       <w:pPr>
         <w:pStyle w:val="Heading1"/>
@@ -30103,7 +31125,7 @@
             </wp:anchor>
           </w:drawing>
         </mc:Choice>
-        <mc:Fallback xmlns:a="http://schemas.openxmlformats.org/drawingml/2006/main" xmlns:pic="http://schemas.openxmlformats.org/drawingml/2006/picture" xmlns:a14="http://schemas.microsoft.com/office/drawing/2010/main">
+        <mc:Fallback xmlns:a14="http://schemas.microsoft.com/office/drawing/2010/main" xmlns:pic="http://schemas.openxmlformats.org/drawingml/2006/picture" xmlns:a="http://schemas.openxmlformats.org/drawingml/2006/main">
           <w:pict w14:anchorId="44D4DE1A">
             <v:shapetype id="_x0000_t32" coordsize="21600,21600" o:oned="t" filled="f" o:spt="32" path="m,l21600,21600e" w14:anchorId="7996C48F">
               <v:path fillok="f" arrowok="t" o:connecttype="none"/>
@@ -30394,7 +31416,7 @@
             </wp:anchor>
           </w:drawing>
         </mc:Choice>
-        <mc:Fallback xmlns:a="http://schemas.openxmlformats.org/drawingml/2006/main" xmlns:pic="http://schemas.openxmlformats.org/drawingml/2006/picture" xmlns:a14="http://schemas.microsoft.com/office/drawing/2010/main">
+        <mc:Fallback xmlns:a14="http://schemas.microsoft.com/office/drawing/2010/main" xmlns:pic="http://schemas.openxmlformats.org/drawingml/2006/picture" xmlns:a="http://schemas.openxmlformats.org/drawingml/2006/main">
           <w:pict w14:anchorId="18211A6C">
             <v:shapetype id="_x0000_t32" coordsize="21600,21600" o:oned="t" filled="f" o:spt="32" path="m,l21600,21600e" w14:anchorId="1F7B267B">
               <v:path fillok="f" arrowok="t" o:connecttype="none"/>
@@ -30697,7 +31719,7 @@
             </wp:anchor>
           </w:drawing>
         </mc:Choice>
-        <mc:Fallback xmlns:a="http://schemas.openxmlformats.org/drawingml/2006/main" xmlns:a14="http://schemas.microsoft.com/office/drawing/2010/main">
+        <mc:Fallback xmlns:a14="http://schemas.microsoft.com/office/drawing/2010/main" xmlns:a="http://schemas.openxmlformats.org/drawingml/2006/main">
           <w:pict w14:anchorId="2258254A">
             <v:shapetype id="_x0000_t32" coordsize="21600,21600" o:oned="t" filled="f" o:spt="32" path="m,l21600,21600e" w14:anchorId="4BB0A5D0">
               <v:path fillok="f" arrowok="t" o:connecttype="none"/>
@@ -30829,7 +31851,7 @@
             </wp:anchor>
           </w:drawing>
         </mc:Choice>
-        <mc:Fallback xmlns:a="http://schemas.openxmlformats.org/drawingml/2006/main" xmlns:a14="http://schemas.microsoft.com/office/drawing/2010/main">
+        <mc:Fallback xmlns:a14="http://schemas.microsoft.com/office/drawing/2010/main" xmlns:a="http://schemas.openxmlformats.org/drawingml/2006/main">
           <w:pict w14:anchorId="50FA3E29">
             <v:shapetype id="_x0000_t32" coordsize="21600,21600" o:oned="t" filled="f" o:spt="32" path="m,l21600,21600e" w14:anchorId="66A82D6C">
               <v:path fillok="f" arrowok="t" o:connecttype="none"/>
@@ -37227,6 +38249,7 @@
   <w:style w:type="character" w:default="1" w:styleId="DefaultParagraphFont">
     <w:name w:val="Default Paragraph Font"/>
     <w:uiPriority w:val="1"/>
+    <w:semiHidden/>
     <w:unhideWhenUsed/>
   </w:style>
   <w:style w:type="table" w:default="1" w:styleId="TableNormal">
@@ -38493,6 +39516,15 @@
 </file>
 
 <file path=customXml/item2.xml><?xml version="1.0" encoding="utf-8"?>
+<?mso-contentType ?>
+<FormTemplates xmlns="http://schemas.microsoft.com/sharepoint/v3/contenttype/forms">
+  <Display>DocumentLibraryForm</Display>
+  <Edit>DocumentLibraryForm</Edit>
+  <New>DocumentLibraryForm</New>
+</FormTemplates>
+</file>
+
+<file path=customXml/item3.xml><?xml version="1.0" encoding="utf-8"?>
 <ct:contentTypeSchema xmlns:ct="http://schemas.microsoft.com/office/2006/metadata/contentType" xmlns:ma="http://schemas.microsoft.com/office/2006/metadata/properties/metaAttributes" ct:_="" ma:_="" ma:contentTypeName="Documento" ma:contentTypeID="0x01010025101D0885731048B0CD21D432E8305A" ma:contentTypeVersion="11" ma:contentTypeDescription="Crear nuevo documento." ma:contentTypeScope="" ma:versionID="81bcf49ec1edc4061c6f9fddaf17e5a4">
   <xsd:schema xmlns:xsd="http://www.w3.org/2001/XMLSchema" xmlns:xs="http://www.w3.org/2001/XMLSchema" xmlns:p="http://schemas.microsoft.com/office/2006/metadata/properties" xmlns:ns3="0dd81e3e-32c4-45c3-852a-33c36a8ca9a2" targetNamespace="http://schemas.microsoft.com/office/2006/metadata/properties" ma:root="true" ma:fieldsID="e214c24f35242a31bbaa59618cd4f46f" ns3:_="">
     <xsd:import namespace="0dd81e3e-32c4-45c3-852a-33c36a8ca9a2"/>
@@ -38680,17 +39712,8 @@
 </ct:contentTypeSchema>
 </file>
 
-<file path=customXml/item3.xml><?xml version="1.0" encoding="utf-8"?>
+<file path=customXml/item4.xml><?xml version="1.0" encoding="utf-8"?>
 <b:Sources xmlns:b="http://schemas.openxmlformats.org/officeDocument/2006/bibliography" xmlns="http://schemas.openxmlformats.org/officeDocument/2006/bibliography" SelectedStyle="\APA.XSL" StyleName="APA Fifth Edition"/>
-</file>
-
-<file path=customXml/item4.xml><?xml version="1.0" encoding="utf-8"?>
-<?mso-contentType ?>
-<FormTemplates xmlns="http://schemas.microsoft.com/sharepoint/v3/contenttype/forms">
-  <Display>DocumentLibraryForm</Display>
-  <Edit>DocumentLibraryForm</Edit>
-  <New>DocumentLibraryForm</New>
-</FormTemplates>
 </file>
 
 <file path=customXml/itemProps1.xml><?xml version="1.0" encoding="utf-8"?>
@@ -38704,6 +39727,14 @@
 </file>
 
 <file path=customXml/itemProps2.xml><?xml version="1.0" encoding="utf-8"?>
+<ds:datastoreItem xmlns:ds="http://schemas.openxmlformats.org/officeDocument/2006/customXml" ds:itemID="{D6C383AF-1EC1-4F0E-B800-E4A39F6E2FAF}">
+  <ds:schemaRefs>
+    <ds:schemaRef ds:uri="http://schemas.microsoft.com/sharepoint/v3/contenttype/forms"/>
+  </ds:schemaRefs>
+</ds:datastoreItem>
+</file>
+
+<file path=customXml/itemProps3.xml><?xml version="1.0" encoding="utf-8"?>
 <ds:datastoreItem xmlns:ds="http://schemas.openxmlformats.org/officeDocument/2006/customXml" ds:itemID="{DCD06B4A-01B4-46AA-8422-B68B8898A05E}">
   <ds:schemaRefs>
     <ds:schemaRef ds:uri="http://schemas.microsoft.com/office/2006/metadata/contentType"/>
@@ -38721,18 +39752,10 @@
 </ds:datastoreItem>
 </file>
 
-<file path=customXml/itemProps3.xml><?xml version="1.0" encoding="utf-8"?>
+<file path=customXml/itemProps4.xml><?xml version="1.0" encoding="utf-8"?>
 <ds:datastoreItem xmlns:ds="http://schemas.openxmlformats.org/officeDocument/2006/customXml" ds:itemID="{16C71FD4-B25F-4F52-875D-9049229978E5}">
   <ds:schemaRefs>
     <ds:schemaRef ds:uri="http://schemas.openxmlformats.org/officeDocument/2006/bibliography"/>
   </ds:schemaRefs>
 </ds:datastoreItem>
-</file>
-
-<file path=customXml/itemProps4.xml><?xml version="1.0" encoding="utf-8"?>
-<ds:datastoreItem xmlns:ds="http://schemas.openxmlformats.org/officeDocument/2006/customXml" ds:itemID="{D6C383AF-1EC1-4F0E-B800-E4A39F6E2FAF}">
-  <ds:schemaRefs>
-    <ds:schemaRef ds:uri="http://schemas.microsoft.com/sharepoint/v3/contenttype/forms"/>
-  </ds:schemaRefs>
-</ds:datastoreItem>
 </file>
</xml_diff>

<commit_message>
[FIX] Submission Fixes finished
</commit_message>
<xml_diff>
--- a/MemoriaTFG-IvanMartinNieto.docx
+++ b/MemoriaTFG-IvanMartinNieto.docx
@@ -83,7 +83,7 @@
               </wp:anchor>
             </w:drawing>
           </mc:Choice>
-          <mc:Fallback xmlns:pic="http://schemas.openxmlformats.org/drawingml/2006/picture" xmlns:a14="http://schemas.microsoft.com/office/drawing/2010/main" xmlns:a="http://schemas.openxmlformats.org/drawingml/2006/main" xmlns:asvg="http://schemas.microsoft.com/office/drawing/2016/SVG/main">
+          <mc:Fallback xmlns:asvg="http://schemas.microsoft.com/office/drawing/2016/SVG/main" xmlns:a="http://schemas.openxmlformats.org/drawingml/2006/main" xmlns:a14="http://schemas.microsoft.com/office/drawing/2010/main" xmlns:pic="http://schemas.openxmlformats.org/drawingml/2006/picture">
             <w:pict w14:anchorId="0829D9D1">
               <v:shapetype id="_x0000_t32" coordsize="21600,21600" o:oned="t" filled="f" o:spt="32" path="m,l21600,21600e" w14:anchorId="38844837">
                 <v:path fillok="f" arrowok="t" o:connecttype="none"/>
@@ -25123,7 +25123,7 @@
       </w:tblGrid>
       <w:tr>
         <w:trPr>
-          <w:trHeight w:val="720"/>
+          <w:trHeight w:val="629"/>
         </w:trPr>
         <w:tc>
           <w:tcPr>
@@ -25283,23 +25283,7 @@
                 <w:bCs/>
                 <w:color w:val="991B1B"/>
               </w:rPr>
-              <w:t>Uso en la</w:t>
-            </w:r>
-            <w:r>
-              <w:rPr>
-                <w:b/>
-                <w:bCs/>
-                <w:color w:val="991B1B"/>
-              </w:rPr>
-              <w:t xml:space="preserve"> </w:t>
-            </w:r>
-            <w:r>
-              <w:rPr>
-                <w:b/>
-                <w:bCs/>
-                <w:color w:val="991B1B"/>
-              </w:rPr>
-              <w:t>Aplicación</w:t>
+              <w:t>Uso en la Aplicación</w:t>
             </w:r>
           </w:p>
         </w:tc>
@@ -25342,7 +25326,7 @@
       </w:tr>
       <w:tr>
         <w:trPr>
-          <w:trHeight w:val="1021"/>
+          <w:trHeight w:val="465"/>
         </w:trPr>
         <w:tc>
           <w:tcPr>
@@ -25431,6 +25415,7 @@
               <w:bottom w:val="single" w:sz="4" w:space="0" w:color="D1D5DB"/>
               <w:right w:val="single" w:sz="4" w:space="0" w:color="D1D5DB"/>
             </w:tcBorders>
+            <w:shd w:val="clear" w:color="auto" w:fill="FE0000"/>
             <w:vAlign w:val="center"/>
             <w:hideMark/>
           </w:tcPr>
@@ -25449,7 +25434,7 @@
             <w:r>
               <w:rPr>
                 <w:rFonts w:ascii="Segoe UI" w:hAnsi="Segoe UI" w:cs="Segoe UI"/>
-                <w:color w:val="1F1F1F"/>
+                <w:color w:val="FFFFFF" w:themeColor="background1"/>
                 <w:sz w:val="19"/>
                 <w:szCs w:val="19"/>
               </w:rPr>
@@ -25488,27 +25473,7 @@
                 <w:sz w:val="19"/>
                 <w:szCs w:val="19"/>
               </w:rPr>
-              <w:t xml:space="preserve">Botón de "Inscribirse", bordes de tarjetas destacadas, </w:t>
-            </w:r>
-            <w:proofErr w:type="spellStart"/>
-            <w:r>
-              <w:rPr>
-                <w:rFonts w:ascii="Segoe UI" w:hAnsi="Segoe UI" w:cs="Segoe UI"/>
-                <w:color w:val="1F1F1F"/>
-                <w:sz w:val="19"/>
-                <w:szCs w:val="19"/>
-              </w:rPr>
-              <w:t>hover</w:t>
-            </w:r>
-            <w:proofErr w:type="spellEnd"/>
-            <w:r>
-              <w:rPr>
-                <w:rFonts w:ascii="Segoe UI" w:hAnsi="Segoe UI" w:cs="Segoe UI"/>
-                <w:color w:val="1F1F1F"/>
-                <w:sz w:val="19"/>
-                <w:szCs w:val="19"/>
-              </w:rPr>
-              <w:t xml:space="preserve"> de enlaces y textos de impacto.</w:t>
+              <w:t>Botón de "Inscribirse", bordes de tarjetas destacadas, hover de enlaces y textos de impacto.</w:t>
             </w:r>
           </w:p>
         </w:tc>
@@ -25550,7 +25515,7 @@
       </w:tr>
       <w:tr>
         <w:trPr>
-          <w:trHeight w:val="824"/>
+          <w:trHeight w:val="465"/>
         </w:trPr>
         <w:tc>
           <w:tcPr>
@@ -25639,6 +25604,7 @@
               <w:bottom w:val="single" w:sz="4" w:space="0" w:color="D1D5DB"/>
               <w:right w:val="single" w:sz="4" w:space="0" w:color="D1D5DB"/>
             </w:tcBorders>
+            <w:shd w:val="clear" w:color="auto" w:fill="171717"/>
             <w:vAlign w:val="center"/>
             <w:hideMark/>
           </w:tcPr>
@@ -25657,7 +25623,7 @@
             <w:r>
               <w:rPr>
                 <w:rFonts w:ascii="Segoe UI" w:hAnsi="Segoe UI" w:cs="Segoe UI"/>
-                <w:color w:val="1F1F1F"/>
+                <w:color w:val="FFFFFF" w:themeColor="background1"/>
                 <w:sz w:val="19"/>
                 <w:szCs w:val="19"/>
               </w:rPr>
@@ -25738,7 +25704,7 @@
       </w:tr>
       <w:tr>
         <w:trPr>
-          <w:trHeight w:val="835"/>
+          <w:trHeight w:val="465"/>
         </w:trPr>
         <w:tc>
           <w:tcPr>
@@ -25827,6 +25793,7 @@
               <w:bottom w:val="single" w:sz="4" w:space="0" w:color="D1D5DB"/>
               <w:right w:val="single" w:sz="4" w:space="0" w:color="D1D5DB"/>
             </w:tcBorders>
+            <w:shd w:val="clear" w:color="auto" w:fill="262626"/>
             <w:vAlign w:val="center"/>
             <w:hideMark/>
           </w:tcPr>
@@ -25845,7 +25812,7 @@
             <w:r>
               <w:rPr>
                 <w:rFonts w:ascii="Segoe UI" w:hAnsi="Segoe UI" w:cs="Segoe UI"/>
-                <w:color w:val="1F1F1F"/>
+                <w:color w:val="FFFFFF" w:themeColor="background1"/>
                 <w:sz w:val="19"/>
                 <w:szCs w:val="19"/>
               </w:rPr>
@@ -25926,7 +25893,7 @@
       </w:tr>
       <w:tr>
         <w:trPr>
-          <w:trHeight w:val="834"/>
+          <w:trHeight w:val="465"/>
         </w:trPr>
         <w:tc>
           <w:tcPr>
@@ -26015,6 +25982,7 @@
               <w:bottom w:val="single" w:sz="4" w:space="0" w:color="D1D5DB"/>
               <w:right w:val="single" w:sz="4" w:space="0" w:color="D1D5DB"/>
             </w:tcBorders>
+            <w:shd w:val="clear" w:color="auto" w:fill="FFFFFF"/>
             <w:vAlign w:val="center"/>
             <w:hideMark/>
           </w:tcPr>
@@ -26150,7 +26118,7 @@
       </w:tr>
       <w:tr>
         <w:trPr>
-          <w:trHeight w:val="819"/>
+          <w:trHeight w:val="465"/>
         </w:trPr>
         <w:tc>
           <w:tcPr>
@@ -26239,6 +26207,7 @@
               <w:bottom w:val="single" w:sz="4" w:space="0" w:color="D1D5DB"/>
               <w:right w:val="single" w:sz="4" w:space="0" w:color="D1D5DB"/>
             </w:tcBorders>
+            <w:shd w:val="clear" w:color="auto" w:fill="9CA3AF"/>
             <w:vAlign w:val="center"/>
             <w:hideMark/>
           </w:tcPr>
@@ -26249,15 +26218,15 @@
               <w:spacing w:after="0" w:line="240" w:lineRule="auto"/>
               <w:rPr>
                 <w:rFonts w:ascii="Segoe UI" w:hAnsi="Segoe UI" w:cs="Segoe UI"/>
-                <w:color w:val="1F1F1F"/>
-                <w:sz w:val="19"/>
-                <w:szCs w:val="19"/>
-              </w:rPr>
-            </w:pPr>
-            <w:r>
-              <w:rPr>
-                <w:rFonts w:ascii="Segoe UI" w:hAnsi="Segoe UI" w:cs="Segoe UI"/>
-                <w:color w:val="1F1F1F"/>
+                <w:color w:val="000000" w:themeColor="text1"/>
+                <w:sz w:val="19"/>
+                <w:szCs w:val="19"/>
+              </w:rPr>
+            </w:pPr>
+            <w:r>
+              <w:rPr>
+                <w:rFonts w:ascii="Segoe UI" w:hAnsi="Segoe UI" w:cs="Segoe UI"/>
+                <w:color w:val="000000" w:themeColor="text1"/>
                 <w:sz w:val="19"/>
                 <w:szCs w:val="19"/>
               </w:rPr>
@@ -26415,76 +26384,550 @@
         <w:t>Tipografía</w:t>
       </w:r>
     </w:p>
-    <w:p>
-      <w:pPr>
-        <w:pStyle w:val="Heading2"/>
-        <w:keepNext w:val="0"/>
-        <w:widowControl w:val="0"/>
-        <w:shd w:val="clear" w:color="auto" w:fill="FFFFFF" w:themeFill="background1"/>
-        <w:spacing w:before="0" w:after="48"/>
-        <w:ind w:left="708"/>
-        <w:rPr>
-          <w:rFonts w:ascii="Segoe UI" w:eastAsia="Segoe UI" w:hAnsi="Segoe UI" w:cs="Segoe UI"/>
-          <w:i w:val="0"/>
-          <w:iCs w:val="0"/>
-          <w:color w:val="212121"/>
-          <w:sz w:val="24"/>
-        </w:rPr>
-      </w:pPr>
-      <w:r>
-        <w:rPr>
-          <w:rFonts w:ascii="Segoe UI" w:eastAsia="Segoe UI" w:hAnsi="Segoe UI" w:cs="Segoe UI"/>
-          <w:i w:val="0"/>
-          <w:iCs w:val="0"/>
-          <w:color w:val="212121"/>
-          <w:sz w:val="24"/>
-        </w:rPr>
-        <w:t>Se emplea la familia tipográfica </w:t>
-      </w:r>
-      <w:r>
-        <w:rPr>
-          <w:rFonts w:ascii="Segoe UI" w:eastAsia="Segoe UI" w:hAnsi="Segoe UI" w:cs="Segoe UI"/>
-          <w:b/>
-          <w:i w:val="0"/>
-          <w:iCs w:val="0"/>
-          <w:color w:val="212121"/>
-          <w:sz w:val="24"/>
-        </w:rPr>
-        <w:t>Inter</w:t>
-      </w:r>
-      <w:r>
-        <w:rPr>
-          <w:rFonts w:ascii="Segoe UI" w:eastAsia="Segoe UI" w:hAnsi="Segoe UI" w:cs="Segoe UI"/>
-          <w:i w:val="0"/>
-          <w:iCs w:val="0"/>
-          <w:color w:val="212121"/>
-          <w:sz w:val="24"/>
-        </w:rPr>
-        <w:t xml:space="preserve">, nativa en entornos web modernos e incluida a través de </w:t>
-      </w:r>
-      <w:proofErr w:type="spellStart"/>
-      <w:r>
-        <w:rPr>
-          <w:rFonts w:ascii="Segoe UI" w:eastAsia="Segoe UI" w:hAnsi="Segoe UI" w:cs="Segoe UI"/>
-          <w:i w:val="0"/>
-          <w:iCs w:val="0"/>
-          <w:color w:val="212121"/>
-          <w:sz w:val="24"/>
-        </w:rPr>
-        <w:t>Tailwind</w:t>
-      </w:r>
-      <w:proofErr w:type="spellEnd"/>
-      <w:r>
-        <w:rPr>
-          <w:rFonts w:ascii="Segoe UI" w:eastAsia="Segoe UI" w:hAnsi="Segoe UI" w:cs="Segoe UI"/>
-          <w:i w:val="0"/>
-          <w:iCs w:val="0"/>
-          <w:color w:val="212121"/>
-          <w:sz w:val="24"/>
-        </w:rPr>
-        <w:t xml:space="preserve"> CSS. Destaca por su legibilidad en pantallas pequeñas y su aspecto limpio y profesional, ideal para la lectura densa de tablas de marcas deportivas y listados de atletas.</w:t>
-      </w:r>
-    </w:p>
+    <w:tbl>
+      <w:tblPr>
+        <w:tblW w:w="9488" w:type="dxa"/>
+        <w:tblCellMar>
+          <w:left w:w="70" w:type="dxa"/>
+          <w:right w:w="70" w:type="dxa"/>
+        </w:tblCellMar>
+        <w:tblLook w:val="04A0" w:firstRow="1" w:lastRow="0" w:firstColumn="1" w:lastColumn="0" w:noHBand="0" w:noVBand="1"/>
+      </w:tblPr>
+      <w:tblGrid>
+        <w:gridCol w:w="1129"/>
+        <w:gridCol w:w="1560"/>
+        <w:gridCol w:w="2551"/>
+        <w:gridCol w:w="4248"/>
+      </w:tblGrid>
+      <w:tr>
+        <w:trPr>
+          <w:trHeight w:val="629"/>
+        </w:trPr>
+        <w:tc>
+          <w:tcPr>
+            <w:tcW w:w="1129" w:type="dxa"/>
+            <w:tcBorders>
+              <w:top w:val="single" w:sz="4" w:space="0" w:color="D1D5DB"/>
+              <w:left w:val="single" w:sz="4" w:space="0" w:color="D1D5DB"/>
+              <w:bottom w:val="single" w:sz="4" w:space="0" w:color="D1D5DB"/>
+              <w:right w:val="single" w:sz="4" w:space="0" w:color="D1D5DB"/>
+            </w:tcBorders>
+            <w:shd w:val="clear" w:color="auto" w:fill="FEE2E2"/>
+            <w:vAlign w:val="center"/>
+            <w:hideMark/>
+          </w:tcPr>
+          <w:p>
+            <w:pPr>
+              <w:keepNext w:val="0"/>
+              <w:widowControl w:val="0"/>
+              <w:shd w:val="clear" w:color="auto" w:fill="FFFFFF" w:themeFill="background1"/>
+              <w:spacing w:after="0"/>
+              <w:jc w:val="center"/>
+              <w:rPr>
+                <w:b/>
+                <w:bCs/>
+                <w:color w:val="991B1B"/>
+              </w:rPr>
+            </w:pPr>
+            <w:r>
+              <w:rPr>
+                <w:b/>
+                <w:bCs/>
+                <w:color w:val="991B1B"/>
+              </w:rPr>
+              <w:t>Fuente</w:t>
+            </w:r>
+          </w:p>
+        </w:tc>
+        <w:tc>
+          <w:tcPr>
+            <w:tcW w:w="1560" w:type="dxa"/>
+            <w:tcBorders>
+              <w:top w:val="single" w:sz="4" w:space="0" w:color="D1D5DB"/>
+              <w:left w:val="single" w:sz="4" w:space="0" w:color="D1D5DB"/>
+              <w:bottom w:val="single" w:sz="4" w:space="0" w:color="D1D5DB"/>
+              <w:right w:val="single" w:sz="4" w:space="0" w:color="D1D5DB"/>
+            </w:tcBorders>
+            <w:shd w:val="clear" w:color="auto" w:fill="FEE2E2"/>
+            <w:vAlign w:val="center"/>
+            <w:hideMark/>
+          </w:tcPr>
+          <w:p>
+            <w:pPr>
+              <w:keepNext w:val="0"/>
+              <w:widowControl w:val="0"/>
+              <w:shd w:val="clear" w:color="auto" w:fill="FFFFFF" w:themeFill="background1"/>
+              <w:spacing w:after="0"/>
+              <w:jc w:val="center"/>
+              <w:rPr>
+                <w:b/>
+                <w:bCs/>
+                <w:color w:val="991B1B"/>
+              </w:rPr>
+            </w:pPr>
+            <w:r>
+              <w:rPr>
+                <w:b/>
+                <w:bCs/>
+                <w:color w:val="991B1B"/>
+              </w:rPr>
+              <w:t>Categoría</w:t>
+            </w:r>
+          </w:p>
+        </w:tc>
+        <w:tc>
+          <w:tcPr>
+            <w:tcW w:w="2551" w:type="dxa"/>
+            <w:tcBorders>
+              <w:top w:val="single" w:sz="4" w:space="0" w:color="D1D5DB"/>
+              <w:left w:val="single" w:sz="4" w:space="0" w:color="D1D5DB"/>
+              <w:bottom w:val="single" w:sz="4" w:space="0" w:color="D1D5DB"/>
+              <w:right w:val="single" w:sz="4" w:space="0" w:color="D1D5DB"/>
+            </w:tcBorders>
+            <w:shd w:val="clear" w:color="auto" w:fill="FEE2E2"/>
+            <w:vAlign w:val="center"/>
+            <w:hideMark/>
+          </w:tcPr>
+          <w:p>
+            <w:pPr>
+              <w:keepNext w:val="0"/>
+              <w:widowControl w:val="0"/>
+              <w:shd w:val="clear" w:color="auto" w:fill="FFFFFF" w:themeFill="background1"/>
+              <w:spacing w:after="0"/>
+              <w:jc w:val="center"/>
+              <w:rPr>
+                <w:b/>
+                <w:bCs/>
+                <w:color w:val="991B1B"/>
+              </w:rPr>
+            </w:pPr>
+            <w:r>
+              <w:rPr>
+                <w:b/>
+                <w:bCs/>
+                <w:color w:val="991B1B"/>
+              </w:rPr>
+              <w:t>Uso en la Aplicación</w:t>
+            </w:r>
+          </w:p>
+        </w:tc>
+        <w:tc>
+          <w:tcPr>
+            <w:tcW w:w="4248" w:type="dxa"/>
+            <w:tcBorders>
+              <w:top w:val="single" w:sz="4" w:space="0" w:color="D1D5DB"/>
+              <w:left w:val="single" w:sz="4" w:space="0" w:color="D1D5DB"/>
+              <w:bottom w:val="single" w:sz="4" w:space="0" w:color="D1D5DB"/>
+              <w:right w:val="single" w:sz="4" w:space="0" w:color="D1D5DB"/>
+            </w:tcBorders>
+            <w:shd w:val="clear" w:color="auto" w:fill="FEE2E2"/>
+            <w:vAlign w:val="center"/>
+            <w:hideMark/>
+          </w:tcPr>
+          <w:p>
+            <w:pPr>
+              <w:keepNext w:val="0"/>
+              <w:widowControl w:val="0"/>
+              <w:shd w:val="clear" w:color="auto" w:fill="FFFFFF" w:themeFill="background1"/>
+              <w:spacing w:after="0"/>
+              <w:jc w:val="center"/>
+              <w:rPr>
+                <w:b/>
+                <w:bCs/>
+                <w:color w:val="991B1B"/>
+              </w:rPr>
+            </w:pPr>
+            <w:r>
+              <w:rPr>
+                <w:b/>
+                <w:bCs/>
+                <w:color w:val="991B1B"/>
+              </w:rPr>
+              <w:t>Justificación</w:t>
+            </w:r>
+          </w:p>
+        </w:tc>
+      </w:tr>
+      <w:tr>
+        <w:trPr>
+          <w:trHeight w:val="465"/>
+        </w:trPr>
+        <w:tc>
+          <w:tcPr>
+            <w:tcW w:w="1129" w:type="dxa"/>
+            <w:tcBorders>
+              <w:top w:val="single" w:sz="4" w:space="0" w:color="D1D5DB"/>
+              <w:left w:val="single" w:sz="4" w:space="0" w:color="D1D5DB"/>
+              <w:bottom w:val="single" w:sz="4" w:space="0" w:color="D1D5DB"/>
+              <w:right w:val="single" w:sz="4" w:space="0" w:color="D1D5DB"/>
+            </w:tcBorders>
+            <w:vAlign w:val="center"/>
+            <w:hideMark/>
+          </w:tcPr>
+          <w:p>
+            <w:pPr>
+              <w:keepNext w:val="0"/>
+              <w:suppressAutoHyphens w:val="0"/>
+              <w:spacing w:after="0" w:line="240" w:lineRule="auto"/>
+              <w:rPr>
+                <w:rFonts w:ascii="Segoe UI" w:hAnsi="Segoe UI" w:cs="Segoe UI"/>
+                <w:b/>
+                <w:bCs/>
+                <w:color w:val="1F1F1F"/>
+                <w:sz w:val="19"/>
+                <w:szCs w:val="19"/>
+              </w:rPr>
+            </w:pPr>
+            <w:r>
+              <w:rPr>
+                <w:rFonts w:ascii="Segoe UI" w:hAnsi="Segoe UI" w:cs="Segoe UI"/>
+                <w:b/>
+                <w:bCs/>
+                <w:color w:val="1F1F1F"/>
+                <w:sz w:val="19"/>
+                <w:szCs w:val="19"/>
+              </w:rPr>
+              <w:t>Graduate</w:t>
+            </w:r>
+          </w:p>
+        </w:tc>
+        <w:tc>
+          <w:tcPr>
+            <w:tcW w:w="1560" w:type="dxa"/>
+            <w:tcBorders>
+              <w:top w:val="single" w:sz="4" w:space="0" w:color="D1D5DB"/>
+              <w:left w:val="single" w:sz="4" w:space="0" w:color="D1D5DB"/>
+              <w:bottom w:val="single" w:sz="4" w:space="0" w:color="D1D5DB"/>
+              <w:right w:val="single" w:sz="4" w:space="0" w:color="D1D5DB"/>
+            </w:tcBorders>
+            <w:vAlign w:val="center"/>
+            <w:hideMark/>
+          </w:tcPr>
+          <w:p>
+            <w:pPr>
+              <w:keepNext w:val="0"/>
+              <w:suppressAutoHyphens w:val="0"/>
+              <w:spacing w:after="0" w:line="240" w:lineRule="auto"/>
+              <w:rPr>
+                <w:rFonts w:ascii="Segoe UI" w:hAnsi="Segoe UI" w:cs="Segoe UI"/>
+                <w:color w:val="1F1F1F"/>
+                <w:sz w:val="19"/>
+                <w:szCs w:val="19"/>
+              </w:rPr>
+            </w:pPr>
+            <w:r>
+              <w:rPr>
+                <w:rFonts w:ascii="Segoe UI" w:hAnsi="Segoe UI" w:cs="Segoe UI"/>
+                <w:color w:val="1F1F1F"/>
+                <w:sz w:val="19"/>
+                <w:szCs w:val="19"/>
+              </w:rPr>
+              <w:t>Serif (Collegiate)</w:t>
+            </w:r>
+          </w:p>
+        </w:tc>
+        <w:tc>
+          <w:tcPr>
+            <w:tcW w:w="2551" w:type="dxa"/>
+            <w:tcBorders>
+              <w:top w:val="single" w:sz="4" w:space="0" w:color="D1D5DB"/>
+              <w:left w:val="single" w:sz="4" w:space="0" w:color="D1D5DB"/>
+              <w:bottom w:val="single" w:sz="4" w:space="0" w:color="D1D5DB"/>
+              <w:right w:val="single" w:sz="4" w:space="0" w:color="D1D5DB"/>
+            </w:tcBorders>
+            <w:vAlign w:val="center"/>
+            <w:hideMark/>
+          </w:tcPr>
+          <w:p>
+            <w:pPr>
+              <w:keepNext w:val="0"/>
+              <w:suppressAutoHyphens w:val="0"/>
+              <w:spacing w:after="0" w:line="240" w:lineRule="auto"/>
+              <w:rPr>
+                <w:rFonts w:ascii="Segoe UI" w:hAnsi="Segoe UI" w:cs="Segoe UI"/>
+                <w:color w:val="1F1F1F"/>
+                <w:sz w:val="19"/>
+                <w:szCs w:val="19"/>
+              </w:rPr>
+            </w:pPr>
+            <w:r>
+              <w:rPr>
+                <w:rFonts w:ascii="Segoe UI" w:hAnsi="Segoe UI" w:cs="Segoe UI"/>
+                <w:color w:val="1F1F1F"/>
+                <w:sz w:val="19"/>
+                <w:szCs w:val="19"/>
+              </w:rPr>
+              <w:t>Títulos principales de marca y logotipos.</w:t>
+            </w:r>
+          </w:p>
+        </w:tc>
+        <w:tc>
+          <w:tcPr>
+            <w:tcW w:w="4248" w:type="dxa"/>
+            <w:tcBorders>
+              <w:top w:val="single" w:sz="4" w:space="0" w:color="D1D5DB"/>
+              <w:left w:val="single" w:sz="4" w:space="0" w:color="D1D5DB"/>
+              <w:bottom w:val="single" w:sz="4" w:space="0" w:color="D1D5DB"/>
+              <w:right w:val="single" w:sz="4" w:space="0" w:color="D1D5DB"/>
+            </w:tcBorders>
+            <w:vAlign w:val="center"/>
+            <w:hideMark/>
+          </w:tcPr>
+          <w:p>
+            <w:pPr>
+              <w:keepNext w:val="0"/>
+              <w:suppressAutoHyphens w:val="0"/>
+              <w:spacing w:after="0" w:line="240" w:lineRule="auto"/>
+              <w:rPr>
+                <w:rFonts w:ascii="Segoe UI" w:hAnsi="Segoe UI" w:cs="Segoe UI"/>
+                <w:color w:val="1F1F1F"/>
+                <w:sz w:val="19"/>
+                <w:szCs w:val="19"/>
+              </w:rPr>
+            </w:pPr>
+            <w:r>
+              <w:rPr>
+                <w:rFonts w:ascii="Segoe UI" w:hAnsi="Segoe UI" w:cs="Segoe UI"/>
+                <w:color w:val="1F1F1F"/>
+                <w:sz w:val="19"/>
+                <w:szCs w:val="19"/>
+              </w:rPr>
+              <w:t>Evoca la estética de las universidades americanas y los clubes deportivos tradicionales. Sus remates cuadrados y estructura robusta transmiten</w:t>
+            </w:r>
+            <w:r>
+              <w:rPr>
+                <w:rFonts w:ascii="Segoe UI" w:hAnsi="Segoe UI" w:cs="Segoe UI"/>
+                <w:color w:val="1F1F1F"/>
+                <w:sz w:val="19"/>
+                <w:szCs w:val="19"/>
+              </w:rPr>
+              <w:t xml:space="preserve"> </w:t>
+            </w:r>
+            <w:r>
+              <w:rPr>
+                <w:rFonts w:ascii="Segoe UI" w:hAnsi="Segoe UI" w:cs="Segoe UI"/>
+                <w:color w:val="1F1F1F"/>
+                <w:sz w:val="19"/>
+                <w:szCs w:val="19"/>
+              </w:rPr>
+              <w:t>espíritu de equipo</w:t>
+            </w:r>
+            <w:r>
+              <w:rPr>
+                <w:rFonts w:ascii="Segoe UI" w:hAnsi="Segoe UI" w:cs="Segoe UI"/>
+                <w:color w:val="1F1F1F"/>
+                <w:sz w:val="19"/>
+                <w:szCs w:val="19"/>
+              </w:rPr>
+              <w:t xml:space="preserve"> gracias a su asociación por la cultura popular</w:t>
+            </w:r>
+            <w:r>
+              <w:rPr>
+                <w:rFonts w:ascii="Segoe UI" w:hAnsi="Segoe UI" w:cs="Segoe UI"/>
+                <w:color w:val="1F1F1F"/>
+                <w:sz w:val="19"/>
+                <w:szCs w:val="19"/>
+              </w:rPr>
+              <w:t>.</w:t>
+            </w:r>
+          </w:p>
+        </w:tc>
+      </w:tr>
+      <w:tr>
+        <w:trPr>
+          <w:trHeight w:val="465"/>
+        </w:trPr>
+        <w:tc>
+          <w:tcPr>
+            <w:tcW w:w="1129" w:type="dxa"/>
+            <w:tcBorders>
+              <w:top w:val="single" w:sz="4" w:space="0" w:color="D1D5DB"/>
+              <w:left w:val="single" w:sz="4" w:space="0" w:color="D1D5DB"/>
+              <w:bottom w:val="single" w:sz="4" w:space="0" w:color="D1D5DB"/>
+              <w:right w:val="single" w:sz="4" w:space="0" w:color="D1D5DB"/>
+            </w:tcBorders>
+            <w:vAlign w:val="center"/>
+            <w:hideMark/>
+          </w:tcPr>
+          <w:p>
+            <w:pPr>
+              <w:keepNext w:val="0"/>
+              <w:suppressAutoHyphens w:val="0"/>
+              <w:spacing w:after="0" w:line="240" w:lineRule="auto"/>
+              <w:rPr>
+                <w:rFonts w:ascii="Segoe UI" w:hAnsi="Segoe UI" w:cs="Segoe UI"/>
+                <w:b/>
+                <w:bCs/>
+                <w:color w:val="1F1F1F"/>
+                <w:sz w:val="19"/>
+                <w:szCs w:val="19"/>
+              </w:rPr>
+            </w:pPr>
+            <w:r>
+              <w:rPr>
+                <w:rFonts w:ascii="Segoe UI" w:hAnsi="Segoe UI" w:cs="Segoe UI"/>
+                <w:b/>
+                <w:bCs/>
+                <w:color w:val="1F1F1F"/>
+                <w:sz w:val="19"/>
+                <w:szCs w:val="19"/>
+              </w:rPr>
+              <w:t>Inter</w:t>
+            </w:r>
+          </w:p>
+        </w:tc>
+        <w:tc>
+          <w:tcPr>
+            <w:tcW w:w="1560" w:type="dxa"/>
+            <w:tcBorders>
+              <w:top w:val="single" w:sz="4" w:space="0" w:color="D1D5DB"/>
+              <w:left w:val="single" w:sz="4" w:space="0" w:color="D1D5DB"/>
+              <w:bottom w:val="single" w:sz="4" w:space="0" w:color="D1D5DB"/>
+              <w:right w:val="single" w:sz="4" w:space="0" w:color="D1D5DB"/>
+            </w:tcBorders>
+            <w:vAlign w:val="center"/>
+            <w:hideMark/>
+          </w:tcPr>
+          <w:p>
+            <w:pPr>
+              <w:keepNext w:val="0"/>
+              <w:suppressAutoHyphens w:val="0"/>
+              <w:spacing w:after="0" w:line="240" w:lineRule="auto"/>
+              <w:rPr>
+                <w:rFonts w:ascii="Segoe UI" w:hAnsi="Segoe UI" w:cs="Segoe UI"/>
+                <w:color w:val="1F1F1F"/>
+                <w:sz w:val="19"/>
+                <w:szCs w:val="19"/>
+              </w:rPr>
+            </w:pPr>
+            <w:r>
+              <w:rPr>
+                <w:rFonts w:ascii="Segoe UI" w:hAnsi="Segoe UI" w:cs="Segoe UI"/>
+                <w:color w:val="1F1F1F"/>
+                <w:sz w:val="19"/>
+                <w:szCs w:val="19"/>
+              </w:rPr>
+              <w:t>Sans-serif (Variable)</w:t>
+            </w:r>
+          </w:p>
+        </w:tc>
+        <w:tc>
+          <w:tcPr>
+            <w:tcW w:w="2551" w:type="dxa"/>
+            <w:tcBorders>
+              <w:top w:val="single" w:sz="4" w:space="0" w:color="D1D5DB"/>
+              <w:left w:val="single" w:sz="4" w:space="0" w:color="D1D5DB"/>
+              <w:bottom w:val="single" w:sz="4" w:space="0" w:color="D1D5DB"/>
+              <w:right w:val="single" w:sz="4" w:space="0" w:color="D1D5DB"/>
+            </w:tcBorders>
+            <w:vAlign w:val="center"/>
+            <w:hideMark/>
+          </w:tcPr>
+          <w:p>
+            <w:pPr>
+              <w:keepNext w:val="0"/>
+              <w:suppressAutoHyphens w:val="0"/>
+              <w:spacing w:after="0" w:line="240" w:lineRule="auto"/>
+              <w:rPr>
+                <w:rFonts w:ascii="Segoe UI" w:hAnsi="Segoe UI" w:cs="Segoe UI"/>
+                <w:color w:val="1F1F1F"/>
+                <w:sz w:val="19"/>
+                <w:szCs w:val="19"/>
+              </w:rPr>
+            </w:pPr>
+            <w:r>
+              <w:rPr>
+                <w:rFonts w:ascii="Segoe UI" w:hAnsi="Segoe UI" w:cs="Segoe UI"/>
+                <w:color w:val="1F1F1F"/>
+                <w:sz w:val="19"/>
+                <w:szCs w:val="19"/>
+              </w:rPr>
+              <w:t>Textos de cuerpo, botones, menús y formularios.</w:t>
+            </w:r>
+          </w:p>
+        </w:tc>
+        <w:tc>
+          <w:tcPr>
+            <w:tcW w:w="4248" w:type="dxa"/>
+            <w:tcBorders>
+              <w:top w:val="single" w:sz="4" w:space="0" w:color="D1D5DB"/>
+              <w:left w:val="single" w:sz="4" w:space="0" w:color="D1D5DB"/>
+              <w:bottom w:val="single" w:sz="4" w:space="0" w:color="D1D5DB"/>
+              <w:right w:val="single" w:sz="4" w:space="0" w:color="D1D5DB"/>
+            </w:tcBorders>
+            <w:vAlign w:val="center"/>
+            <w:hideMark/>
+          </w:tcPr>
+          <w:p>
+            <w:pPr>
+              <w:keepNext w:val="0"/>
+              <w:suppressAutoHyphens w:val="0"/>
+              <w:spacing w:after="0" w:line="240" w:lineRule="auto"/>
+              <w:rPr>
+                <w:rFonts w:ascii="Segoe UI" w:hAnsi="Segoe UI" w:cs="Segoe UI"/>
+                <w:color w:val="1F1F1F"/>
+                <w:sz w:val="19"/>
+                <w:szCs w:val="19"/>
+              </w:rPr>
+            </w:pPr>
+            <w:r>
+              <w:rPr>
+                <w:rFonts w:ascii="Segoe UI" w:hAnsi="Segoe UI" w:cs="Segoe UI"/>
+                <w:color w:val="1F1F1F"/>
+                <w:sz w:val="19"/>
+                <w:szCs w:val="19"/>
+              </w:rPr>
+              <w:t xml:space="preserve">Es una fuente diseñada específicamente para pantallas. Su alta legibilidad en tamaños pequeños es </w:t>
+            </w:r>
+            <w:r>
+              <w:rPr>
+                <w:rFonts w:ascii="Segoe UI" w:hAnsi="Segoe UI" w:cs="Segoe UI"/>
+                <w:color w:val="1F1F1F"/>
+                <w:sz w:val="19"/>
+                <w:szCs w:val="19"/>
+              </w:rPr>
+              <w:t>importante</w:t>
+            </w:r>
+            <w:r>
+              <w:rPr>
+                <w:rFonts w:ascii="Segoe UI" w:hAnsi="Segoe UI" w:cs="Segoe UI"/>
+                <w:color w:val="1F1F1F"/>
+                <w:sz w:val="19"/>
+                <w:szCs w:val="19"/>
+              </w:rPr>
+              <w:t xml:space="preserve"> para que los </w:t>
+            </w:r>
+            <w:r>
+              <w:rPr>
+                <w:rFonts w:ascii="Segoe UI" w:hAnsi="Segoe UI" w:cs="Segoe UI"/>
+                <w:color w:val="1F1F1F"/>
+                <w:sz w:val="19"/>
+                <w:szCs w:val="19"/>
+              </w:rPr>
+              <w:t>usuarios</w:t>
+            </w:r>
+            <w:r>
+              <w:rPr>
+                <w:rFonts w:ascii="Segoe UI" w:hAnsi="Segoe UI" w:cs="Segoe UI"/>
+                <w:color w:val="1F1F1F"/>
+                <w:sz w:val="19"/>
+                <w:szCs w:val="19"/>
+              </w:rPr>
+              <w:t xml:space="preserve"> puedan leer sus sesiones de entrenamiento o revisar documentos de inscripción sin fatiga visual</w:t>
+            </w:r>
+            <w:r>
+              <w:rPr>
+                <w:rFonts w:ascii="Segoe UI" w:hAnsi="Segoe UI" w:cs="Segoe UI"/>
+                <w:color w:val="1F1F1F"/>
+                <w:sz w:val="19"/>
+                <w:szCs w:val="19"/>
+              </w:rPr>
+              <w:t>, sobre todo en dispositivos pequeños.</w:t>
+            </w:r>
+          </w:p>
+        </w:tc>
+      </w:tr>
+    </w:tbl>
     <w:p>
       <w:pPr>
         <w:pStyle w:val="Heading2"/>
@@ -31125,7 +31568,7 @@
             </wp:anchor>
           </w:drawing>
         </mc:Choice>
-        <mc:Fallback xmlns:a14="http://schemas.microsoft.com/office/drawing/2010/main" xmlns:pic="http://schemas.openxmlformats.org/drawingml/2006/picture" xmlns:a="http://schemas.openxmlformats.org/drawingml/2006/main">
+        <mc:Fallback xmlns:a="http://schemas.openxmlformats.org/drawingml/2006/main" xmlns:pic="http://schemas.openxmlformats.org/drawingml/2006/picture" xmlns:a14="http://schemas.microsoft.com/office/drawing/2010/main">
           <w:pict w14:anchorId="44D4DE1A">
             <v:shapetype id="_x0000_t32" coordsize="21600,21600" o:oned="t" filled="f" o:spt="32" path="m,l21600,21600e" w14:anchorId="7996C48F">
               <v:path fillok="f" arrowok="t" o:connecttype="none"/>
@@ -31416,7 +31859,7 @@
             </wp:anchor>
           </w:drawing>
         </mc:Choice>
-        <mc:Fallback xmlns:a14="http://schemas.microsoft.com/office/drawing/2010/main" xmlns:pic="http://schemas.openxmlformats.org/drawingml/2006/picture" xmlns:a="http://schemas.openxmlformats.org/drawingml/2006/main">
+        <mc:Fallback xmlns:a="http://schemas.openxmlformats.org/drawingml/2006/main" xmlns:pic="http://schemas.openxmlformats.org/drawingml/2006/picture" xmlns:a14="http://schemas.microsoft.com/office/drawing/2010/main">
           <w:pict w14:anchorId="18211A6C">
             <v:shapetype id="_x0000_t32" coordsize="21600,21600" o:oned="t" filled="f" o:spt="32" path="m,l21600,21600e" w14:anchorId="1F7B267B">
               <v:path fillok="f" arrowok="t" o:connecttype="none"/>
@@ -31719,7 +32162,7 @@
             </wp:anchor>
           </w:drawing>
         </mc:Choice>
-        <mc:Fallback xmlns:a14="http://schemas.microsoft.com/office/drawing/2010/main" xmlns:a="http://schemas.openxmlformats.org/drawingml/2006/main">
+        <mc:Fallback xmlns:a="http://schemas.openxmlformats.org/drawingml/2006/main" xmlns:a14="http://schemas.microsoft.com/office/drawing/2010/main">
           <w:pict w14:anchorId="2258254A">
             <v:shapetype id="_x0000_t32" coordsize="21600,21600" o:oned="t" filled="f" o:spt="32" path="m,l21600,21600e" w14:anchorId="4BB0A5D0">
               <v:path fillok="f" arrowok="t" o:connecttype="none"/>
@@ -31851,7 +32294,7 @@
             </wp:anchor>
           </w:drawing>
         </mc:Choice>
-        <mc:Fallback xmlns:a14="http://schemas.microsoft.com/office/drawing/2010/main" xmlns:a="http://schemas.openxmlformats.org/drawingml/2006/main">
+        <mc:Fallback xmlns:a="http://schemas.openxmlformats.org/drawingml/2006/main" xmlns:a14="http://schemas.microsoft.com/office/drawing/2010/main">
           <w:pict w14:anchorId="50FA3E29">
             <v:shapetype id="_x0000_t32" coordsize="21600,21600" o:oned="t" filled="f" o:spt="32" path="m,l21600,21600e" w14:anchorId="66A82D6C">
               <v:path fillok="f" arrowok="t" o:connecttype="none"/>
@@ -39516,6 +39959,10 @@
 </file>
 
 <file path=customXml/item2.xml><?xml version="1.0" encoding="utf-8"?>
+<b:Sources xmlns:b="http://schemas.openxmlformats.org/officeDocument/2006/bibliography" xmlns="http://schemas.openxmlformats.org/officeDocument/2006/bibliography" SelectedStyle="\APA.XSL" StyleName="APA Fifth Edition"/>
+</file>
+
+<file path=customXml/item3.xml><?xml version="1.0" encoding="utf-8"?>
 <?mso-contentType ?>
 <FormTemplates xmlns="http://schemas.microsoft.com/sharepoint/v3/contenttype/forms">
   <Display>DocumentLibraryForm</Display>
@@ -39524,7 +39971,7 @@
 </FormTemplates>
 </file>
 
-<file path=customXml/item3.xml><?xml version="1.0" encoding="utf-8"?>
+<file path=customXml/item4.xml><?xml version="1.0" encoding="utf-8"?>
 <ct:contentTypeSchema xmlns:ct="http://schemas.microsoft.com/office/2006/metadata/contentType" xmlns:ma="http://schemas.microsoft.com/office/2006/metadata/properties/metaAttributes" ct:_="" ma:_="" ma:contentTypeName="Documento" ma:contentTypeID="0x01010025101D0885731048B0CD21D432E8305A" ma:contentTypeVersion="11" ma:contentTypeDescription="Crear nuevo documento." ma:contentTypeScope="" ma:versionID="81bcf49ec1edc4061c6f9fddaf17e5a4">
   <xsd:schema xmlns:xsd="http://www.w3.org/2001/XMLSchema" xmlns:xs="http://www.w3.org/2001/XMLSchema" xmlns:p="http://schemas.microsoft.com/office/2006/metadata/properties" xmlns:ns3="0dd81e3e-32c4-45c3-852a-33c36a8ca9a2" targetNamespace="http://schemas.microsoft.com/office/2006/metadata/properties" ma:root="true" ma:fieldsID="e214c24f35242a31bbaa59618cd4f46f" ns3:_="">
     <xsd:import namespace="0dd81e3e-32c4-45c3-852a-33c36a8ca9a2"/>
@@ -39712,10 +40159,6 @@
 </ct:contentTypeSchema>
 </file>
 
-<file path=customXml/item4.xml><?xml version="1.0" encoding="utf-8"?>
-<b:Sources xmlns:b="http://schemas.openxmlformats.org/officeDocument/2006/bibliography" xmlns="http://schemas.openxmlformats.org/officeDocument/2006/bibliography" SelectedStyle="\APA.XSL" StyleName="APA Fifth Edition"/>
-</file>
-
 <file path=customXml/itemProps1.xml><?xml version="1.0" encoding="utf-8"?>
 <ds:datastoreItem xmlns:ds="http://schemas.openxmlformats.org/officeDocument/2006/customXml" ds:itemID="{56B03E1A-13FD-4632-B7FD-6FEC8181D718}">
   <ds:schemaRefs>
@@ -39727,6 +40170,14 @@
 </file>
 
 <file path=customXml/itemProps2.xml><?xml version="1.0" encoding="utf-8"?>
+<ds:datastoreItem xmlns:ds="http://schemas.openxmlformats.org/officeDocument/2006/customXml" ds:itemID="{16C71FD4-B25F-4F52-875D-9049229978E5}">
+  <ds:schemaRefs>
+    <ds:schemaRef ds:uri="http://schemas.openxmlformats.org/officeDocument/2006/bibliography"/>
+  </ds:schemaRefs>
+</ds:datastoreItem>
+</file>
+
+<file path=customXml/itemProps3.xml><?xml version="1.0" encoding="utf-8"?>
 <ds:datastoreItem xmlns:ds="http://schemas.openxmlformats.org/officeDocument/2006/customXml" ds:itemID="{D6C383AF-1EC1-4F0E-B800-E4A39F6E2FAF}">
   <ds:schemaRefs>
     <ds:schemaRef ds:uri="http://schemas.microsoft.com/sharepoint/v3/contenttype/forms"/>
@@ -39734,7 +40185,7 @@
 </ds:datastoreItem>
 </file>
 
-<file path=customXml/itemProps3.xml><?xml version="1.0" encoding="utf-8"?>
+<file path=customXml/itemProps4.xml><?xml version="1.0" encoding="utf-8"?>
 <ds:datastoreItem xmlns:ds="http://schemas.openxmlformats.org/officeDocument/2006/customXml" ds:itemID="{DCD06B4A-01B4-46AA-8422-B68B8898A05E}">
   <ds:schemaRefs>
     <ds:schemaRef ds:uri="http://schemas.microsoft.com/office/2006/metadata/contentType"/>
@@ -39750,12 +40201,4 @@
     <ds:schemaRef ds:uri="http://schemas.microsoft.com/internal/obd"/>
   </ds:schemaRefs>
 </ds:datastoreItem>
-</file>
-
-<file path=customXml/itemProps4.xml><?xml version="1.0" encoding="utf-8"?>
-<ds:datastoreItem xmlns:ds="http://schemas.openxmlformats.org/officeDocument/2006/customXml" ds:itemID="{16C71FD4-B25F-4F52-875D-9049229978E5}">
-  <ds:schemaRefs>
-    <ds:schemaRef ds:uri="http://schemas.openxmlformats.org/officeDocument/2006/bibliography"/>
-  </ds:schemaRefs>
-</ds:datastoreItem>
 </file>
</xml_diff>